<commit_message>
Manual v2: where each budget comes from (D0/B0/15/P0)
Co-Authored-By: Claude Opus 5.5 <noreply@anthropic.com>
</commit_message>
<xml_diff>
--- a/docs/eGP-Alert-v3-Technical-Manual-v2.docx
+++ b/docs/eGP-Alert-v3-Technical-Manual-v2.docx
@@ -111,7 +111,7 @@
     <w:sdt>
       <w:sdtPr>
         <w:alias w:val="สารบัญ"/>
-        <w:id w:val="726105983"/>
+        <w:id w:val="-1959092518"/>
       </w:sdtPr>
       <w:sdtEndPr>
         <w:rPr>
@@ -144,7 +144,7 @@
           <w:r>
             <w:fldChar w:fldCharType="separate"/>
           </w:r>
-          <w:hyperlink w:anchor="_Toc242953751" w:history="1">
+          <w:hyperlink w:anchor="_Toc242957382" w:history="1">
             <w:r>
               <w:rPr>
                 <w:rStyle w:val="Hyperlink"/>
@@ -168,7 +168,7 @@
               <w:rPr>
                 <w:noProof/>
               </w:rPr>
-              <w:instrText xml:space="preserve"> PAGEREF _Toc242953751 \h </w:instrText>
+              <w:instrText xml:space="preserve"> PAGEREF _Toc242957382 \h </w:instrText>
             </w:r>
             <w:r>
               <w:rPr>
@@ -210,7 +210,7 @@
               <w14:ligatures w14:val="standardContextual"/>
             </w:rPr>
           </w:pPr>
-          <w:hyperlink w:anchor="_Toc242953752" w:history="1">
+          <w:hyperlink w:anchor="_Toc242957383" w:history="1">
             <w:r>
               <w:rPr>
                 <w:rStyle w:val="Hyperlink"/>
@@ -234,7 +234,7 @@
               <w:rPr>
                 <w:noProof/>
               </w:rPr>
-              <w:instrText xml:space="preserve"> PAGEREF _Toc242953752 \h </w:instrText>
+              <w:instrText xml:space="preserve"> PAGEREF _Toc242957383 \h </w:instrText>
             </w:r>
             <w:r>
               <w:rPr>
@@ -276,7 +276,7 @@
               <w14:ligatures w14:val="standardContextual"/>
             </w:rPr>
           </w:pPr>
-          <w:hyperlink w:anchor="_Toc242953753" w:history="1">
+          <w:hyperlink w:anchor="_Toc242957384" w:history="1">
             <w:r>
               <w:rPr>
                 <w:rStyle w:val="Hyperlink"/>
@@ -300,7 +300,7 @@
               <w:rPr>
                 <w:noProof/>
               </w:rPr>
-              <w:instrText xml:space="preserve"> PAGEREF _Toc242953753 \h </w:instrText>
+              <w:instrText xml:space="preserve"> PAGEREF _Toc242957384 \h </w:instrText>
             </w:r>
             <w:r>
               <w:rPr>
@@ -342,7 +342,7 @@
               <w14:ligatures w14:val="standardContextual"/>
             </w:rPr>
           </w:pPr>
-          <w:hyperlink w:anchor="_Toc242953754" w:history="1">
+          <w:hyperlink w:anchor="_Toc242957385" w:history="1">
             <w:r>
               <w:rPr>
                 <w:rStyle w:val="Hyperlink"/>
@@ -366,7 +366,7 @@
               <w:rPr>
                 <w:noProof/>
               </w:rPr>
-              <w:instrText xml:space="preserve"> PAGEREF _Toc242953754 \h </w:instrText>
+              <w:instrText xml:space="preserve"> PAGEREF _Toc242957385 \h </w:instrText>
             </w:r>
             <w:r>
               <w:rPr>
@@ -408,7 +408,7 @@
               <w14:ligatures w14:val="standardContextual"/>
             </w:rPr>
           </w:pPr>
-          <w:hyperlink w:anchor="_Toc242953755" w:history="1">
+          <w:hyperlink w:anchor="_Toc242957386" w:history="1">
             <w:r>
               <w:rPr>
                 <w:rStyle w:val="Hyperlink"/>
@@ -432,7 +432,7 @@
               <w:rPr>
                 <w:noProof/>
               </w:rPr>
-              <w:instrText xml:space="preserve"> PAGEREF _Toc242953755 \h </w:instrText>
+              <w:instrText xml:space="preserve"> PAGEREF _Toc242957386 \h </w:instrText>
             </w:r>
             <w:r>
               <w:rPr>
@@ -474,7 +474,7 @@
               <w14:ligatures w14:val="standardContextual"/>
             </w:rPr>
           </w:pPr>
-          <w:hyperlink w:anchor="_Toc242953756" w:history="1">
+          <w:hyperlink w:anchor="_Toc242957387" w:history="1">
             <w:r>
               <w:rPr>
                 <w:rStyle w:val="Hyperlink"/>
@@ -498,7 +498,7 @@
               <w:rPr>
                 <w:noProof/>
               </w:rPr>
-              <w:instrText xml:space="preserve"> PAGEREF _Toc242953756 \h </w:instrText>
+              <w:instrText xml:space="preserve"> PAGEREF _Toc242957387 \h </w:instrText>
             </w:r>
             <w:r>
               <w:rPr>
@@ -540,7 +540,7 @@
               <w14:ligatures w14:val="standardContextual"/>
             </w:rPr>
           </w:pPr>
-          <w:hyperlink w:anchor="_Toc242953757" w:history="1">
+          <w:hyperlink w:anchor="_Toc242957388" w:history="1">
             <w:r>
               <w:rPr>
                 <w:rStyle w:val="Hyperlink"/>
@@ -564,7 +564,7 @@
               <w:rPr>
                 <w:noProof/>
               </w:rPr>
-              <w:instrText xml:space="preserve"> PAGEREF _Toc242953757 \h </w:instrText>
+              <w:instrText xml:space="preserve"> PAGEREF _Toc242957388 \h </w:instrText>
             </w:r>
             <w:r>
               <w:rPr>
@@ -606,7 +606,7 @@
               <w14:ligatures w14:val="standardContextual"/>
             </w:rPr>
           </w:pPr>
-          <w:hyperlink w:anchor="_Toc242953758" w:history="1">
+          <w:hyperlink w:anchor="_Toc242957389" w:history="1">
             <w:r>
               <w:rPr>
                 <w:rStyle w:val="Hyperlink"/>
@@ -630,7 +630,7 @@
               <w:rPr>
                 <w:noProof/>
               </w:rPr>
-              <w:instrText xml:space="preserve"> PAGEREF _Toc242953758 \h </w:instrText>
+              <w:instrText xml:space="preserve"> PAGEREF _Toc242957389 \h </w:instrText>
             </w:r>
             <w:r>
               <w:rPr>
@@ -672,7 +672,7 @@
               <w14:ligatures w14:val="standardContextual"/>
             </w:rPr>
           </w:pPr>
-          <w:hyperlink w:anchor="_Toc242953759" w:history="1">
+          <w:hyperlink w:anchor="_Toc242957390" w:history="1">
             <w:r>
               <w:rPr>
                 <w:rStyle w:val="Hyperlink"/>
@@ -696,7 +696,7 @@
               <w:rPr>
                 <w:noProof/>
               </w:rPr>
-              <w:instrText xml:space="preserve"> PAGEREF _Toc242953759 \h </w:instrText>
+              <w:instrText xml:space="preserve"> PAGEREF _Toc242957390 \h </w:instrText>
             </w:r>
             <w:r>
               <w:rPr>
@@ -738,7 +738,7 @@
               <w14:ligatures w14:val="standardContextual"/>
             </w:rPr>
           </w:pPr>
-          <w:hyperlink w:anchor="_Toc242953760" w:history="1">
+          <w:hyperlink w:anchor="_Toc242957391" w:history="1">
             <w:r>
               <w:rPr>
                 <w:rStyle w:val="Hyperlink"/>
@@ -762,7 +762,7 @@
               <w:rPr>
                 <w:noProof/>
               </w:rPr>
-              <w:instrText xml:space="preserve"> PAGEREF _Toc242953760 \h </w:instrText>
+              <w:instrText xml:space="preserve"> PAGEREF _Toc242957391 \h </w:instrText>
             </w:r>
             <w:r>
               <w:rPr>
@@ -804,7 +804,7 @@
               <w14:ligatures w14:val="standardContextual"/>
             </w:rPr>
           </w:pPr>
-          <w:hyperlink w:anchor="_Toc242953761" w:history="1">
+          <w:hyperlink w:anchor="_Toc242957392" w:history="1">
             <w:r>
               <w:rPr>
                 <w:rStyle w:val="Hyperlink"/>
@@ -828,7 +828,7 @@
               <w:rPr>
                 <w:noProof/>
               </w:rPr>
-              <w:instrText xml:space="preserve"> PAGEREF _Toc242953761 \h </w:instrText>
+              <w:instrText xml:space="preserve"> PAGEREF _Toc242957392 \h </w:instrText>
             </w:r>
             <w:r>
               <w:rPr>
@@ -870,7 +870,7 @@
               <w14:ligatures w14:val="standardContextual"/>
             </w:rPr>
           </w:pPr>
-          <w:hyperlink w:anchor="_Toc242953762" w:history="1">
+          <w:hyperlink w:anchor="_Toc242957393" w:history="1">
             <w:r>
               <w:rPr>
                 <w:rStyle w:val="Hyperlink"/>
@@ -894,7 +894,7 @@
               <w:rPr>
                 <w:noProof/>
               </w:rPr>
-              <w:instrText xml:space="preserve"> PAGEREF _Toc242953762 \h </w:instrText>
+              <w:instrText xml:space="preserve"> PAGEREF _Toc242957393 \h </w:instrText>
             </w:r>
             <w:r>
               <w:rPr>
@@ -936,7 +936,7 @@
               <w14:ligatures w14:val="standardContextual"/>
             </w:rPr>
           </w:pPr>
-          <w:hyperlink w:anchor="_Toc242953763" w:history="1">
+          <w:hyperlink w:anchor="_Toc242957394" w:history="1">
             <w:r>
               <w:rPr>
                 <w:rStyle w:val="Hyperlink"/>
@@ -960,7 +960,7 @@
               <w:rPr>
                 <w:noProof/>
               </w:rPr>
-              <w:instrText xml:space="preserve"> PAGEREF _Toc242953763 \h </w:instrText>
+              <w:instrText xml:space="preserve"> PAGEREF _Toc242957394 \h </w:instrText>
             </w:r>
             <w:r>
               <w:rPr>
@@ -1002,7 +1002,7 @@
               <w14:ligatures w14:val="standardContextual"/>
             </w:rPr>
           </w:pPr>
-          <w:hyperlink w:anchor="_Toc242953764" w:history="1">
+          <w:hyperlink w:anchor="_Toc242957395" w:history="1">
             <w:r>
               <w:rPr>
                 <w:rStyle w:val="Hyperlink"/>
@@ -1026,7 +1026,7 @@
               <w:rPr>
                 <w:noProof/>
               </w:rPr>
-              <w:instrText xml:space="preserve"> PAGEREF _Toc242953764 \h </w:instrText>
+              <w:instrText xml:space="preserve"> PAGEREF _Toc242957395 \h </w:instrText>
             </w:r>
             <w:r>
               <w:rPr>
@@ -1068,7 +1068,7 @@
               <w14:ligatures w14:val="standardContextual"/>
             </w:rPr>
           </w:pPr>
-          <w:hyperlink w:anchor="_Toc242953765" w:history="1">
+          <w:hyperlink w:anchor="_Toc242957396" w:history="1">
             <w:r>
               <w:rPr>
                 <w:rStyle w:val="Hyperlink"/>
@@ -1092,7 +1092,7 @@
               <w:rPr>
                 <w:noProof/>
               </w:rPr>
-              <w:instrText xml:space="preserve"> PAGEREF _Toc242953765 \h </w:instrText>
+              <w:instrText xml:space="preserve"> PAGEREF _Toc242957396 \h </w:instrText>
             </w:r>
             <w:r>
               <w:rPr>
@@ -1134,7 +1134,7 @@
               <w14:ligatures w14:val="standardContextual"/>
             </w:rPr>
           </w:pPr>
-          <w:hyperlink w:anchor="_Toc242953766" w:history="1">
+          <w:hyperlink w:anchor="_Toc242957397" w:history="1">
             <w:r>
               <w:rPr>
                 <w:rStyle w:val="Hyperlink"/>
@@ -1158,7 +1158,7 @@
               <w:rPr>
                 <w:noProof/>
               </w:rPr>
-              <w:instrText xml:space="preserve"> PAGEREF _Toc242953766 \h </w:instrText>
+              <w:instrText xml:space="preserve"> PAGEREF _Toc242957397 \h </w:instrText>
             </w:r>
             <w:r>
               <w:rPr>
@@ -1200,7 +1200,7 @@
               <w14:ligatures w14:val="standardContextual"/>
             </w:rPr>
           </w:pPr>
-          <w:hyperlink w:anchor="_Toc242953767" w:history="1">
+          <w:hyperlink w:anchor="_Toc242957398" w:history="1">
             <w:r>
               <w:rPr>
                 <w:rStyle w:val="Hyperlink"/>
@@ -1224,7 +1224,7 @@
               <w:rPr>
                 <w:noProof/>
               </w:rPr>
-              <w:instrText xml:space="preserve"> PAGEREF _Toc242953767 \h </w:instrText>
+              <w:instrText xml:space="preserve"> PAGEREF _Toc242957398 \h </w:instrText>
             </w:r>
             <w:r>
               <w:rPr>
@@ -1266,7 +1266,7 @@
               <w14:ligatures w14:val="standardContextual"/>
             </w:rPr>
           </w:pPr>
-          <w:hyperlink w:anchor="_Toc242953768" w:history="1">
+          <w:hyperlink w:anchor="_Toc242957399" w:history="1">
             <w:r>
               <w:rPr>
                 <w:rStyle w:val="Hyperlink"/>
@@ -1290,7 +1290,7 @@
               <w:rPr>
                 <w:noProof/>
               </w:rPr>
-              <w:instrText xml:space="preserve"> PAGEREF _Toc242953768 \h </w:instrText>
+              <w:instrText xml:space="preserve"> PAGEREF _Toc242957399 \h </w:instrText>
             </w:r>
             <w:r>
               <w:rPr>
@@ -1332,7 +1332,7 @@
               <w14:ligatures w14:val="standardContextual"/>
             </w:rPr>
           </w:pPr>
-          <w:hyperlink w:anchor="_Toc242953769" w:history="1">
+          <w:hyperlink w:anchor="_Toc242957400" w:history="1">
             <w:r>
               <w:rPr>
                 <w:rStyle w:val="Hyperlink"/>
@@ -1356,7 +1356,139 @@
               <w:rPr>
                 <w:noProof/>
               </w:rPr>
-              <w:instrText xml:space="preserve"> PAGEREF _Toc242953769 \h </w:instrText>
+              <w:instrText xml:space="preserve"> PAGEREF _Toc242957400 \h </w:instrText>
+            </w:r>
+            <w:r>
+              <w:rPr>
+                <w:noProof/>
+              </w:rPr>
+            </w:r>
+            <w:r>
+              <w:rPr>
+                <w:noProof/>
+              </w:rPr>
+              <w:fldChar w:fldCharType="separate"/>
+            </w:r>
+            <w:r>
+              <w:rPr>
+                <w:noProof/>
+              </w:rPr>
+              <w:t>13</w:t>
+            </w:r>
+            <w:r>
+              <w:rPr>
+                <w:noProof/>
+              </w:rPr>
+              <w:fldChar w:fldCharType="end"/>
+            </w:r>
+          </w:hyperlink>
+        </w:p>
+        <w:p>
+          <w:pPr>
+            <w:pStyle w:val="TOC2"/>
+            <w:tabs>
+              <w:tab w:val="right" w:leader="dot" w:pos="9628"/>
+            </w:tabs>
+            <w:rPr>
+              <w:rFonts w:asciiTheme="minorHAnsi" w:eastAsiaTheme="minorEastAsia" w:hAnsiTheme="minorHAnsi" w:cstheme="minorBidi"/>
+              <w:noProof/>
+              <w:kern w:val="2"/>
+              <w:sz w:val="24"/>
+              <w:szCs w:val="30"/>
+              <w14:ligatures w14:val="standardContextual"/>
+            </w:rPr>
+          </w:pPr>
+          <w:hyperlink w:anchor="_Toc242957401" w:history="1">
+            <w:r>
+              <w:rPr>
+                <w:rStyle w:val="Hyperlink"/>
+                <w:noProof/>
+              </w:rPr>
+              <w:t>8.1 งบประมาณมาจากไหน (แยกตามประเภท)</w:t>
+            </w:r>
+            <w:r>
+              <w:rPr>
+                <w:noProof/>
+              </w:rPr>
+              <w:tab/>
+            </w:r>
+            <w:r>
+              <w:rPr>
+                <w:noProof/>
+              </w:rPr>
+              <w:fldChar w:fldCharType="begin"/>
+            </w:r>
+            <w:r>
+              <w:rPr>
+                <w:noProof/>
+              </w:rPr>
+              <w:instrText xml:space="preserve"> PAGEREF _Toc242957401 \h </w:instrText>
+            </w:r>
+            <w:r>
+              <w:rPr>
+                <w:noProof/>
+              </w:rPr>
+            </w:r>
+            <w:r>
+              <w:rPr>
+                <w:noProof/>
+              </w:rPr>
+              <w:fldChar w:fldCharType="separate"/>
+            </w:r>
+            <w:r>
+              <w:rPr>
+                <w:noProof/>
+              </w:rPr>
+              <w:t>13</w:t>
+            </w:r>
+            <w:r>
+              <w:rPr>
+                <w:noProof/>
+              </w:rPr>
+              <w:fldChar w:fldCharType="end"/>
+            </w:r>
+          </w:hyperlink>
+        </w:p>
+        <w:p>
+          <w:pPr>
+            <w:pStyle w:val="TOC2"/>
+            <w:tabs>
+              <w:tab w:val="right" w:leader="dot" w:pos="9628"/>
+            </w:tabs>
+            <w:rPr>
+              <w:rFonts w:asciiTheme="minorHAnsi" w:eastAsiaTheme="minorEastAsia" w:hAnsiTheme="minorHAnsi" w:cstheme="minorBidi"/>
+              <w:noProof/>
+              <w:kern w:val="2"/>
+              <w:sz w:val="24"/>
+              <w:szCs w:val="30"/>
+              <w14:ligatures w14:val="standardContextual"/>
+            </w:rPr>
+          </w:pPr>
+          <w:hyperlink w:anchor="_Toc242957402" w:history="1">
+            <w:r>
+              <w:rPr>
+                <w:rStyle w:val="Hyperlink"/>
+                <w:noProof/>
+              </w:rPr>
+              <w:t>8.2 ขั้นตอนของ D0 / B0 / 15</w:t>
+            </w:r>
+            <w:r>
+              <w:rPr>
+                <w:noProof/>
+              </w:rPr>
+              <w:tab/>
+            </w:r>
+            <w:r>
+              <w:rPr>
+                <w:noProof/>
+              </w:rPr>
+              <w:fldChar w:fldCharType="begin"/>
+            </w:r>
+            <w:r>
+              <w:rPr>
+                <w:noProof/>
+              </w:rPr>
+              <w:instrText xml:space="preserve"> PAGEREF _Toc242957402 \h </w:instrText>
             </w:r>
             <w:r>
               <w:rPr>
@@ -1398,7 +1530,7 @@
               <w14:ligatures w14:val="standardContextual"/>
             </w:rPr>
           </w:pPr>
-          <w:hyperlink w:anchor="_Toc242953770" w:history="1">
+          <w:hyperlink w:anchor="_Toc242957403" w:history="1">
             <w:r>
               <w:rPr>
                 <w:rStyle w:val="Hyperlink"/>
@@ -1422,7 +1554,7 @@
               <w:rPr>
                 <w:noProof/>
               </w:rPr>
-              <w:instrText xml:space="preserve"> PAGEREF _Toc242953770 \h </w:instrText>
+              <w:instrText xml:space="preserve"> PAGEREF _Toc242957403 \h </w:instrText>
             </w:r>
             <w:r>
               <w:rPr>
@@ -1439,7 +1571,7 @@
               <w:rPr>
                 <w:noProof/>
               </w:rPr>
-              <w:t>14</w:t>
+              <w:t>15</w:t>
             </w:r>
             <w:r>
               <w:rPr>
@@ -1464,7 +1596,7 @@
               <w14:ligatures w14:val="standardContextual"/>
             </w:rPr>
           </w:pPr>
-          <w:hyperlink w:anchor="_Toc242953771" w:history="1">
+          <w:hyperlink w:anchor="_Toc242957404" w:history="1">
             <w:r>
               <w:rPr>
                 <w:rStyle w:val="Hyperlink"/>
@@ -1488,7 +1620,7 @@
               <w:rPr>
                 <w:noProof/>
               </w:rPr>
-              <w:instrText xml:space="preserve"> PAGEREF _Toc242953771 \h </w:instrText>
+              <w:instrText xml:space="preserve"> PAGEREF _Toc242957404 \h </w:instrText>
             </w:r>
             <w:r>
               <w:rPr>
@@ -1505,7 +1637,7 @@
               <w:rPr>
                 <w:noProof/>
               </w:rPr>
-              <w:t>14</w:t>
+              <w:t>15</w:t>
             </w:r>
             <w:r>
               <w:rPr>
@@ -1530,7 +1662,7 @@
               <w14:ligatures w14:val="standardContextual"/>
             </w:rPr>
           </w:pPr>
-          <w:hyperlink w:anchor="_Toc242953772" w:history="1">
+          <w:hyperlink w:anchor="_Toc242957405" w:history="1">
             <w:r>
               <w:rPr>
                 <w:rStyle w:val="Hyperlink"/>
@@ -1554,7 +1686,7 @@
               <w:rPr>
                 <w:noProof/>
               </w:rPr>
-              <w:instrText xml:space="preserve"> PAGEREF _Toc242953772 \h </w:instrText>
+              <w:instrText xml:space="preserve"> PAGEREF _Toc242957405 \h </w:instrText>
             </w:r>
             <w:r>
               <w:rPr>
@@ -1571,7 +1703,7 @@
               <w:rPr>
                 <w:noProof/>
               </w:rPr>
-              <w:t>14</w:t>
+              <w:t>15</w:t>
             </w:r>
             <w:r>
               <w:rPr>
@@ -1596,7 +1728,7 @@
               <w14:ligatures w14:val="standardContextual"/>
             </w:rPr>
           </w:pPr>
-          <w:hyperlink w:anchor="_Toc242953773" w:history="1">
+          <w:hyperlink w:anchor="_Toc242957406" w:history="1">
             <w:r>
               <w:rPr>
                 <w:rStyle w:val="Hyperlink"/>
@@ -1620,7 +1752,7 @@
               <w:rPr>
                 <w:noProof/>
               </w:rPr>
-              <w:instrText xml:space="preserve"> PAGEREF _Toc242953773 \h </w:instrText>
+              <w:instrText xml:space="preserve"> PAGEREF _Toc242957406 \h </w:instrText>
             </w:r>
             <w:r>
               <w:rPr>
@@ -1637,7 +1769,7 @@
               <w:rPr>
                 <w:noProof/>
               </w:rPr>
-              <w:t>14</w:t>
+              <w:t>15</w:t>
             </w:r>
             <w:r>
               <w:rPr>
@@ -1662,7 +1794,7 @@
               <w14:ligatures w14:val="standardContextual"/>
             </w:rPr>
           </w:pPr>
-          <w:hyperlink w:anchor="_Toc242953774" w:history="1">
+          <w:hyperlink w:anchor="_Toc242957407" w:history="1">
             <w:r>
               <w:rPr>
                 <w:rStyle w:val="Hyperlink"/>
@@ -1686,7 +1818,7 @@
               <w:rPr>
                 <w:noProof/>
               </w:rPr>
-              <w:instrText xml:space="preserve"> PAGEREF _Toc242953774 \h </w:instrText>
+              <w:instrText xml:space="preserve"> PAGEREF _Toc242957407 \h </w:instrText>
             </w:r>
             <w:r>
               <w:rPr>
@@ -1703,7 +1835,7 @@
               <w:rPr>
                 <w:noProof/>
               </w:rPr>
-              <w:t>15</w:t>
+              <w:t>16</w:t>
             </w:r>
             <w:r>
               <w:rPr>
@@ -1728,7 +1860,7 @@
               <w14:ligatures w14:val="standardContextual"/>
             </w:rPr>
           </w:pPr>
-          <w:hyperlink w:anchor="_Toc242953775" w:history="1">
+          <w:hyperlink w:anchor="_Toc242957408" w:history="1">
             <w:r>
               <w:rPr>
                 <w:rStyle w:val="Hyperlink"/>
@@ -1752,7 +1884,7 @@
               <w:rPr>
                 <w:noProof/>
               </w:rPr>
-              <w:instrText xml:space="preserve"> PAGEREF _Toc242953775 \h </w:instrText>
+              <w:instrText xml:space="preserve"> PAGEREF _Toc242957408 \h </w:instrText>
             </w:r>
             <w:r>
               <w:rPr>
@@ -1769,7 +1901,7 @@
               <w:rPr>
                 <w:noProof/>
               </w:rPr>
-              <w:t>15</w:t>
+              <w:t>16</w:t>
             </w:r>
             <w:r>
               <w:rPr>
@@ -1794,7 +1926,7 @@
               <w14:ligatures w14:val="standardContextual"/>
             </w:rPr>
           </w:pPr>
-          <w:hyperlink w:anchor="_Toc242953776" w:history="1">
+          <w:hyperlink w:anchor="_Toc242957409" w:history="1">
             <w:r>
               <w:rPr>
                 <w:rStyle w:val="Hyperlink"/>
@@ -1818,7 +1950,7 @@
               <w:rPr>
                 <w:noProof/>
               </w:rPr>
-              <w:instrText xml:space="preserve"> PAGEREF _Toc242953776 \h </w:instrText>
+              <w:instrText xml:space="preserve"> PAGEREF _Toc242957409 \h </w:instrText>
             </w:r>
             <w:r>
               <w:rPr>
@@ -1835,7 +1967,7 @@
               <w:rPr>
                 <w:noProof/>
               </w:rPr>
-              <w:t>15</w:t>
+              <w:t>16</w:t>
             </w:r>
             <w:r>
               <w:rPr>
@@ -1860,7 +1992,7 @@
               <w14:ligatures w14:val="standardContextual"/>
             </w:rPr>
           </w:pPr>
-          <w:hyperlink w:anchor="_Toc242953777" w:history="1">
+          <w:hyperlink w:anchor="_Toc242957410" w:history="1">
             <w:r>
               <w:rPr>
                 <w:rStyle w:val="Hyperlink"/>
@@ -1884,7 +2016,7 @@
               <w:rPr>
                 <w:noProof/>
               </w:rPr>
-              <w:instrText xml:space="preserve"> PAGEREF _Toc242953777 \h </w:instrText>
+              <w:instrText xml:space="preserve"> PAGEREF _Toc242957410 \h </w:instrText>
             </w:r>
             <w:r>
               <w:rPr>
@@ -1901,7 +2033,7 @@
               <w:rPr>
                 <w:noProof/>
               </w:rPr>
-              <w:t>16</w:t>
+              <w:t>17</w:t>
             </w:r>
             <w:r>
               <w:rPr>
@@ -1926,7 +2058,7 @@
               <w14:ligatures w14:val="standardContextual"/>
             </w:rPr>
           </w:pPr>
-          <w:hyperlink w:anchor="_Toc242953778" w:history="1">
+          <w:hyperlink w:anchor="_Toc242957411" w:history="1">
             <w:r>
               <w:rPr>
                 <w:rStyle w:val="Hyperlink"/>
@@ -1950,7 +2082,7 @@
               <w:rPr>
                 <w:noProof/>
               </w:rPr>
-              <w:instrText xml:space="preserve"> PAGEREF _Toc242953778 \h </w:instrText>
+              <w:instrText xml:space="preserve"> PAGEREF _Toc242957411 \h </w:instrText>
             </w:r>
             <w:r>
               <w:rPr>
@@ -1967,7 +2099,7 @@
               <w:rPr>
                 <w:noProof/>
               </w:rPr>
-              <w:t>16</w:t>
+              <w:t>17</w:t>
             </w:r>
             <w:r>
               <w:rPr>
@@ -1992,7 +2124,7 @@
               <w14:ligatures w14:val="standardContextual"/>
             </w:rPr>
           </w:pPr>
-          <w:hyperlink w:anchor="_Toc242953779" w:history="1">
+          <w:hyperlink w:anchor="_Toc242957412" w:history="1">
             <w:r>
               <w:rPr>
                 <w:rStyle w:val="Hyperlink"/>
@@ -2016,7 +2148,7 @@
               <w:rPr>
                 <w:noProof/>
               </w:rPr>
-              <w:instrText xml:space="preserve"> PAGEREF _Toc242953779 \h </w:instrText>
+              <w:instrText xml:space="preserve"> PAGEREF _Toc242957412 \h </w:instrText>
             </w:r>
             <w:r>
               <w:rPr>
@@ -2033,7 +2165,7 @@
               <w:rPr>
                 <w:noProof/>
               </w:rPr>
-              <w:t>16</w:t>
+              <w:t>17</w:t>
             </w:r>
             <w:r>
               <w:rPr>
@@ -2058,7 +2190,7 @@
               <w14:ligatures w14:val="standardContextual"/>
             </w:rPr>
           </w:pPr>
-          <w:hyperlink w:anchor="_Toc242953780" w:history="1">
+          <w:hyperlink w:anchor="_Toc242957413" w:history="1">
             <w:r>
               <w:rPr>
                 <w:rStyle w:val="Hyperlink"/>
@@ -2082,7 +2214,7 @@
               <w:rPr>
                 <w:noProof/>
               </w:rPr>
-              <w:instrText xml:space="preserve"> PAGEREF _Toc242953780 \h </w:instrText>
+              <w:instrText xml:space="preserve"> PAGEREF _Toc242957413 \h </w:instrText>
             </w:r>
             <w:r>
               <w:rPr>
@@ -2099,7 +2231,7 @@
               <w:rPr>
                 <w:noProof/>
               </w:rPr>
-              <w:t>17</w:t>
+              <w:t>18</w:t>
             </w:r>
             <w:r>
               <w:rPr>
@@ -2124,7 +2256,7 @@
               <w14:ligatures w14:val="standardContextual"/>
             </w:rPr>
           </w:pPr>
-          <w:hyperlink w:anchor="_Toc242953781" w:history="1">
+          <w:hyperlink w:anchor="_Toc242957414" w:history="1">
             <w:r>
               <w:rPr>
                 <w:rStyle w:val="Hyperlink"/>
@@ -2148,7 +2280,7 @@
               <w:rPr>
                 <w:noProof/>
               </w:rPr>
-              <w:instrText xml:space="preserve"> PAGEREF _Toc242953781 \h </w:instrText>
+              <w:instrText xml:space="preserve"> PAGEREF _Toc242957414 \h </w:instrText>
             </w:r>
             <w:r>
               <w:rPr>
@@ -2165,7 +2297,7 @@
               <w:rPr>
                 <w:noProof/>
               </w:rPr>
-              <w:t>18</w:t>
+              <w:t>19</w:t>
             </w:r>
             <w:r>
               <w:rPr>
@@ -2190,7 +2322,7 @@
               <w14:ligatures w14:val="standardContextual"/>
             </w:rPr>
           </w:pPr>
-          <w:hyperlink w:anchor="_Toc242953782" w:history="1">
+          <w:hyperlink w:anchor="_Toc242957415" w:history="1">
             <w:r>
               <w:rPr>
                 <w:rStyle w:val="Hyperlink"/>
@@ -2214,7 +2346,7 @@
               <w:rPr>
                 <w:noProof/>
               </w:rPr>
-              <w:instrText xml:space="preserve"> PAGEREF _Toc242953782 \h </w:instrText>
+              <w:instrText xml:space="preserve"> PAGEREF _Toc242957415 \h </w:instrText>
             </w:r>
             <w:r>
               <w:rPr>
@@ -2231,7 +2363,7 @@
               <w:rPr>
                 <w:noProof/>
               </w:rPr>
-              <w:t>18</w:t>
+              <w:t>19</w:t>
             </w:r>
             <w:r>
               <w:rPr>
@@ -2256,7 +2388,7 @@
               <w14:ligatures w14:val="standardContextual"/>
             </w:rPr>
           </w:pPr>
-          <w:hyperlink w:anchor="_Toc242953783" w:history="1">
+          <w:hyperlink w:anchor="_Toc242957416" w:history="1">
             <w:r>
               <w:rPr>
                 <w:rStyle w:val="Hyperlink"/>
@@ -2280,7 +2412,7 @@
               <w:rPr>
                 <w:noProof/>
               </w:rPr>
-              <w:instrText xml:space="preserve"> PAGEREF _Toc242953783 \h </w:instrText>
+              <w:instrText xml:space="preserve"> PAGEREF _Toc242957416 \h </w:instrText>
             </w:r>
             <w:r>
               <w:rPr>
@@ -2297,7 +2429,7 @@
               <w:rPr>
                 <w:noProof/>
               </w:rPr>
-              <w:t>18</w:t>
+              <w:t>19</w:t>
             </w:r>
             <w:r>
               <w:rPr>
@@ -2322,7 +2454,7 @@
               <w14:ligatures w14:val="standardContextual"/>
             </w:rPr>
           </w:pPr>
-          <w:hyperlink w:anchor="_Toc242953784" w:history="1">
+          <w:hyperlink w:anchor="_Toc242957417" w:history="1">
             <w:r>
               <w:rPr>
                 <w:rStyle w:val="Hyperlink"/>
@@ -2346,7 +2478,7 @@
               <w:rPr>
                 <w:noProof/>
               </w:rPr>
-              <w:instrText xml:space="preserve"> PAGEREF _Toc242953784 \h </w:instrText>
+              <w:instrText xml:space="preserve"> PAGEREF _Toc242957417 \h </w:instrText>
             </w:r>
             <w:r>
               <w:rPr>
@@ -2363,7 +2495,7 @@
               <w:rPr>
                 <w:noProof/>
               </w:rPr>
-              <w:t>19</w:t>
+              <w:t>20</w:t>
             </w:r>
             <w:r>
               <w:rPr>
@@ -2388,7 +2520,7 @@
               <w14:ligatures w14:val="standardContextual"/>
             </w:rPr>
           </w:pPr>
-          <w:hyperlink w:anchor="_Toc242953785" w:history="1">
+          <w:hyperlink w:anchor="_Toc242957418" w:history="1">
             <w:r>
               <w:rPr>
                 <w:rStyle w:val="Hyperlink"/>
@@ -2412,7 +2544,7 @@
               <w:rPr>
                 <w:noProof/>
               </w:rPr>
-              <w:instrText xml:space="preserve"> PAGEREF _Toc242953785 \h </w:instrText>
+              <w:instrText xml:space="preserve"> PAGEREF _Toc242957418 \h </w:instrText>
             </w:r>
             <w:r>
               <w:rPr>
@@ -2429,7 +2561,7 @@
               <w:rPr>
                 <w:noProof/>
               </w:rPr>
-              <w:t>20</w:t>
+              <w:t>21</w:t>
             </w:r>
             <w:r>
               <w:rPr>
@@ -2454,7 +2586,7 @@
               <w14:ligatures w14:val="standardContextual"/>
             </w:rPr>
           </w:pPr>
-          <w:hyperlink w:anchor="_Toc242953786" w:history="1">
+          <w:hyperlink w:anchor="_Toc242957419" w:history="1">
             <w:r>
               <w:rPr>
                 <w:rStyle w:val="Hyperlink"/>
@@ -2478,7 +2610,7 @@
               <w:rPr>
                 <w:noProof/>
               </w:rPr>
-              <w:instrText xml:space="preserve"> PAGEREF _Toc242953786 \h </w:instrText>
+              <w:instrText xml:space="preserve"> PAGEREF _Toc242957419 \h </w:instrText>
             </w:r>
             <w:r>
               <w:rPr>
@@ -2495,7 +2627,7 @@
               <w:rPr>
                 <w:noProof/>
               </w:rPr>
-              <w:t>20</w:t>
+              <w:t>21</w:t>
             </w:r>
             <w:r>
               <w:rPr>
@@ -2520,7 +2652,7 @@
               <w14:ligatures w14:val="standardContextual"/>
             </w:rPr>
           </w:pPr>
-          <w:hyperlink w:anchor="_Toc242953787" w:history="1">
+          <w:hyperlink w:anchor="_Toc242957420" w:history="1">
             <w:r>
               <w:rPr>
                 <w:rStyle w:val="Hyperlink"/>
@@ -2544,7 +2676,7 @@
               <w:rPr>
                 <w:noProof/>
               </w:rPr>
-              <w:instrText xml:space="preserve"> PAGEREF _Toc242953787 \h </w:instrText>
+              <w:instrText xml:space="preserve"> PAGEREF _Toc242957420 \h </w:instrText>
             </w:r>
             <w:r>
               <w:rPr>
@@ -2561,7 +2693,7 @@
               <w:rPr>
                 <w:noProof/>
               </w:rPr>
-              <w:t>20</w:t>
+              <w:t>21</w:t>
             </w:r>
             <w:r>
               <w:rPr>
@@ -2586,7 +2718,7 @@
               <w14:ligatures w14:val="standardContextual"/>
             </w:rPr>
           </w:pPr>
-          <w:hyperlink w:anchor="_Toc242953788" w:history="1">
+          <w:hyperlink w:anchor="_Toc242957421" w:history="1">
             <w:r>
               <w:rPr>
                 <w:rStyle w:val="Hyperlink"/>
@@ -2610,7 +2742,7 @@
               <w:rPr>
                 <w:noProof/>
               </w:rPr>
-              <w:instrText xml:space="preserve"> PAGEREF _Toc242953788 \h </w:instrText>
+              <w:instrText xml:space="preserve"> PAGEREF _Toc242957421 \h </w:instrText>
             </w:r>
             <w:r>
               <w:rPr>
@@ -2627,7 +2759,7 @@
               <w:rPr>
                 <w:noProof/>
               </w:rPr>
-              <w:t>20</w:t>
+              <w:t>21</w:t>
             </w:r>
             <w:r>
               <w:rPr>
@@ -2652,7 +2784,7 @@
               <w14:ligatures w14:val="standardContextual"/>
             </w:rPr>
           </w:pPr>
-          <w:hyperlink w:anchor="_Toc242953789" w:history="1">
+          <w:hyperlink w:anchor="_Toc242957422" w:history="1">
             <w:r>
               <w:rPr>
                 <w:rStyle w:val="Hyperlink"/>
@@ -2676,7 +2808,7 @@
               <w:rPr>
                 <w:noProof/>
               </w:rPr>
-              <w:instrText xml:space="preserve"> PAGEREF _Toc242953789 \h </w:instrText>
+              <w:instrText xml:space="preserve"> PAGEREF _Toc242957422 \h </w:instrText>
             </w:r>
             <w:r>
               <w:rPr>
@@ -2693,7 +2825,7 @@
               <w:rPr>
                 <w:noProof/>
               </w:rPr>
-              <w:t>21</w:t>
+              <w:t>22</w:t>
             </w:r>
             <w:r>
               <w:rPr>
@@ -2718,7 +2850,7 @@
               <w14:ligatures w14:val="standardContextual"/>
             </w:rPr>
           </w:pPr>
-          <w:hyperlink w:anchor="_Toc242953790" w:history="1">
+          <w:hyperlink w:anchor="_Toc242957423" w:history="1">
             <w:r>
               <w:rPr>
                 <w:rStyle w:val="Hyperlink"/>
@@ -2742,7 +2874,7 @@
               <w:rPr>
                 <w:noProof/>
               </w:rPr>
-              <w:instrText xml:space="preserve"> PAGEREF _Toc242953790 \h </w:instrText>
+              <w:instrText xml:space="preserve"> PAGEREF _Toc242957423 \h </w:instrText>
             </w:r>
             <w:r>
               <w:rPr>
@@ -2759,7 +2891,7 @@
               <w:rPr>
                 <w:noProof/>
               </w:rPr>
-              <w:t>21</w:t>
+              <w:t>22</w:t>
             </w:r>
             <w:r>
               <w:rPr>
@@ -2784,7 +2916,7 @@
               <w14:ligatures w14:val="standardContextual"/>
             </w:rPr>
           </w:pPr>
-          <w:hyperlink w:anchor="_Toc242953791" w:history="1">
+          <w:hyperlink w:anchor="_Toc242957424" w:history="1">
             <w:r>
               <w:rPr>
                 <w:rStyle w:val="Hyperlink"/>
@@ -2808,7 +2940,7 @@
               <w:rPr>
                 <w:noProof/>
               </w:rPr>
-              <w:instrText xml:space="preserve"> PAGEREF _Toc242953791 \h </w:instrText>
+              <w:instrText xml:space="preserve"> PAGEREF _Toc242957424 \h </w:instrText>
             </w:r>
             <w:r>
               <w:rPr>
@@ -2825,7 +2957,7 @@
               <w:rPr>
                 <w:noProof/>
               </w:rPr>
-              <w:t>21</w:t>
+              <w:t>22</w:t>
             </w:r>
             <w:r>
               <w:rPr>
@@ -2837,7 +2969,6 @@
         </w:p>
         <w:p>
           <w:r>
-            <w:lastRenderedPageBreak/>
             <w:fldChar w:fldCharType="end"/>
           </w:r>
         </w:p>
@@ -2849,7 +2980,7 @@
         <w:pageBreakBefore/>
         <w:spacing w:before="360" w:after="160"/>
       </w:pPr>
-      <w:bookmarkStart w:id="0" w:name="_Toc242953751"/>
+      <w:bookmarkStart w:id="0" w:name="_Toc242957382"/>
       <w:r>
         <w:lastRenderedPageBreak/>
         <w:t xml:space="preserve">1. </w:t>
@@ -2876,7 +3007,7 @@
         <w:keepNext/>
         <w:spacing w:before="280" w:after="120"/>
       </w:pPr>
-      <w:bookmarkStart w:id="1" w:name="_Toc242953752"/>
+      <w:bookmarkStart w:id="1" w:name="_Toc242957383"/>
       <w:r>
         <w:t xml:space="preserve">1.1 </w:t>
       </w:r>
@@ -3405,7 +3536,7 @@
         <w:keepNext/>
         <w:spacing w:before="280" w:after="120"/>
       </w:pPr>
-      <w:bookmarkStart w:id="2" w:name="_Toc242953753"/>
+      <w:bookmarkStart w:id="2" w:name="_Toc242957384"/>
       <w:r>
         <w:t xml:space="preserve">1.2 </w:t>
       </w:r>
@@ -3489,7 +3620,7 @@
         <w:pageBreakBefore/>
         <w:spacing w:before="360" w:after="160"/>
       </w:pPr>
-      <w:bookmarkStart w:id="3" w:name="_Toc242953754"/>
+      <w:bookmarkStart w:id="3" w:name="_Toc242957385"/>
       <w:r>
         <w:lastRenderedPageBreak/>
         <w:t xml:space="preserve">2. </w:t>
@@ -5529,7 +5660,7 @@
         <w:pageBreakBefore/>
         <w:spacing w:before="360" w:after="160"/>
       </w:pPr>
-      <w:bookmarkStart w:id="4" w:name="_Toc242953755"/>
+      <w:bookmarkStart w:id="4" w:name="_Toc242957386"/>
       <w:r>
         <w:lastRenderedPageBreak/>
         <w:t xml:space="preserve">3. </w:t>
@@ -6363,7 +6494,7 @@
         <w:keepNext/>
         <w:spacing w:before="280" w:after="120"/>
       </w:pPr>
-      <w:bookmarkStart w:id="5" w:name="_Toc242953756"/>
+      <w:bookmarkStart w:id="5" w:name="_Toc242957387"/>
       <w:r>
         <w:t xml:space="preserve">3.1 Flow </w:t>
       </w:r>
@@ -6509,7 +6640,7 @@
         <w:t xml:space="preserve"> </w:t>
       </w:r>
       <w:r>
-        <w:t xml:space="preserve">รายการที่เกี่ยวข้อง (คะแนน ≥ 50) ของ D0/B0/15 → ดาวน์โหลดเอกสาร → regex → (ถ้าจับไม่ได้) Gemini Flash Lite → บันทึก </w:t>
+        <w:t xml:space="preserve">รายการที่เกี่ยวข้อง (คะแนน ≥ 50) ของ D0/B0/15/P0 → ดาวน์โหลดเอกสาร → regex / ตารางในหน้าแผน → (ถ้าจับไม่ได้) Gemini → บันทึก </w:t>
       </w:r>
       <w:r>
         <w:rPr>
@@ -6581,7 +6712,7 @@
         <w:pageBreakBefore/>
         <w:spacing w:before="360" w:after="160"/>
       </w:pPr>
-      <w:bookmarkStart w:id="6" w:name="_Toc242953757"/>
+      <w:bookmarkStart w:id="6" w:name="_Toc242957388"/>
       <w:r>
         <w:lastRenderedPageBreak/>
         <w:t xml:space="preserve">4. </w:t>
@@ -6635,7 +6766,7 @@
         <w:keepNext/>
         <w:spacing w:before="280" w:after="120"/>
       </w:pPr>
-      <w:bookmarkStart w:id="7" w:name="_Toc242953758"/>
+      <w:bookmarkStart w:id="7" w:name="_Toc242957389"/>
       <w:r>
         <w:t xml:space="preserve">4.1 RSS </w:t>
       </w:r>
@@ -7830,7 +7961,7 @@
         <w:keepNext/>
         <w:spacing w:before="280" w:after="120"/>
       </w:pPr>
-      <w:bookmarkStart w:id="8" w:name="_Toc242953759"/>
+      <w:bookmarkStart w:id="8" w:name="_Toc242957390"/>
       <w:r>
         <w:t xml:space="preserve">4.2 </w:t>
       </w:r>
@@ -7966,7 +8097,7 @@
         <w:keepNext/>
         <w:spacing w:before="280" w:after="120"/>
       </w:pPr>
-      <w:bookmarkStart w:id="9" w:name="_Toc242953760"/>
+      <w:bookmarkStart w:id="9" w:name="_Toc242957391"/>
       <w:r>
         <w:lastRenderedPageBreak/>
         <w:t xml:space="preserve">4.3 </w:t>
@@ -8602,7 +8733,7 @@
         <w:pageBreakBefore/>
         <w:spacing w:before="360" w:after="160"/>
       </w:pPr>
-      <w:bookmarkStart w:id="10" w:name="_Toc242953761"/>
+      <w:bookmarkStart w:id="10" w:name="_Toc242957392"/>
       <w:r>
         <w:lastRenderedPageBreak/>
         <w:t xml:space="preserve">5. </w:t>
@@ -8886,7 +9017,7 @@
         <w:pageBreakBefore/>
         <w:spacing w:before="360" w:after="160"/>
       </w:pPr>
-      <w:bookmarkStart w:id="11" w:name="_Toc242953762"/>
+      <w:bookmarkStart w:id="11" w:name="_Toc242957393"/>
       <w:r>
         <w:lastRenderedPageBreak/>
         <w:t xml:space="preserve">6. </w:t>
@@ -8970,7 +9101,7 @@
         <w:keepNext/>
         <w:spacing w:before="280" w:after="120"/>
       </w:pPr>
-      <w:bookmarkStart w:id="12" w:name="_Toc242953763"/>
+      <w:bookmarkStart w:id="12" w:name="_Toc242957394"/>
       <w:r>
         <w:t xml:space="preserve">6.1 </w:t>
       </w:r>
@@ -9095,7 +9226,7 @@
         <w:keepNext/>
         <w:spacing w:before="280" w:after="120"/>
       </w:pPr>
-      <w:bookmarkStart w:id="13" w:name="_Toc242953764"/>
+      <w:bookmarkStart w:id="13" w:name="_Toc242957395"/>
       <w:r>
         <w:t xml:space="preserve">6.2 </w:t>
       </w:r>
@@ -9928,7 +10059,7 @@
         <w:keepNext/>
         <w:spacing w:before="280" w:after="120"/>
       </w:pPr>
-      <w:bookmarkStart w:id="14" w:name="_Toc242953765"/>
+      <w:bookmarkStart w:id="14" w:name="_Toc242957396"/>
       <w:r>
         <w:t xml:space="preserve">6.3 Prompt </w:t>
       </w:r>
@@ -10590,7 +10721,7 @@
         <w:pageBreakBefore/>
         <w:spacing w:before="360" w:after="160"/>
       </w:pPr>
-      <w:bookmarkStart w:id="15" w:name="_Toc242953766"/>
+      <w:bookmarkStart w:id="15" w:name="_Toc242957397"/>
       <w:r>
         <w:lastRenderedPageBreak/>
         <w:t xml:space="preserve">7. </w:t>
@@ -10718,9 +10849,9 @@
         <w:tblLook w:val="04A0" w:firstRow="1" w:lastRow="0" w:firstColumn="1" w:lastColumn="0" w:noHBand="0" w:noVBand="1"/>
       </w:tblPr>
       <w:tblGrid>
-        <w:gridCol w:w="1851"/>
-        <w:gridCol w:w="2023"/>
-        <w:gridCol w:w="3456"/>
+        <w:gridCol w:w="2433"/>
+        <w:gridCol w:w="1887"/>
+        <w:gridCol w:w="3010"/>
         <w:gridCol w:w="2308"/>
       </w:tblGrid>
       <w:tr>
@@ -11113,6 +11244,137 @@
                 <w:szCs w:val="18"/>
               </w:rPr>
               <w:t>0–10 request</w:t>
+            </w:r>
+          </w:p>
+        </w:tc>
+      </w:tr>
+      <w:tr>
+        <w:tblPrEx>
+          <w:tblCellMar>
+            <w:top w:w="0" w:type="dxa"/>
+            <w:bottom w:w="0" w:type="dxa"/>
+          </w:tblCellMar>
+        </w:tblPrEx>
+        <w:tc>
+          <w:tcPr>
+            <w:tcW w:w="1881" w:type="dxa"/>
+            <w:tcBorders>
+              <w:top w:val="single" w:sz="4" w:space="0" w:color="C9D3CE"/>
+              <w:left w:val="single" w:sz="4" w:space="0" w:color="C9D3CE"/>
+              <w:bottom w:val="single" w:sz="4" w:space="0" w:color="C9D3CE"/>
+              <w:right w:val="single" w:sz="4" w:space="0" w:color="C9D3CE"/>
+            </w:tcBorders>
+            <w:tcMar>
+              <w:top w:w="60" w:type="dxa"/>
+              <w:left w:w="100" w:type="dxa"/>
+              <w:bottom w:w="60" w:type="dxa"/>
+              <w:right w:w="100" w:type="dxa"/>
+            </w:tcMar>
+          </w:tcPr>
+          <w:p>
+            <w:pPr>
+              <w:spacing w:after="20" w:line="260" w:lineRule="auto"/>
+            </w:pPr>
+            <w:r>
+              <w:rPr>
+                <w:sz w:val="18"/>
+                <w:szCs w:val="18"/>
+              </w:rPr>
+              <w:t>อ่านราคากลางที่เป็นภาพสแกน (แนบ PDF)</w:t>
+            </w:r>
+          </w:p>
+        </w:tc>
+        <w:tc>
+          <w:tcPr>
+            <w:tcW w:w="2116" w:type="dxa"/>
+            <w:tcBorders>
+              <w:top w:val="single" w:sz="4" w:space="0" w:color="C9D3CE"/>
+              <w:left w:val="single" w:sz="4" w:space="0" w:color="C9D3CE"/>
+              <w:bottom w:val="single" w:sz="4" w:space="0" w:color="C9D3CE"/>
+              <w:right w:val="single" w:sz="4" w:space="0" w:color="C9D3CE"/>
+            </w:tcBorders>
+            <w:tcMar>
+              <w:top w:w="60" w:type="dxa"/>
+              <w:left w:w="100" w:type="dxa"/>
+              <w:bottom w:w="60" w:type="dxa"/>
+              <w:right w:w="100" w:type="dxa"/>
+            </w:tcMar>
+          </w:tcPr>
+          <w:p>
+            <w:pPr>
+              <w:spacing w:after="20" w:line="260" w:lineRule="auto"/>
+            </w:pPr>
+            <w:r>
+              <w:rPr>
+                <w:sz w:val="18"/>
+                <w:szCs w:val="18"/>
+              </w:rPr>
+              <w:t>enrich.py</w:t>
+            </w:r>
+          </w:p>
+        </w:tc>
+        <w:tc>
+          <w:tcPr>
+            <w:tcW w:w="3761" w:type="dxa"/>
+            <w:tcBorders>
+              <w:top w:val="single" w:sz="4" w:space="0" w:color="C9D3CE"/>
+              <w:left w:val="single" w:sz="4" w:space="0" w:color="C9D3CE"/>
+              <w:bottom w:val="single" w:sz="4" w:space="0" w:color="C9D3CE"/>
+              <w:right w:val="single" w:sz="4" w:space="0" w:color="C9D3CE"/>
+            </w:tcBorders>
+            <w:tcMar>
+              <w:top w:w="60" w:type="dxa"/>
+              <w:left w:w="100" w:type="dxa"/>
+              <w:bottom w:w="60" w:type="dxa"/>
+              <w:right w:w="100" w:type="dxa"/>
+            </w:tcMar>
+          </w:tcPr>
+          <w:p>
+            <w:pPr>
+              <w:spacing w:after="20" w:line="260" w:lineRule="auto"/>
+            </w:pPr>
+            <w:r>
+              <w:rPr>
+                <w:sz w:val="18"/>
+                <w:szCs w:val="18"/>
+              </w:rPr>
+              <w:t>gemini-3.8-flash → gemini-3.6-flash → gemini-2.5-flash (</w:t>
+            </w:r>
+            <w:r>
+              <w:rPr>
+                <w:sz w:val="18"/>
+                <w:szCs w:val="18"/>
+              </w:rPr>
+              <w:t>ไม่ใช้ Lite)</w:t>
+            </w:r>
+          </w:p>
+        </w:tc>
+        <w:tc>
+          <w:tcPr>
+            <w:tcW w:w="1880" w:type="dxa"/>
+            <w:tcBorders>
+              <w:top w:val="single" w:sz="4" w:space="0" w:color="C9D3CE"/>
+              <w:left w:val="single" w:sz="4" w:space="0" w:color="C9D3CE"/>
+              <w:bottom w:val="single" w:sz="4" w:space="0" w:color="C9D3CE"/>
+              <w:right w:val="single" w:sz="4" w:space="0" w:color="C9D3CE"/>
+            </w:tcBorders>
+            <w:tcMar>
+              <w:top w:w="60" w:type="dxa"/>
+              <w:left w:w="100" w:type="dxa"/>
+              <w:bottom w:w="60" w:type="dxa"/>
+              <w:right w:w="100" w:type="dxa"/>
+            </w:tcMar>
+          </w:tcPr>
+          <w:p>
+            <w:pPr>
+              <w:spacing w:after="20" w:line="260" w:lineRule="auto"/>
+            </w:pPr>
+            <w:r>
+              <w:rPr>
+                <w:sz w:val="18"/>
+                <w:szCs w:val="18"/>
+              </w:rPr>
+              <w:t>10–25 request</w:t>
             </w:r>
           </w:p>
         </w:tc>
@@ -11129,7 +11391,7 @@
         <w:keepNext/>
         <w:spacing w:before="280" w:after="120"/>
       </w:pPr>
-      <w:bookmarkStart w:id="16" w:name="_Toc242953767"/>
+      <w:bookmarkStart w:id="16" w:name="_Toc242957398"/>
       <w:r>
         <w:t xml:space="preserve">7.1 </w:t>
       </w:r>
@@ -11587,7 +11849,7 @@
         <w:keepNext/>
         <w:spacing w:before="280" w:after="120"/>
       </w:pPr>
-      <w:bookmarkStart w:id="17" w:name="_Toc242953768"/>
+      <w:bookmarkStart w:id="17" w:name="_Toc242957399"/>
       <w:r>
         <w:t xml:space="preserve">7.2 </w:t>
       </w:r>
@@ -11711,7 +11973,7 @@
         <w:pageBreakBefore/>
         <w:spacing w:before="360" w:after="160"/>
       </w:pPr>
-      <w:bookmarkStart w:id="18" w:name="_Toc242953769"/>
+      <w:bookmarkStart w:id="18" w:name="_Toc242957400"/>
       <w:r>
         <w:lastRenderedPageBreak/>
         <w:t xml:space="preserve">8. </w:t>
@@ -11767,6 +12029,787 @@
         </w:rPr>
         <w:t>announcement_details</w:t>
       </w:r>
+    </w:p>
+    <w:p>
+      <w:pPr>
+        <w:pStyle w:val="Heading2"/>
+        <w:keepNext/>
+        <w:spacing w:before="280" w:after="120"/>
+      </w:pPr>
+      <w:bookmarkStart w:id="19" w:name="_Toc242957401"/>
+      <w:r>
+        <w:t xml:space="preserve">8.1 </w:t>
+      </w:r>
+      <w:r>
+        <w:t>งบประมาณมาจากไหน (แยกตามประเภท)</w:t>
+      </w:r>
+      <w:bookmarkEnd w:id="19"/>
+    </w:p>
+    <w:tbl>
+      <w:tblPr>
+        <w:tblW w:w="9638" w:type="dxa"/>
+        <w:tblBorders>
+          <w:top w:val="single" w:sz="4" w:space="0" w:color="auto"/>
+          <w:left w:val="single" w:sz="4" w:space="0" w:color="auto"/>
+          <w:bottom w:val="single" w:sz="4" w:space="0" w:color="auto"/>
+          <w:right w:val="single" w:sz="4" w:space="0" w:color="auto"/>
+          <w:insideH w:val="single" w:sz="4" w:space="0" w:color="auto"/>
+          <w:insideV w:val="single" w:sz="4" w:space="0" w:color="auto"/>
+        </w:tblBorders>
+        <w:tblCellMar>
+          <w:left w:w="10" w:type="dxa"/>
+          <w:right w:w="10" w:type="dxa"/>
+        </w:tblCellMar>
+        <w:tblLook w:val="04A0" w:firstRow="1" w:lastRow="0" w:firstColumn="1" w:lastColumn="0" w:noHBand="0" w:noVBand="1"/>
+      </w:tblPr>
+      <w:tblGrid>
+        <w:gridCol w:w="1555"/>
+        <w:gridCol w:w="2873"/>
+        <w:gridCol w:w="2880"/>
+        <w:gridCol w:w="2330"/>
+      </w:tblGrid>
+      <w:tr>
+        <w:tblPrEx>
+          <w:tblCellMar>
+            <w:top w:w="0" w:type="dxa"/>
+            <w:bottom w:w="0" w:type="dxa"/>
+          </w:tblCellMar>
+        </w:tblPrEx>
+        <w:trPr>
+          <w:tblHeader/>
+        </w:trPr>
+        <w:tc>
+          <w:tcPr>
+            <w:tcW w:w="1566" w:type="dxa"/>
+            <w:tcBorders>
+              <w:top w:val="single" w:sz="4" w:space="0" w:color="C9D3CE"/>
+              <w:left w:val="single" w:sz="4" w:space="0" w:color="C9D3CE"/>
+              <w:bottom w:val="single" w:sz="4" w:space="0" w:color="C9D3CE"/>
+              <w:right w:val="single" w:sz="4" w:space="0" w:color="C9D3CE"/>
+            </w:tcBorders>
+            <w:shd w:val="clear" w:color="auto" w:fill="E4EFEA"/>
+            <w:tcMar>
+              <w:top w:w="60" w:type="dxa"/>
+              <w:left w:w="100" w:type="dxa"/>
+              <w:bottom w:w="60" w:type="dxa"/>
+              <w:right w:w="100" w:type="dxa"/>
+            </w:tcMar>
+          </w:tcPr>
+          <w:p>
+            <w:pPr>
+              <w:spacing w:after="20" w:line="260" w:lineRule="auto"/>
+            </w:pPr>
+            <w:r>
+              <w:rPr>
+                <w:b/>
+                <w:bCs/>
+                <w:sz w:val="18"/>
+                <w:szCs w:val="18"/>
+              </w:rPr>
+              <w:t>ประเภท</w:t>
+            </w:r>
+          </w:p>
+        </w:tc>
+        <w:tc>
+          <w:tcPr>
+            <w:tcW w:w="2891" w:type="dxa"/>
+            <w:tcBorders>
+              <w:top w:val="single" w:sz="4" w:space="0" w:color="C9D3CE"/>
+              <w:left w:val="single" w:sz="4" w:space="0" w:color="C9D3CE"/>
+              <w:bottom w:val="single" w:sz="4" w:space="0" w:color="C9D3CE"/>
+              <w:right w:val="single" w:sz="4" w:space="0" w:color="C9D3CE"/>
+            </w:tcBorders>
+            <w:shd w:val="clear" w:color="auto" w:fill="E4EFEA"/>
+            <w:tcMar>
+              <w:top w:w="60" w:type="dxa"/>
+              <w:left w:w="100" w:type="dxa"/>
+              <w:bottom w:w="60" w:type="dxa"/>
+              <w:right w:w="100" w:type="dxa"/>
+            </w:tcMar>
+          </w:tcPr>
+          <w:p>
+            <w:pPr>
+              <w:spacing w:after="20" w:line="260" w:lineRule="auto"/>
+            </w:pPr>
+            <w:r>
+              <w:rPr>
+                <w:b/>
+                <w:bCs/>
+                <w:sz w:val="18"/>
+                <w:szCs w:val="18"/>
+              </w:rPr>
+              <w:t>เอกสารที่ลิงก์ชี้ไป</w:t>
+            </w:r>
+          </w:p>
+        </w:tc>
+        <w:tc>
+          <w:tcPr>
+            <w:tcW w:w="2891" w:type="dxa"/>
+            <w:tcBorders>
+              <w:top w:val="single" w:sz="4" w:space="0" w:color="C9D3CE"/>
+              <w:left w:val="single" w:sz="4" w:space="0" w:color="C9D3CE"/>
+              <w:bottom w:val="single" w:sz="4" w:space="0" w:color="C9D3CE"/>
+              <w:right w:val="single" w:sz="4" w:space="0" w:color="C9D3CE"/>
+            </w:tcBorders>
+            <w:shd w:val="clear" w:color="auto" w:fill="E4EFEA"/>
+            <w:tcMar>
+              <w:top w:w="60" w:type="dxa"/>
+              <w:left w:w="100" w:type="dxa"/>
+              <w:bottom w:w="60" w:type="dxa"/>
+              <w:right w:w="100" w:type="dxa"/>
+            </w:tcMar>
+          </w:tcPr>
+          <w:p>
+            <w:pPr>
+              <w:spacing w:after="20" w:line="260" w:lineRule="auto"/>
+            </w:pPr>
+            <w:r>
+              <w:rPr>
+                <w:b/>
+                <w:bCs/>
+                <w:sz w:val="18"/>
+                <w:szCs w:val="18"/>
+              </w:rPr>
+              <w:t>วิธีอ่าน</w:t>
+            </w:r>
+          </w:p>
+        </w:tc>
+        <w:tc>
+          <w:tcPr>
+            <w:tcW w:w="2290" w:type="dxa"/>
+            <w:tcBorders>
+              <w:top w:val="single" w:sz="4" w:space="0" w:color="C9D3CE"/>
+              <w:left w:val="single" w:sz="4" w:space="0" w:color="C9D3CE"/>
+              <w:bottom w:val="single" w:sz="4" w:space="0" w:color="C9D3CE"/>
+              <w:right w:val="single" w:sz="4" w:space="0" w:color="C9D3CE"/>
+            </w:tcBorders>
+            <w:shd w:val="clear" w:color="auto" w:fill="E4EFEA"/>
+            <w:tcMar>
+              <w:top w:w="60" w:type="dxa"/>
+              <w:left w:w="100" w:type="dxa"/>
+              <w:bottom w:w="60" w:type="dxa"/>
+              <w:right w:w="100" w:type="dxa"/>
+            </w:tcMar>
+          </w:tcPr>
+          <w:p>
+            <w:pPr>
+              <w:spacing w:after="20" w:line="260" w:lineRule="auto"/>
+            </w:pPr>
+            <w:r>
+              <w:rPr>
+                <w:b/>
+                <w:bCs/>
+                <w:sz w:val="18"/>
+                <w:szCs w:val="18"/>
+              </w:rPr>
+              <w:t>ได้อะไร</w:t>
+            </w:r>
+          </w:p>
+        </w:tc>
+      </w:tr>
+      <w:tr>
+        <w:tblPrEx>
+          <w:tblCellMar>
+            <w:top w:w="0" w:type="dxa"/>
+            <w:bottom w:w="0" w:type="dxa"/>
+          </w:tblCellMar>
+        </w:tblPrEx>
+        <w:tc>
+          <w:tcPr>
+            <w:tcW w:w="1566" w:type="dxa"/>
+            <w:tcBorders>
+              <w:top w:val="single" w:sz="4" w:space="0" w:color="C9D3CE"/>
+              <w:left w:val="single" w:sz="4" w:space="0" w:color="C9D3CE"/>
+              <w:bottom w:val="single" w:sz="4" w:space="0" w:color="C9D3CE"/>
+              <w:right w:val="single" w:sz="4" w:space="0" w:color="C9D3CE"/>
+            </w:tcBorders>
+            <w:tcMar>
+              <w:top w:w="60" w:type="dxa"/>
+              <w:left w:w="100" w:type="dxa"/>
+              <w:bottom w:w="60" w:type="dxa"/>
+              <w:right w:w="100" w:type="dxa"/>
+            </w:tcMar>
+          </w:tcPr>
+          <w:p>
+            <w:pPr>
+              <w:spacing w:after="20" w:line="260" w:lineRule="auto"/>
+            </w:pPr>
+            <w:r>
+              <w:rPr>
+                <w:sz w:val="18"/>
+                <w:szCs w:val="18"/>
+              </w:rPr>
+              <w:t xml:space="preserve">D0 </w:t>
+            </w:r>
+            <w:r>
+              <w:rPr>
+                <w:sz w:val="18"/>
+                <w:szCs w:val="18"/>
+              </w:rPr>
+              <w:t>ประกาศเชิญชวน</w:t>
+            </w:r>
+          </w:p>
+        </w:tc>
+        <w:tc>
+          <w:tcPr>
+            <w:tcW w:w="2891" w:type="dxa"/>
+            <w:tcBorders>
+              <w:top w:val="single" w:sz="4" w:space="0" w:color="C9D3CE"/>
+              <w:left w:val="single" w:sz="4" w:space="0" w:color="C9D3CE"/>
+              <w:bottom w:val="single" w:sz="4" w:space="0" w:color="C9D3CE"/>
+              <w:right w:val="single" w:sz="4" w:space="0" w:color="C9D3CE"/>
+            </w:tcBorders>
+            <w:tcMar>
+              <w:top w:w="60" w:type="dxa"/>
+              <w:left w:w="100" w:type="dxa"/>
+              <w:bottom w:w="60" w:type="dxa"/>
+              <w:right w:w="100" w:type="dxa"/>
+            </w:tcMar>
+          </w:tcPr>
+          <w:p>
+            <w:pPr>
+              <w:spacing w:after="20" w:line="260" w:lineRule="auto"/>
+            </w:pPr>
+            <w:r>
+              <w:rPr>
+                <w:sz w:val="18"/>
+                <w:szCs w:val="18"/>
+              </w:rPr>
+              <w:t xml:space="preserve">PDF </w:t>
+            </w:r>
+            <w:r>
+              <w:rPr>
+                <w:sz w:val="18"/>
+                <w:szCs w:val="18"/>
+              </w:rPr>
+              <w:t>ประกาศ (มีข้อความ)</w:t>
+            </w:r>
+          </w:p>
+        </w:tc>
+        <w:tc>
+          <w:tcPr>
+            <w:tcW w:w="2891" w:type="dxa"/>
+            <w:tcBorders>
+              <w:top w:val="single" w:sz="4" w:space="0" w:color="C9D3CE"/>
+              <w:left w:val="single" w:sz="4" w:space="0" w:color="C9D3CE"/>
+              <w:bottom w:val="single" w:sz="4" w:space="0" w:color="C9D3CE"/>
+              <w:right w:val="single" w:sz="4" w:space="0" w:color="C9D3CE"/>
+            </w:tcBorders>
+            <w:tcMar>
+              <w:top w:w="60" w:type="dxa"/>
+              <w:left w:w="100" w:type="dxa"/>
+              <w:bottom w:w="60" w:type="dxa"/>
+              <w:right w:w="100" w:type="dxa"/>
+            </w:tcMar>
+          </w:tcPr>
+          <w:p>
+            <w:pPr>
+              <w:spacing w:after="20" w:line="260" w:lineRule="auto"/>
+            </w:pPr>
+            <w:r>
+              <w:rPr>
+                <w:sz w:val="18"/>
+                <w:szCs w:val="18"/>
+              </w:rPr>
+              <w:t>regex</w:t>
+            </w:r>
+          </w:p>
+        </w:tc>
+        <w:tc>
+          <w:tcPr>
+            <w:tcW w:w="2290" w:type="dxa"/>
+            <w:tcBorders>
+              <w:top w:val="single" w:sz="4" w:space="0" w:color="C9D3CE"/>
+              <w:left w:val="single" w:sz="4" w:space="0" w:color="C9D3CE"/>
+              <w:bottom w:val="single" w:sz="4" w:space="0" w:color="C9D3CE"/>
+              <w:right w:val="single" w:sz="4" w:space="0" w:color="C9D3CE"/>
+            </w:tcBorders>
+            <w:tcMar>
+              <w:top w:w="60" w:type="dxa"/>
+              <w:left w:w="100" w:type="dxa"/>
+              <w:bottom w:w="60" w:type="dxa"/>
+              <w:right w:w="100" w:type="dxa"/>
+            </w:tcMar>
+          </w:tcPr>
+          <w:p>
+            <w:pPr>
+              <w:spacing w:after="20" w:line="260" w:lineRule="auto"/>
+            </w:pPr>
+            <w:r>
+              <w:rPr>
+                <w:sz w:val="18"/>
+                <w:szCs w:val="18"/>
+              </w:rPr>
+              <w:t>ราคากลาง, วันยื่นซอง, ช่วงเวลา</w:t>
+            </w:r>
+          </w:p>
+        </w:tc>
+      </w:tr>
+      <w:tr>
+        <w:tblPrEx>
+          <w:tblCellMar>
+            <w:top w:w="0" w:type="dxa"/>
+            <w:bottom w:w="0" w:type="dxa"/>
+          </w:tblCellMar>
+        </w:tblPrEx>
+        <w:tc>
+          <w:tcPr>
+            <w:tcW w:w="1566" w:type="dxa"/>
+            <w:tcBorders>
+              <w:top w:val="single" w:sz="4" w:space="0" w:color="C9D3CE"/>
+              <w:left w:val="single" w:sz="4" w:space="0" w:color="C9D3CE"/>
+              <w:bottom w:val="single" w:sz="4" w:space="0" w:color="C9D3CE"/>
+              <w:right w:val="single" w:sz="4" w:space="0" w:color="C9D3CE"/>
+            </w:tcBorders>
+            <w:tcMar>
+              <w:top w:w="60" w:type="dxa"/>
+              <w:left w:w="100" w:type="dxa"/>
+              <w:bottom w:w="60" w:type="dxa"/>
+              <w:right w:w="100" w:type="dxa"/>
+            </w:tcMar>
+          </w:tcPr>
+          <w:p>
+            <w:pPr>
+              <w:spacing w:after="20" w:line="260" w:lineRule="auto"/>
+            </w:pPr>
+            <w:r>
+              <w:rPr>
+                <w:sz w:val="18"/>
+                <w:szCs w:val="18"/>
+              </w:rPr>
+              <w:t xml:space="preserve">B0 </w:t>
+            </w:r>
+            <w:r>
+              <w:rPr>
+                <w:sz w:val="18"/>
+                <w:szCs w:val="18"/>
+              </w:rPr>
+              <w:t>ร่าง TOR</w:t>
+            </w:r>
+          </w:p>
+        </w:tc>
+        <w:tc>
+          <w:tcPr>
+            <w:tcW w:w="2891" w:type="dxa"/>
+            <w:tcBorders>
+              <w:top w:val="single" w:sz="4" w:space="0" w:color="C9D3CE"/>
+              <w:left w:val="single" w:sz="4" w:space="0" w:color="C9D3CE"/>
+              <w:bottom w:val="single" w:sz="4" w:space="0" w:color="C9D3CE"/>
+              <w:right w:val="single" w:sz="4" w:space="0" w:color="C9D3CE"/>
+            </w:tcBorders>
+            <w:tcMar>
+              <w:top w:w="60" w:type="dxa"/>
+              <w:left w:w="100" w:type="dxa"/>
+              <w:bottom w:w="60" w:type="dxa"/>
+              <w:right w:w="100" w:type="dxa"/>
+            </w:tcMar>
+          </w:tcPr>
+          <w:p>
+            <w:pPr>
+              <w:spacing w:after="20" w:line="260" w:lineRule="auto"/>
+            </w:pPr>
+            <w:r>
+              <w:rPr>
+                <w:sz w:val="18"/>
+                <w:szCs w:val="18"/>
+              </w:rPr>
+              <w:t xml:space="preserve">ZIP: </w:t>
+            </w:r>
+            <w:r>
+              <w:rPr>
+                <w:sz w:val="18"/>
+                <w:szCs w:val="18"/>
+              </w:rPr>
+              <w:t>ร่างประกาศ + ร่างเอกสาร + TOR</w:t>
+            </w:r>
+          </w:p>
+        </w:tc>
+        <w:tc>
+          <w:tcPr>
+            <w:tcW w:w="2891" w:type="dxa"/>
+            <w:tcBorders>
+              <w:top w:val="single" w:sz="4" w:space="0" w:color="C9D3CE"/>
+              <w:left w:val="single" w:sz="4" w:space="0" w:color="C9D3CE"/>
+              <w:bottom w:val="single" w:sz="4" w:space="0" w:color="C9D3CE"/>
+              <w:right w:val="single" w:sz="4" w:space="0" w:color="C9D3CE"/>
+            </w:tcBorders>
+            <w:tcMar>
+              <w:top w:w="60" w:type="dxa"/>
+              <w:left w:w="100" w:type="dxa"/>
+              <w:bottom w:w="60" w:type="dxa"/>
+              <w:right w:w="100" w:type="dxa"/>
+            </w:tcMar>
+          </w:tcPr>
+          <w:p>
+            <w:pPr>
+              <w:spacing w:after="20" w:line="260" w:lineRule="auto"/>
+            </w:pPr>
+            <w:r>
+              <w:rPr>
+                <w:sz w:val="18"/>
+                <w:szCs w:val="18"/>
+              </w:rPr>
+              <w:t xml:space="preserve">regex </w:t>
+            </w:r>
+            <w:r>
+              <w:rPr>
+                <w:sz w:val="18"/>
+                <w:szCs w:val="18"/>
+              </w:rPr>
+              <w:t>จากร่างประกาศ</w:t>
+            </w:r>
+          </w:p>
+        </w:tc>
+        <w:tc>
+          <w:tcPr>
+            <w:tcW w:w="2290" w:type="dxa"/>
+            <w:tcBorders>
+              <w:top w:val="single" w:sz="4" w:space="0" w:color="C9D3CE"/>
+              <w:left w:val="single" w:sz="4" w:space="0" w:color="C9D3CE"/>
+              <w:bottom w:val="single" w:sz="4" w:space="0" w:color="C9D3CE"/>
+              <w:right w:val="single" w:sz="4" w:space="0" w:color="C9D3CE"/>
+            </w:tcBorders>
+            <w:tcMar>
+              <w:top w:w="60" w:type="dxa"/>
+              <w:left w:w="100" w:type="dxa"/>
+              <w:bottom w:w="60" w:type="dxa"/>
+              <w:right w:w="100" w:type="dxa"/>
+            </w:tcMar>
+          </w:tcPr>
+          <w:p>
+            <w:pPr>
+              <w:spacing w:after="20" w:line="260" w:lineRule="auto"/>
+            </w:pPr>
+            <w:r>
+              <w:rPr>
+                <w:sz w:val="18"/>
+                <w:szCs w:val="18"/>
+              </w:rPr>
+              <w:t>ราคากลาง (ยังไม่มีวันยื่นซอง)</w:t>
+            </w:r>
+          </w:p>
+        </w:tc>
+      </w:tr>
+      <w:tr>
+        <w:tblPrEx>
+          <w:tblCellMar>
+            <w:top w:w="0" w:type="dxa"/>
+            <w:bottom w:w="0" w:type="dxa"/>
+          </w:tblCellMar>
+        </w:tblPrEx>
+        <w:tc>
+          <w:tcPr>
+            <w:tcW w:w="1566" w:type="dxa"/>
+            <w:tcBorders>
+              <w:top w:val="single" w:sz="4" w:space="0" w:color="C9D3CE"/>
+              <w:left w:val="single" w:sz="4" w:space="0" w:color="C9D3CE"/>
+              <w:bottom w:val="single" w:sz="4" w:space="0" w:color="C9D3CE"/>
+              <w:right w:val="single" w:sz="4" w:space="0" w:color="C9D3CE"/>
+            </w:tcBorders>
+            <w:tcMar>
+              <w:top w:w="60" w:type="dxa"/>
+              <w:left w:w="100" w:type="dxa"/>
+              <w:bottom w:w="60" w:type="dxa"/>
+              <w:right w:w="100" w:type="dxa"/>
+            </w:tcMar>
+          </w:tcPr>
+          <w:p>
+            <w:pPr>
+              <w:spacing w:after="20" w:line="260" w:lineRule="auto"/>
+            </w:pPr>
+            <w:r>
+              <w:rPr>
+                <w:sz w:val="18"/>
+                <w:szCs w:val="18"/>
+              </w:rPr>
+              <w:t xml:space="preserve">15 </w:t>
+            </w:r>
+            <w:r>
+              <w:rPr>
+                <w:sz w:val="18"/>
+                <w:szCs w:val="18"/>
+              </w:rPr>
+              <w:t>ราคากลาง</w:t>
+            </w:r>
+          </w:p>
+        </w:tc>
+        <w:tc>
+          <w:tcPr>
+            <w:tcW w:w="2891" w:type="dxa"/>
+            <w:tcBorders>
+              <w:top w:val="single" w:sz="4" w:space="0" w:color="C9D3CE"/>
+              <w:left w:val="single" w:sz="4" w:space="0" w:color="C9D3CE"/>
+              <w:bottom w:val="single" w:sz="4" w:space="0" w:color="C9D3CE"/>
+              <w:right w:val="single" w:sz="4" w:space="0" w:color="C9D3CE"/>
+            </w:tcBorders>
+            <w:tcMar>
+              <w:top w:w="60" w:type="dxa"/>
+              <w:left w:w="100" w:type="dxa"/>
+              <w:bottom w:w="60" w:type="dxa"/>
+              <w:right w:w="100" w:type="dxa"/>
+            </w:tcMar>
+          </w:tcPr>
+          <w:p>
+            <w:pPr>
+              <w:spacing w:after="20" w:line="260" w:lineRule="auto"/>
+            </w:pPr>
+            <w:r>
+              <w:rPr>
+                <w:sz w:val="18"/>
+                <w:szCs w:val="18"/>
+              </w:rPr>
+              <w:t xml:space="preserve">ZIP </w:t>
+            </w:r>
+            <w:r>
+              <w:rPr>
+                <w:sz w:val="18"/>
+                <w:szCs w:val="18"/>
+              </w:rPr>
+              <w:t>มี pB0.pdf ส่วนใหญ่เป็นภาพสแกน / บางลิงก์เป็นหน้าเว็บที่ต้องล็อกอิน</w:t>
+            </w:r>
+          </w:p>
+        </w:tc>
+        <w:tc>
+          <w:tcPr>
+            <w:tcW w:w="2891" w:type="dxa"/>
+            <w:tcBorders>
+              <w:top w:val="single" w:sz="4" w:space="0" w:color="C9D3CE"/>
+              <w:left w:val="single" w:sz="4" w:space="0" w:color="C9D3CE"/>
+              <w:bottom w:val="single" w:sz="4" w:space="0" w:color="C9D3CE"/>
+              <w:right w:val="single" w:sz="4" w:space="0" w:color="C9D3CE"/>
+            </w:tcBorders>
+            <w:tcMar>
+              <w:top w:w="60" w:type="dxa"/>
+              <w:left w:w="100" w:type="dxa"/>
+              <w:bottom w:w="60" w:type="dxa"/>
+              <w:right w:w="100" w:type="dxa"/>
+            </w:tcMar>
+          </w:tcPr>
+          <w:p>
+            <w:pPr>
+              <w:spacing w:after="20" w:line="260" w:lineRule="auto"/>
+            </w:pPr>
+            <w:r>
+              <w:rPr>
+                <w:sz w:val="18"/>
+                <w:szCs w:val="18"/>
+              </w:rPr>
+              <w:t>ไฟล์สแกนส่งให้ Gemini Flash อ่านจากภาพ (ไม่ใช้ Flash Lite เพราะอ่านตัวเลขผิด)</w:t>
+            </w:r>
+          </w:p>
+        </w:tc>
+        <w:tc>
+          <w:tcPr>
+            <w:tcW w:w="2290" w:type="dxa"/>
+            <w:tcBorders>
+              <w:top w:val="single" w:sz="4" w:space="0" w:color="C9D3CE"/>
+              <w:left w:val="single" w:sz="4" w:space="0" w:color="C9D3CE"/>
+              <w:bottom w:val="single" w:sz="4" w:space="0" w:color="C9D3CE"/>
+              <w:right w:val="single" w:sz="4" w:space="0" w:color="C9D3CE"/>
+            </w:tcBorders>
+            <w:tcMar>
+              <w:top w:w="60" w:type="dxa"/>
+              <w:left w:w="100" w:type="dxa"/>
+              <w:bottom w:w="60" w:type="dxa"/>
+              <w:right w:w="100" w:type="dxa"/>
+            </w:tcMar>
+          </w:tcPr>
+          <w:p>
+            <w:pPr>
+              <w:spacing w:after="20" w:line="260" w:lineRule="auto"/>
+            </w:pPr>
+            <w:r>
+              <w:rPr>
+                <w:sz w:val="18"/>
+                <w:szCs w:val="18"/>
+              </w:rPr>
+              <w:t>ราคากลาง (ลิงก์ที่ต้องล็อกอินอ่านไม่ได้)</w:t>
+            </w:r>
+          </w:p>
+        </w:tc>
+      </w:tr>
+      <w:tr>
+        <w:tblPrEx>
+          <w:tblCellMar>
+            <w:top w:w="0" w:type="dxa"/>
+            <w:bottom w:w="0" w:type="dxa"/>
+          </w:tblCellMar>
+        </w:tblPrEx>
+        <w:tc>
+          <w:tcPr>
+            <w:tcW w:w="1566" w:type="dxa"/>
+            <w:tcBorders>
+              <w:top w:val="single" w:sz="4" w:space="0" w:color="C9D3CE"/>
+              <w:left w:val="single" w:sz="4" w:space="0" w:color="C9D3CE"/>
+              <w:bottom w:val="single" w:sz="4" w:space="0" w:color="C9D3CE"/>
+              <w:right w:val="single" w:sz="4" w:space="0" w:color="C9D3CE"/>
+            </w:tcBorders>
+            <w:tcMar>
+              <w:top w:w="60" w:type="dxa"/>
+              <w:left w:w="100" w:type="dxa"/>
+              <w:bottom w:w="60" w:type="dxa"/>
+              <w:right w:w="100" w:type="dxa"/>
+            </w:tcMar>
+          </w:tcPr>
+          <w:p>
+            <w:pPr>
+              <w:spacing w:after="20" w:line="260" w:lineRule="auto"/>
+            </w:pPr>
+            <w:r>
+              <w:rPr>
+                <w:sz w:val="18"/>
+                <w:szCs w:val="18"/>
+              </w:rPr>
+              <w:t xml:space="preserve">P0 </w:t>
+            </w:r>
+            <w:r>
+              <w:rPr>
+                <w:sz w:val="18"/>
+                <w:szCs w:val="18"/>
+              </w:rPr>
+              <w:t>แผนจัดซื้อ</w:t>
+            </w:r>
+          </w:p>
+        </w:tc>
+        <w:tc>
+          <w:tcPr>
+            <w:tcW w:w="2891" w:type="dxa"/>
+            <w:tcBorders>
+              <w:top w:val="single" w:sz="4" w:space="0" w:color="C9D3CE"/>
+              <w:left w:val="single" w:sz="4" w:space="0" w:color="C9D3CE"/>
+              <w:bottom w:val="single" w:sz="4" w:space="0" w:color="C9D3CE"/>
+              <w:right w:val="single" w:sz="4" w:space="0" w:color="C9D3CE"/>
+            </w:tcBorders>
+            <w:tcMar>
+              <w:top w:w="60" w:type="dxa"/>
+              <w:left w:w="100" w:type="dxa"/>
+              <w:bottom w:w="60" w:type="dxa"/>
+              <w:right w:w="100" w:type="dxa"/>
+            </w:tcMar>
+          </w:tcPr>
+          <w:p>
+            <w:pPr>
+              <w:spacing w:after="20" w:line="260" w:lineRule="auto"/>
+            </w:pPr>
+            <w:r>
+              <w:rPr>
+                <w:sz w:val="18"/>
+                <w:szCs w:val="18"/>
+              </w:rPr>
+              <w:t>หน้า HTML ของแผนทั้งฉบับ (TIS-620) ตาราง รหัสแผน | ชื่อ | งบประมาณ | เดือน/ปีที่คาดว่าจะประกาศ</w:t>
+            </w:r>
+          </w:p>
+        </w:tc>
+        <w:tc>
+          <w:tcPr>
+            <w:tcW w:w="2891" w:type="dxa"/>
+            <w:tcBorders>
+              <w:top w:val="single" w:sz="4" w:space="0" w:color="C9D3CE"/>
+              <w:left w:val="single" w:sz="4" w:space="0" w:color="C9D3CE"/>
+              <w:bottom w:val="single" w:sz="4" w:space="0" w:color="C9D3CE"/>
+              <w:right w:val="single" w:sz="4" w:space="0" w:color="C9D3CE"/>
+            </w:tcBorders>
+            <w:tcMar>
+              <w:top w:w="60" w:type="dxa"/>
+              <w:left w:w="100" w:type="dxa"/>
+              <w:bottom w:w="60" w:type="dxa"/>
+              <w:right w:w="100" w:type="dxa"/>
+            </w:tcMar>
+          </w:tcPr>
+          <w:p>
+            <w:pPr>
+              <w:spacing w:after="20" w:line="260" w:lineRule="auto"/>
+            </w:pPr>
+            <w:r>
+              <w:rPr>
+                <w:sz w:val="18"/>
+                <w:szCs w:val="18"/>
+              </w:rPr>
+              <w:t>อ่านตาราง (หน้าเดียวใช้กับทุกแผนในหน้านั้น)</w:t>
+            </w:r>
+          </w:p>
+        </w:tc>
+        <w:tc>
+          <w:tcPr>
+            <w:tcW w:w="2290" w:type="dxa"/>
+            <w:tcBorders>
+              <w:top w:val="single" w:sz="4" w:space="0" w:color="C9D3CE"/>
+              <w:left w:val="single" w:sz="4" w:space="0" w:color="C9D3CE"/>
+              <w:bottom w:val="single" w:sz="4" w:space="0" w:color="C9D3CE"/>
+              <w:right w:val="single" w:sz="4" w:space="0" w:color="C9D3CE"/>
+            </w:tcBorders>
+            <w:tcMar>
+              <w:top w:w="60" w:type="dxa"/>
+              <w:left w:w="100" w:type="dxa"/>
+              <w:bottom w:w="60" w:type="dxa"/>
+              <w:right w:w="100" w:type="dxa"/>
+            </w:tcMar>
+          </w:tcPr>
+          <w:p>
+            <w:pPr>
+              <w:spacing w:after="20" w:line="260" w:lineRule="auto"/>
+            </w:pPr>
+            <w:r>
+              <w:rPr>
+                <w:sz w:val="18"/>
+                <w:szCs w:val="18"/>
+              </w:rPr>
+              <w:t>งบประมาณโครงการ, เดือนที่คาดว่าจะประกาศ</w:t>
+            </w:r>
+          </w:p>
+        </w:tc>
+      </w:tr>
+    </w:tbl>
+    <w:p>
+      <w:pPr>
+        <w:spacing w:after="120" w:line="300" w:lineRule="auto"/>
+      </w:pPr>
+      <w:r>
+        <w:rPr>
+          <w:b/>
+          <w:bCs/>
+        </w:rPr>
+        <w:t>ลำดับความน่าเชื่อถือในอีเมล:</w:t>
+      </w:r>
+      <w:r>
+        <w:t xml:space="preserve"> </w:t>
+      </w:r>
+      <w:r>
+        <w:t>ถ้าโครงการเดียวกันมีงบที่โค้ดอ่านจาก D0/B0 จะใช้ค่านั้นก่อน รองลงมาคือค่าของประกาศนั้นเอง แล้วจึงค่าอื่นของโครงการ (เช่นที่ AI อ่านจากภาพ)</w:t>
+      </w:r>
+    </w:p>
+    <w:p>
+      <w:pPr>
+        <w:spacing w:after="120" w:line="300" w:lineRule="auto"/>
+      </w:pPr>
+      <w:r>
+        <w:rPr>
+          <w:b/>
+          <w:bCs/>
+        </w:rPr>
+        <w:t>ข้อผิดพลาดชั่วคราว</w:t>
+      </w:r>
+      <w:r>
+        <w:t xml:space="preserve"> (HTTP 5xx </w:t>
+      </w:r>
+      <w:r>
+        <w:t>เช่น 511, timeout, Gemini Flash ไม่ว่างสำหรับไฟล์สแกน) จะไม่ถูกบันทึก รอบถัดไปจะอ่านใหม่</w:t>
+      </w:r>
+    </w:p>
+    <w:p>
+      <w:pPr>
+        <w:pStyle w:val="Heading2"/>
+        <w:keepNext/>
+        <w:spacing w:before="280" w:after="120"/>
+      </w:pPr>
+      <w:bookmarkStart w:id="20" w:name="_Toc242957402"/>
+      <w:r>
+        <w:t xml:space="preserve">8.2 </w:t>
+      </w:r>
+      <w:r>
+        <w:t>ขั้นตอนของ D0 / B0 / 15</w:t>
+      </w:r>
+      <w:bookmarkEnd w:id="20"/>
     </w:p>
     <w:p>
       <w:pPr>
@@ -11967,7 +13010,7 @@
         <w:spacing w:after="60" w:line="290" w:lineRule="auto"/>
       </w:pPr>
       <w:r>
-        <w:t>ถ้าไม่ได้งบ หรือเป็น D0 แต่ไม่ได้วันยื่นซอง → ส่งข้อความ 8,000 ตัวอักษรแรกให้ Gemini (Flash Lite ก่อน) ตาม prompt ด้านล่าง</w:t>
+        <w:t>ถ้าไม่ได้งบ หรือเป็น D0 แต่ไม่ได้วันยื่นซอง → ส่งข้อความ 8,000 ตัวอักษรแรกให้ Gemini (Flash Lite ก่อน) ตาม prompt ด้านล่าง ถ้าเอกสารไม่มีข้อความ (สแกน) ส่งไฟล์ PDF ให้ Gemini Flash อ่านจากภาพ</w:t>
       </w:r>
     </w:p>
     <w:p>
@@ -12156,6 +13199,7 @@
           <w:sz w:val="18"/>
           <w:szCs w:val="18"/>
         </w:rPr>
+        <w:lastRenderedPageBreak/>
         <w:t xml:space="preserve"> </w:t>
       </w:r>
     </w:p>
@@ -12192,7 +13236,7 @@
         <w:spacing w:after="120" w:line="300" w:lineRule="auto"/>
       </w:pPr>
       <w:r>
-        <w:t>ผลทดสอบแรก: D0 ได้งบ 27/27 วันยื่นซอง 25/27, B0 ได้งบ 16/16, ราคากลาง (15) ได้ 8/27 เพราะลิงก์ส่วนใหญ่ต้องล็อกอิน e-GP</w:t>
+        <w:t>ผล ณ 15 ต.ค. 2569 (รายการที่เกี่ยวข้อง 30 วัน): D0 ได้งบ 37/37, B0 19/19, P0 121/148 (ส่วนที่เหลือรออ่านใหม่หลังแก้), ราคากลางสแกนอ่านด้วย Flash ตรงกับงบใน D0 ทุกรายการที่เทียบได้</w:t>
       </w:r>
     </w:p>
     <w:p>
@@ -12201,7 +13245,7 @@
         <w:pageBreakBefore/>
         <w:spacing w:before="360" w:after="160"/>
       </w:pPr>
-      <w:bookmarkStart w:id="19" w:name="_Toc242953770"/>
+      <w:bookmarkStart w:id="21" w:name="_Toc242957403"/>
       <w:r>
         <w:lastRenderedPageBreak/>
         <w:t xml:space="preserve">9. </w:t>
@@ -12209,7 +13253,7 @@
       <w:r>
         <w:t>ขั้นที่ 5: อีเมลสรุปและ Excel</w:t>
       </w:r>
-      <w:bookmarkEnd w:id="19"/>
+      <w:bookmarkEnd w:id="21"/>
     </w:p>
     <w:p>
       <w:pPr>
@@ -12276,14 +13320,14 @@
         <w:keepNext/>
         <w:spacing w:before="280" w:after="120"/>
       </w:pPr>
-      <w:bookmarkStart w:id="20" w:name="_Toc242953771"/>
+      <w:bookmarkStart w:id="22" w:name="_Toc242957404"/>
       <w:r>
         <w:t xml:space="preserve">9.1 </w:t>
       </w:r>
       <w:r>
         <w:t>เลือกรายการอย่างไร</w:t>
       </w:r>
-      <w:bookmarkEnd w:id="20"/>
+      <w:bookmarkEnd w:id="22"/>
     </w:p>
     <w:p>
       <w:pPr>
@@ -13392,14 +14436,14 @@
         <w:keepNext/>
         <w:spacing w:before="280" w:after="120"/>
       </w:pPr>
-      <w:bookmarkStart w:id="21" w:name="_Toc242953772"/>
+      <w:bookmarkStart w:id="23" w:name="_Toc242957405"/>
       <w:r>
         <w:t xml:space="preserve">9.2 </w:t>
       </w:r>
       <w:r>
         <w:t>ผู้รับและการส่ง</w:t>
       </w:r>
-      <w:bookmarkEnd w:id="21"/>
+      <w:bookmarkEnd w:id="23"/>
     </w:p>
     <w:p>
       <w:pPr>
@@ -13543,14 +14587,14 @@
         <w:keepNext/>
         <w:spacing w:before="280" w:after="120"/>
       </w:pPr>
-      <w:bookmarkStart w:id="22" w:name="_Toc242953773"/>
+      <w:bookmarkStart w:id="24" w:name="_Toc242957406"/>
       <w:r>
         <w:t xml:space="preserve">9.3 </w:t>
       </w:r>
       <w:r>
         <w:t>คอลัมน์ Excel</w:t>
       </w:r>
-      <w:bookmarkEnd w:id="22"/>
+      <w:bookmarkEnd w:id="24"/>
     </w:p>
     <w:p>
       <w:pPr>
@@ -13572,7 +14616,7 @@
         <w:t xml:space="preserve">, </w:t>
       </w:r>
       <w:r>
-        <w:t xml:space="preserve">วันยื่นซอง, เวลายื่น, เหลือ (วัน), วันที่ประกาศ, วิธีจัดหา, เลขโครงการ, เลขแผน, ยกเลิกแล้ว, มีการแก้ไขประกาศ, ลิงก์ · ฟังก์ชัน </w:t>
+        <w:t xml:space="preserve">วันยื่นซอง, เวลายื่น, เหลือ (วัน), คาดว่าจะประกาศ (แผน P0), วันที่ประกาศ, วิธีจัดหา, เลขโครงการ, เลขแผน, ยกเลิกแล้ว, มีการแก้ไขประกาศ, ลิงก์ · ฟังก์ชัน </w:t>
       </w:r>
       <w:r>
         <w:rPr>
@@ -13596,7 +14640,7 @@
         <w:pageBreakBefore/>
         <w:spacing w:before="360" w:after="160"/>
       </w:pPr>
-      <w:bookmarkStart w:id="23" w:name="_Toc242953774"/>
+      <w:bookmarkStart w:id="25" w:name="_Toc242957407"/>
       <w:r>
         <w:lastRenderedPageBreak/>
         <w:t xml:space="preserve">10. </w:t>
@@ -13604,7 +14648,7 @@
       <w:r>
         <w:t>ความครอบคลุมหน่วยงาน</w:t>
       </w:r>
-      <w:bookmarkEnd w:id="23"/>
+      <w:bookmarkEnd w:id="25"/>
     </w:p>
     <w:p>
       <w:pPr>
@@ -13612,14 +14656,14 @@
         <w:keepNext/>
         <w:spacing w:before="280" w:after="120"/>
       </w:pPr>
-      <w:bookmarkStart w:id="24" w:name="_Toc242953775"/>
+      <w:bookmarkStart w:id="26" w:name="_Toc242957408"/>
       <w:r>
         <w:t xml:space="preserve">10.1 </w:t>
       </w:r>
       <w:r>
         <w:t>ดึงซ้ำช่วงบ่าย (recheck.yml)</w:t>
       </w:r>
-      <w:bookmarkEnd w:id="24"/>
+      <w:bookmarkEnd w:id="26"/>
     </w:p>
     <w:p>
       <w:pPr>
@@ -13650,14 +14694,14 @@
         <w:keepNext/>
         <w:spacing w:before="280" w:after="120"/>
       </w:pPr>
-      <w:bookmarkStart w:id="25" w:name="_Toc242953776"/>
+      <w:bookmarkStart w:id="27" w:name="_Toc242957409"/>
       <w:r>
         <w:t xml:space="preserve">10.2 </w:t>
       </w:r>
       <w:r>
         <w:t>หาหน่วยงานใหม่ (sweep.yml)</w:t>
       </w:r>
-      <w:bookmarkEnd w:id="25"/>
+      <w:bookmarkEnd w:id="27"/>
     </w:p>
     <w:p>
       <w:pPr>
@@ -13712,7 +14756,7 @@
         <w:pageBreakBefore/>
         <w:spacing w:before="360" w:after="160"/>
       </w:pPr>
-      <w:bookmarkStart w:id="26" w:name="_Toc242953777"/>
+      <w:bookmarkStart w:id="28" w:name="_Toc242957410"/>
       <w:r>
         <w:lastRenderedPageBreak/>
         <w:t xml:space="preserve">11. </w:t>
@@ -13720,7 +14764,7 @@
       <w:r>
         <w:t>ฐานข้อมูล (Supabase)</w:t>
       </w:r>
-      <w:bookmarkEnd w:id="26"/>
+      <w:bookmarkEnd w:id="28"/>
     </w:p>
     <w:p>
       <w:pPr>
@@ -13778,14 +14822,14 @@
         <w:keepNext/>
         <w:spacing w:before="280" w:after="120"/>
       </w:pPr>
-      <w:bookmarkStart w:id="27" w:name="_Toc242953778"/>
+      <w:bookmarkStart w:id="29" w:name="_Toc242957411"/>
       <w:r>
         <w:t xml:space="preserve">11.1 </w:t>
       </w:r>
       <w:r>
         <w:t>ตาราง</w:t>
       </w:r>
-      <w:bookmarkEnd w:id="27"/>
+      <w:bookmarkEnd w:id="29"/>
     </w:p>
     <w:tbl>
       <w:tblPr>
@@ -14785,14 +15829,14 @@
         <w:keepNext/>
         <w:spacing w:before="280" w:after="120"/>
       </w:pPr>
-      <w:bookmarkStart w:id="28" w:name="_Toc242953779"/>
+      <w:bookmarkStart w:id="30" w:name="_Toc242957412"/>
       <w:r>
         <w:t xml:space="preserve">11.2 </w:t>
       </w:r>
       <w:r>
         <w:t>ฟังก์ชัน (RPC) ที่โค้ดเรียก</w:t>
       </w:r>
-      <w:bookmarkEnd w:id="28"/>
+      <w:bookmarkEnd w:id="30"/>
     </w:p>
     <w:tbl>
       <w:tblPr>
@@ -15982,7 +17026,7 @@
         <w:keepNext/>
         <w:spacing w:before="280" w:after="120"/>
       </w:pPr>
-      <w:bookmarkStart w:id="29" w:name="_Toc242953780"/>
+      <w:bookmarkStart w:id="31" w:name="_Toc242957413"/>
       <w:r>
         <w:lastRenderedPageBreak/>
         <w:t xml:space="preserve">11.3 </w:t>
@@ -15990,7 +17034,7 @@
       <w:r>
         <w:t>งานตั้งเวลา (cron.job)</w:t>
       </w:r>
-      <w:bookmarkEnd w:id="29"/>
+      <w:bookmarkEnd w:id="31"/>
     </w:p>
     <w:tbl>
       <w:tblPr>
@@ -16839,7 +17883,7 @@
         <w:pageBreakBefore/>
         <w:spacing w:before="360" w:after="160"/>
       </w:pPr>
-      <w:bookmarkStart w:id="30" w:name="_Toc242953781"/>
+      <w:bookmarkStart w:id="32" w:name="_Toc242957414"/>
       <w:r>
         <w:lastRenderedPageBreak/>
         <w:t xml:space="preserve">12. </w:t>
@@ -16847,7 +17891,7 @@
       <w:r>
         <w:t>แผนผังไฟล์ในโค้ด</w:t>
       </w:r>
-      <w:bookmarkEnd w:id="30"/>
+      <w:bookmarkEnd w:id="32"/>
     </w:p>
     <w:p>
       <w:pPr>
@@ -16855,11 +17899,11 @@
         <w:keepNext/>
         <w:spacing w:before="280" w:after="120"/>
       </w:pPr>
-      <w:bookmarkStart w:id="31" w:name="_Toc242953782"/>
+      <w:bookmarkStart w:id="33" w:name="_Toc242957415"/>
       <w:r>
         <w:t>12.1 GitHub Workflows (.github/workflows/)</w:t>
       </w:r>
-      <w:bookmarkEnd w:id="31"/>
+      <w:bookmarkEnd w:id="33"/>
     </w:p>
     <w:tbl>
       <w:tblPr>
@@ -17837,14 +18881,14 @@
         <w:keepNext/>
         <w:spacing w:before="280" w:after="120"/>
       </w:pPr>
-      <w:bookmarkStart w:id="32" w:name="_Toc242953783"/>
+      <w:bookmarkStart w:id="34" w:name="_Toc242957416"/>
       <w:r>
         <w:t xml:space="preserve">12.2 </w:t>
       </w:r>
       <w:r>
         <w:t>โค้ด Python</w:t>
       </w:r>
-      <w:bookmarkEnd w:id="32"/>
+      <w:bookmarkEnd w:id="34"/>
     </w:p>
     <w:tbl>
       <w:tblPr>
@@ -18554,7 +19598,7 @@
                 <w:sz w:val="18"/>
                 <w:szCs w:val="18"/>
               </w:rPr>
-              <w:t>USER_AGENT, fetch_text(), normalize(), parse_budget(), parse_bid_date(), parse_department(), plausible(), EXTRACT_PROMPT</w:t>
+              <w:t>USER_AGENT, fetch_text(), html_text(), parse_plan_lines(), normalize(), parse_budget(), parse_bid_date(), parse_department(), plausible(), EXTRACT_PROMPT</w:t>
             </w:r>
           </w:p>
         </w:tc>
@@ -18948,7 +19992,7 @@
                 <w:sz w:val="18"/>
                 <w:szCs w:val="18"/>
               </w:rPr>
-              <w:t>ai_extract(), main()</w:t>
+              <w:t>SCAN_MODELS, transient(), ai_extract(), Enricher.document() / plan_page(), main()</w:t>
             </w:r>
           </w:p>
         </w:tc>
@@ -19245,7 +20289,7 @@
         <w:pageBreakBefore/>
         <w:spacing w:before="360" w:after="160"/>
       </w:pPr>
-      <w:bookmarkStart w:id="33" w:name="_Toc242953784"/>
+      <w:bookmarkStart w:id="35" w:name="_Toc242957417"/>
       <w:r>
         <w:lastRenderedPageBreak/>
         <w:t xml:space="preserve">13. </w:t>
@@ -19253,7 +20297,7 @@
       <w:r>
         <w:t>รหัสผ่านและการตั้งค่า</w:t>
       </w:r>
-      <w:bookmarkEnd w:id="33"/>
+      <w:bookmarkEnd w:id="35"/>
     </w:p>
     <w:tbl>
       <w:tblPr>
@@ -20299,7 +21343,7 @@
         <w:pageBreakBefore/>
         <w:spacing w:before="360" w:after="160"/>
       </w:pPr>
-      <w:bookmarkStart w:id="34" w:name="_Toc242953785"/>
+      <w:bookmarkStart w:id="36" w:name="_Toc242957418"/>
       <w:r>
         <w:lastRenderedPageBreak/>
         <w:t xml:space="preserve">14. </w:t>
@@ -20307,7 +21351,7 @@
       <w:r>
         <w:t>การดูแลและแก้ปัญหา</w:t>
       </w:r>
-      <w:bookmarkEnd w:id="34"/>
+      <w:bookmarkEnd w:id="36"/>
     </w:p>
     <w:p>
       <w:pPr>
@@ -20315,14 +21359,14 @@
         <w:keepNext/>
         <w:spacing w:before="280" w:after="120"/>
       </w:pPr>
-      <w:bookmarkStart w:id="35" w:name="_Toc242953786"/>
+      <w:bookmarkStart w:id="37" w:name="_Toc242957419"/>
       <w:r>
         <w:t xml:space="preserve">14.1 </w:t>
       </w:r>
       <w:r>
         <w:t>งานที่ทำบ่อย</w:t>
       </w:r>
-      <w:bookmarkEnd w:id="35"/>
+      <w:bookmarkEnd w:id="37"/>
     </w:p>
     <w:tbl>
       <w:tblPr>
@@ -20992,14 +22036,14 @@
         <w:keepNext/>
         <w:spacing w:before="280" w:after="120"/>
       </w:pPr>
-      <w:bookmarkStart w:id="36" w:name="_Toc242953787"/>
+      <w:bookmarkStart w:id="38" w:name="_Toc242957420"/>
       <w:r>
         <w:t xml:space="preserve">14.2 </w:t>
       </w:r>
       <w:r>
         <w:t>อาการและสาเหตุ</w:t>
       </w:r>
-      <w:bookmarkEnd w:id="36"/>
+      <w:bookmarkEnd w:id="38"/>
     </w:p>
     <w:tbl>
       <w:tblPr>
@@ -21756,14 +22800,14 @@
         <w:keepNext/>
         <w:spacing w:before="280" w:after="120"/>
       </w:pPr>
-      <w:bookmarkStart w:id="37" w:name="_Toc242953788"/>
+      <w:bookmarkStart w:id="39" w:name="_Toc242957421"/>
       <w:r>
         <w:t xml:space="preserve">14.3 </w:t>
       </w:r>
       <w:r>
         <w:t>ข้อจำกัดที่ทราบ</w:t>
       </w:r>
-      <w:bookmarkEnd w:id="37"/>
+      <w:bookmarkEnd w:id="39"/>
     </w:p>
     <w:p>
       <w:pPr>
@@ -21839,12 +22883,12 @@
         <w:pageBreakBefore/>
         <w:spacing w:before="360" w:after="160"/>
       </w:pPr>
-      <w:bookmarkStart w:id="38" w:name="_Toc242953789"/>
+      <w:bookmarkStart w:id="40" w:name="_Toc242957422"/>
       <w:r>
         <w:lastRenderedPageBreak/>
         <w:t>ภาคผนวก</w:t>
       </w:r>
-      <w:bookmarkEnd w:id="38"/>
+      <w:bookmarkEnd w:id="40"/>
     </w:p>
     <w:p>
       <w:pPr>
@@ -21852,11 +22896,11 @@
         <w:keepNext/>
         <w:spacing w:before="280" w:after="120"/>
       </w:pPr>
-      <w:bookmarkStart w:id="39" w:name="_Toc242953790"/>
+      <w:bookmarkStart w:id="41" w:name="_Toc242957423"/>
       <w:r>
         <w:t>ก. รหัสวิธีจัดหา (methodId)</w:t>
       </w:r>
-      <w:bookmarkEnd w:id="39"/>
+      <w:bookmarkEnd w:id="41"/>
     </w:p>
     <w:tbl>
       <w:tblPr>
@@ -22758,11 +23802,11 @@
         <w:keepNext/>
         <w:spacing w:before="280" w:after="120"/>
       </w:pPr>
-      <w:bookmarkStart w:id="40" w:name="_Toc242953791"/>
+      <w:bookmarkStart w:id="42" w:name="_Toc242957424"/>
       <w:r>
         <w:t>ข. ผลสำคัญจาก Phase 0</w:t>
       </w:r>
-      <w:bookmarkEnd w:id="40"/>
+      <w:bookmarkEnd w:id="42"/>
     </w:p>
     <w:p>
       <w:pPr>
@@ -22935,10 +23979,10 @@
 <file path=word/numbering.xml><?xml version="1.0" encoding="utf-8"?>
 <w:numbering xmlns:wpc="http://schemas.microsoft.com/office/word/2010/wordprocessingCanvas" xmlns:cx="http://schemas.microsoft.com/office/drawing/2014/chartex" xmlns:cx1="http://schemas.microsoft.com/office/drawing/2015/9/8/chartex" xmlns:cx2="http://schemas.microsoft.com/office/drawing/2015/10/21/chartex" xmlns:cx3="http://schemas.microsoft.com/office/drawing/2016/5/9/chartex" xmlns:cx4="http://schemas.microsoft.com/office/drawing/2016/5/10/chartex" xmlns:cx5="http://schemas.microsoft.com/office/drawing/2016/5/11/chartex" xmlns:cx6="http://schemas.microsoft.com/office/drawing/2016/5/12/chartex" xmlns:cx7="http://schemas.microsoft.com/office/drawing/2016/5/13/chartex" xmlns:cx8="http://schemas.microsoft.com/office/drawing/2016/5/14/chartex" xmlns:mc="http://schemas.openxmlformats.org/markup-compatibility/2006" xmlns:aink="http://schemas.microsoft.com/office/drawing/2016/ink" xmlns:am3d="http://schemas.microsoft.com/office/drawing/2017/model3d" xmlns:o="urn:schemas-microsoft-com:office:office" xmlns:oel="http://schemas.microsoft.com/office/2019/extlst" xmlns:r="http://schemas.openxmlformats.org/officeDocument/2006/relationships" xmlns:m="http://schemas.openxmlformats.org/officeDocument/2006/math" xmlns:v="urn:schemas-microsoft-com:vml" xmlns:wp14="http://schemas.microsoft.com/office/word/2010/wordprocessingDrawing" xmlns:wp="http://schemas.openxmlformats.org/drawingml/2006/wordprocessingDrawing" xmlns:w10="urn:schemas-microsoft-com:office:word" xmlns:w="http://schemas.openxmlformats.org/wordprocessingml/2006/main" xmlns:w14="http://schemas.microsoft.com/office/word/2010/wordml" xmlns:w15="http://schemas.microsoft.com/office/word/2012/wordml" xmlns:w16cex="http://schemas.microsoft.com/office/word/2018/wordml/cex" xmlns:w16cid="http://schemas.microsoft.com/office/word/2016/wordml/cid" xmlns:w16="http://schemas.microsoft.com/office/word/2018/wordml" xmlns:w16du="http://schemas.microsoft.com/office/word/2023/wordml/word16du" xmlns:w16sdtdh="http://schemas.microsoft.com/office/word/2020/wordml/sdtdatahash" xmlns:w16sdtfl="http://schemas.microsoft.com/office/word/2024/wordml/sdtformatlock" xmlns:w16se="http://schemas.microsoft.com/office/word/2015/wordml/symex" xmlns:wpg="http://schemas.microsoft.com/office/word/2010/wordprocessingGroup" xmlns:wpi="http://schemas.microsoft.com/office/word/2010/wordprocessingInk" xmlns:wne="http://schemas.microsoft.com/office/word/2006/wordml" xmlns:wps="http://schemas.microsoft.com/office/word/2010/wordprocessingShape" mc:Ignorable="w14 w15 w16se w16cid w16 w16cex w16sdtdh w16sdtfl w16du wp14">
   <w:abstractNum w:abstractNumId="0" w15:restartNumberingAfterBreak="0">
-    <w:nsid w:val="381B2E18"/>
+    <w:nsid w:val="18407A73"/>
     <w:multiLevelType w:val="hybridMultilevel"/>
-    <w:tmpl w:val="044646B0"/>
-    <w:lvl w:ilvl="0" w:tplc="49525DE0">
+    <w:tmpl w:val="A8428D7A"/>
+    <w:lvl w:ilvl="0" w:tplc="10BEC004">
       <w:start w:val="1"/>
       <w:numFmt w:val="decimal"/>
       <w:lvlText w:val="%1."/>
@@ -22947,52 +23991,106 @@
         <w:ind w:left="540" w:hanging="360"/>
       </w:pPr>
     </w:lvl>
-    <w:lvl w:ilvl="1" w:tplc="E2E634C0">
+    <w:lvl w:ilvl="1" w:tplc="DA3E0460">
       <w:numFmt w:val="decimal"/>
       <w:lvlText w:val=""/>
       <w:lvlJc w:val="left"/>
     </w:lvl>
-    <w:lvl w:ilvl="2" w:tplc="F5905780">
+    <w:lvl w:ilvl="2" w:tplc="173A6DB6">
       <w:numFmt w:val="decimal"/>
       <w:lvlText w:val=""/>
       <w:lvlJc w:val="left"/>
     </w:lvl>
-    <w:lvl w:ilvl="3" w:tplc="463847F4">
+    <w:lvl w:ilvl="3" w:tplc="455C4BCE">
       <w:numFmt w:val="decimal"/>
       <w:lvlText w:val=""/>
       <w:lvlJc w:val="left"/>
     </w:lvl>
-    <w:lvl w:ilvl="4" w:tplc="B1629EE0">
+    <w:lvl w:ilvl="4" w:tplc="B0E25DEC">
       <w:numFmt w:val="decimal"/>
       <w:lvlText w:val=""/>
       <w:lvlJc w:val="left"/>
     </w:lvl>
-    <w:lvl w:ilvl="5" w:tplc="8592D19E">
+    <w:lvl w:ilvl="5" w:tplc="87483794">
       <w:numFmt w:val="decimal"/>
       <w:lvlText w:val=""/>
       <w:lvlJc w:val="left"/>
     </w:lvl>
-    <w:lvl w:ilvl="6" w:tplc="16D69200">
+    <w:lvl w:ilvl="6" w:tplc="B7B893EE">
       <w:numFmt w:val="decimal"/>
       <w:lvlText w:val=""/>
       <w:lvlJc w:val="left"/>
     </w:lvl>
-    <w:lvl w:ilvl="7" w:tplc="B43AB482">
+    <w:lvl w:ilvl="7" w:tplc="7CC8A81E">
       <w:numFmt w:val="decimal"/>
       <w:lvlText w:val=""/>
       <w:lvlJc w:val="left"/>
     </w:lvl>
-    <w:lvl w:ilvl="8" w:tplc="8C24E7F6">
+    <w:lvl w:ilvl="8" w:tplc="0D5E4458">
       <w:numFmt w:val="decimal"/>
       <w:lvlText w:val=""/>
       <w:lvlJc w:val="left"/>
     </w:lvl>
   </w:abstractNum>
   <w:abstractNum w:abstractNumId="1" w15:restartNumberingAfterBreak="0">
-    <w:nsid w:val="3CC87DD4"/>
+    <w:nsid w:val="25D102AA"/>
     <w:multiLevelType w:val="hybridMultilevel"/>
-    <w:tmpl w:val="B3B49EFC"/>
-    <w:lvl w:ilvl="0" w:tplc="BC521F92">
+    <w:tmpl w:val="DDF45BE2"/>
+    <w:lvl w:ilvl="0" w:tplc="62C47056">
+      <w:start w:val="1"/>
+      <w:numFmt w:val="decimal"/>
+      <w:lvlText w:val="%1."/>
+      <w:lvlJc w:val="left"/>
+      <w:pPr>
+        <w:ind w:left="540" w:hanging="360"/>
+      </w:pPr>
+    </w:lvl>
+    <w:lvl w:ilvl="1" w:tplc="258E2692">
+      <w:numFmt w:val="decimal"/>
+      <w:lvlText w:val=""/>
+      <w:lvlJc w:val="left"/>
+    </w:lvl>
+    <w:lvl w:ilvl="2" w:tplc="2CB6CB52">
+      <w:numFmt w:val="decimal"/>
+      <w:lvlText w:val=""/>
+      <w:lvlJc w:val="left"/>
+    </w:lvl>
+    <w:lvl w:ilvl="3" w:tplc="97227D1E">
+      <w:numFmt w:val="decimal"/>
+      <w:lvlText w:val=""/>
+      <w:lvlJc w:val="left"/>
+    </w:lvl>
+    <w:lvl w:ilvl="4" w:tplc="4D145456">
+      <w:numFmt w:val="decimal"/>
+      <w:lvlText w:val=""/>
+      <w:lvlJc w:val="left"/>
+    </w:lvl>
+    <w:lvl w:ilvl="5" w:tplc="D00AB994">
+      <w:numFmt w:val="decimal"/>
+      <w:lvlText w:val=""/>
+      <w:lvlJc w:val="left"/>
+    </w:lvl>
+    <w:lvl w:ilvl="6" w:tplc="0DB8D28A">
+      <w:numFmt w:val="decimal"/>
+      <w:lvlText w:val=""/>
+      <w:lvlJc w:val="left"/>
+    </w:lvl>
+    <w:lvl w:ilvl="7" w:tplc="94DE7CFE">
+      <w:numFmt w:val="decimal"/>
+      <w:lvlText w:val=""/>
+      <w:lvlJc w:val="left"/>
+    </w:lvl>
+    <w:lvl w:ilvl="8" w:tplc="90AED91A">
+      <w:numFmt w:val="decimal"/>
+      <w:lvlText w:val=""/>
+      <w:lvlJc w:val="left"/>
+    </w:lvl>
+  </w:abstractNum>
+  <w:abstractNum w:abstractNumId="2" w15:restartNumberingAfterBreak="0">
+    <w:nsid w:val="51CD6D6B"/>
+    <w:multiLevelType w:val="hybridMultilevel"/>
+    <w:tmpl w:val="F7ECB700"/>
+    <w:lvl w:ilvl="0" w:tplc="F8F09F86">
       <w:start w:val="1"/>
       <w:numFmt w:val="bullet"/>
       <w:lvlText w:val="●"/>
@@ -23001,7 +24099,7 @@
         <w:ind w:left="720" w:hanging="360"/>
       </w:pPr>
     </w:lvl>
-    <w:lvl w:ilvl="1" w:tplc="74E887DA">
+    <w:lvl w:ilvl="1" w:tplc="5ECAFB40">
       <w:start w:val="1"/>
       <w:numFmt w:val="bullet"/>
       <w:lvlText w:val="○"/>
@@ -23010,7 +24108,7 @@
         <w:ind w:left="1440" w:hanging="360"/>
       </w:pPr>
     </w:lvl>
-    <w:lvl w:ilvl="2" w:tplc="41166D3E">
+    <w:lvl w:ilvl="2" w:tplc="5C187FB2">
       <w:start w:val="1"/>
       <w:numFmt w:val="bullet"/>
       <w:lvlText w:val="■"/>
@@ -23019,7 +24117,7 @@
         <w:ind w:left="2160" w:hanging="360"/>
       </w:pPr>
     </w:lvl>
-    <w:lvl w:ilvl="3" w:tplc="4030D6A6">
+    <w:lvl w:ilvl="3" w:tplc="64FA41D8">
       <w:start w:val="1"/>
       <w:numFmt w:val="bullet"/>
       <w:lvlText w:val="●"/>
@@ -23028,7 +24126,7 @@
         <w:ind w:left="2880" w:hanging="360"/>
       </w:pPr>
     </w:lvl>
-    <w:lvl w:ilvl="4" w:tplc="5426A47A">
+    <w:lvl w:ilvl="4" w:tplc="70AA9370">
       <w:start w:val="1"/>
       <w:numFmt w:val="bullet"/>
       <w:lvlText w:val="○"/>
@@ -23037,7 +24135,7 @@
         <w:ind w:left="3600" w:hanging="360"/>
       </w:pPr>
     </w:lvl>
-    <w:lvl w:ilvl="5" w:tplc="5C84917A">
+    <w:lvl w:ilvl="5" w:tplc="D4346D2A">
       <w:start w:val="1"/>
       <w:numFmt w:val="bullet"/>
       <w:lvlText w:val="■"/>
@@ -23046,7 +24144,7 @@
         <w:ind w:left="4320" w:hanging="360"/>
       </w:pPr>
     </w:lvl>
-    <w:lvl w:ilvl="6" w:tplc="9F5E52EE">
+    <w:lvl w:ilvl="6" w:tplc="4C6C530A">
       <w:start w:val="1"/>
       <w:numFmt w:val="bullet"/>
       <w:lvlText w:val="●"/>
@@ -23055,7 +24153,7 @@
         <w:ind w:left="5040" w:hanging="360"/>
       </w:pPr>
     </w:lvl>
-    <w:lvl w:ilvl="7" w:tplc="CE869458">
+    <w:lvl w:ilvl="7" w:tplc="3A7880B2">
       <w:start w:val="1"/>
       <w:numFmt w:val="bullet"/>
       <w:lvlText w:val="●"/>
@@ -23064,7 +24162,7 @@
         <w:ind w:left="5760" w:hanging="360"/>
       </w:pPr>
     </w:lvl>
-    <w:lvl w:ilvl="8" w:tplc="6DB65BAE">
+    <w:lvl w:ilvl="8" w:tplc="B8F8B31A">
       <w:start w:val="1"/>
       <w:numFmt w:val="bullet"/>
       <w:lvlText w:val="●"/>
@@ -23074,11 +24172,69 @@
       </w:pPr>
     </w:lvl>
   </w:abstractNum>
-  <w:abstractNum w:abstractNumId="2" w15:restartNumberingAfterBreak="0">
-    <w:nsid w:val="556C6A39"/>
+  <w:abstractNum w:abstractNumId="3" w15:restartNumberingAfterBreak="0">
+    <w:nsid w:val="599A37FC"/>
     <w:multiLevelType w:val="hybridMultilevel"/>
-    <w:tmpl w:val="9C388B8C"/>
-    <w:lvl w:ilvl="0" w:tplc="05387FE0">
+    <w:tmpl w:val="017E8E2C"/>
+    <w:lvl w:ilvl="0" w:tplc="D6AAF510">
+      <w:start w:val="1"/>
+      <w:numFmt w:val="bullet"/>
+      <w:lvlText w:val="•"/>
+      <w:lvlJc w:val="left"/>
+      <w:pPr>
+        <w:ind w:left="540" w:hanging="270"/>
+      </w:pPr>
+    </w:lvl>
+    <w:lvl w:ilvl="1" w:tplc="002CEF1E">
+      <w:start w:val="1"/>
+      <w:numFmt w:val="bullet"/>
+      <w:lvlText w:val="–"/>
+      <w:lvlJc w:val="left"/>
+      <w:pPr>
+        <w:ind w:left="900" w:hanging="270"/>
+      </w:pPr>
+    </w:lvl>
+    <w:lvl w:ilvl="2" w:tplc="DC58D50A">
+      <w:numFmt w:val="decimal"/>
+      <w:lvlText w:val=""/>
+      <w:lvlJc w:val="left"/>
+    </w:lvl>
+    <w:lvl w:ilvl="3" w:tplc="6374B992">
+      <w:numFmt w:val="decimal"/>
+      <w:lvlText w:val=""/>
+      <w:lvlJc w:val="left"/>
+    </w:lvl>
+    <w:lvl w:ilvl="4" w:tplc="A3547D1E">
+      <w:numFmt w:val="decimal"/>
+      <w:lvlText w:val=""/>
+      <w:lvlJc w:val="left"/>
+    </w:lvl>
+    <w:lvl w:ilvl="5" w:tplc="7F927C66">
+      <w:numFmt w:val="decimal"/>
+      <w:lvlText w:val=""/>
+      <w:lvlJc w:val="left"/>
+    </w:lvl>
+    <w:lvl w:ilvl="6" w:tplc="F7D692D0">
+      <w:numFmt w:val="decimal"/>
+      <w:lvlText w:val=""/>
+      <w:lvlJc w:val="left"/>
+    </w:lvl>
+    <w:lvl w:ilvl="7" w:tplc="BC78B974">
+      <w:numFmt w:val="decimal"/>
+      <w:lvlText w:val=""/>
+      <w:lvlJc w:val="left"/>
+    </w:lvl>
+    <w:lvl w:ilvl="8" w:tplc="0A8A972A">
+      <w:numFmt w:val="decimal"/>
+      <w:lvlText w:val=""/>
+      <w:lvlJc w:val="left"/>
+    </w:lvl>
+  </w:abstractNum>
+  <w:abstractNum w:abstractNumId="4" w15:restartNumberingAfterBreak="0">
+    <w:nsid w:val="5F1F72D8"/>
+    <w:multiLevelType w:val="hybridMultilevel"/>
+    <w:tmpl w:val="0DE6A876"/>
+    <w:lvl w:ilvl="0" w:tplc="24F8B124">
       <w:start w:val="1"/>
       <w:numFmt w:val="decimal"/>
       <w:lvlText w:val="%1."/>
@@ -23087,110 +24243,52 @@
         <w:ind w:left="540" w:hanging="360"/>
       </w:pPr>
     </w:lvl>
-    <w:lvl w:ilvl="1" w:tplc="368642DE">
+    <w:lvl w:ilvl="1" w:tplc="56101F12">
       <w:numFmt w:val="decimal"/>
       <w:lvlText w:val=""/>
       <w:lvlJc w:val="left"/>
     </w:lvl>
-    <w:lvl w:ilvl="2" w:tplc="D1C87748">
+    <w:lvl w:ilvl="2" w:tplc="69A08B88">
       <w:numFmt w:val="decimal"/>
       <w:lvlText w:val=""/>
       <w:lvlJc w:val="left"/>
     </w:lvl>
-    <w:lvl w:ilvl="3" w:tplc="6D40CC3A">
+    <w:lvl w:ilvl="3" w:tplc="60DEBE36">
       <w:numFmt w:val="decimal"/>
       <w:lvlText w:val=""/>
       <w:lvlJc w:val="left"/>
     </w:lvl>
-    <w:lvl w:ilvl="4" w:tplc="83D2AE18">
+    <w:lvl w:ilvl="4" w:tplc="D8329E48">
       <w:numFmt w:val="decimal"/>
       <w:lvlText w:val=""/>
       <w:lvlJc w:val="left"/>
     </w:lvl>
-    <w:lvl w:ilvl="5" w:tplc="54CEB790">
+    <w:lvl w:ilvl="5" w:tplc="D70EC268">
       <w:numFmt w:val="decimal"/>
       <w:lvlText w:val=""/>
       <w:lvlJc w:val="left"/>
     </w:lvl>
-    <w:lvl w:ilvl="6" w:tplc="C696E5F6">
+    <w:lvl w:ilvl="6" w:tplc="B5B8FF88">
       <w:numFmt w:val="decimal"/>
       <w:lvlText w:val=""/>
       <w:lvlJc w:val="left"/>
     </w:lvl>
-    <w:lvl w:ilvl="7" w:tplc="C31A72CE">
+    <w:lvl w:ilvl="7" w:tplc="C804F238">
       <w:numFmt w:val="decimal"/>
       <w:lvlText w:val=""/>
       <w:lvlJc w:val="left"/>
     </w:lvl>
-    <w:lvl w:ilvl="8" w:tplc="D1009DF8">
+    <w:lvl w:ilvl="8" w:tplc="DCB4907A">
       <w:numFmt w:val="decimal"/>
       <w:lvlText w:val=""/>
       <w:lvlJc w:val="left"/>
     </w:lvl>
   </w:abstractNum>
-  <w:abstractNum w:abstractNumId="3" w15:restartNumberingAfterBreak="0">
-    <w:nsid w:val="5598742F"/>
+  <w:abstractNum w:abstractNumId="5" w15:restartNumberingAfterBreak="0">
+    <w:nsid w:val="6BF5688B"/>
     <w:multiLevelType w:val="hybridMultilevel"/>
-    <w:tmpl w:val="20DAAA74"/>
-    <w:lvl w:ilvl="0" w:tplc="D30E3788">
-      <w:start w:val="1"/>
-      <w:numFmt w:val="bullet"/>
-      <w:lvlText w:val="•"/>
-      <w:lvlJc w:val="left"/>
-      <w:pPr>
-        <w:ind w:left="540" w:hanging="270"/>
-      </w:pPr>
-    </w:lvl>
-    <w:lvl w:ilvl="1" w:tplc="B70CBC0E">
-      <w:start w:val="1"/>
-      <w:numFmt w:val="bullet"/>
-      <w:lvlText w:val="–"/>
-      <w:lvlJc w:val="left"/>
-      <w:pPr>
-        <w:ind w:left="900" w:hanging="270"/>
-      </w:pPr>
-    </w:lvl>
-    <w:lvl w:ilvl="2" w:tplc="15E8A904">
-      <w:numFmt w:val="decimal"/>
-      <w:lvlText w:val=""/>
-      <w:lvlJc w:val="left"/>
-    </w:lvl>
-    <w:lvl w:ilvl="3" w:tplc="8104E876">
-      <w:numFmt w:val="decimal"/>
-      <w:lvlText w:val=""/>
-      <w:lvlJc w:val="left"/>
-    </w:lvl>
-    <w:lvl w:ilvl="4" w:tplc="928A32F6">
-      <w:numFmt w:val="decimal"/>
-      <w:lvlText w:val=""/>
-      <w:lvlJc w:val="left"/>
-    </w:lvl>
-    <w:lvl w:ilvl="5" w:tplc="65EA4E32">
-      <w:numFmt w:val="decimal"/>
-      <w:lvlText w:val=""/>
-      <w:lvlJc w:val="left"/>
-    </w:lvl>
-    <w:lvl w:ilvl="6" w:tplc="4970DFCA">
-      <w:numFmt w:val="decimal"/>
-      <w:lvlText w:val=""/>
-      <w:lvlJc w:val="left"/>
-    </w:lvl>
-    <w:lvl w:ilvl="7" w:tplc="F3186F7C">
-      <w:numFmt w:val="decimal"/>
-      <w:lvlText w:val=""/>
-      <w:lvlJc w:val="left"/>
-    </w:lvl>
-    <w:lvl w:ilvl="8" w:tplc="45AE7ECC">
-      <w:numFmt w:val="decimal"/>
-      <w:lvlText w:val=""/>
-      <w:lvlJc w:val="left"/>
-    </w:lvl>
-  </w:abstractNum>
-  <w:abstractNum w:abstractNumId="4" w15:restartNumberingAfterBreak="0">
-    <w:nsid w:val="71FE5FDB"/>
-    <w:multiLevelType w:val="hybridMultilevel"/>
-    <w:tmpl w:val="2D4288F0"/>
-    <w:lvl w:ilvl="0" w:tplc="EDCC73E0">
+    <w:tmpl w:val="F98631C0"/>
+    <w:lvl w:ilvl="0" w:tplc="E69EBE1A">
       <w:start w:val="1"/>
       <w:numFmt w:val="decimal"/>
       <w:lvlText w:val="%1."/>
@@ -23199,133 +24297,79 @@
         <w:ind w:left="540" w:hanging="360"/>
       </w:pPr>
     </w:lvl>
-    <w:lvl w:ilvl="1" w:tplc="EF5421F4">
+    <w:lvl w:ilvl="1" w:tplc="62908278">
       <w:numFmt w:val="decimal"/>
       <w:lvlText w:val=""/>
       <w:lvlJc w:val="left"/>
     </w:lvl>
-    <w:lvl w:ilvl="2" w:tplc="11C28530">
+    <w:lvl w:ilvl="2" w:tplc="A1ACF5D4">
       <w:numFmt w:val="decimal"/>
       <w:lvlText w:val=""/>
       <w:lvlJc w:val="left"/>
     </w:lvl>
-    <w:lvl w:ilvl="3" w:tplc="297E55BA">
+    <w:lvl w:ilvl="3" w:tplc="5596DC20">
       <w:numFmt w:val="decimal"/>
       <w:lvlText w:val=""/>
       <w:lvlJc w:val="left"/>
     </w:lvl>
-    <w:lvl w:ilvl="4" w:tplc="3D8A3F04">
+    <w:lvl w:ilvl="4" w:tplc="7ABCFCEC">
       <w:numFmt w:val="decimal"/>
       <w:lvlText w:val=""/>
       <w:lvlJc w:val="left"/>
     </w:lvl>
-    <w:lvl w:ilvl="5" w:tplc="D81AD4D4">
+    <w:lvl w:ilvl="5" w:tplc="9BEA020E">
       <w:numFmt w:val="decimal"/>
       <w:lvlText w:val=""/>
       <w:lvlJc w:val="left"/>
     </w:lvl>
-    <w:lvl w:ilvl="6" w:tplc="5FD60F86">
+    <w:lvl w:ilvl="6" w:tplc="3392F126">
       <w:numFmt w:val="decimal"/>
       <w:lvlText w:val=""/>
       <w:lvlJc w:val="left"/>
     </w:lvl>
-    <w:lvl w:ilvl="7" w:tplc="D0A286D8">
+    <w:lvl w:ilvl="7" w:tplc="DC286484">
       <w:numFmt w:val="decimal"/>
       <w:lvlText w:val=""/>
       <w:lvlJc w:val="left"/>
     </w:lvl>
-    <w:lvl w:ilvl="8" w:tplc="7F7E6BDA">
+    <w:lvl w:ilvl="8" w:tplc="79E4A5FE">
       <w:numFmt w:val="decimal"/>
       <w:lvlText w:val=""/>
       <w:lvlJc w:val="left"/>
     </w:lvl>
   </w:abstractNum>
-  <w:abstractNum w:abstractNumId="5" w15:restartNumberingAfterBreak="0">
-    <w:nsid w:val="7B473193"/>
-    <w:multiLevelType w:val="hybridMultilevel"/>
-    <w:tmpl w:val="42B47330"/>
-    <w:lvl w:ilvl="0" w:tplc="5BDEA8C4">
-      <w:start w:val="1"/>
-      <w:numFmt w:val="decimal"/>
-      <w:lvlText w:val="%1."/>
-      <w:lvlJc w:val="left"/>
-      <w:pPr>
-        <w:ind w:left="540" w:hanging="360"/>
-      </w:pPr>
-    </w:lvl>
-    <w:lvl w:ilvl="1" w:tplc="E56E62B4">
-      <w:numFmt w:val="decimal"/>
-      <w:lvlText w:val=""/>
-      <w:lvlJc w:val="left"/>
-    </w:lvl>
-    <w:lvl w:ilvl="2" w:tplc="31446142">
-      <w:numFmt w:val="decimal"/>
-      <w:lvlText w:val=""/>
-      <w:lvlJc w:val="left"/>
-    </w:lvl>
-    <w:lvl w:ilvl="3" w:tplc="8C5C111C">
-      <w:numFmt w:val="decimal"/>
-      <w:lvlText w:val=""/>
-      <w:lvlJc w:val="left"/>
-    </w:lvl>
-    <w:lvl w:ilvl="4" w:tplc="B19AF6D6">
-      <w:numFmt w:val="decimal"/>
-      <w:lvlText w:val=""/>
-      <w:lvlJc w:val="left"/>
-    </w:lvl>
-    <w:lvl w:ilvl="5" w:tplc="F27ABBAE">
-      <w:numFmt w:val="decimal"/>
-      <w:lvlText w:val=""/>
-      <w:lvlJc w:val="left"/>
-    </w:lvl>
-    <w:lvl w:ilvl="6" w:tplc="94889D36">
-      <w:numFmt w:val="decimal"/>
-      <w:lvlText w:val=""/>
-      <w:lvlJc w:val="left"/>
-    </w:lvl>
-    <w:lvl w:ilvl="7" w:tplc="B58A03EA">
-      <w:numFmt w:val="decimal"/>
-      <w:lvlText w:val=""/>
-      <w:lvlJc w:val="left"/>
-    </w:lvl>
-    <w:lvl w:ilvl="8" w:tplc="8A6E3FBC">
-      <w:numFmt w:val="decimal"/>
-      <w:lvlText w:val=""/>
-      <w:lvlJc w:val="left"/>
-    </w:lvl>
-  </w:abstractNum>
-  <w:num w:numId="1" w16cid:durableId="1858690831">
+  <w:num w:numId="1" w16cid:durableId="590895261">
+    <w:abstractNumId w:val="2"/>
+    <w:lvlOverride w:ilvl="0">
+      <w:startOverride w:val="1"/>
+    </w:lvlOverride>
+  </w:num>
+  <w:num w:numId="2" w16cid:durableId="302853949">
+    <w:abstractNumId w:val="3"/>
+    <w:lvlOverride w:ilvl="0">
+      <w:startOverride w:val="1"/>
+    </w:lvlOverride>
+  </w:num>
+  <w:num w:numId="3" w16cid:durableId="110708527">
     <w:abstractNumId w:val="1"/>
     <w:lvlOverride w:ilvl="0">
       <w:startOverride w:val="1"/>
     </w:lvlOverride>
   </w:num>
-  <w:num w:numId="2" w16cid:durableId="1941795322">
-    <w:abstractNumId w:val="3"/>
-    <w:lvlOverride w:ilvl="0">
-      <w:startOverride w:val="1"/>
-    </w:lvlOverride>
-  </w:num>
-  <w:num w:numId="3" w16cid:durableId="904605517">
+  <w:num w:numId="4" w16cid:durableId="1487044321">
     <w:abstractNumId w:val="5"/>
     <w:lvlOverride w:ilvl="0">
       <w:startOverride w:val="1"/>
     </w:lvlOverride>
   </w:num>
-  <w:num w:numId="4" w16cid:durableId="1303192851">
-    <w:abstractNumId w:val="4"/>
-    <w:lvlOverride w:ilvl="0">
-      <w:startOverride w:val="1"/>
-    </w:lvlOverride>
-  </w:num>
-  <w:num w:numId="5" w16cid:durableId="243414797">
+  <w:num w:numId="5" w16cid:durableId="528378364">
     <w:abstractNumId w:val="0"/>
     <w:lvlOverride w:ilvl="0">
       <w:startOverride w:val="1"/>
     </w:lvlOverride>
   </w:num>
-  <w:num w:numId="6" w16cid:durableId="63646488">
-    <w:abstractNumId w:val="2"/>
+  <w:num w:numId="6" w16cid:durableId="105394686">
+    <w:abstractNumId w:val="4"/>
     <w:lvlOverride w:ilvl="0">
       <w:startOverride w:val="1"/>
     </w:lvlOverride>
@@ -23904,7 +24948,7 @@
     <w:autoRedefine/>
     <w:uiPriority w:val="39"/>
     <w:unhideWhenUsed/>
-    <w:rsid w:val="00C94E9B"/>
+    <w:rsid w:val="00EB6D1D"/>
     <w:pPr>
       <w:spacing w:after="100"/>
     </w:pPr>
@@ -23920,7 +24964,7 @@
     <w:autoRedefine/>
     <w:uiPriority w:val="39"/>
     <w:unhideWhenUsed/>
-    <w:rsid w:val="00C94E9B"/>
+    <w:rsid w:val="00EB6D1D"/>
     <w:pPr>
       <w:spacing w:after="100"/>
       <w:ind w:left="200"/>

</xml_diff>

<commit_message>
Manual: remove sender email and Supabase project id; drop the old copy from the repo
Co-Authored-By: Claude Opus 5.5 <noreply@anthropic.com>
</commit_message>
<xml_diff>
--- a/docs/eGP-Alert-v3-Technical-Manual-v2.docx
+++ b/docs/eGP-Alert-v3-Technical-Manual-v2.docx
@@ -104,14 +104,13 @@
           <w:sz w:val="28"/>
           <w:szCs w:val="28"/>
         </w:rPr>
-        <w:lastRenderedPageBreak/>
         <w:t>สารบัญ</w:t>
       </w:r>
     </w:p>
     <w:sdt>
       <w:sdtPr>
         <w:alias w:val="สารบัญ"/>
-        <w:id w:val="-1397513775"/>
+        <w:id w:val="518050820"/>
       </w:sdtPr>
       <w:sdtEndPr>
         <w:rPr>
@@ -144,7 +143,7 @@
           <w:r>
             <w:fldChar w:fldCharType="separate"/>
           </w:r>
-          <w:hyperlink w:anchor="_Toc242977844" w:history="1">
+          <w:hyperlink w:anchor="_Toc242978240" w:history="1">
             <w:r>
               <w:rPr>
                 <w:rStyle w:val="Hyperlink"/>
@@ -168,7 +167,7 @@
               <w:rPr>
                 <w:noProof/>
               </w:rPr>
-              <w:instrText xml:space="preserve"> PAGEREF _Toc242977844 \h </w:instrText>
+              <w:instrText xml:space="preserve"> PAGEREF _Toc242978240 \h </w:instrText>
             </w:r>
             <w:r>
               <w:rPr>
@@ -210,7 +209,7 @@
               <w14:ligatures w14:val="standardContextual"/>
             </w:rPr>
           </w:pPr>
-          <w:hyperlink w:anchor="_Toc242977845" w:history="1">
+          <w:hyperlink w:anchor="_Toc242978241" w:history="1">
             <w:r>
               <w:rPr>
                 <w:rStyle w:val="Hyperlink"/>
@@ -234,7 +233,7 @@
               <w:rPr>
                 <w:noProof/>
               </w:rPr>
-              <w:instrText xml:space="preserve"> PAGEREF _Toc242977845 \h </w:instrText>
+              <w:instrText xml:space="preserve"> PAGEREF _Toc242978241 \h </w:instrText>
             </w:r>
             <w:r>
               <w:rPr>
@@ -276,7 +275,7 @@
               <w14:ligatures w14:val="standardContextual"/>
             </w:rPr>
           </w:pPr>
-          <w:hyperlink w:anchor="_Toc242977846" w:history="1">
+          <w:hyperlink w:anchor="_Toc242978242" w:history="1">
             <w:r>
               <w:rPr>
                 <w:rStyle w:val="Hyperlink"/>
@@ -300,7 +299,7 @@
               <w:rPr>
                 <w:noProof/>
               </w:rPr>
-              <w:instrText xml:space="preserve"> PAGEREF _Toc242977846 \h </w:instrText>
+              <w:instrText xml:space="preserve"> PAGEREF _Toc242978242 \h </w:instrText>
             </w:r>
             <w:r>
               <w:rPr>
@@ -342,7 +341,7 @@
               <w14:ligatures w14:val="standardContextual"/>
             </w:rPr>
           </w:pPr>
-          <w:hyperlink w:anchor="_Toc242977847" w:history="1">
+          <w:hyperlink w:anchor="_Toc242978243" w:history="1">
             <w:r>
               <w:rPr>
                 <w:rStyle w:val="Hyperlink"/>
@@ -366,7 +365,7 @@
               <w:rPr>
                 <w:noProof/>
               </w:rPr>
-              <w:instrText xml:space="preserve"> PAGEREF _Toc242977847 \h </w:instrText>
+              <w:instrText xml:space="preserve"> PAGEREF _Toc242978243 \h </w:instrText>
             </w:r>
             <w:r>
               <w:rPr>
@@ -408,7 +407,7 @@
               <w14:ligatures w14:val="standardContextual"/>
             </w:rPr>
           </w:pPr>
-          <w:hyperlink w:anchor="_Toc242977848" w:history="1">
+          <w:hyperlink w:anchor="_Toc242978244" w:history="1">
             <w:r>
               <w:rPr>
                 <w:rStyle w:val="Hyperlink"/>
@@ -432,7 +431,7 @@
               <w:rPr>
                 <w:noProof/>
               </w:rPr>
-              <w:instrText xml:space="preserve"> PAGEREF _Toc242977848 \h </w:instrText>
+              <w:instrText xml:space="preserve"> PAGEREF _Toc242978244 \h </w:instrText>
             </w:r>
             <w:r>
               <w:rPr>
@@ -474,7 +473,7 @@
               <w14:ligatures w14:val="standardContextual"/>
             </w:rPr>
           </w:pPr>
-          <w:hyperlink w:anchor="_Toc242977849" w:history="1">
+          <w:hyperlink w:anchor="_Toc242978245" w:history="1">
             <w:r>
               <w:rPr>
                 <w:rStyle w:val="Hyperlink"/>
@@ -498,7 +497,7 @@
               <w:rPr>
                 <w:noProof/>
               </w:rPr>
-              <w:instrText xml:space="preserve"> PAGEREF _Toc242977849 \h </w:instrText>
+              <w:instrText xml:space="preserve"> PAGEREF _Toc242978245 \h </w:instrText>
             </w:r>
             <w:r>
               <w:rPr>
@@ -540,7 +539,7 @@
               <w14:ligatures w14:val="standardContextual"/>
             </w:rPr>
           </w:pPr>
-          <w:hyperlink w:anchor="_Toc242977850" w:history="1">
+          <w:hyperlink w:anchor="_Toc242978246" w:history="1">
             <w:r>
               <w:rPr>
                 <w:rStyle w:val="Hyperlink"/>
@@ -564,7 +563,7 @@
               <w:rPr>
                 <w:noProof/>
               </w:rPr>
-              <w:instrText xml:space="preserve"> PAGEREF _Toc242977850 \h </w:instrText>
+              <w:instrText xml:space="preserve"> PAGEREF _Toc242978246 \h </w:instrText>
             </w:r>
             <w:r>
               <w:rPr>
@@ -606,7 +605,7 @@
               <w14:ligatures w14:val="standardContextual"/>
             </w:rPr>
           </w:pPr>
-          <w:hyperlink w:anchor="_Toc242977851" w:history="1">
+          <w:hyperlink w:anchor="_Toc242978247" w:history="1">
             <w:r>
               <w:rPr>
                 <w:rStyle w:val="Hyperlink"/>
@@ -630,7 +629,7 @@
               <w:rPr>
                 <w:noProof/>
               </w:rPr>
-              <w:instrText xml:space="preserve"> PAGEREF _Toc242977851 \h </w:instrText>
+              <w:instrText xml:space="preserve"> PAGEREF _Toc242978247 \h </w:instrText>
             </w:r>
             <w:r>
               <w:rPr>
@@ -672,7 +671,7 @@
               <w14:ligatures w14:val="standardContextual"/>
             </w:rPr>
           </w:pPr>
-          <w:hyperlink w:anchor="_Toc242977852" w:history="1">
+          <w:hyperlink w:anchor="_Toc242978248" w:history="1">
             <w:r>
               <w:rPr>
                 <w:rStyle w:val="Hyperlink"/>
@@ -696,7 +695,7 @@
               <w:rPr>
                 <w:noProof/>
               </w:rPr>
-              <w:instrText xml:space="preserve"> PAGEREF _Toc242977852 \h </w:instrText>
+              <w:instrText xml:space="preserve"> PAGEREF _Toc242978248 \h </w:instrText>
             </w:r>
             <w:r>
               <w:rPr>
@@ -738,7 +737,7 @@
               <w14:ligatures w14:val="standardContextual"/>
             </w:rPr>
           </w:pPr>
-          <w:hyperlink w:anchor="_Toc242977853" w:history="1">
+          <w:hyperlink w:anchor="_Toc242978249" w:history="1">
             <w:r>
               <w:rPr>
                 <w:rStyle w:val="Hyperlink"/>
@@ -762,7 +761,7 @@
               <w:rPr>
                 <w:noProof/>
               </w:rPr>
-              <w:instrText xml:space="preserve"> PAGEREF _Toc242977853 \h </w:instrText>
+              <w:instrText xml:space="preserve"> PAGEREF _Toc242978249 \h </w:instrText>
             </w:r>
             <w:r>
               <w:rPr>
@@ -804,7 +803,7 @@
               <w14:ligatures w14:val="standardContextual"/>
             </w:rPr>
           </w:pPr>
-          <w:hyperlink w:anchor="_Toc242977854" w:history="1">
+          <w:hyperlink w:anchor="_Toc242978250" w:history="1">
             <w:r>
               <w:rPr>
                 <w:rStyle w:val="Hyperlink"/>
@@ -828,7 +827,7 @@
               <w:rPr>
                 <w:noProof/>
               </w:rPr>
-              <w:instrText xml:space="preserve"> PAGEREF _Toc242977854 \h </w:instrText>
+              <w:instrText xml:space="preserve"> PAGEREF _Toc242978250 \h </w:instrText>
             </w:r>
             <w:r>
               <w:rPr>
@@ -870,7 +869,7 @@
               <w14:ligatures w14:val="standardContextual"/>
             </w:rPr>
           </w:pPr>
-          <w:hyperlink w:anchor="_Toc242977855" w:history="1">
+          <w:hyperlink w:anchor="_Toc242978251" w:history="1">
             <w:r>
               <w:rPr>
                 <w:rStyle w:val="Hyperlink"/>
@@ -894,7 +893,7 @@
               <w:rPr>
                 <w:noProof/>
               </w:rPr>
-              <w:instrText xml:space="preserve"> PAGEREF _Toc242977855 \h </w:instrText>
+              <w:instrText xml:space="preserve"> PAGEREF _Toc242978251 \h </w:instrText>
             </w:r>
             <w:r>
               <w:rPr>
@@ -936,7 +935,7 @@
               <w14:ligatures w14:val="standardContextual"/>
             </w:rPr>
           </w:pPr>
-          <w:hyperlink w:anchor="_Toc242977856" w:history="1">
+          <w:hyperlink w:anchor="_Toc242978252" w:history="1">
             <w:r>
               <w:rPr>
                 <w:rStyle w:val="Hyperlink"/>
@@ -960,7 +959,7 @@
               <w:rPr>
                 <w:noProof/>
               </w:rPr>
-              <w:instrText xml:space="preserve"> PAGEREF _Toc242977856 \h </w:instrText>
+              <w:instrText xml:space="preserve"> PAGEREF _Toc242978252 \h </w:instrText>
             </w:r>
             <w:r>
               <w:rPr>
@@ -1002,7 +1001,7 @@
               <w14:ligatures w14:val="standardContextual"/>
             </w:rPr>
           </w:pPr>
-          <w:hyperlink w:anchor="_Toc242977857" w:history="1">
+          <w:hyperlink w:anchor="_Toc242978253" w:history="1">
             <w:r>
               <w:rPr>
                 <w:rStyle w:val="Hyperlink"/>
@@ -1026,7 +1025,7 @@
               <w:rPr>
                 <w:noProof/>
               </w:rPr>
-              <w:instrText xml:space="preserve"> PAGEREF _Toc242977857 \h </w:instrText>
+              <w:instrText xml:space="preserve"> PAGEREF _Toc242978253 \h </w:instrText>
             </w:r>
             <w:r>
               <w:rPr>
@@ -1068,7 +1067,7 @@
               <w14:ligatures w14:val="standardContextual"/>
             </w:rPr>
           </w:pPr>
-          <w:hyperlink w:anchor="_Toc242977858" w:history="1">
+          <w:hyperlink w:anchor="_Toc242978254" w:history="1">
             <w:r>
               <w:rPr>
                 <w:rStyle w:val="Hyperlink"/>
@@ -1092,7 +1091,7 @@
               <w:rPr>
                 <w:noProof/>
               </w:rPr>
-              <w:instrText xml:space="preserve"> PAGEREF _Toc242977858 \h </w:instrText>
+              <w:instrText xml:space="preserve"> PAGEREF _Toc242978254 \h </w:instrText>
             </w:r>
             <w:r>
               <w:rPr>
@@ -1134,7 +1133,7 @@
               <w14:ligatures w14:val="standardContextual"/>
             </w:rPr>
           </w:pPr>
-          <w:hyperlink w:anchor="_Toc242977859" w:history="1">
+          <w:hyperlink w:anchor="_Toc242978255" w:history="1">
             <w:r>
               <w:rPr>
                 <w:rStyle w:val="Hyperlink"/>
@@ -1158,7 +1157,7 @@
               <w:rPr>
                 <w:noProof/>
               </w:rPr>
-              <w:instrText xml:space="preserve"> PAGEREF _Toc242977859 \h </w:instrText>
+              <w:instrText xml:space="preserve"> PAGEREF _Toc242978255 \h </w:instrText>
             </w:r>
             <w:r>
               <w:rPr>
@@ -1200,7 +1199,7 @@
               <w14:ligatures w14:val="standardContextual"/>
             </w:rPr>
           </w:pPr>
-          <w:hyperlink w:anchor="_Toc242977860" w:history="1">
+          <w:hyperlink w:anchor="_Toc242978256" w:history="1">
             <w:r>
               <w:rPr>
                 <w:rStyle w:val="Hyperlink"/>
@@ -1224,7 +1223,7 @@
               <w:rPr>
                 <w:noProof/>
               </w:rPr>
-              <w:instrText xml:space="preserve"> PAGEREF _Toc242977860 \h </w:instrText>
+              <w:instrText xml:space="preserve"> PAGEREF _Toc242978256 \h </w:instrText>
             </w:r>
             <w:r>
               <w:rPr>
@@ -1266,7 +1265,7 @@
               <w14:ligatures w14:val="standardContextual"/>
             </w:rPr>
           </w:pPr>
-          <w:hyperlink w:anchor="_Toc242977861" w:history="1">
+          <w:hyperlink w:anchor="_Toc242978257" w:history="1">
             <w:r>
               <w:rPr>
                 <w:rStyle w:val="Hyperlink"/>
@@ -1290,7 +1289,7 @@
               <w:rPr>
                 <w:noProof/>
               </w:rPr>
-              <w:instrText xml:space="preserve"> PAGEREF _Toc242977861 \h </w:instrText>
+              <w:instrText xml:space="preserve"> PAGEREF _Toc242978257 \h </w:instrText>
             </w:r>
             <w:r>
               <w:rPr>
@@ -1332,7 +1331,7 @@
               <w14:ligatures w14:val="standardContextual"/>
             </w:rPr>
           </w:pPr>
-          <w:hyperlink w:anchor="_Toc242977862" w:history="1">
+          <w:hyperlink w:anchor="_Toc242978258" w:history="1">
             <w:r>
               <w:rPr>
                 <w:rStyle w:val="Hyperlink"/>
@@ -1356,7 +1355,7 @@
               <w:rPr>
                 <w:noProof/>
               </w:rPr>
-              <w:instrText xml:space="preserve"> PAGEREF _Toc242977862 \h </w:instrText>
+              <w:instrText xml:space="preserve"> PAGEREF _Toc242978258 \h </w:instrText>
             </w:r>
             <w:r>
               <w:rPr>
@@ -1398,7 +1397,7 @@
               <w14:ligatures w14:val="standardContextual"/>
             </w:rPr>
           </w:pPr>
-          <w:hyperlink w:anchor="_Toc242977863" w:history="1">
+          <w:hyperlink w:anchor="_Toc242978259" w:history="1">
             <w:r>
               <w:rPr>
                 <w:rStyle w:val="Hyperlink"/>
@@ -1422,7 +1421,7 @@
               <w:rPr>
                 <w:noProof/>
               </w:rPr>
-              <w:instrText xml:space="preserve"> PAGEREF _Toc242977863 \h </w:instrText>
+              <w:instrText xml:space="preserve"> PAGEREF _Toc242978259 \h </w:instrText>
             </w:r>
             <w:r>
               <w:rPr>
@@ -1464,7 +1463,7 @@
               <w14:ligatures w14:val="standardContextual"/>
             </w:rPr>
           </w:pPr>
-          <w:hyperlink w:anchor="_Toc242977864" w:history="1">
+          <w:hyperlink w:anchor="_Toc242978260" w:history="1">
             <w:r>
               <w:rPr>
                 <w:rStyle w:val="Hyperlink"/>
@@ -1488,7 +1487,7 @@
               <w:rPr>
                 <w:noProof/>
               </w:rPr>
-              <w:instrText xml:space="preserve"> PAGEREF _Toc242977864 \h </w:instrText>
+              <w:instrText xml:space="preserve"> PAGEREF _Toc242978260 \h </w:instrText>
             </w:r>
             <w:r>
               <w:rPr>
@@ -1530,7 +1529,7 @@
               <w14:ligatures w14:val="standardContextual"/>
             </w:rPr>
           </w:pPr>
-          <w:hyperlink w:anchor="_Toc242977865" w:history="1">
+          <w:hyperlink w:anchor="_Toc242978261" w:history="1">
             <w:r>
               <w:rPr>
                 <w:rStyle w:val="Hyperlink"/>
@@ -1554,7 +1553,7 @@
               <w:rPr>
                 <w:noProof/>
               </w:rPr>
-              <w:instrText xml:space="preserve"> PAGEREF _Toc242977865 \h </w:instrText>
+              <w:instrText xml:space="preserve"> PAGEREF _Toc242978261 \h </w:instrText>
             </w:r>
             <w:r>
               <w:rPr>
@@ -1596,7 +1595,7 @@
               <w14:ligatures w14:val="standardContextual"/>
             </w:rPr>
           </w:pPr>
-          <w:hyperlink w:anchor="_Toc242977866" w:history="1">
+          <w:hyperlink w:anchor="_Toc242978262" w:history="1">
             <w:r>
               <w:rPr>
                 <w:rStyle w:val="Hyperlink"/>
@@ -1620,7 +1619,7 @@
               <w:rPr>
                 <w:noProof/>
               </w:rPr>
-              <w:instrText xml:space="preserve"> PAGEREF _Toc242977866 \h </w:instrText>
+              <w:instrText xml:space="preserve"> PAGEREF _Toc242978262 \h </w:instrText>
             </w:r>
             <w:r>
               <w:rPr>
@@ -1662,7 +1661,7 @@
               <w14:ligatures w14:val="standardContextual"/>
             </w:rPr>
           </w:pPr>
-          <w:hyperlink w:anchor="_Toc242977867" w:history="1">
+          <w:hyperlink w:anchor="_Toc242978263" w:history="1">
             <w:r>
               <w:rPr>
                 <w:rStyle w:val="Hyperlink"/>
@@ -1686,7 +1685,7 @@
               <w:rPr>
                 <w:noProof/>
               </w:rPr>
-              <w:instrText xml:space="preserve"> PAGEREF _Toc242977867 \h </w:instrText>
+              <w:instrText xml:space="preserve"> PAGEREF _Toc242978263 \h </w:instrText>
             </w:r>
             <w:r>
               <w:rPr>
@@ -1728,7 +1727,7 @@
               <w14:ligatures w14:val="standardContextual"/>
             </w:rPr>
           </w:pPr>
-          <w:hyperlink w:anchor="_Toc242977868" w:history="1">
+          <w:hyperlink w:anchor="_Toc242978264" w:history="1">
             <w:r>
               <w:rPr>
                 <w:rStyle w:val="Hyperlink"/>
@@ -1752,7 +1751,7 @@
               <w:rPr>
                 <w:noProof/>
               </w:rPr>
-              <w:instrText xml:space="preserve"> PAGEREF _Toc242977868 \h </w:instrText>
+              <w:instrText xml:space="preserve"> PAGEREF _Toc242978264 \h </w:instrText>
             </w:r>
             <w:r>
               <w:rPr>
@@ -1794,7 +1793,7 @@
               <w14:ligatures w14:val="standardContextual"/>
             </w:rPr>
           </w:pPr>
-          <w:hyperlink w:anchor="_Toc242977869" w:history="1">
+          <w:hyperlink w:anchor="_Toc242978265" w:history="1">
             <w:r>
               <w:rPr>
                 <w:rStyle w:val="Hyperlink"/>
@@ -1818,7 +1817,7 @@
               <w:rPr>
                 <w:noProof/>
               </w:rPr>
-              <w:instrText xml:space="preserve"> PAGEREF _Toc242977869 \h </w:instrText>
+              <w:instrText xml:space="preserve"> PAGEREF _Toc242978265 \h </w:instrText>
             </w:r>
             <w:r>
               <w:rPr>
@@ -1860,7 +1859,7 @@
               <w14:ligatures w14:val="standardContextual"/>
             </w:rPr>
           </w:pPr>
-          <w:hyperlink w:anchor="_Toc242977870" w:history="1">
+          <w:hyperlink w:anchor="_Toc242978266" w:history="1">
             <w:r>
               <w:rPr>
                 <w:rStyle w:val="Hyperlink"/>
@@ -1884,7 +1883,7 @@
               <w:rPr>
                 <w:noProof/>
               </w:rPr>
-              <w:instrText xml:space="preserve"> PAGEREF _Toc242977870 \h </w:instrText>
+              <w:instrText xml:space="preserve"> PAGEREF _Toc242978266 \h </w:instrText>
             </w:r>
             <w:r>
               <w:rPr>
@@ -1926,7 +1925,7 @@
               <w14:ligatures w14:val="standardContextual"/>
             </w:rPr>
           </w:pPr>
-          <w:hyperlink w:anchor="_Toc242977871" w:history="1">
+          <w:hyperlink w:anchor="_Toc242978267" w:history="1">
             <w:r>
               <w:rPr>
                 <w:rStyle w:val="Hyperlink"/>
@@ -1950,7 +1949,7 @@
               <w:rPr>
                 <w:noProof/>
               </w:rPr>
-              <w:instrText xml:space="preserve"> PAGEREF _Toc242977871 \h </w:instrText>
+              <w:instrText xml:space="preserve"> PAGEREF _Toc242978267 \h </w:instrText>
             </w:r>
             <w:r>
               <w:rPr>
@@ -1992,7 +1991,7 @@
               <w14:ligatures w14:val="standardContextual"/>
             </w:rPr>
           </w:pPr>
-          <w:hyperlink w:anchor="_Toc242977872" w:history="1">
+          <w:hyperlink w:anchor="_Toc242978268" w:history="1">
             <w:r>
               <w:rPr>
                 <w:rStyle w:val="Hyperlink"/>
@@ -2016,7 +2015,7 @@
               <w:rPr>
                 <w:noProof/>
               </w:rPr>
-              <w:instrText xml:space="preserve"> PAGEREF _Toc242977872 \h </w:instrText>
+              <w:instrText xml:space="preserve"> PAGEREF _Toc242978268 \h </w:instrText>
             </w:r>
             <w:r>
               <w:rPr>
@@ -2058,7 +2057,7 @@
               <w14:ligatures w14:val="standardContextual"/>
             </w:rPr>
           </w:pPr>
-          <w:hyperlink w:anchor="_Toc242977873" w:history="1">
+          <w:hyperlink w:anchor="_Toc242978269" w:history="1">
             <w:r>
               <w:rPr>
                 <w:rStyle w:val="Hyperlink"/>
@@ -2082,7 +2081,7 @@
               <w:rPr>
                 <w:noProof/>
               </w:rPr>
-              <w:instrText xml:space="preserve"> PAGEREF _Toc242977873 \h </w:instrText>
+              <w:instrText xml:space="preserve"> PAGEREF _Toc242978269 \h </w:instrText>
             </w:r>
             <w:r>
               <w:rPr>
@@ -2124,7 +2123,7 @@
               <w14:ligatures w14:val="standardContextual"/>
             </w:rPr>
           </w:pPr>
-          <w:hyperlink w:anchor="_Toc242977874" w:history="1">
+          <w:hyperlink w:anchor="_Toc242978270" w:history="1">
             <w:r>
               <w:rPr>
                 <w:rStyle w:val="Hyperlink"/>
@@ -2148,7 +2147,7 @@
               <w:rPr>
                 <w:noProof/>
               </w:rPr>
-              <w:instrText xml:space="preserve"> PAGEREF _Toc242977874 \h </w:instrText>
+              <w:instrText xml:space="preserve"> PAGEREF _Toc242978270 \h </w:instrText>
             </w:r>
             <w:r>
               <w:rPr>
@@ -2190,7 +2189,7 @@
               <w14:ligatures w14:val="standardContextual"/>
             </w:rPr>
           </w:pPr>
-          <w:hyperlink w:anchor="_Toc242977875" w:history="1">
+          <w:hyperlink w:anchor="_Toc242978271" w:history="1">
             <w:r>
               <w:rPr>
                 <w:rStyle w:val="Hyperlink"/>
@@ -2214,7 +2213,7 @@
               <w:rPr>
                 <w:noProof/>
               </w:rPr>
-              <w:instrText xml:space="preserve"> PAGEREF _Toc242977875 \h </w:instrText>
+              <w:instrText xml:space="preserve"> PAGEREF _Toc242978271 \h </w:instrText>
             </w:r>
             <w:r>
               <w:rPr>
@@ -2256,7 +2255,7 @@
               <w14:ligatures w14:val="standardContextual"/>
             </w:rPr>
           </w:pPr>
-          <w:hyperlink w:anchor="_Toc242977876" w:history="1">
+          <w:hyperlink w:anchor="_Toc242978272" w:history="1">
             <w:r>
               <w:rPr>
                 <w:rStyle w:val="Hyperlink"/>
@@ -2280,7 +2279,7 @@
               <w:rPr>
                 <w:noProof/>
               </w:rPr>
-              <w:instrText xml:space="preserve"> PAGEREF _Toc242977876 \h </w:instrText>
+              <w:instrText xml:space="preserve"> PAGEREF _Toc242978272 \h </w:instrText>
             </w:r>
             <w:r>
               <w:rPr>
@@ -2322,7 +2321,7 @@
               <w14:ligatures w14:val="standardContextual"/>
             </w:rPr>
           </w:pPr>
-          <w:hyperlink w:anchor="_Toc242977877" w:history="1">
+          <w:hyperlink w:anchor="_Toc242978273" w:history="1">
             <w:r>
               <w:rPr>
                 <w:rStyle w:val="Hyperlink"/>
@@ -2346,7 +2345,7 @@
               <w:rPr>
                 <w:noProof/>
               </w:rPr>
-              <w:instrText xml:space="preserve"> PAGEREF _Toc242977877 \h </w:instrText>
+              <w:instrText xml:space="preserve"> PAGEREF _Toc242978273 \h </w:instrText>
             </w:r>
             <w:r>
               <w:rPr>
@@ -2388,7 +2387,7 @@
               <w14:ligatures w14:val="standardContextual"/>
             </w:rPr>
           </w:pPr>
-          <w:hyperlink w:anchor="_Toc242977878" w:history="1">
+          <w:hyperlink w:anchor="_Toc242978274" w:history="1">
             <w:r>
               <w:rPr>
                 <w:rStyle w:val="Hyperlink"/>
@@ -2412,7 +2411,7 @@
               <w:rPr>
                 <w:noProof/>
               </w:rPr>
-              <w:instrText xml:space="preserve"> PAGEREF _Toc242977878 \h </w:instrText>
+              <w:instrText xml:space="preserve"> PAGEREF _Toc242978274 \h </w:instrText>
             </w:r>
             <w:r>
               <w:rPr>
@@ -2454,7 +2453,7 @@
               <w14:ligatures w14:val="standardContextual"/>
             </w:rPr>
           </w:pPr>
-          <w:hyperlink w:anchor="_Toc242977879" w:history="1">
+          <w:hyperlink w:anchor="_Toc242978275" w:history="1">
             <w:r>
               <w:rPr>
                 <w:rStyle w:val="Hyperlink"/>
@@ -2478,7 +2477,7 @@
               <w:rPr>
                 <w:noProof/>
               </w:rPr>
-              <w:instrText xml:space="preserve"> PAGEREF _Toc242977879 \h </w:instrText>
+              <w:instrText xml:space="preserve"> PAGEREF _Toc242978275 \h </w:instrText>
             </w:r>
             <w:r>
               <w:rPr>
@@ -2520,7 +2519,7 @@
               <w14:ligatures w14:val="standardContextual"/>
             </w:rPr>
           </w:pPr>
-          <w:hyperlink w:anchor="_Toc242977880" w:history="1">
+          <w:hyperlink w:anchor="_Toc242978276" w:history="1">
             <w:r>
               <w:rPr>
                 <w:rStyle w:val="Hyperlink"/>
@@ -2544,7 +2543,7 @@
               <w:rPr>
                 <w:noProof/>
               </w:rPr>
-              <w:instrText xml:space="preserve"> PAGEREF _Toc242977880 \h </w:instrText>
+              <w:instrText xml:space="preserve"> PAGEREF _Toc242978276 \h </w:instrText>
             </w:r>
             <w:r>
               <w:rPr>
@@ -2586,7 +2585,7 @@
               <w14:ligatures w14:val="standardContextual"/>
             </w:rPr>
           </w:pPr>
-          <w:hyperlink w:anchor="_Toc242977881" w:history="1">
+          <w:hyperlink w:anchor="_Toc242978277" w:history="1">
             <w:r>
               <w:rPr>
                 <w:rStyle w:val="Hyperlink"/>
@@ -2610,7 +2609,7 @@
               <w:rPr>
                 <w:noProof/>
               </w:rPr>
-              <w:instrText xml:space="preserve"> PAGEREF _Toc242977881 \h </w:instrText>
+              <w:instrText xml:space="preserve"> PAGEREF _Toc242978277 \h </w:instrText>
             </w:r>
             <w:r>
               <w:rPr>
@@ -2652,7 +2651,7 @@
               <w14:ligatures w14:val="standardContextual"/>
             </w:rPr>
           </w:pPr>
-          <w:hyperlink w:anchor="_Toc242977882" w:history="1">
+          <w:hyperlink w:anchor="_Toc242978278" w:history="1">
             <w:r>
               <w:rPr>
                 <w:rStyle w:val="Hyperlink"/>
@@ -2676,7 +2675,7 @@
               <w:rPr>
                 <w:noProof/>
               </w:rPr>
-              <w:instrText xml:space="preserve"> PAGEREF _Toc242977882 \h </w:instrText>
+              <w:instrText xml:space="preserve"> PAGEREF _Toc242978278 \h </w:instrText>
             </w:r>
             <w:r>
               <w:rPr>
@@ -2718,7 +2717,7 @@
               <w14:ligatures w14:val="standardContextual"/>
             </w:rPr>
           </w:pPr>
-          <w:hyperlink w:anchor="_Toc242977883" w:history="1">
+          <w:hyperlink w:anchor="_Toc242978279" w:history="1">
             <w:r>
               <w:rPr>
                 <w:rStyle w:val="Hyperlink"/>
@@ -2742,7 +2741,7 @@
               <w:rPr>
                 <w:noProof/>
               </w:rPr>
-              <w:instrText xml:space="preserve"> PAGEREF _Toc242977883 \h </w:instrText>
+              <w:instrText xml:space="preserve"> PAGEREF _Toc242978279 \h </w:instrText>
             </w:r>
             <w:r>
               <w:rPr>
@@ -2784,7 +2783,7 @@
               <w14:ligatures w14:val="standardContextual"/>
             </w:rPr>
           </w:pPr>
-          <w:hyperlink w:anchor="_Toc242977884" w:history="1">
+          <w:hyperlink w:anchor="_Toc242978280" w:history="1">
             <w:r>
               <w:rPr>
                 <w:rStyle w:val="Hyperlink"/>
@@ -2808,7 +2807,7 @@
               <w:rPr>
                 <w:noProof/>
               </w:rPr>
-              <w:instrText xml:space="preserve"> PAGEREF _Toc242977884 \h </w:instrText>
+              <w:instrText xml:space="preserve"> PAGEREF _Toc242978280 \h </w:instrText>
             </w:r>
             <w:r>
               <w:rPr>
@@ -2850,7 +2849,7 @@
               <w14:ligatures w14:val="standardContextual"/>
             </w:rPr>
           </w:pPr>
-          <w:hyperlink w:anchor="_Toc242977885" w:history="1">
+          <w:hyperlink w:anchor="_Toc242978281" w:history="1">
             <w:r>
               <w:rPr>
                 <w:rStyle w:val="Hyperlink"/>
@@ -2874,7 +2873,7 @@
               <w:rPr>
                 <w:noProof/>
               </w:rPr>
-              <w:instrText xml:space="preserve"> PAGEREF _Toc242977885 \h </w:instrText>
+              <w:instrText xml:space="preserve"> PAGEREF _Toc242978281 \h </w:instrText>
             </w:r>
             <w:r>
               <w:rPr>
@@ -2916,7 +2915,7 @@
               <w14:ligatures w14:val="standardContextual"/>
             </w:rPr>
           </w:pPr>
-          <w:hyperlink w:anchor="_Toc242977886" w:history="1">
+          <w:hyperlink w:anchor="_Toc242978282" w:history="1">
             <w:r>
               <w:rPr>
                 <w:rStyle w:val="Hyperlink"/>
@@ -2940,7 +2939,7 @@
               <w:rPr>
                 <w:noProof/>
               </w:rPr>
-              <w:instrText xml:space="preserve"> PAGEREF _Toc242977886 \h </w:instrText>
+              <w:instrText xml:space="preserve"> PAGEREF _Toc242978282 \h </w:instrText>
             </w:r>
             <w:r>
               <w:rPr>
@@ -2982,7 +2981,7 @@
               <w14:ligatures w14:val="standardContextual"/>
             </w:rPr>
           </w:pPr>
-          <w:hyperlink w:anchor="_Toc242977887" w:history="1">
+          <w:hyperlink w:anchor="_Toc242978283" w:history="1">
             <w:r>
               <w:rPr>
                 <w:rStyle w:val="Hyperlink"/>
@@ -3006,7 +3005,7 @@
               <w:rPr>
                 <w:noProof/>
               </w:rPr>
-              <w:instrText xml:space="preserve"> PAGEREF _Toc242977887 \h </w:instrText>
+              <w:instrText xml:space="preserve"> PAGEREF _Toc242978283 \h </w:instrText>
             </w:r>
             <w:r>
               <w:rPr>
@@ -3046,9 +3045,8 @@
         <w:pageBreakBefore/>
         <w:spacing w:before="360" w:after="160"/>
       </w:pPr>
-      <w:bookmarkStart w:id="0" w:name="_Toc242977844"/>
-      <w:r>
-        <w:lastRenderedPageBreak/>
+      <w:bookmarkStart w:id="0" w:name="_Toc242978240"/>
+      <w:r>
         <w:t xml:space="preserve">1. </w:t>
       </w:r>
       <w:r>
@@ -3073,7 +3071,7 @@
         <w:keepNext/>
         <w:spacing w:before="280" w:after="120"/>
       </w:pPr>
-      <w:bookmarkStart w:id="1" w:name="_Toc242977845"/>
+      <w:bookmarkStart w:id="1" w:name="_Toc242978241"/>
       <w:r>
         <w:t xml:space="preserve">1.1 </w:t>
       </w:r>
@@ -3097,7 +3095,7 @@
           <w:left w:w="10" w:type="dxa"/>
           <w:right w:w="10" w:type="dxa"/>
         </w:tblCellMar>
-        <w:tblLook w:val="0000" w:firstRow="0" w:lastRow="0" w:firstColumn="0" w:lastColumn="0" w:noHBand="0" w:noVBand="0"/>
+        <w:tblLook w:val="04A0" w:firstRow="1" w:lastRow="0" w:firstColumn="1" w:lastColumn="0" w:noHBand="0" w:noVBand="1"/>
       </w:tblPr>
       <w:tblGrid>
         <w:gridCol w:w="4819"/>
@@ -3602,7 +3600,7 @@
         <w:keepNext/>
         <w:spacing w:before="280" w:after="120"/>
       </w:pPr>
-      <w:bookmarkStart w:id="2" w:name="_Toc242977846"/>
+      <w:bookmarkStart w:id="2" w:name="_Toc242978242"/>
       <w:r>
         <w:t xml:space="preserve">1.2 </w:t>
       </w:r>
@@ -3686,9 +3684,8 @@
         <w:pageBreakBefore/>
         <w:spacing w:before="360" w:after="160"/>
       </w:pPr>
-      <w:bookmarkStart w:id="3" w:name="_Toc242977847"/>
-      <w:r>
-        <w:lastRenderedPageBreak/>
+      <w:bookmarkStart w:id="3" w:name="_Toc242978243"/>
+      <w:r>
         <w:t xml:space="preserve">2. </w:t>
       </w:r>
       <w:r>
@@ -3757,7 +3754,7 @@
           <w:left w:w="10" w:type="dxa"/>
           <w:right w:w="10" w:type="dxa"/>
         </w:tblCellMar>
-        <w:tblLook w:val="0000" w:firstRow="0" w:lastRow="0" w:firstColumn="0" w:lastColumn="0" w:noHBand="0" w:noVBand="0"/>
+        <w:tblLook w:val="04A0" w:firstRow="1" w:lastRow="0" w:firstColumn="1" w:lastColumn="0" w:noHBand="0" w:noVBand="1"/>
       </w:tblPr>
       <w:tblGrid>
         <w:gridCol w:w="1309"/>
@@ -4796,7 +4793,7 @@
           <w:left w:w="10" w:type="dxa"/>
           <w:right w:w="10" w:type="dxa"/>
         </w:tblCellMar>
-        <w:tblLook w:val="0000" w:firstRow="0" w:lastRow="0" w:firstColumn="0" w:lastColumn="0" w:noHBand="0" w:noVBand="0"/>
+        <w:tblLook w:val="04A0" w:firstRow="1" w:lastRow="0" w:firstColumn="1" w:lastColumn="0" w:noHBand="0" w:noVBand="1"/>
       </w:tblPr>
       <w:tblGrid>
         <w:gridCol w:w="1759"/>
@@ -5692,7 +5689,7 @@
                 <w:sz w:val="18"/>
                 <w:szCs w:val="18"/>
               </w:rPr>
-              <w:t>ส่งอีเมลจาก schartwu@gmail.com ด้วย App Password</w:t>
+              <w:t>ส่งอีเมลจากบัญชี Gmail ใน Secret SENDER_EMAIL ด้วย App Password</w:t>
             </w:r>
           </w:p>
         </w:tc>
@@ -5726,9 +5723,8 @@
         <w:pageBreakBefore/>
         <w:spacing w:before="360" w:after="160"/>
       </w:pPr>
-      <w:bookmarkStart w:id="4" w:name="_Toc242977848"/>
-      <w:r>
-        <w:lastRenderedPageBreak/>
+      <w:bookmarkStart w:id="4" w:name="_Toc242978244"/>
+      <w:r>
         <w:t xml:space="preserve">3. </w:t>
       </w:r>
       <w:r>
@@ -5751,7 +5747,7 @@
           <w:left w:w="10" w:type="dxa"/>
           <w:right w:w="10" w:type="dxa"/>
         </w:tblCellMar>
-        <w:tblLook w:val="0000" w:firstRow="0" w:lastRow="0" w:firstColumn="0" w:lastColumn="0" w:noHBand="0" w:noVBand="0"/>
+        <w:tblLook w:val="04A0" w:firstRow="1" w:lastRow="0" w:firstColumn="1" w:lastColumn="0" w:noHBand="0" w:noVBand="1"/>
       </w:tblPr>
       <w:tblGrid>
         <w:gridCol w:w="1393"/>
@@ -6436,7 +6432,7 @@
         <w:keepNext/>
         <w:spacing w:before="280" w:after="120"/>
       </w:pPr>
-      <w:bookmarkStart w:id="5" w:name="_Toc242977849"/>
+      <w:bookmarkStart w:id="5" w:name="_Toc242978245"/>
       <w:r>
         <w:t xml:space="preserve">3.1 Flow </w:t>
       </w:r>
@@ -6654,9 +6650,8 @@
         <w:pageBreakBefore/>
         <w:spacing w:before="360" w:after="160"/>
       </w:pPr>
-      <w:bookmarkStart w:id="6" w:name="_Toc242977850"/>
-      <w:r>
-        <w:lastRenderedPageBreak/>
+      <w:bookmarkStart w:id="6" w:name="_Toc242978246"/>
+      <w:r>
         <w:t xml:space="preserve">4. </w:t>
       </w:r>
       <w:r>
@@ -6708,7 +6703,7 @@
         <w:keepNext/>
         <w:spacing w:before="280" w:after="120"/>
       </w:pPr>
-      <w:bookmarkStart w:id="7" w:name="_Toc242977851"/>
+      <w:bookmarkStart w:id="7" w:name="_Toc242978247"/>
       <w:r>
         <w:t xml:space="preserve">4.1 RSS </w:t>
       </w:r>
@@ -6812,7 +6807,7 @@
           <w:left w:w="10" w:type="dxa"/>
           <w:right w:w="10" w:type="dxa"/>
         </w:tblCellMar>
-        <w:tblLook w:val="0000" w:firstRow="0" w:lastRow="0" w:firstColumn="0" w:lastColumn="0" w:noHBand="0" w:noVBand="0"/>
+        <w:tblLook w:val="04A0" w:firstRow="1" w:lastRow="0" w:firstColumn="1" w:lastColumn="0" w:noHBand="0" w:noVBand="1"/>
       </w:tblPr>
       <w:tblGrid>
         <w:gridCol w:w="1401"/>
@@ -7903,7 +7898,7 @@
         <w:keepNext/>
         <w:spacing w:before="280" w:after="120"/>
       </w:pPr>
-      <w:bookmarkStart w:id="8" w:name="_Toc242977852"/>
+      <w:bookmarkStart w:id="8" w:name="_Toc242978248"/>
       <w:r>
         <w:t xml:space="preserve">4.2 </w:t>
       </w:r>
@@ -8039,9 +8034,8 @@
         <w:keepNext/>
         <w:spacing w:before="280" w:after="120"/>
       </w:pPr>
-      <w:bookmarkStart w:id="9" w:name="_Toc242977853"/>
-      <w:r>
-        <w:lastRenderedPageBreak/>
+      <w:bookmarkStart w:id="9" w:name="_Toc242978249"/>
+      <w:r>
         <w:t xml:space="preserve">4.3 </w:t>
       </w:r>
       <w:r>
@@ -8064,7 +8058,7 @@
           <w:left w:w="10" w:type="dxa"/>
           <w:right w:w="10" w:type="dxa"/>
         </w:tblCellMar>
-        <w:tblLook w:val="0000" w:firstRow="0" w:lastRow="0" w:firstColumn="0" w:lastColumn="0" w:noHBand="0" w:noVBand="0"/>
+        <w:tblLook w:val="04A0" w:firstRow="1" w:lastRow="0" w:firstColumn="1" w:lastColumn="0" w:noHBand="0" w:noVBand="1"/>
       </w:tblPr>
       <w:tblGrid>
         <w:gridCol w:w="1285"/>
@@ -8675,9 +8669,8 @@
         <w:pageBreakBefore/>
         <w:spacing w:before="360" w:after="160"/>
       </w:pPr>
-      <w:bookmarkStart w:id="10" w:name="_Toc242977854"/>
-      <w:r>
-        <w:lastRenderedPageBreak/>
+      <w:bookmarkStart w:id="10" w:name="_Toc242978250"/>
+      <w:r>
         <w:t xml:space="preserve">5. </w:t>
       </w:r>
       <w:r>
@@ -8959,9 +8952,8 @@
         <w:pageBreakBefore/>
         <w:spacing w:before="360" w:after="160"/>
       </w:pPr>
-      <w:bookmarkStart w:id="11" w:name="_Toc242977855"/>
-      <w:r>
-        <w:lastRenderedPageBreak/>
+      <w:bookmarkStart w:id="11" w:name="_Toc242978251"/>
+      <w:r>
         <w:t xml:space="preserve">6. </w:t>
       </w:r>
       <w:r>
@@ -9043,7 +9035,7 @@
         <w:keepNext/>
         <w:spacing w:before="280" w:after="120"/>
       </w:pPr>
-      <w:bookmarkStart w:id="12" w:name="_Toc242977856"/>
+      <w:bookmarkStart w:id="12" w:name="_Toc242978252"/>
       <w:r>
         <w:t xml:space="preserve">6.1 </w:t>
       </w:r>
@@ -9168,7 +9160,7 @@
         <w:keepNext/>
         <w:spacing w:before="280" w:after="120"/>
       </w:pPr>
-      <w:bookmarkStart w:id="13" w:name="_Toc242977857"/>
+      <w:bookmarkStart w:id="13" w:name="_Toc242978253"/>
       <w:r>
         <w:t xml:space="preserve">6.2 </w:t>
       </w:r>
@@ -9200,7 +9192,7 @@
           <w:left w:w="10" w:type="dxa"/>
           <w:right w:w="10" w:type="dxa"/>
         </w:tblCellMar>
-        <w:tblLook w:val="0000" w:firstRow="0" w:lastRow="0" w:firstColumn="0" w:lastColumn="0" w:noHBand="0" w:noVBand="0"/>
+        <w:tblLook w:val="04A0" w:firstRow="1" w:lastRow="0" w:firstColumn="1" w:lastColumn="0" w:noHBand="0" w:noVBand="1"/>
       </w:tblPr>
       <w:tblGrid>
         <w:gridCol w:w="1716"/>
@@ -9434,7 +9426,7 @@
           <w:left w:w="10" w:type="dxa"/>
           <w:right w:w="10" w:type="dxa"/>
         </w:tblCellMar>
-        <w:tblLook w:val="0000" w:firstRow="0" w:lastRow="0" w:firstColumn="0" w:lastColumn="0" w:noHBand="0" w:noVBand="0"/>
+        <w:tblLook w:val="04A0" w:firstRow="1" w:lastRow="0" w:firstColumn="1" w:lastColumn="0" w:noHBand="0" w:noVBand="1"/>
       </w:tblPr>
       <w:tblGrid>
         <w:gridCol w:w="8032"/>
@@ -10001,7 +9993,7 @@
         <w:keepNext/>
         <w:spacing w:before="280" w:after="120"/>
       </w:pPr>
-      <w:bookmarkStart w:id="14" w:name="_Toc242977858"/>
+      <w:bookmarkStart w:id="14" w:name="_Toc242978254"/>
       <w:r>
         <w:t xml:space="preserve">6.3 Prompt </w:t>
       </w:r>
@@ -10210,7 +10202,6 @@
           <w:sz w:val="18"/>
           <w:szCs w:val="18"/>
         </w:rPr>
-        <w:lastRenderedPageBreak/>
         <w:t xml:space="preserve">  </w:t>
       </w:r>
       <w:r>
@@ -10663,9 +10654,8 @@
         <w:pageBreakBefore/>
         <w:spacing w:before="360" w:after="160"/>
       </w:pPr>
-      <w:bookmarkStart w:id="15" w:name="_Toc242977859"/>
-      <w:r>
-        <w:lastRenderedPageBreak/>
+      <w:bookmarkStart w:id="15" w:name="_Toc242978255"/>
+      <w:r>
         <w:t xml:space="preserve">7. </w:t>
       </w:r>
       <w:r>
@@ -10788,7 +10778,7 @@
           <w:left w:w="10" w:type="dxa"/>
           <w:right w:w="10" w:type="dxa"/>
         </w:tblCellMar>
-        <w:tblLook w:val="0000" w:firstRow="0" w:lastRow="0" w:firstColumn="0" w:lastColumn="0" w:noHBand="0" w:noVBand="0"/>
+        <w:tblLook w:val="04A0" w:firstRow="1" w:lastRow="0" w:firstColumn="1" w:lastColumn="0" w:noHBand="0" w:noVBand="1"/>
       </w:tblPr>
       <w:tblGrid>
         <w:gridCol w:w="2433"/>
@@ -11333,7 +11323,7 @@
         <w:keepNext/>
         <w:spacing w:before="280" w:after="120"/>
       </w:pPr>
-      <w:bookmarkStart w:id="16" w:name="_Toc242977860"/>
+      <w:bookmarkStart w:id="16" w:name="_Toc242978256"/>
       <w:r>
         <w:t xml:space="preserve">7.1 </w:t>
       </w:r>
@@ -11368,7 +11358,7 @@
           <w:left w:w="10" w:type="dxa"/>
           <w:right w:w="10" w:type="dxa"/>
         </w:tblCellMar>
-        <w:tblLook w:val="0000" w:firstRow="0" w:lastRow="0" w:firstColumn="0" w:lastColumn="0" w:noHBand="0" w:noVBand="0"/>
+        <w:tblLook w:val="04A0" w:firstRow="1" w:lastRow="0" w:firstColumn="1" w:lastColumn="0" w:noHBand="0" w:noVBand="1"/>
       </w:tblPr>
       <w:tblGrid>
         <w:gridCol w:w="6425"/>
@@ -11791,7 +11781,7 @@
         <w:keepNext/>
         <w:spacing w:before="280" w:after="120"/>
       </w:pPr>
-      <w:bookmarkStart w:id="17" w:name="_Toc242977861"/>
+      <w:bookmarkStart w:id="17" w:name="_Toc242978257"/>
       <w:r>
         <w:t xml:space="preserve">7.2 </w:t>
       </w:r>
@@ -11915,9 +11905,8 @@
         <w:pageBreakBefore/>
         <w:spacing w:before="360" w:after="160"/>
       </w:pPr>
-      <w:bookmarkStart w:id="18" w:name="_Toc242977862"/>
-      <w:r>
-        <w:lastRenderedPageBreak/>
+      <w:bookmarkStart w:id="18" w:name="_Toc242978258"/>
+      <w:r>
         <w:t xml:space="preserve">8. </w:t>
       </w:r>
       <w:r>
@@ -11978,7 +11967,7 @@
         <w:keepNext/>
         <w:spacing w:before="280" w:after="120"/>
       </w:pPr>
-      <w:bookmarkStart w:id="19" w:name="_Toc242977863"/>
+      <w:bookmarkStart w:id="19" w:name="_Toc242978259"/>
       <w:r>
         <w:t xml:space="preserve">8.1 </w:t>
       </w:r>
@@ -12002,7 +11991,7 @@
           <w:left w:w="10" w:type="dxa"/>
           <w:right w:w="10" w:type="dxa"/>
         </w:tblCellMar>
-        <w:tblLook w:val="0000" w:firstRow="0" w:lastRow="0" w:firstColumn="0" w:lastColumn="0" w:noHBand="0" w:noVBand="0"/>
+        <w:tblLook w:val="04A0" w:firstRow="1" w:lastRow="0" w:firstColumn="1" w:lastColumn="0" w:noHBand="0" w:noVBand="1"/>
       </w:tblPr>
       <w:tblGrid>
         <w:gridCol w:w="1555"/>
@@ -12744,7 +12733,7 @@
         <w:keepNext/>
         <w:spacing w:before="280" w:after="120"/>
       </w:pPr>
-      <w:bookmarkStart w:id="20" w:name="_Toc242977864"/>
+      <w:bookmarkStart w:id="20" w:name="_Toc242978260"/>
       <w:r>
         <w:t xml:space="preserve">8.2 </w:t>
       </w:r>
@@ -13141,7 +13130,6 @@
           <w:sz w:val="18"/>
           <w:szCs w:val="18"/>
         </w:rPr>
-        <w:lastRenderedPageBreak/>
         <w:t xml:space="preserve"> </w:t>
       </w:r>
     </w:p>
@@ -13187,9 +13175,8 @@
         <w:pageBreakBefore/>
         <w:spacing w:before="360" w:after="160"/>
       </w:pPr>
-      <w:bookmarkStart w:id="21" w:name="_Toc242977865"/>
-      <w:r>
-        <w:lastRenderedPageBreak/>
+      <w:bookmarkStart w:id="21" w:name="_Toc242978261"/>
+      <w:r>
         <w:t xml:space="preserve">9. </w:t>
       </w:r>
       <w:r>
@@ -13262,7 +13249,7 @@
         <w:keepNext/>
         <w:spacing w:before="280" w:after="120"/>
       </w:pPr>
-      <w:bookmarkStart w:id="22" w:name="_Toc242977866"/>
+      <w:bookmarkStart w:id="22" w:name="_Toc242978262"/>
       <w:r>
         <w:t xml:space="preserve">9.1 </w:t>
       </w:r>
@@ -13352,7 +13339,7 @@
           <w:left w:w="10" w:type="dxa"/>
           <w:right w:w="10" w:type="dxa"/>
         </w:tblCellMar>
-        <w:tblLook w:val="0000" w:firstRow="0" w:lastRow="0" w:firstColumn="0" w:lastColumn="0" w:noHBand="0" w:noVBand="0"/>
+        <w:tblLook w:val="04A0" w:firstRow="1" w:lastRow="0" w:firstColumn="1" w:lastColumn="0" w:noHBand="0" w:noVBand="1"/>
       </w:tblPr>
       <w:tblGrid>
         <w:gridCol w:w="4889"/>
@@ -14378,7 +14365,7 @@
         <w:keepNext/>
         <w:spacing w:before="280" w:after="120"/>
       </w:pPr>
-      <w:bookmarkStart w:id="23" w:name="_Toc242977867"/>
+      <w:bookmarkStart w:id="23" w:name="_Toc242978263"/>
       <w:r>
         <w:t xml:space="preserve">9.2 </w:t>
       </w:r>
@@ -14501,7 +14488,16 @@
           <w:sz w:val="17"/>
           <w:szCs w:val="17"/>
         </w:rPr>
-        <w:t>--to a@b.com</w:t>
+        <w:t>--to &lt;</w:t>
+      </w:r>
+      <w:r>
+        <w:rPr>
+          <w:rFonts w:ascii="Consolas" w:eastAsia="Consolas" w:hAnsi="Consolas" w:cs="Consolas"/>
+          <w:color w:val="2D4A8A"/>
+          <w:sz w:val="17"/>
+          <w:szCs w:val="17"/>
+        </w:rPr>
+        <w:t>อีเมล&gt;</w:t>
       </w:r>
       <w:r>
         <w:t xml:space="preserve"> = </w:t>
@@ -14529,7 +14525,7 @@
         <w:keepNext/>
         <w:spacing w:before="280" w:after="120"/>
       </w:pPr>
-      <w:bookmarkStart w:id="24" w:name="_Toc242977868"/>
+      <w:bookmarkStart w:id="24" w:name="_Toc242978264"/>
       <w:r>
         <w:t xml:space="preserve">9.3 </w:t>
       </w:r>
@@ -14582,9 +14578,8 @@
         <w:pageBreakBefore/>
         <w:spacing w:before="360" w:after="160"/>
       </w:pPr>
-      <w:bookmarkStart w:id="25" w:name="_Toc242977869"/>
-      <w:r>
-        <w:lastRenderedPageBreak/>
+      <w:bookmarkStart w:id="25" w:name="_Toc242978265"/>
+      <w:r>
         <w:t xml:space="preserve">10. </w:t>
       </w:r>
       <w:r>
@@ -14598,7 +14593,7 @@
         <w:keepNext/>
         <w:spacing w:before="280" w:after="120"/>
       </w:pPr>
-      <w:bookmarkStart w:id="26" w:name="_Toc242977870"/>
+      <w:bookmarkStart w:id="26" w:name="_Toc242978266"/>
       <w:r>
         <w:t xml:space="preserve">10.1 </w:t>
       </w:r>
@@ -14636,7 +14631,7 @@
         <w:keepNext/>
         <w:spacing w:before="280" w:after="120"/>
       </w:pPr>
-      <w:bookmarkStart w:id="27" w:name="_Toc242977871"/>
+      <w:bookmarkStart w:id="27" w:name="_Toc242978267"/>
       <w:r>
         <w:t xml:space="preserve">10.2 </w:t>
       </w:r>
@@ -14698,9 +14693,8 @@
         <w:pageBreakBefore/>
         <w:spacing w:before="360" w:after="160"/>
       </w:pPr>
-      <w:bookmarkStart w:id="28" w:name="_Toc242977872"/>
-      <w:r>
-        <w:lastRenderedPageBreak/>
+      <w:bookmarkStart w:id="28" w:name="_Toc242978268"/>
+      <w:r>
         <w:t xml:space="preserve">11. </w:t>
       </w:r>
       <w:r>
@@ -14714,7 +14708,7 @@
         <w:keepNext/>
         <w:spacing w:before="280" w:after="120"/>
       </w:pPr>
-      <w:bookmarkStart w:id="29" w:name="_Toc242977873"/>
+      <w:bookmarkStart w:id="29" w:name="_Toc242978269"/>
       <w:r>
         <w:t xml:space="preserve">11.0 </w:t>
       </w:r>
@@ -14858,22 +14852,10 @@
         <w:t>egp-alert-v3</w:t>
       </w:r>
       <w:r>
-        <w:t xml:space="preserve"> (id </w:t>
-      </w:r>
-      <w:r>
-        <w:rPr>
-          <w:rFonts w:ascii="Consolas" w:eastAsia="Consolas" w:hAnsi="Consolas" w:cs="Consolas"/>
-          <w:color w:val="2D4A8A"/>
-          <w:sz w:val="17"/>
-          <w:szCs w:val="17"/>
-        </w:rPr>
-        <w:t>riijevairavovwagzdiv</w:t>
-      </w:r>
-      <w:r>
-        <w:t xml:space="preserve">, </w:t>
-      </w:r>
-      <w:r>
-        <w:t xml:space="preserve">ภูมิภาค ap-southeast-1) ทุกตารางเปิด Row Level Security และไม่มี policy ให้ใครอ่าน มีเพียงโค้ดบน GitHub ที่ใช้ service role key เข้าถึงได้ ไฟล์สร้างทั้งหมดอยู่ใน </w:t>
+        <w:t xml:space="preserve"> (</w:t>
+      </w:r>
+      <w:r>
+        <w:t xml:space="preserve">ภูมิภาค ap-southeast-1 · ดูรหัส project ได้ใน Supabase Dashboard) ทุกตารางเปิด Row Level Security และไม่มี policy ให้ใครอ่าน มีเพียงโค้ดบน GitHub ที่ใช้ service role key เข้าถึงได้ ไฟล์สร้างทั้งหมดอยู่ใน </w:t>
       </w:r>
       <w:r>
         <w:rPr>
@@ -14897,7 +14879,7 @@
         <w:keepNext/>
         <w:spacing w:before="280" w:after="120"/>
       </w:pPr>
-      <w:bookmarkStart w:id="30" w:name="_Toc242977874"/>
+      <w:bookmarkStart w:id="30" w:name="_Toc242978270"/>
       <w:r>
         <w:t xml:space="preserve">11.1 </w:t>
       </w:r>
@@ -14921,7 +14903,7 @@
           <w:left w:w="10" w:type="dxa"/>
           <w:right w:w="10" w:type="dxa"/>
         </w:tblCellMar>
-        <w:tblLook w:val="0000" w:firstRow="0" w:lastRow="0" w:firstColumn="0" w:lastColumn="0" w:noHBand="0" w:noVBand="0"/>
+        <w:tblLook w:val="04A0" w:firstRow="1" w:lastRow="0" w:firstColumn="1" w:lastColumn="0" w:noHBand="0" w:noVBand="1"/>
       </w:tblPr>
       <w:tblGrid>
         <w:gridCol w:w="1988"/>
@@ -15904,7 +15886,7 @@
         <w:keepNext/>
         <w:spacing w:before="280" w:after="120"/>
       </w:pPr>
-      <w:bookmarkStart w:id="31" w:name="_Toc242977875"/>
+      <w:bookmarkStart w:id="31" w:name="_Toc242978271"/>
       <w:r>
         <w:t xml:space="preserve">11.2 </w:t>
       </w:r>
@@ -15928,7 +15910,7 @@
           <w:left w:w="10" w:type="dxa"/>
           <w:right w:w="10" w:type="dxa"/>
         </w:tblCellMar>
-        <w:tblLook w:val="0000" w:firstRow="0" w:lastRow="0" w:firstColumn="0" w:lastColumn="0" w:noHBand="0" w:noVBand="0"/>
+        <w:tblLook w:val="04A0" w:firstRow="1" w:lastRow="0" w:firstColumn="1" w:lastColumn="0" w:noHBand="0" w:noVBand="1"/>
       </w:tblPr>
       <w:tblGrid>
         <w:gridCol w:w="3614"/>
@@ -16366,7 +16348,6 @@
                 <w:sz w:val="18"/>
                 <w:szCs w:val="18"/>
               </w:rPr>
-              <w:lastRenderedPageBreak/>
               <w:t>unclassified_titles(types, limit)</w:t>
             </w:r>
           </w:p>
@@ -17102,7 +17083,7 @@
         <w:keepNext/>
         <w:spacing w:before="280" w:after="120"/>
       </w:pPr>
-      <w:bookmarkStart w:id="32" w:name="_Toc242977876"/>
+      <w:bookmarkStart w:id="32" w:name="_Toc242978272"/>
       <w:r>
         <w:t xml:space="preserve">11.3 </w:t>
       </w:r>
@@ -17126,7 +17107,7 @@
           <w:left w:w="10" w:type="dxa"/>
           <w:right w:w="10" w:type="dxa"/>
         </w:tblCellMar>
-        <w:tblLook w:val="0000" w:firstRow="0" w:lastRow="0" w:firstColumn="0" w:lastColumn="0" w:noHBand="0" w:noVBand="0"/>
+        <w:tblLook w:val="04A0" w:firstRow="1" w:lastRow="0" w:firstColumn="1" w:lastColumn="0" w:noHBand="0" w:noVBand="1"/>
       </w:tblPr>
       <w:tblGrid>
         <w:gridCol w:w="2536"/>
@@ -17827,9 +17808,8 @@
         <w:pageBreakBefore/>
         <w:spacing w:before="360" w:after="160"/>
       </w:pPr>
-      <w:bookmarkStart w:id="33" w:name="_Toc242977877"/>
-      <w:r>
-        <w:lastRenderedPageBreak/>
+      <w:bookmarkStart w:id="33" w:name="_Toc242978273"/>
+      <w:r>
         <w:t xml:space="preserve">12. </w:t>
       </w:r>
       <w:r>
@@ -17843,7 +17823,7 @@
         <w:keepNext/>
         <w:spacing w:before="280" w:after="120"/>
       </w:pPr>
-      <w:bookmarkStart w:id="34" w:name="_Toc242977878"/>
+      <w:bookmarkStart w:id="34" w:name="_Toc242978274"/>
       <w:r>
         <w:t>12.1 GitHub Workflows (.github/workflows/)</w:t>
       </w:r>
@@ -17864,7 +17844,7 @@
           <w:left w:w="10" w:type="dxa"/>
           <w:right w:w="10" w:type="dxa"/>
         </w:tblCellMar>
-        <w:tblLook w:val="0000" w:firstRow="0" w:lastRow="0" w:firstColumn="0" w:lastColumn="0" w:noHBand="0" w:noVBand="0"/>
+        <w:tblLook w:val="04A0" w:firstRow="1" w:lastRow="0" w:firstColumn="1" w:lastColumn="0" w:noHBand="0" w:noVBand="1"/>
       </w:tblPr>
       <w:tblGrid>
         <w:gridCol w:w="1547"/>
@@ -18825,7 +18805,7 @@
         <w:keepNext/>
         <w:spacing w:before="280" w:after="120"/>
       </w:pPr>
-      <w:bookmarkStart w:id="35" w:name="_Toc242977879"/>
+      <w:bookmarkStart w:id="35" w:name="_Toc242978275"/>
       <w:r>
         <w:t xml:space="preserve">12.2 </w:t>
       </w:r>
@@ -18849,7 +18829,7 @@
           <w:left w:w="10" w:type="dxa"/>
           <w:right w:w="10" w:type="dxa"/>
         </w:tblCellMar>
-        <w:tblLook w:val="0000" w:firstRow="0" w:lastRow="0" w:firstColumn="0" w:lastColumn="0" w:noHBand="0" w:noVBand="0"/>
+        <w:tblLook w:val="04A0" w:firstRow="1" w:lastRow="0" w:firstColumn="1" w:lastColumn="0" w:noHBand="0" w:noVBand="1"/>
       </w:tblPr>
       <w:tblGrid>
         <w:gridCol w:w="2410"/>
@@ -20233,9 +20213,8 @@
         <w:pageBreakBefore/>
         <w:spacing w:before="360" w:after="160"/>
       </w:pPr>
-      <w:bookmarkStart w:id="36" w:name="_Toc242977880"/>
-      <w:r>
-        <w:lastRenderedPageBreak/>
+      <w:bookmarkStart w:id="36" w:name="_Toc242978276"/>
+      <w:r>
         <w:t xml:space="preserve">13. </w:t>
       </w:r>
       <w:r>
@@ -20258,13 +20237,13 @@
           <w:left w:w="10" w:type="dxa"/>
           <w:right w:w="10" w:type="dxa"/>
         </w:tblCellMar>
-        <w:tblLook w:val="0000" w:firstRow="0" w:lastRow="0" w:firstColumn="0" w:lastColumn="0" w:noHBand="0" w:noVBand="0"/>
+        <w:tblLook w:val="04A0" w:firstRow="1" w:lastRow="0" w:firstColumn="1" w:lastColumn="0" w:noHBand="0" w:noVBand="1"/>
       </w:tblPr>
       <w:tblGrid>
-        <w:gridCol w:w="2773"/>
-        <w:gridCol w:w="1497"/>
-        <w:gridCol w:w="1940"/>
-        <w:gridCol w:w="3428"/>
+        <w:gridCol w:w="2774"/>
+        <w:gridCol w:w="1548"/>
+        <w:gridCol w:w="1965"/>
+        <w:gridCol w:w="3351"/>
       </w:tblGrid>
       <w:tr>
         <w:tblPrEx>
@@ -20524,7 +20503,14 @@
                 <w:sz w:val="18"/>
                 <w:szCs w:val="18"/>
               </w:rPr>
-              <w:t>https://riijevairavovwagzdiv.supabase.co</w:t>
+              <w:t xml:space="preserve">URL </w:t>
+            </w:r>
+            <w:r>
+              <w:rPr>
+                <w:sz w:val="18"/>
+                <w:szCs w:val="18"/>
+              </w:rPr>
+              <w:t>ของ project (Supabase → Project Settings → API)</w:t>
             </w:r>
           </w:p>
         </w:tc>
@@ -20896,7 +20882,7 @@
                 <w:sz w:val="18"/>
                 <w:szCs w:val="18"/>
               </w:rPr>
-              <w:t>schartwu@gmail.com + Gmail App Password</w:t>
+              <w:t>บัญชี Gmail ผู้ส่ง + Gmail App Password</w:t>
             </w:r>
           </w:p>
         </w:tc>
@@ -21287,9 +21273,8 @@
         <w:pageBreakBefore/>
         <w:spacing w:before="360" w:after="160"/>
       </w:pPr>
-      <w:bookmarkStart w:id="37" w:name="_Toc242977881"/>
-      <w:r>
-        <w:lastRenderedPageBreak/>
+      <w:bookmarkStart w:id="37" w:name="_Toc242978277"/>
+      <w:r>
         <w:t xml:space="preserve">14. </w:t>
       </w:r>
       <w:r>
@@ -21303,7 +21288,7 @@
         <w:keepNext/>
         <w:spacing w:before="280" w:after="120"/>
       </w:pPr>
-      <w:bookmarkStart w:id="38" w:name="_Toc242977882"/>
+      <w:bookmarkStart w:id="38" w:name="_Toc242978278"/>
       <w:r>
         <w:t xml:space="preserve">14.1 </w:t>
       </w:r>
@@ -21327,7 +21312,7 @@
           <w:left w:w="10" w:type="dxa"/>
           <w:right w:w="10" w:type="dxa"/>
         </w:tblCellMar>
-        <w:tblLook w:val="0000" w:firstRow="0" w:lastRow="0" w:firstColumn="0" w:lastColumn="0" w:noHBand="0" w:noVBand="0"/>
+        <w:tblLook w:val="04A0" w:firstRow="1" w:lastRow="0" w:firstColumn="1" w:lastColumn="0" w:noHBand="0" w:noVBand="1"/>
       </w:tblPr>
       <w:tblGrid>
         <w:gridCol w:w="2754"/>
@@ -21980,7 +21965,7 @@
         <w:keepNext/>
         <w:spacing w:before="280" w:after="120"/>
       </w:pPr>
-      <w:bookmarkStart w:id="39" w:name="_Toc242977883"/>
+      <w:bookmarkStart w:id="39" w:name="_Toc242978279"/>
       <w:r>
         <w:t xml:space="preserve">14.2 </w:t>
       </w:r>
@@ -22004,7 +21989,7 @@
           <w:left w:w="10" w:type="dxa"/>
           <w:right w:w="10" w:type="dxa"/>
         </w:tblCellMar>
-        <w:tblLook w:val="0000" w:firstRow="0" w:lastRow="0" w:firstColumn="0" w:lastColumn="0" w:noHBand="0" w:noVBand="0"/>
+        <w:tblLook w:val="04A0" w:firstRow="1" w:lastRow="0" w:firstColumn="1" w:lastColumn="0" w:noHBand="0" w:noVBand="1"/>
       </w:tblPr>
       <w:tblGrid>
         <w:gridCol w:w="3037"/>
@@ -22744,7 +22729,7 @@
         <w:keepNext/>
         <w:spacing w:before="280" w:after="120"/>
       </w:pPr>
-      <w:bookmarkStart w:id="40" w:name="_Toc242977884"/>
+      <w:bookmarkStart w:id="40" w:name="_Toc242978280"/>
       <w:r>
         <w:t xml:space="preserve">14.3 </w:t>
       </w:r>
@@ -22827,9 +22812,8 @@
         <w:pageBreakBefore/>
         <w:spacing w:before="360" w:after="160"/>
       </w:pPr>
-      <w:bookmarkStart w:id="41" w:name="_Toc242977885"/>
-      <w:r>
-        <w:lastRenderedPageBreak/>
+      <w:bookmarkStart w:id="41" w:name="_Toc242978281"/>
+      <w:r>
         <w:t>ภาคผนวก</w:t>
       </w:r>
       <w:bookmarkEnd w:id="41"/>
@@ -22840,7 +22824,7 @@
         <w:keepNext/>
         <w:spacing w:before="280" w:after="120"/>
       </w:pPr>
-      <w:bookmarkStart w:id="42" w:name="_Toc242977886"/>
+      <w:bookmarkStart w:id="42" w:name="_Toc242978282"/>
       <w:r>
         <w:t>ก. รหัสวิธีจัดหา (methodId)</w:t>
       </w:r>
@@ -22861,7 +22845,7 @@
           <w:left w:w="10" w:type="dxa"/>
           <w:right w:w="10" w:type="dxa"/>
         </w:tblCellMar>
-        <w:tblLook w:val="0000" w:firstRow="0" w:lastRow="0" w:firstColumn="0" w:lastColumn="0" w:noHBand="0" w:noVBand="0"/>
+        <w:tblLook w:val="04A0" w:firstRow="1" w:lastRow="0" w:firstColumn="1" w:lastColumn="0" w:noHBand="0" w:noVBand="1"/>
       </w:tblPr>
       <w:tblGrid>
         <w:gridCol w:w="1606"/>
@@ -23746,7 +23730,7 @@
         <w:keepNext/>
         <w:spacing w:before="280" w:after="120"/>
       </w:pPr>
-      <w:bookmarkStart w:id="43" w:name="_Toc242977887"/>
+      <w:bookmarkStart w:id="43" w:name="_Toc242978283"/>
       <w:r>
         <w:t>ข. ผลสำคัญจาก Phase 0</w:t>
       </w:r>
@@ -23923,10 +23907,10 @@
 <file path=word/numbering.xml><?xml version="1.0" encoding="utf-8"?>
 <w:numbering xmlns:wpc="http://schemas.microsoft.com/office/word/2010/wordprocessingCanvas" xmlns:cx="http://schemas.microsoft.com/office/drawing/2014/chartex" xmlns:cx1="http://schemas.microsoft.com/office/drawing/2015/9/8/chartex" xmlns:cx2="http://schemas.microsoft.com/office/drawing/2015/10/21/chartex" xmlns:cx3="http://schemas.microsoft.com/office/drawing/2016/5/9/chartex" xmlns:cx4="http://schemas.microsoft.com/office/drawing/2016/5/10/chartex" xmlns:cx5="http://schemas.microsoft.com/office/drawing/2016/5/11/chartex" xmlns:cx6="http://schemas.microsoft.com/office/drawing/2016/5/12/chartex" xmlns:cx7="http://schemas.microsoft.com/office/drawing/2016/5/13/chartex" xmlns:cx8="http://schemas.microsoft.com/office/drawing/2016/5/14/chartex" xmlns:mc="http://schemas.openxmlformats.org/markup-compatibility/2006" xmlns:aink="http://schemas.microsoft.com/office/drawing/2016/ink" xmlns:am3d="http://schemas.microsoft.com/office/drawing/2017/model3d" xmlns:o="urn:schemas-microsoft-com:office:office" xmlns:oel="http://schemas.microsoft.com/office/2019/extlst" xmlns:r="http://schemas.openxmlformats.org/officeDocument/2006/relationships" xmlns:m="http://schemas.openxmlformats.org/officeDocument/2006/math" xmlns:v="urn:schemas-microsoft-com:vml" xmlns:wp14="http://schemas.microsoft.com/office/word/2010/wordprocessingDrawing" xmlns:wp="http://schemas.openxmlformats.org/drawingml/2006/wordprocessingDrawing" xmlns:w10="urn:schemas-microsoft-com:office:word" xmlns:w="http://schemas.openxmlformats.org/wordprocessingml/2006/main" xmlns:w14="http://schemas.microsoft.com/office/word/2010/wordml" xmlns:w15="http://schemas.microsoft.com/office/word/2012/wordml" xmlns:w16cex="http://schemas.microsoft.com/office/word/2018/wordml/cex" xmlns:w16cid="http://schemas.microsoft.com/office/word/2016/wordml/cid" xmlns:w16="http://schemas.microsoft.com/office/word/2018/wordml" xmlns:w16du="http://schemas.microsoft.com/office/word/2023/wordml/word16du" xmlns:w16sdtdh="http://schemas.microsoft.com/office/word/2020/wordml/sdtdatahash" xmlns:w16sdtfl="http://schemas.microsoft.com/office/word/2024/wordml/sdtformatlock" xmlns:w16se="http://schemas.microsoft.com/office/word/2015/wordml/symex" xmlns:wpg="http://schemas.microsoft.com/office/word/2010/wordprocessingGroup" xmlns:wpi="http://schemas.microsoft.com/office/word/2010/wordprocessingInk" xmlns:wne="http://schemas.microsoft.com/office/word/2006/wordml" xmlns:wps="http://schemas.microsoft.com/office/word/2010/wordprocessingShape" mc:Ignorable="w14 w15 w16se w16cid w16 w16cex w16sdtdh w16sdtfl w16du wp14">
   <w:abstractNum w:abstractNumId="0" w15:restartNumberingAfterBreak="0">
-    <w:nsid w:val="112C6B3F"/>
+    <w:nsid w:val="05ED7297"/>
     <w:multiLevelType w:val="hybridMultilevel"/>
-    <w:tmpl w:val="26700208"/>
-    <w:lvl w:ilvl="0" w:tplc="28EA0E28">
+    <w:tmpl w:val="A1441900"/>
+    <w:lvl w:ilvl="0" w:tplc="8CA40C34">
       <w:start w:val="1"/>
       <w:numFmt w:val="decimal"/>
       <w:lvlText w:val="%1."/>
@@ -23935,52 +23919,52 @@
         <w:ind w:left="540" w:hanging="360"/>
       </w:pPr>
     </w:lvl>
-    <w:lvl w:ilvl="1" w:tplc="94D2BBC6">
+    <w:lvl w:ilvl="1" w:tplc="615A1852">
       <w:numFmt w:val="decimal"/>
       <w:lvlText w:val=""/>
       <w:lvlJc w:val="left"/>
     </w:lvl>
-    <w:lvl w:ilvl="2" w:tplc="4B9E7A3E">
+    <w:lvl w:ilvl="2" w:tplc="5C024058">
       <w:numFmt w:val="decimal"/>
       <w:lvlText w:val=""/>
       <w:lvlJc w:val="left"/>
     </w:lvl>
-    <w:lvl w:ilvl="3" w:tplc="3FAC2CCA">
+    <w:lvl w:ilvl="3" w:tplc="FC9459DC">
       <w:numFmt w:val="decimal"/>
       <w:lvlText w:val=""/>
       <w:lvlJc w:val="left"/>
     </w:lvl>
-    <w:lvl w:ilvl="4" w:tplc="A252D5AA">
+    <w:lvl w:ilvl="4" w:tplc="B57277F2">
       <w:numFmt w:val="decimal"/>
       <w:lvlText w:val=""/>
       <w:lvlJc w:val="left"/>
     </w:lvl>
-    <w:lvl w:ilvl="5" w:tplc="63089EF4">
+    <w:lvl w:ilvl="5" w:tplc="E4C26976">
       <w:numFmt w:val="decimal"/>
       <w:lvlText w:val=""/>
       <w:lvlJc w:val="left"/>
     </w:lvl>
-    <w:lvl w:ilvl="6" w:tplc="6A641E6E">
+    <w:lvl w:ilvl="6" w:tplc="5C824C36">
       <w:numFmt w:val="decimal"/>
       <w:lvlText w:val=""/>
       <w:lvlJc w:val="left"/>
     </w:lvl>
-    <w:lvl w:ilvl="7" w:tplc="C046F264">
+    <w:lvl w:ilvl="7" w:tplc="301E4800">
       <w:numFmt w:val="decimal"/>
       <w:lvlText w:val=""/>
       <w:lvlJc w:val="left"/>
     </w:lvl>
-    <w:lvl w:ilvl="8" w:tplc="B0F42E66">
+    <w:lvl w:ilvl="8" w:tplc="B4EAFDA4">
       <w:numFmt w:val="decimal"/>
       <w:lvlText w:val=""/>
       <w:lvlJc w:val="left"/>
     </w:lvl>
   </w:abstractNum>
   <w:abstractNum w:abstractNumId="1" w15:restartNumberingAfterBreak="0">
-    <w:nsid w:val="38AB49B8"/>
+    <w:nsid w:val="2FDA6CBE"/>
     <w:multiLevelType w:val="hybridMultilevel"/>
-    <w:tmpl w:val="BE22C3D4"/>
-    <w:lvl w:ilvl="0" w:tplc="36060340">
+    <w:tmpl w:val="1896A8B8"/>
+    <w:lvl w:ilvl="0" w:tplc="08B43554">
       <w:start w:val="1"/>
       <w:numFmt w:val="decimal"/>
       <w:lvlText w:val="%1."/>
@@ -23989,52 +23973,164 @@
         <w:ind w:left="540" w:hanging="360"/>
       </w:pPr>
     </w:lvl>
-    <w:lvl w:ilvl="1" w:tplc="065C3B12">
+    <w:lvl w:ilvl="1" w:tplc="64EC26F4">
       <w:numFmt w:val="decimal"/>
       <w:lvlText w:val=""/>
       <w:lvlJc w:val="left"/>
     </w:lvl>
-    <w:lvl w:ilvl="2" w:tplc="6EB0E35E">
+    <w:lvl w:ilvl="2" w:tplc="C07E1634">
       <w:numFmt w:val="decimal"/>
       <w:lvlText w:val=""/>
       <w:lvlJc w:val="left"/>
     </w:lvl>
-    <w:lvl w:ilvl="3" w:tplc="1E24A418">
+    <w:lvl w:ilvl="3" w:tplc="39722B44">
       <w:numFmt w:val="decimal"/>
       <w:lvlText w:val=""/>
       <w:lvlJc w:val="left"/>
     </w:lvl>
-    <w:lvl w:ilvl="4" w:tplc="D3CE3688">
+    <w:lvl w:ilvl="4" w:tplc="3612CA32">
       <w:numFmt w:val="decimal"/>
       <w:lvlText w:val=""/>
       <w:lvlJc w:val="left"/>
     </w:lvl>
-    <w:lvl w:ilvl="5" w:tplc="8CA2AC24">
+    <w:lvl w:ilvl="5" w:tplc="8ACC3B84">
       <w:numFmt w:val="decimal"/>
       <w:lvlText w:val=""/>
       <w:lvlJc w:val="left"/>
     </w:lvl>
-    <w:lvl w:ilvl="6" w:tplc="55D44042">
+    <w:lvl w:ilvl="6" w:tplc="CA14111C">
       <w:numFmt w:val="decimal"/>
       <w:lvlText w:val=""/>
       <w:lvlJc w:val="left"/>
     </w:lvl>
-    <w:lvl w:ilvl="7" w:tplc="91FA9718">
+    <w:lvl w:ilvl="7" w:tplc="C1383908">
       <w:numFmt w:val="decimal"/>
       <w:lvlText w:val=""/>
       <w:lvlJc w:val="left"/>
     </w:lvl>
-    <w:lvl w:ilvl="8" w:tplc="D904F1DC">
+    <w:lvl w:ilvl="8" w:tplc="5F246FC0">
       <w:numFmt w:val="decimal"/>
       <w:lvlText w:val=""/>
       <w:lvlJc w:val="left"/>
     </w:lvl>
   </w:abstractNum>
   <w:abstractNum w:abstractNumId="2" w15:restartNumberingAfterBreak="0">
-    <w:nsid w:val="404142A9"/>
+    <w:nsid w:val="36B62103"/>
     <w:multiLevelType w:val="hybridMultilevel"/>
-    <w:tmpl w:val="539ACB30"/>
-    <w:lvl w:ilvl="0" w:tplc="69182072">
+    <w:tmpl w:val="58984986"/>
+    <w:lvl w:ilvl="0" w:tplc="23D04DFA">
+      <w:start w:val="1"/>
+      <w:numFmt w:val="decimal"/>
+      <w:lvlText w:val="%1."/>
+      <w:lvlJc w:val="left"/>
+      <w:pPr>
+        <w:ind w:left="540" w:hanging="360"/>
+      </w:pPr>
+    </w:lvl>
+    <w:lvl w:ilvl="1" w:tplc="F1526AD6">
+      <w:numFmt w:val="decimal"/>
+      <w:lvlText w:val=""/>
+      <w:lvlJc w:val="left"/>
+    </w:lvl>
+    <w:lvl w:ilvl="2" w:tplc="19E859AC">
+      <w:numFmt w:val="decimal"/>
+      <w:lvlText w:val=""/>
+      <w:lvlJc w:val="left"/>
+    </w:lvl>
+    <w:lvl w:ilvl="3" w:tplc="86A4DBC6">
+      <w:numFmt w:val="decimal"/>
+      <w:lvlText w:val=""/>
+      <w:lvlJc w:val="left"/>
+    </w:lvl>
+    <w:lvl w:ilvl="4" w:tplc="EDD6D23E">
+      <w:numFmt w:val="decimal"/>
+      <w:lvlText w:val=""/>
+      <w:lvlJc w:val="left"/>
+    </w:lvl>
+    <w:lvl w:ilvl="5" w:tplc="40881BB0">
+      <w:numFmt w:val="decimal"/>
+      <w:lvlText w:val=""/>
+      <w:lvlJc w:val="left"/>
+    </w:lvl>
+    <w:lvl w:ilvl="6" w:tplc="93AA4ADC">
+      <w:numFmt w:val="decimal"/>
+      <w:lvlText w:val=""/>
+      <w:lvlJc w:val="left"/>
+    </w:lvl>
+    <w:lvl w:ilvl="7" w:tplc="45F4151A">
+      <w:numFmt w:val="decimal"/>
+      <w:lvlText w:val=""/>
+      <w:lvlJc w:val="left"/>
+    </w:lvl>
+    <w:lvl w:ilvl="8" w:tplc="DE0E565E">
+      <w:numFmt w:val="decimal"/>
+      <w:lvlText w:val=""/>
+      <w:lvlJc w:val="left"/>
+    </w:lvl>
+  </w:abstractNum>
+  <w:abstractNum w:abstractNumId="3" w15:restartNumberingAfterBreak="0">
+    <w:nsid w:val="38345027"/>
+    <w:multiLevelType w:val="hybridMultilevel"/>
+    <w:tmpl w:val="53EE2696"/>
+    <w:lvl w:ilvl="0" w:tplc="CCA4236A">
+      <w:start w:val="1"/>
+      <w:numFmt w:val="bullet"/>
+      <w:lvlText w:val="•"/>
+      <w:lvlJc w:val="left"/>
+      <w:pPr>
+        <w:ind w:left="540" w:hanging="270"/>
+      </w:pPr>
+    </w:lvl>
+    <w:lvl w:ilvl="1" w:tplc="F8545836">
+      <w:start w:val="1"/>
+      <w:numFmt w:val="bullet"/>
+      <w:lvlText w:val="–"/>
+      <w:lvlJc w:val="left"/>
+      <w:pPr>
+        <w:ind w:left="900" w:hanging="270"/>
+      </w:pPr>
+    </w:lvl>
+    <w:lvl w:ilvl="2" w:tplc="88D6E1CE">
+      <w:numFmt w:val="decimal"/>
+      <w:lvlText w:val=""/>
+      <w:lvlJc w:val="left"/>
+    </w:lvl>
+    <w:lvl w:ilvl="3" w:tplc="1BD4E3DA">
+      <w:numFmt w:val="decimal"/>
+      <w:lvlText w:val=""/>
+      <w:lvlJc w:val="left"/>
+    </w:lvl>
+    <w:lvl w:ilvl="4" w:tplc="E3F27A8C">
+      <w:numFmt w:val="decimal"/>
+      <w:lvlText w:val=""/>
+      <w:lvlJc w:val="left"/>
+    </w:lvl>
+    <w:lvl w:ilvl="5" w:tplc="BAC82EE8">
+      <w:numFmt w:val="decimal"/>
+      <w:lvlText w:val=""/>
+      <w:lvlJc w:val="left"/>
+    </w:lvl>
+    <w:lvl w:ilvl="6" w:tplc="F54C2AE6">
+      <w:numFmt w:val="decimal"/>
+      <w:lvlText w:val=""/>
+      <w:lvlJc w:val="left"/>
+    </w:lvl>
+    <w:lvl w:ilvl="7" w:tplc="452899A0">
+      <w:numFmt w:val="decimal"/>
+      <w:lvlText w:val=""/>
+      <w:lvlJc w:val="left"/>
+    </w:lvl>
+    <w:lvl w:ilvl="8" w:tplc="0C9E88DA">
+      <w:numFmt w:val="decimal"/>
+      <w:lvlText w:val=""/>
+      <w:lvlJc w:val="left"/>
+    </w:lvl>
+  </w:abstractNum>
+  <w:abstractNum w:abstractNumId="4" w15:restartNumberingAfterBreak="0">
+    <w:nsid w:val="42933BB4"/>
+    <w:multiLevelType w:val="hybridMultilevel"/>
+    <w:tmpl w:val="29D8B04A"/>
+    <w:lvl w:ilvl="0" w:tplc="99B8B696">
       <w:start w:val="1"/>
       <w:numFmt w:val="bullet"/>
       <w:lvlText w:val="●"/>
@@ -24043,7 +24139,7 @@
         <w:ind w:left="720" w:hanging="360"/>
       </w:pPr>
     </w:lvl>
-    <w:lvl w:ilvl="1" w:tplc="1054CE70">
+    <w:lvl w:ilvl="1" w:tplc="2912022A">
       <w:start w:val="1"/>
       <w:numFmt w:val="bullet"/>
       <w:lvlText w:val="○"/>
@@ -24052,7 +24148,7 @@
         <w:ind w:left="1440" w:hanging="360"/>
       </w:pPr>
     </w:lvl>
-    <w:lvl w:ilvl="2" w:tplc="1FC078BA">
+    <w:lvl w:ilvl="2" w:tplc="65E69B36">
       <w:start w:val="1"/>
       <w:numFmt w:val="bullet"/>
       <w:lvlText w:val="■"/>
@@ -24061,7 +24157,7 @@
         <w:ind w:left="2160" w:hanging="360"/>
       </w:pPr>
     </w:lvl>
-    <w:lvl w:ilvl="3" w:tplc="D4DA7002">
+    <w:lvl w:ilvl="3" w:tplc="DC78A68C">
       <w:start w:val="1"/>
       <w:numFmt w:val="bullet"/>
       <w:lvlText w:val="●"/>
@@ -24070,7 +24166,7 @@
         <w:ind w:left="2880" w:hanging="360"/>
       </w:pPr>
     </w:lvl>
-    <w:lvl w:ilvl="4" w:tplc="5942A4E4">
+    <w:lvl w:ilvl="4" w:tplc="D354ECDC">
       <w:start w:val="1"/>
       <w:numFmt w:val="bullet"/>
       <w:lvlText w:val="○"/>
@@ -24079,7 +24175,7 @@
         <w:ind w:left="3600" w:hanging="360"/>
       </w:pPr>
     </w:lvl>
-    <w:lvl w:ilvl="5" w:tplc="36A0DFCE">
+    <w:lvl w:ilvl="5" w:tplc="78DC2A02">
       <w:start w:val="1"/>
       <w:numFmt w:val="bullet"/>
       <w:lvlText w:val="■"/>
@@ -24088,7 +24184,7 @@
         <w:ind w:left="4320" w:hanging="360"/>
       </w:pPr>
     </w:lvl>
-    <w:lvl w:ilvl="6" w:tplc="9A2E4204">
+    <w:lvl w:ilvl="6" w:tplc="FDB6C892">
       <w:start w:val="1"/>
       <w:numFmt w:val="bullet"/>
       <w:lvlText w:val="●"/>
@@ -24097,7 +24193,7 @@
         <w:ind w:left="5040" w:hanging="360"/>
       </w:pPr>
     </w:lvl>
-    <w:lvl w:ilvl="7" w:tplc="EDE2B4CA">
+    <w:lvl w:ilvl="7" w:tplc="21680F78">
       <w:start w:val="1"/>
       <w:numFmt w:val="bullet"/>
       <w:lvlText w:val="●"/>
@@ -24106,7 +24202,7 @@
         <w:ind w:left="5760" w:hanging="360"/>
       </w:pPr>
     </w:lvl>
-    <w:lvl w:ilvl="8" w:tplc="43F2F3E0">
+    <w:lvl w:ilvl="8" w:tplc="EE04C98E">
       <w:start w:val="1"/>
       <w:numFmt w:val="bullet"/>
       <w:lvlText w:val="●"/>
@@ -24116,11 +24212,11 @@
       </w:pPr>
     </w:lvl>
   </w:abstractNum>
-  <w:abstractNum w:abstractNumId="3" w15:restartNumberingAfterBreak="0">
-    <w:nsid w:val="40CC1F7C"/>
+  <w:abstractNum w:abstractNumId="5" w15:restartNumberingAfterBreak="0">
+    <w:nsid w:val="484B22E4"/>
     <w:multiLevelType w:val="hybridMultilevel"/>
-    <w:tmpl w:val="398AB542"/>
-    <w:lvl w:ilvl="0" w:tplc="198EB438">
+    <w:tmpl w:val="6450B72E"/>
+    <w:lvl w:ilvl="0" w:tplc="07046228">
       <w:start w:val="1"/>
       <w:numFmt w:val="decimal"/>
       <w:lvlText w:val="%1."/>
@@ -24129,191 +24225,79 @@
         <w:ind w:left="540" w:hanging="360"/>
       </w:pPr>
     </w:lvl>
-    <w:lvl w:ilvl="1" w:tplc="7730F310">
+    <w:lvl w:ilvl="1" w:tplc="ECE81938">
       <w:numFmt w:val="decimal"/>
       <w:lvlText w:val=""/>
       <w:lvlJc w:val="left"/>
     </w:lvl>
-    <w:lvl w:ilvl="2" w:tplc="6C86B1A0">
+    <w:lvl w:ilvl="2" w:tplc="D84C8E8E">
       <w:numFmt w:val="decimal"/>
       <w:lvlText w:val=""/>
       <w:lvlJc w:val="left"/>
     </w:lvl>
-    <w:lvl w:ilvl="3" w:tplc="C778CFE0">
+    <w:lvl w:ilvl="3" w:tplc="3FCA9F02">
       <w:numFmt w:val="decimal"/>
       <w:lvlText w:val=""/>
       <w:lvlJc w:val="left"/>
     </w:lvl>
-    <w:lvl w:ilvl="4" w:tplc="7F6E311C">
+    <w:lvl w:ilvl="4" w:tplc="B296BE02">
       <w:numFmt w:val="decimal"/>
       <w:lvlText w:val=""/>
       <w:lvlJc w:val="left"/>
     </w:lvl>
-    <w:lvl w:ilvl="5" w:tplc="562C67D4">
+    <w:lvl w:ilvl="5" w:tplc="D90AF598">
       <w:numFmt w:val="decimal"/>
       <w:lvlText w:val=""/>
       <w:lvlJc w:val="left"/>
     </w:lvl>
-    <w:lvl w:ilvl="6" w:tplc="B36CCD0E">
+    <w:lvl w:ilvl="6" w:tplc="6AE079FE">
       <w:numFmt w:val="decimal"/>
       <w:lvlText w:val=""/>
       <w:lvlJc w:val="left"/>
     </w:lvl>
-    <w:lvl w:ilvl="7" w:tplc="1BB084AE">
+    <w:lvl w:ilvl="7" w:tplc="A0649832">
       <w:numFmt w:val="decimal"/>
       <w:lvlText w:val=""/>
       <w:lvlJc w:val="left"/>
     </w:lvl>
-    <w:lvl w:ilvl="8" w:tplc="6A6E5F8C">
+    <w:lvl w:ilvl="8" w:tplc="6318F020">
       <w:numFmt w:val="decimal"/>
       <w:lvlText w:val=""/>
       <w:lvlJc w:val="left"/>
     </w:lvl>
   </w:abstractNum>
-  <w:abstractNum w:abstractNumId="4" w15:restartNumberingAfterBreak="0">
-    <w:nsid w:val="66D95855"/>
-    <w:multiLevelType w:val="hybridMultilevel"/>
-    <w:tmpl w:val="EA601188"/>
-    <w:lvl w:ilvl="0" w:tplc="13562F36">
-      <w:start w:val="1"/>
-      <w:numFmt w:val="decimal"/>
-      <w:lvlText w:val="%1."/>
-      <w:lvlJc w:val="left"/>
-      <w:pPr>
-        <w:ind w:left="540" w:hanging="360"/>
-      </w:pPr>
-    </w:lvl>
-    <w:lvl w:ilvl="1" w:tplc="8848CFF8">
-      <w:numFmt w:val="decimal"/>
-      <w:lvlText w:val=""/>
-      <w:lvlJc w:val="left"/>
-    </w:lvl>
-    <w:lvl w:ilvl="2" w:tplc="D398007A">
-      <w:numFmt w:val="decimal"/>
-      <w:lvlText w:val=""/>
-      <w:lvlJc w:val="left"/>
-    </w:lvl>
-    <w:lvl w:ilvl="3" w:tplc="C4407A44">
-      <w:numFmt w:val="decimal"/>
-      <w:lvlText w:val=""/>
-      <w:lvlJc w:val="left"/>
-    </w:lvl>
-    <w:lvl w:ilvl="4" w:tplc="27C8ABB0">
-      <w:numFmt w:val="decimal"/>
-      <w:lvlText w:val=""/>
-      <w:lvlJc w:val="left"/>
-    </w:lvl>
-    <w:lvl w:ilvl="5" w:tplc="156AF782">
-      <w:numFmt w:val="decimal"/>
-      <w:lvlText w:val=""/>
-      <w:lvlJc w:val="left"/>
-    </w:lvl>
-    <w:lvl w:ilvl="6" w:tplc="D34A3604">
-      <w:numFmt w:val="decimal"/>
-      <w:lvlText w:val=""/>
-      <w:lvlJc w:val="left"/>
-    </w:lvl>
-    <w:lvl w:ilvl="7" w:tplc="B9266D72">
-      <w:numFmt w:val="decimal"/>
-      <w:lvlText w:val=""/>
-      <w:lvlJc w:val="left"/>
-    </w:lvl>
-    <w:lvl w:ilvl="8" w:tplc="2D0A441A">
-      <w:numFmt w:val="decimal"/>
-      <w:lvlText w:val=""/>
-      <w:lvlJc w:val="left"/>
-    </w:lvl>
-  </w:abstractNum>
-  <w:abstractNum w:abstractNumId="5" w15:restartNumberingAfterBreak="0">
-    <w:nsid w:val="70140097"/>
-    <w:multiLevelType w:val="hybridMultilevel"/>
-    <w:tmpl w:val="B1BADBFA"/>
-    <w:lvl w:ilvl="0" w:tplc="C85C0EA4">
-      <w:start w:val="1"/>
-      <w:numFmt w:val="bullet"/>
-      <w:lvlText w:val="•"/>
-      <w:lvlJc w:val="left"/>
-      <w:pPr>
-        <w:ind w:left="540" w:hanging="270"/>
-      </w:pPr>
-    </w:lvl>
-    <w:lvl w:ilvl="1" w:tplc="ED34851E">
-      <w:start w:val="1"/>
-      <w:numFmt w:val="bullet"/>
-      <w:lvlText w:val="–"/>
-      <w:lvlJc w:val="left"/>
-      <w:pPr>
-        <w:ind w:left="900" w:hanging="270"/>
-      </w:pPr>
-    </w:lvl>
-    <w:lvl w:ilvl="2" w:tplc="3656FE88">
-      <w:numFmt w:val="decimal"/>
-      <w:lvlText w:val=""/>
-      <w:lvlJc w:val="left"/>
-    </w:lvl>
-    <w:lvl w:ilvl="3" w:tplc="2C66C38E">
-      <w:numFmt w:val="decimal"/>
-      <w:lvlText w:val=""/>
-      <w:lvlJc w:val="left"/>
-    </w:lvl>
-    <w:lvl w:ilvl="4" w:tplc="BED6BB42">
-      <w:numFmt w:val="decimal"/>
-      <w:lvlText w:val=""/>
-      <w:lvlJc w:val="left"/>
-    </w:lvl>
-    <w:lvl w:ilvl="5" w:tplc="89D06BE6">
-      <w:numFmt w:val="decimal"/>
-      <w:lvlText w:val=""/>
-      <w:lvlJc w:val="left"/>
-    </w:lvl>
-    <w:lvl w:ilvl="6" w:tplc="B170C000">
-      <w:numFmt w:val="decimal"/>
-      <w:lvlText w:val=""/>
-      <w:lvlJc w:val="left"/>
-    </w:lvl>
-    <w:lvl w:ilvl="7" w:tplc="4D60C926">
-      <w:numFmt w:val="decimal"/>
-      <w:lvlText w:val=""/>
-      <w:lvlJc w:val="left"/>
-    </w:lvl>
-    <w:lvl w:ilvl="8" w:tplc="455C41F0">
-      <w:numFmt w:val="decimal"/>
-      <w:lvlText w:val=""/>
-      <w:lvlJc w:val="left"/>
-    </w:lvl>
-  </w:abstractNum>
-  <w:num w:numId="1" w16cid:durableId="1577091002">
-    <w:abstractNumId w:val="2"/>
+  <w:num w:numId="1" w16cid:durableId="11147571">
+    <w:abstractNumId w:val="4"/>
     <w:lvlOverride w:ilvl="0">
       <w:startOverride w:val="1"/>
     </w:lvlOverride>
   </w:num>
-  <w:num w:numId="2" w16cid:durableId="1304581901">
+  <w:num w:numId="2" w16cid:durableId="1205406075">
+    <w:abstractNumId w:val="3"/>
+    <w:lvlOverride w:ilvl="0">
+      <w:startOverride w:val="1"/>
+    </w:lvlOverride>
+  </w:num>
+  <w:num w:numId="3" w16cid:durableId="1117258049">
+    <w:abstractNumId w:val="1"/>
+    <w:lvlOverride w:ilvl="0">
+      <w:startOverride w:val="1"/>
+    </w:lvlOverride>
+  </w:num>
+  <w:num w:numId="4" w16cid:durableId="943996199">
     <w:abstractNumId w:val="5"/>
     <w:lvlOverride w:ilvl="0">
       <w:startOverride w:val="1"/>
     </w:lvlOverride>
   </w:num>
-  <w:num w:numId="3" w16cid:durableId="384107223">
-    <w:abstractNumId w:val="1"/>
-    <w:lvlOverride w:ilvl="0">
-      <w:startOverride w:val="1"/>
-    </w:lvlOverride>
-  </w:num>
-  <w:num w:numId="4" w16cid:durableId="1377437180">
+  <w:num w:numId="5" w16cid:durableId="1095439021">
     <w:abstractNumId w:val="0"/>
     <w:lvlOverride w:ilvl="0">
       <w:startOverride w:val="1"/>
     </w:lvlOverride>
   </w:num>
-  <w:num w:numId="5" w16cid:durableId="124660967">
-    <w:abstractNumId w:val="4"/>
-    <w:lvlOverride w:ilvl="0">
-      <w:startOverride w:val="1"/>
-    </w:lvlOverride>
-  </w:num>
-  <w:num w:numId="6" w16cid:durableId="1106342194">
-    <w:abstractNumId w:val="3"/>
+  <w:num w:numId="6" w16cid:durableId="1812553294">
+    <w:abstractNumId w:val="2"/>
     <w:lvlOverride w:ilvl="0">
       <w:startOverride w:val="1"/>
     </w:lvlOverride>
@@ -24892,7 +24876,7 @@
     <w:autoRedefine/>
     <w:uiPriority w:val="39"/>
     <w:unhideWhenUsed/>
-    <w:rsid w:val="009E1829"/>
+    <w:rsid w:val="00A07D5D"/>
     <w:pPr>
       <w:spacing w:after="100"/>
     </w:pPr>
@@ -24908,7 +24892,7 @@
     <w:autoRedefine/>
     <w:uiPriority w:val="39"/>
     <w:unhideWhenUsed/>
-    <w:rsid w:val="009E1829"/>
+    <w:rsid w:val="00A07D5D"/>
     <w:pPr>
       <w:spacing w:after="100"/>
       <w:ind w:left="200"/>

</xml_diff>

<commit_message>
Manual: province filter, W0 winners, TARGET_PROVINCES; recheck no longer scheduled
Co-Authored-By: Claude Opus 5.5 <noreply@anthropic.com>
</commit_message>
<xml_diff>
--- a/docs/eGP-Alert-v3-Technical-Manual-v2.docx
+++ b/docs/eGP-Alert-v3-Technical-Manual-v2.docx
@@ -84,7 +84,7 @@
         <w:spacing w:after="120" w:line="300" w:lineRule="auto"/>
       </w:pPr>
       <w:r>
-        <w:t>ขอบเขต: Phase 0 (สำรวจข้อมูล) และ Phase 1 (ระบบแจ้งเตือนรายวัน) · เปิดใช้งานกับทีม Sale 15 ตุลาคม 2569 (ปิดระบบเดิม prospecting-automated-2 แล้ว) · ฉบับวันที่ 15 ตุลาคม 2569</w:t>
+        <w:t>ขอบเขต: Phase 0 (สำรวจข้อมูล) และ Phase 1 (ระบบแจ้งเตือนรายวัน) · เปิดใช้งานกับทีม Sale 15 ตุลาคม 2569 (ปิดระบบเดิม prospecting-automated-2 แล้ว) · ฉบับวันที่ 20 ตุลาคม 2569 (เพิ่มการกรองจังหวัด และผู้ชนะ/ราคาที่ชนะของประกาศผู้ชนะ)</w:t>
       </w:r>
     </w:p>
     <w:p>
@@ -104,13 +104,14 @@
           <w:sz w:val="28"/>
           <w:szCs w:val="28"/>
         </w:rPr>
+        <w:lastRenderedPageBreak/>
         <w:t>สารบัญ</w:t>
       </w:r>
     </w:p>
     <w:sdt>
       <w:sdtPr>
         <w:alias w:val="สารบัญ"/>
-        <w:id w:val="518050820"/>
+        <w:id w:val="-1297908597"/>
       </w:sdtPr>
       <w:sdtEndPr>
         <w:rPr>
@@ -143,7 +144,7 @@
           <w:r>
             <w:fldChar w:fldCharType="separate"/>
           </w:r>
-          <w:hyperlink w:anchor="_Toc242978240" w:history="1">
+          <w:hyperlink w:anchor="_Toc243378713" w:history="1">
             <w:r>
               <w:rPr>
                 <w:rStyle w:val="Hyperlink"/>
@@ -167,7 +168,7 @@
               <w:rPr>
                 <w:noProof/>
               </w:rPr>
-              <w:instrText xml:space="preserve"> PAGEREF _Toc242978240 \h </w:instrText>
+              <w:instrText xml:space="preserve"> PAGEREF _Toc243378713 \h </w:instrText>
             </w:r>
             <w:r>
               <w:rPr>
@@ -209,7 +210,7 @@
               <w14:ligatures w14:val="standardContextual"/>
             </w:rPr>
           </w:pPr>
-          <w:hyperlink w:anchor="_Toc242978241" w:history="1">
+          <w:hyperlink w:anchor="_Toc243378714" w:history="1">
             <w:r>
               <w:rPr>
                 <w:rStyle w:val="Hyperlink"/>
@@ -233,7 +234,7 @@
               <w:rPr>
                 <w:noProof/>
               </w:rPr>
-              <w:instrText xml:space="preserve"> PAGEREF _Toc242978241 \h </w:instrText>
+              <w:instrText xml:space="preserve"> PAGEREF _Toc243378714 \h </w:instrText>
             </w:r>
             <w:r>
               <w:rPr>
@@ -275,7 +276,7 @@
               <w14:ligatures w14:val="standardContextual"/>
             </w:rPr>
           </w:pPr>
-          <w:hyperlink w:anchor="_Toc242978242" w:history="1">
+          <w:hyperlink w:anchor="_Toc243378715" w:history="1">
             <w:r>
               <w:rPr>
                 <w:rStyle w:val="Hyperlink"/>
@@ -299,7 +300,7 @@
               <w:rPr>
                 <w:noProof/>
               </w:rPr>
-              <w:instrText xml:space="preserve"> PAGEREF _Toc242978242 \h </w:instrText>
+              <w:instrText xml:space="preserve"> PAGEREF _Toc243378715 \h </w:instrText>
             </w:r>
             <w:r>
               <w:rPr>
@@ -341,7 +342,7 @@
               <w14:ligatures w14:val="standardContextual"/>
             </w:rPr>
           </w:pPr>
-          <w:hyperlink w:anchor="_Toc242978243" w:history="1">
+          <w:hyperlink w:anchor="_Toc243378716" w:history="1">
             <w:r>
               <w:rPr>
                 <w:rStyle w:val="Hyperlink"/>
@@ -365,7 +366,7 @@
               <w:rPr>
                 <w:noProof/>
               </w:rPr>
-              <w:instrText xml:space="preserve"> PAGEREF _Toc242978243 \h </w:instrText>
+              <w:instrText xml:space="preserve"> PAGEREF _Toc243378716 \h </w:instrText>
             </w:r>
             <w:r>
               <w:rPr>
@@ -407,7 +408,7 @@
               <w14:ligatures w14:val="standardContextual"/>
             </w:rPr>
           </w:pPr>
-          <w:hyperlink w:anchor="_Toc242978244" w:history="1">
+          <w:hyperlink w:anchor="_Toc243378717" w:history="1">
             <w:r>
               <w:rPr>
                 <w:rStyle w:val="Hyperlink"/>
@@ -431,7 +432,7 @@
               <w:rPr>
                 <w:noProof/>
               </w:rPr>
-              <w:instrText xml:space="preserve"> PAGEREF _Toc242978244 \h </w:instrText>
+              <w:instrText xml:space="preserve"> PAGEREF _Toc243378717 \h </w:instrText>
             </w:r>
             <w:r>
               <w:rPr>
@@ -473,7 +474,7 @@
               <w14:ligatures w14:val="standardContextual"/>
             </w:rPr>
           </w:pPr>
-          <w:hyperlink w:anchor="_Toc242978245" w:history="1">
+          <w:hyperlink w:anchor="_Toc243378718" w:history="1">
             <w:r>
               <w:rPr>
                 <w:rStyle w:val="Hyperlink"/>
@@ -497,7 +498,7 @@
               <w:rPr>
                 <w:noProof/>
               </w:rPr>
-              <w:instrText xml:space="preserve"> PAGEREF _Toc242978245 \h </w:instrText>
+              <w:instrText xml:space="preserve"> PAGEREF _Toc243378718 \h </w:instrText>
             </w:r>
             <w:r>
               <w:rPr>
@@ -539,7 +540,7 @@
               <w14:ligatures w14:val="standardContextual"/>
             </w:rPr>
           </w:pPr>
-          <w:hyperlink w:anchor="_Toc242978246" w:history="1">
+          <w:hyperlink w:anchor="_Toc243378719" w:history="1">
             <w:r>
               <w:rPr>
                 <w:rStyle w:val="Hyperlink"/>
@@ -563,7 +564,7 @@
               <w:rPr>
                 <w:noProof/>
               </w:rPr>
-              <w:instrText xml:space="preserve"> PAGEREF _Toc242978246 \h </w:instrText>
+              <w:instrText xml:space="preserve"> PAGEREF _Toc243378719 \h </w:instrText>
             </w:r>
             <w:r>
               <w:rPr>
@@ -605,7 +606,7 @@
               <w14:ligatures w14:val="standardContextual"/>
             </w:rPr>
           </w:pPr>
-          <w:hyperlink w:anchor="_Toc242978247" w:history="1">
+          <w:hyperlink w:anchor="_Toc243378720" w:history="1">
             <w:r>
               <w:rPr>
                 <w:rStyle w:val="Hyperlink"/>
@@ -629,7 +630,7 @@
               <w:rPr>
                 <w:noProof/>
               </w:rPr>
-              <w:instrText xml:space="preserve"> PAGEREF _Toc242978247 \h </w:instrText>
+              <w:instrText xml:space="preserve"> PAGEREF _Toc243378720 \h </w:instrText>
             </w:r>
             <w:r>
               <w:rPr>
@@ -671,7 +672,7 @@
               <w14:ligatures w14:val="standardContextual"/>
             </w:rPr>
           </w:pPr>
-          <w:hyperlink w:anchor="_Toc242978248" w:history="1">
+          <w:hyperlink w:anchor="_Toc243378721" w:history="1">
             <w:r>
               <w:rPr>
                 <w:rStyle w:val="Hyperlink"/>
@@ -695,7 +696,7 @@
               <w:rPr>
                 <w:noProof/>
               </w:rPr>
-              <w:instrText xml:space="preserve"> PAGEREF _Toc242978248 \h </w:instrText>
+              <w:instrText xml:space="preserve"> PAGEREF _Toc243378721 \h </w:instrText>
             </w:r>
             <w:r>
               <w:rPr>
@@ -737,7 +738,7 @@
               <w14:ligatures w14:val="standardContextual"/>
             </w:rPr>
           </w:pPr>
-          <w:hyperlink w:anchor="_Toc242978249" w:history="1">
+          <w:hyperlink w:anchor="_Toc243378722" w:history="1">
             <w:r>
               <w:rPr>
                 <w:rStyle w:val="Hyperlink"/>
@@ -761,7 +762,7 @@
               <w:rPr>
                 <w:noProof/>
               </w:rPr>
-              <w:instrText xml:space="preserve"> PAGEREF _Toc242978249 \h </w:instrText>
+              <w:instrText xml:space="preserve"> PAGEREF _Toc243378722 \h </w:instrText>
             </w:r>
             <w:r>
               <w:rPr>
@@ -803,7 +804,7 @@
               <w14:ligatures w14:val="standardContextual"/>
             </w:rPr>
           </w:pPr>
-          <w:hyperlink w:anchor="_Toc242978250" w:history="1">
+          <w:hyperlink w:anchor="_Toc243378723" w:history="1">
             <w:r>
               <w:rPr>
                 <w:rStyle w:val="Hyperlink"/>
@@ -827,7 +828,7 @@
               <w:rPr>
                 <w:noProof/>
               </w:rPr>
-              <w:instrText xml:space="preserve"> PAGEREF _Toc242978250 \h </w:instrText>
+              <w:instrText xml:space="preserve"> PAGEREF _Toc243378723 \h </w:instrText>
             </w:r>
             <w:r>
               <w:rPr>
@@ -869,7 +870,7 @@
               <w14:ligatures w14:val="standardContextual"/>
             </w:rPr>
           </w:pPr>
-          <w:hyperlink w:anchor="_Toc242978251" w:history="1">
+          <w:hyperlink w:anchor="_Toc243378724" w:history="1">
             <w:r>
               <w:rPr>
                 <w:rStyle w:val="Hyperlink"/>
@@ -893,7 +894,7 @@
               <w:rPr>
                 <w:noProof/>
               </w:rPr>
-              <w:instrText xml:space="preserve"> PAGEREF _Toc242978251 \h </w:instrText>
+              <w:instrText xml:space="preserve"> PAGEREF _Toc243378724 \h </w:instrText>
             </w:r>
             <w:r>
               <w:rPr>
@@ -935,7 +936,7 @@
               <w14:ligatures w14:val="standardContextual"/>
             </w:rPr>
           </w:pPr>
-          <w:hyperlink w:anchor="_Toc242978252" w:history="1">
+          <w:hyperlink w:anchor="_Toc243378725" w:history="1">
             <w:r>
               <w:rPr>
                 <w:rStyle w:val="Hyperlink"/>
@@ -959,7 +960,7 @@
               <w:rPr>
                 <w:noProof/>
               </w:rPr>
-              <w:instrText xml:space="preserve"> PAGEREF _Toc242978252 \h </w:instrText>
+              <w:instrText xml:space="preserve"> PAGEREF _Toc243378725 \h </w:instrText>
             </w:r>
             <w:r>
               <w:rPr>
@@ -1001,7 +1002,7 @@
               <w14:ligatures w14:val="standardContextual"/>
             </w:rPr>
           </w:pPr>
-          <w:hyperlink w:anchor="_Toc242978253" w:history="1">
+          <w:hyperlink w:anchor="_Toc243378726" w:history="1">
             <w:r>
               <w:rPr>
                 <w:rStyle w:val="Hyperlink"/>
@@ -1025,7 +1026,7 @@
               <w:rPr>
                 <w:noProof/>
               </w:rPr>
-              <w:instrText xml:space="preserve"> PAGEREF _Toc242978253 \h </w:instrText>
+              <w:instrText xml:space="preserve"> PAGEREF _Toc243378726 \h </w:instrText>
             </w:r>
             <w:r>
               <w:rPr>
@@ -1067,7 +1068,7 @@
               <w14:ligatures w14:val="standardContextual"/>
             </w:rPr>
           </w:pPr>
-          <w:hyperlink w:anchor="_Toc242978254" w:history="1">
+          <w:hyperlink w:anchor="_Toc243378727" w:history="1">
             <w:r>
               <w:rPr>
                 <w:rStyle w:val="Hyperlink"/>
@@ -1091,7 +1092,7 @@
               <w:rPr>
                 <w:noProof/>
               </w:rPr>
-              <w:instrText xml:space="preserve"> PAGEREF _Toc242978254 \h </w:instrText>
+              <w:instrText xml:space="preserve"> PAGEREF _Toc243378727 \h </w:instrText>
             </w:r>
             <w:r>
               <w:rPr>
@@ -1133,7 +1134,7 @@
               <w14:ligatures w14:val="standardContextual"/>
             </w:rPr>
           </w:pPr>
-          <w:hyperlink w:anchor="_Toc242978255" w:history="1">
+          <w:hyperlink w:anchor="_Toc243378728" w:history="1">
             <w:r>
               <w:rPr>
                 <w:rStyle w:val="Hyperlink"/>
@@ -1157,7 +1158,7 @@
               <w:rPr>
                 <w:noProof/>
               </w:rPr>
-              <w:instrText xml:space="preserve"> PAGEREF _Toc242978255 \h </w:instrText>
+              <w:instrText xml:space="preserve"> PAGEREF _Toc243378728 \h </w:instrText>
             </w:r>
             <w:r>
               <w:rPr>
@@ -1199,7 +1200,7 @@
               <w14:ligatures w14:val="standardContextual"/>
             </w:rPr>
           </w:pPr>
-          <w:hyperlink w:anchor="_Toc242978256" w:history="1">
+          <w:hyperlink w:anchor="_Toc243378729" w:history="1">
             <w:r>
               <w:rPr>
                 <w:rStyle w:val="Hyperlink"/>
@@ -1223,7 +1224,7 @@
               <w:rPr>
                 <w:noProof/>
               </w:rPr>
-              <w:instrText xml:space="preserve"> PAGEREF _Toc242978256 \h </w:instrText>
+              <w:instrText xml:space="preserve"> PAGEREF _Toc243378729 \h </w:instrText>
             </w:r>
             <w:r>
               <w:rPr>
@@ -1265,7 +1266,7 @@
               <w14:ligatures w14:val="standardContextual"/>
             </w:rPr>
           </w:pPr>
-          <w:hyperlink w:anchor="_Toc242978257" w:history="1">
+          <w:hyperlink w:anchor="_Toc243378730" w:history="1">
             <w:r>
               <w:rPr>
                 <w:rStyle w:val="Hyperlink"/>
@@ -1289,7 +1290,7 @@
               <w:rPr>
                 <w:noProof/>
               </w:rPr>
-              <w:instrText xml:space="preserve"> PAGEREF _Toc242978257 \h </w:instrText>
+              <w:instrText xml:space="preserve"> PAGEREF _Toc243378730 \h </w:instrText>
             </w:r>
             <w:r>
               <w:rPr>
@@ -1331,7 +1332,7 @@
               <w14:ligatures w14:val="standardContextual"/>
             </w:rPr>
           </w:pPr>
-          <w:hyperlink w:anchor="_Toc242978258" w:history="1">
+          <w:hyperlink w:anchor="_Toc243378731" w:history="1">
             <w:r>
               <w:rPr>
                 <w:rStyle w:val="Hyperlink"/>
@@ -1355,7 +1356,7 @@
               <w:rPr>
                 <w:noProof/>
               </w:rPr>
-              <w:instrText xml:space="preserve"> PAGEREF _Toc242978258 \h </w:instrText>
+              <w:instrText xml:space="preserve"> PAGEREF _Toc243378731 \h </w:instrText>
             </w:r>
             <w:r>
               <w:rPr>
@@ -1397,7 +1398,7 @@
               <w14:ligatures w14:val="standardContextual"/>
             </w:rPr>
           </w:pPr>
-          <w:hyperlink w:anchor="_Toc242978259" w:history="1">
+          <w:hyperlink w:anchor="_Toc243378732" w:history="1">
             <w:r>
               <w:rPr>
                 <w:rStyle w:val="Hyperlink"/>
@@ -1421,7 +1422,7 @@
               <w:rPr>
                 <w:noProof/>
               </w:rPr>
-              <w:instrText xml:space="preserve"> PAGEREF _Toc242978259 \h </w:instrText>
+              <w:instrText xml:space="preserve"> PAGEREF _Toc243378732 \h </w:instrText>
             </w:r>
             <w:r>
               <w:rPr>
@@ -1463,7 +1464,7 @@
               <w14:ligatures w14:val="standardContextual"/>
             </w:rPr>
           </w:pPr>
-          <w:hyperlink w:anchor="_Toc242978260" w:history="1">
+          <w:hyperlink w:anchor="_Toc243378733" w:history="1">
             <w:r>
               <w:rPr>
                 <w:rStyle w:val="Hyperlink"/>
@@ -1487,7 +1488,7 @@
               <w:rPr>
                 <w:noProof/>
               </w:rPr>
-              <w:instrText xml:space="preserve"> PAGEREF _Toc242978260 \h </w:instrText>
+              <w:instrText xml:space="preserve"> PAGEREF _Toc243378733 \h </w:instrText>
             </w:r>
             <w:r>
               <w:rPr>
@@ -1505,6 +1506,138 @@
                 <w:noProof/>
               </w:rPr>
               <w:t>13</w:t>
+            </w:r>
+            <w:r>
+              <w:rPr>
+                <w:noProof/>
+              </w:rPr>
+              <w:fldChar w:fldCharType="end"/>
+            </w:r>
+          </w:hyperlink>
+        </w:p>
+        <w:p>
+          <w:pPr>
+            <w:pStyle w:val="TOC2"/>
+            <w:tabs>
+              <w:tab w:val="right" w:leader="dot" w:pos="9628"/>
+            </w:tabs>
+            <w:rPr>
+              <w:rFonts w:asciiTheme="minorHAnsi" w:eastAsiaTheme="minorEastAsia" w:hAnsiTheme="minorHAnsi" w:cstheme="minorBidi"/>
+              <w:noProof/>
+              <w:kern w:val="2"/>
+              <w:sz w:val="24"/>
+              <w:szCs w:val="30"/>
+              <w14:ligatures w14:val="standardContextual"/>
+            </w:rPr>
+          </w:pPr>
+          <w:hyperlink w:anchor="_Toc243378734" w:history="1">
+            <w:r>
+              <w:rPr>
+                <w:rStyle w:val="Hyperlink"/>
+                <w:noProof/>
+              </w:rPr>
+              <w:t>8.3 จังหวัดของประกาศ</w:t>
+            </w:r>
+            <w:r>
+              <w:rPr>
+                <w:noProof/>
+              </w:rPr>
+              <w:tab/>
+            </w:r>
+            <w:r>
+              <w:rPr>
+                <w:noProof/>
+              </w:rPr>
+              <w:fldChar w:fldCharType="begin"/>
+            </w:r>
+            <w:r>
+              <w:rPr>
+                <w:noProof/>
+              </w:rPr>
+              <w:instrText xml:space="preserve"> PAGEREF _Toc243378734 \h </w:instrText>
+            </w:r>
+            <w:r>
+              <w:rPr>
+                <w:noProof/>
+              </w:rPr>
+            </w:r>
+            <w:r>
+              <w:rPr>
+                <w:noProof/>
+              </w:rPr>
+              <w:fldChar w:fldCharType="separate"/>
+            </w:r>
+            <w:r>
+              <w:rPr>
+                <w:noProof/>
+              </w:rPr>
+              <w:t>14</w:t>
+            </w:r>
+            <w:r>
+              <w:rPr>
+                <w:noProof/>
+              </w:rPr>
+              <w:fldChar w:fldCharType="end"/>
+            </w:r>
+          </w:hyperlink>
+        </w:p>
+        <w:p>
+          <w:pPr>
+            <w:pStyle w:val="TOC2"/>
+            <w:tabs>
+              <w:tab w:val="right" w:leader="dot" w:pos="9628"/>
+            </w:tabs>
+            <w:rPr>
+              <w:rFonts w:asciiTheme="minorHAnsi" w:eastAsiaTheme="minorEastAsia" w:hAnsiTheme="minorHAnsi" w:cstheme="minorBidi"/>
+              <w:noProof/>
+              <w:kern w:val="2"/>
+              <w:sz w:val="24"/>
+              <w:szCs w:val="30"/>
+              <w14:ligatures w14:val="standardContextual"/>
+            </w:rPr>
+          </w:pPr>
+          <w:hyperlink w:anchor="_Toc243378735" w:history="1">
+            <w:r>
+              <w:rPr>
+                <w:rStyle w:val="Hyperlink"/>
+                <w:noProof/>
+              </w:rPr>
+              <w:t>8.4 ผู้ชนะและราคาที่ชนะ (W0)</w:t>
+            </w:r>
+            <w:r>
+              <w:rPr>
+                <w:noProof/>
+              </w:rPr>
+              <w:tab/>
+            </w:r>
+            <w:r>
+              <w:rPr>
+                <w:noProof/>
+              </w:rPr>
+              <w:fldChar w:fldCharType="begin"/>
+            </w:r>
+            <w:r>
+              <w:rPr>
+                <w:noProof/>
+              </w:rPr>
+              <w:instrText xml:space="preserve"> PAGEREF _Toc243378735 \h </w:instrText>
+            </w:r>
+            <w:r>
+              <w:rPr>
+                <w:noProof/>
+              </w:rPr>
+            </w:r>
+            <w:r>
+              <w:rPr>
+                <w:noProof/>
+              </w:rPr>
+              <w:fldChar w:fldCharType="separate"/>
+            </w:r>
+            <w:r>
+              <w:rPr>
+                <w:noProof/>
+              </w:rPr>
+              <w:t>14</w:t>
             </w:r>
             <w:r>
               <w:rPr>
@@ -1529,7 +1662,7 @@
               <w14:ligatures w14:val="standardContextual"/>
             </w:rPr>
           </w:pPr>
-          <w:hyperlink w:anchor="_Toc242978261" w:history="1">
+          <w:hyperlink w:anchor="_Toc243378736" w:history="1">
             <w:r>
               <w:rPr>
                 <w:rStyle w:val="Hyperlink"/>
@@ -1553,7 +1686,7 @@
               <w:rPr>
                 <w:noProof/>
               </w:rPr>
-              <w:instrText xml:space="preserve"> PAGEREF _Toc242978261 \h </w:instrText>
+              <w:instrText xml:space="preserve"> PAGEREF _Toc243378736 \h </w:instrText>
             </w:r>
             <w:r>
               <w:rPr>
@@ -1595,7 +1728,7 @@
               <w14:ligatures w14:val="standardContextual"/>
             </w:rPr>
           </w:pPr>
-          <w:hyperlink w:anchor="_Toc242978262" w:history="1">
+          <w:hyperlink w:anchor="_Toc243378737" w:history="1">
             <w:r>
               <w:rPr>
                 <w:rStyle w:val="Hyperlink"/>
@@ -1619,7 +1752,7 @@
               <w:rPr>
                 <w:noProof/>
               </w:rPr>
-              <w:instrText xml:space="preserve"> PAGEREF _Toc242978262 \h </w:instrText>
+              <w:instrText xml:space="preserve"> PAGEREF _Toc243378737 \h </w:instrText>
             </w:r>
             <w:r>
               <w:rPr>
@@ -1661,7 +1794,7 @@
               <w14:ligatures w14:val="standardContextual"/>
             </w:rPr>
           </w:pPr>
-          <w:hyperlink w:anchor="_Toc242978263" w:history="1">
+          <w:hyperlink w:anchor="_Toc243378738" w:history="1">
             <w:r>
               <w:rPr>
                 <w:rStyle w:val="Hyperlink"/>
@@ -1685,7 +1818,7 @@
               <w:rPr>
                 <w:noProof/>
               </w:rPr>
-              <w:instrText xml:space="preserve"> PAGEREF _Toc242978263 \h </w:instrText>
+              <w:instrText xml:space="preserve"> PAGEREF _Toc243378738 \h </w:instrText>
             </w:r>
             <w:r>
               <w:rPr>
@@ -1727,7 +1860,7 @@
               <w14:ligatures w14:val="standardContextual"/>
             </w:rPr>
           </w:pPr>
-          <w:hyperlink w:anchor="_Toc242978264" w:history="1">
+          <w:hyperlink w:anchor="_Toc243378739" w:history="1">
             <w:r>
               <w:rPr>
                 <w:rStyle w:val="Hyperlink"/>
@@ -1751,7 +1884,7 @@
               <w:rPr>
                 <w:noProof/>
               </w:rPr>
-              <w:instrText xml:space="preserve"> PAGEREF _Toc242978264 \h </w:instrText>
+              <w:instrText xml:space="preserve"> PAGEREF _Toc243378739 \h </w:instrText>
             </w:r>
             <w:r>
               <w:rPr>
@@ -1793,7 +1926,7 @@
               <w14:ligatures w14:val="standardContextual"/>
             </w:rPr>
           </w:pPr>
-          <w:hyperlink w:anchor="_Toc242978265" w:history="1">
+          <w:hyperlink w:anchor="_Toc243378740" w:history="1">
             <w:r>
               <w:rPr>
                 <w:rStyle w:val="Hyperlink"/>
@@ -1817,7 +1950,7 @@
               <w:rPr>
                 <w:noProof/>
               </w:rPr>
-              <w:instrText xml:space="preserve"> PAGEREF _Toc242978265 \h </w:instrText>
+              <w:instrText xml:space="preserve"> PAGEREF _Toc243378740 \h </w:instrText>
             </w:r>
             <w:r>
               <w:rPr>
@@ -1859,7 +1992,7 @@
               <w14:ligatures w14:val="standardContextual"/>
             </w:rPr>
           </w:pPr>
-          <w:hyperlink w:anchor="_Toc242978266" w:history="1">
+          <w:hyperlink w:anchor="_Toc243378741" w:history="1">
             <w:r>
               <w:rPr>
                 <w:rStyle w:val="Hyperlink"/>
@@ -1883,7 +2016,7 @@
               <w:rPr>
                 <w:noProof/>
               </w:rPr>
-              <w:instrText xml:space="preserve"> PAGEREF _Toc242978266 \h </w:instrText>
+              <w:instrText xml:space="preserve"> PAGEREF _Toc243378741 \h </w:instrText>
             </w:r>
             <w:r>
               <w:rPr>
@@ -1925,7 +2058,7 @@
               <w14:ligatures w14:val="standardContextual"/>
             </w:rPr>
           </w:pPr>
-          <w:hyperlink w:anchor="_Toc242978267" w:history="1">
+          <w:hyperlink w:anchor="_Toc243378742" w:history="1">
             <w:r>
               <w:rPr>
                 <w:rStyle w:val="Hyperlink"/>
@@ -1949,7 +2082,7 @@
               <w:rPr>
                 <w:noProof/>
               </w:rPr>
-              <w:instrText xml:space="preserve"> PAGEREF _Toc242978267 \h </w:instrText>
+              <w:instrText xml:space="preserve"> PAGEREF _Toc243378742 \h </w:instrText>
             </w:r>
             <w:r>
               <w:rPr>
@@ -1991,7 +2124,7 @@
               <w14:ligatures w14:val="standardContextual"/>
             </w:rPr>
           </w:pPr>
-          <w:hyperlink w:anchor="_Toc242978268" w:history="1">
+          <w:hyperlink w:anchor="_Toc243378743" w:history="1">
             <w:r>
               <w:rPr>
                 <w:rStyle w:val="Hyperlink"/>
@@ -2015,7 +2148,7 @@
               <w:rPr>
                 <w:noProof/>
               </w:rPr>
-              <w:instrText xml:space="preserve"> PAGEREF _Toc242978268 \h </w:instrText>
+              <w:instrText xml:space="preserve"> PAGEREF _Toc243378743 \h </w:instrText>
             </w:r>
             <w:r>
               <w:rPr>
@@ -2057,7 +2190,7 @@
               <w14:ligatures w14:val="standardContextual"/>
             </w:rPr>
           </w:pPr>
-          <w:hyperlink w:anchor="_Toc242978269" w:history="1">
+          <w:hyperlink w:anchor="_Toc243378744" w:history="1">
             <w:r>
               <w:rPr>
                 <w:rStyle w:val="Hyperlink"/>
@@ -2081,7 +2214,7 @@
               <w:rPr>
                 <w:noProof/>
               </w:rPr>
-              <w:instrText xml:space="preserve"> PAGEREF _Toc242978269 \h </w:instrText>
+              <w:instrText xml:space="preserve"> PAGEREF _Toc243378744 \h </w:instrText>
             </w:r>
             <w:r>
               <w:rPr>
@@ -2123,7 +2256,7 @@
               <w14:ligatures w14:val="standardContextual"/>
             </w:rPr>
           </w:pPr>
-          <w:hyperlink w:anchor="_Toc242978270" w:history="1">
+          <w:hyperlink w:anchor="_Toc243378745" w:history="1">
             <w:r>
               <w:rPr>
                 <w:rStyle w:val="Hyperlink"/>
@@ -2147,7 +2280,7 @@
               <w:rPr>
                 <w:noProof/>
               </w:rPr>
-              <w:instrText xml:space="preserve"> PAGEREF _Toc242978270 \h </w:instrText>
+              <w:instrText xml:space="preserve"> PAGEREF _Toc243378745 \h </w:instrText>
             </w:r>
             <w:r>
               <w:rPr>
@@ -2189,7 +2322,7 @@
               <w14:ligatures w14:val="standardContextual"/>
             </w:rPr>
           </w:pPr>
-          <w:hyperlink w:anchor="_Toc242978271" w:history="1">
+          <w:hyperlink w:anchor="_Toc243378746" w:history="1">
             <w:r>
               <w:rPr>
                 <w:rStyle w:val="Hyperlink"/>
@@ -2213,7 +2346,7 @@
               <w:rPr>
                 <w:noProof/>
               </w:rPr>
-              <w:instrText xml:space="preserve"> PAGEREF _Toc242978271 \h </w:instrText>
+              <w:instrText xml:space="preserve"> PAGEREF _Toc243378746 \h </w:instrText>
             </w:r>
             <w:r>
               <w:rPr>
@@ -2255,7 +2388,7 @@
               <w14:ligatures w14:val="standardContextual"/>
             </w:rPr>
           </w:pPr>
-          <w:hyperlink w:anchor="_Toc242978272" w:history="1">
+          <w:hyperlink w:anchor="_Toc243378747" w:history="1">
             <w:r>
               <w:rPr>
                 <w:rStyle w:val="Hyperlink"/>
@@ -2279,7 +2412,7 @@
               <w:rPr>
                 <w:noProof/>
               </w:rPr>
-              <w:instrText xml:space="preserve"> PAGEREF _Toc242978272 \h </w:instrText>
+              <w:instrText xml:space="preserve"> PAGEREF _Toc243378747 \h </w:instrText>
             </w:r>
             <w:r>
               <w:rPr>
@@ -2321,7 +2454,7 @@
               <w14:ligatures w14:val="standardContextual"/>
             </w:rPr>
           </w:pPr>
-          <w:hyperlink w:anchor="_Toc242978273" w:history="1">
+          <w:hyperlink w:anchor="_Toc243378748" w:history="1">
             <w:r>
               <w:rPr>
                 <w:rStyle w:val="Hyperlink"/>
@@ -2345,7 +2478,7 @@
               <w:rPr>
                 <w:noProof/>
               </w:rPr>
-              <w:instrText xml:space="preserve"> PAGEREF _Toc242978273 \h </w:instrText>
+              <w:instrText xml:space="preserve"> PAGEREF _Toc243378748 \h </w:instrText>
             </w:r>
             <w:r>
               <w:rPr>
@@ -2387,7 +2520,7 @@
               <w14:ligatures w14:val="standardContextual"/>
             </w:rPr>
           </w:pPr>
-          <w:hyperlink w:anchor="_Toc242978274" w:history="1">
+          <w:hyperlink w:anchor="_Toc243378749" w:history="1">
             <w:r>
               <w:rPr>
                 <w:rStyle w:val="Hyperlink"/>
@@ -2411,7 +2544,7 @@
               <w:rPr>
                 <w:noProof/>
               </w:rPr>
-              <w:instrText xml:space="preserve"> PAGEREF _Toc242978274 \h </w:instrText>
+              <w:instrText xml:space="preserve"> PAGEREF _Toc243378749 \h </w:instrText>
             </w:r>
             <w:r>
               <w:rPr>
@@ -2453,7 +2586,7 @@
               <w14:ligatures w14:val="standardContextual"/>
             </w:rPr>
           </w:pPr>
-          <w:hyperlink w:anchor="_Toc242978275" w:history="1">
+          <w:hyperlink w:anchor="_Toc243378750" w:history="1">
             <w:r>
               <w:rPr>
                 <w:rStyle w:val="Hyperlink"/>
@@ -2477,7 +2610,7 @@
               <w:rPr>
                 <w:noProof/>
               </w:rPr>
-              <w:instrText xml:space="preserve"> PAGEREF _Toc242978275 \h </w:instrText>
+              <w:instrText xml:space="preserve"> PAGEREF _Toc243378750 \h </w:instrText>
             </w:r>
             <w:r>
               <w:rPr>
@@ -2519,7 +2652,7 @@
               <w14:ligatures w14:val="standardContextual"/>
             </w:rPr>
           </w:pPr>
-          <w:hyperlink w:anchor="_Toc242978276" w:history="1">
+          <w:hyperlink w:anchor="_Toc243378751" w:history="1">
             <w:r>
               <w:rPr>
                 <w:rStyle w:val="Hyperlink"/>
@@ -2543,7 +2676,7 @@
               <w:rPr>
                 <w:noProof/>
               </w:rPr>
-              <w:instrText xml:space="preserve"> PAGEREF _Toc242978276 \h </w:instrText>
+              <w:instrText xml:space="preserve"> PAGEREF _Toc243378751 \h </w:instrText>
             </w:r>
             <w:r>
               <w:rPr>
@@ -2560,7 +2693,7 @@
               <w:rPr>
                 <w:noProof/>
               </w:rPr>
-              <w:t>20</w:t>
+              <w:t>21</w:t>
             </w:r>
             <w:r>
               <w:rPr>
@@ -2585,7 +2718,7 @@
               <w14:ligatures w14:val="standardContextual"/>
             </w:rPr>
           </w:pPr>
-          <w:hyperlink w:anchor="_Toc242978277" w:history="1">
+          <w:hyperlink w:anchor="_Toc243378752" w:history="1">
             <w:r>
               <w:rPr>
                 <w:rStyle w:val="Hyperlink"/>
@@ -2609,7 +2742,7 @@
               <w:rPr>
                 <w:noProof/>
               </w:rPr>
-              <w:instrText xml:space="preserve"> PAGEREF _Toc242978277 \h </w:instrText>
+              <w:instrText xml:space="preserve"> PAGEREF _Toc243378752 \h </w:instrText>
             </w:r>
             <w:r>
               <w:rPr>
@@ -2626,7 +2759,7 @@
               <w:rPr>
                 <w:noProof/>
               </w:rPr>
-              <w:t>21</w:t>
+              <w:t>22</w:t>
             </w:r>
             <w:r>
               <w:rPr>
@@ -2651,7 +2784,7 @@
               <w14:ligatures w14:val="standardContextual"/>
             </w:rPr>
           </w:pPr>
-          <w:hyperlink w:anchor="_Toc242978278" w:history="1">
+          <w:hyperlink w:anchor="_Toc243378753" w:history="1">
             <w:r>
               <w:rPr>
                 <w:rStyle w:val="Hyperlink"/>
@@ -2675,7 +2808,7 @@
               <w:rPr>
                 <w:noProof/>
               </w:rPr>
-              <w:instrText xml:space="preserve"> PAGEREF _Toc242978278 \h </w:instrText>
+              <w:instrText xml:space="preserve"> PAGEREF _Toc243378753 \h </w:instrText>
             </w:r>
             <w:r>
               <w:rPr>
@@ -2692,7 +2825,7 @@
               <w:rPr>
                 <w:noProof/>
               </w:rPr>
-              <w:t>21</w:t>
+              <w:t>22</w:t>
             </w:r>
             <w:r>
               <w:rPr>
@@ -2717,7 +2850,7 @@
               <w14:ligatures w14:val="standardContextual"/>
             </w:rPr>
           </w:pPr>
-          <w:hyperlink w:anchor="_Toc242978279" w:history="1">
+          <w:hyperlink w:anchor="_Toc243378754" w:history="1">
             <w:r>
               <w:rPr>
                 <w:rStyle w:val="Hyperlink"/>
@@ -2741,7 +2874,7 @@
               <w:rPr>
                 <w:noProof/>
               </w:rPr>
-              <w:instrText xml:space="preserve"> PAGEREF _Toc242978279 \h </w:instrText>
+              <w:instrText xml:space="preserve"> PAGEREF _Toc243378754 \h </w:instrText>
             </w:r>
             <w:r>
               <w:rPr>
@@ -2758,7 +2891,7 @@
               <w:rPr>
                 <w:noProof/>
               </w:rPr>
-              <w:t>21</w:t>
+              <w:t>22</w:t>
             </w:r>
             <w:r>
               <w:rPr>
@@ -2783,7 +2916,7 @@
               <w14:ligatures w14:val="standardContextual"/>
             </w:rPr>
           </w:pPr>
-          <w:hyperlink w:anchor="_Toc242978280" w:history="1">
+          <w:hyperlink w:anchor="_Toc243378755" w:history="1">
             <w:r>
               <w:rPr>
                 <w:rStyle w:val="Hyperlink"/>
@@ -2807,7 +2940,7 @@
               <w:rPr>
                 <w:noProof/>
               </w:rPr>
-              <w:instrText xml:space="preserve"> PAGEREF _Toc242978280 \h </w:instrText>
+              <w:instrText xml:space="preserve"> PAGEREF _Toc243378755 \h </w:instrText>
             </w:r>
             <w:r>
               <w:rPr>
@@ -2824,7 +2957,7 @@
               <w:rPr>
                 <w:noProof/>
               </w:rPr>
-              <w:t>21</w:t>
+              <w:t>22</w:t>
             </w:r>
             <w:r>
               <w:rPr>
@@ -2849,7 +2982,7 @@
               <w14:ligatures w14:val="standardContextual"/>
             </w:rPr>
           </w:pPr>
-          <w:hyperlink w:anchor="_Toc242978281" w:history="1">
+          <w:hyperlink w:anchor="_Toc243378756" w:history="1">
             <w:r>
               <w:rPr>
                 <w:rStyle w:val="Hyperlink"/>
@@ -2873,7 +3006,7 @@
               <w:rPr>
                 <w:noProof/>
               </w:rPr>
-              <w:instrText xml:space="preserve"> PAGEREF _Toc242978281 \h </w:instrText>
+              <w:instrText xml:space="preserve"> PAGEREF _Toc243378756 \h </w:instrText>
             </w:r>
             <w:r>
               <w:rPr>
@@ -2890,7 +3023,7 @@
               <w:rPr>
                 <w:noProof/>
               </w:rPr>
-              <w:t>22</w:t>
+              <w:t>24</w:t>
             </w:r>
             <w:r>
               <w:rPr>
@@ -2915,7 +3048,7 @@
               <w14:ligatures w14:val="standardContextual"/>
             </w:rPr>
           </w:pPr>
-          <w:hyperlink w:anchor="_Toc242978282" w:history="1">
+          <w:hyperlink w:anchor="_Toc243378757" w:history="1">
             <w:r>
               <w:rPr>
                 <w:rStyle w:val="Hyperlink"/>
@@ -2939,7 +3072,7 @@
               <w:rPr>
                 <w:noProof/>
               </w:rPr>
-              <w:instrText xml:space="preserve"> PAGEREF _Toc242978282 \h </w:instrText>
+              <w:instrText xml:space="preserve"> PAGEREF _Toc243378757 \h </w:instrText>
             </w:r>
             <w:r>
               <w:rPr>
@@ -2956,7 +3089,7 @@
               <w:rPr>
                 <w:noProof/>
               </w:rPr>
-              <w:t>22</w:t>
+              <w:t>24</w:t>
             </w:r>
             <w:r>
               <w:rPr>
@@ -2981,7 +3114,7 @@
               <w14:ligatures w14:val="standardContextual"/>
             </w:rPr>
           </w:pPr>
-          <w:hyperlink w:anchor="_Toc242978283" w:history="1">
+          <w:hyperlink w:anchor="_Toc243378758" w:history="1">
             <w:r>
               <w:rPr>
                 <w:rStyle w:val="Hyperlink"/>
@@ -3005,7 +3138,7 @@
               <w:rPr>
                 <w:noProof/>
               </w:rPr>
-              <w:instrText xml:space="preserve"> PAGEREF _Toc242978283 \h </w:instrText>
+              <w:instrText xml:space="preserve"> PAGEREF _Toc243378758 \h </w:instrText>
             </w:r>
             <w:r>
               <w:rPr>
@@ -3022,7 +3155,7 @@
               <w:rPr>
                 <w:noProof/>
               </w:rPr>
-              <w:t>22</w:t>
+              <w:t>24</w:t>
             </w:r>
             <w:r>
               <w:rPr>
@@ -3045,8 +3178,9 @@
         <w:pageBreakBefore/>
         <w:spacing w:before="360" w:after="160"/>
       </w:pPr>
-      <w:bookmarkStart w:id="0" w:name="_Toc242978240"/>
-      <w:r>
+      <w:bookmarkStart w:id="0" w:name="_Toc243378713"/>
+      <w:r>
+        <w:lastRenderedPageBreak/>
         <w:t xml:space="preserve">1. </w:t>
       </w:r>
       <w:r>
@@ -3071,7 +3205,7 @@
         <w:keepNext/>
         <w:spacing w:before="280" w:after="120"/>
       </w:pPr>
-      <w:bookmarkStart w:id="1" w:name="_Toc242978241"/>
+      <w:bookmarkStart w:id="1" w:name="_Toc243378714"/>
       <w:r>
         <w:t xml:space="preserve">1.1 </w:t>
       </w:r>
@@ -3600,7 +3734,7 @@
         <w:keepNext/>
         <w:spacing w:before="280" w:after="120"/>
       </w:pPr>
-      <w:bookmarkStart w:id="2" w:name="_Toc242978242"/>
+      <w:bookmarkStart w:id="2" w:name="_Toc243378715"/>
       <w:r>
         <w:t xml:space="preserve">1.2 </w:t>
       </w:r>
@@ -3680,12 +3814,59 @@
     </w:p>
     <w:p>
       <w:pPr>
+        <w:pStyle w:val="ListParagraph"/>
+        <w:numPr>
+          <w:ilvl w:val="0"/>
+          <w:numId w:val="2"/>
+        </w:numPr>
+        <w:spacing w:after="60" w:line="290" w:lineRule="auto"/>
+      </w:pPr>
+      <w:r>
+        <w:rPr>
+          <w:b/>
+          <w:bCs/>
+        </w:rPr>
+        <w:t>เฉพาะจังหวัดของทีม Sale</w:t>
+      </w:r>
+      <w:r>
+        <w:t xml:space="preserve"> (</w:t>
+      </w:r>
+      <w:r>
+        <w:t>กรุงเทพฯ ปริมณฑล และภาคตะวันออก 15 จังหวัด) รวมประกาศที่ระบุจังหวัดไม่ได้ ประกาศจังหวัดอื่นย้ายไปแท็บ "จังหวัดอื่น" ใน Excel (หัวข้อ 8.3, 9.1)</w:t>
+      </w:r>
+    </w:p>
+    <w:p>
+      <w:pPr>
+        <w:pStyle w:val="ListParagraph"/>
+        <w:numPr>
+          <w:ilvl w:val="0"/>
+          <w:numId w:val="2"/>
+        </w:numPr>
+        <w:spacing w:after="60" w:line="290" w:lineRule="auto"/>
+      </w:pPr>
+      <w:r>
+        <w:rPr>
+          <w:b/>
+          <w:bCs/>
+        </w:rPr>
+        <w:t>ผู้ชนะและราคาที่ชนะ</w:t>
+      </w:r>
+      <w:r>
+        <w:t xml:space="preserve"> </w:t>
+      </w:r>
+      <w:r>
+        <w:t>ของประกาศผู้ชนะ (W0) ในอีเมลและ Excel (หัวข้อ 8.4)</w:t>
+      </w:r>
+    </w:p>
+    <w:p>
+      <w:pPr>
         <w:pStyle w:val="Heading1"/>
         <w:pageBreakBefore/>
         <w:spacing w:before="360" w:after="160"/>
       </w:pPr>
-      <w:bookmarkStart w:id="3" w:name="_Toc242978243"/>
-      <w:r>
+      <w:bookmarkStart w:id="3" w:name="_Toc243378716"/>
+      <w:r>
+        <w:lastRenderedPageBreak/>
         <w:t xml:space="preserve">2. </w:t>
       </w:r>
       <w:r>
@@ -3933,19 +4114,14 @@
                 <w:sz w:val="18"/>
                 <w:szCs w:val="18"/>
               </w:rPr>
-              <w:t>14:00, 16:30</w:t>
-            </w:r>
-          </w:p>
-          <w:p>
-            <w:pPr>
-              <w:spacing w:after="20" w:line="260" w:lineRule="auto"/>
-            </w:pPr>
-            <w:r>
-              <w:rPr>
-                <w:sz w:val="18"/>
-                <w:szCs w:val="18"/>
-              </w:rPr>
-              <w:t>จ.–ศ.</w:t>
+              <w:t xml:space="preserve">18:00 </w:t>
+            </w:r>
+            <w:r>
+              <w:rPr>
+                <w:sz w:val="18"/>
+                <w:szCs w:val="18"/>
+              </w:rPr>
+              <w:t>ทุกวัน</w:t>
             </w:r>
           </w:p>
         </w:tc>
@@ -3981,26 +4157,7 @@
                 <w:sz w:val="18"/>
                 <w:szCs w:val="18"/>
               </w:rPr>
-              <w:t>สั่ง recheck.yml</w:t>
-            </w:r>
-          </w:p>
-          <w:p>
-            <w:pPr>
-              <w:spacing w:after="20" w:line="260" w:lineRule="auto"/>
-            </w:pPr>
-            <w:r>
-              <w:rPr>
-                <w:sz w:val="18"/>
-                <w:szCs w:val="18"/>
-              </w:rPr>
-              <w:t xml:space="preserve">← </w:t>
-            </w:r>
-            <w:r>
-              <w:rPr>
-                <w:sz w:val="18"/>
-                <w:szCs w:val="18"/>
-              </w:rPr>
-              <w:t>รับรายการใหม่ลง announcements</w:t>
+              <w:t>สั่ง daily.yml</w:t>
             </w:r>
           </w:p>
         </w:tc>
@@ -4029,14 +4186,14 @@
                 <w:sz w:val="18"/>
                 <w:szCs w:val="18"/>
               </w:rPr>
-              <w:t xml:space="preserve">recheck.yml: </w:t>
-            </w:r>
-            <w:r>
-              <w:rPr>
-                <w:sz w:val="18"/>
-                <w:szCs w:val="18"/>
-              </w:rPr>
-              <w:t>ดึงเฉพาะ feed ที่ชนเพดาน → load_runs</w:t>
+              <w:t xml:space="preserve">job collect ×3 </w:t>
+            </w:r>
+            <w:r>
+              <w:rPr>
+                <w:sz w:val="18"/>
+                <w:szCs w:val="18"/>
+              </w:rPr>
+              <w:t>เครื่อง: ดึง RSS ทุกหน่วยงาน × 7 ประเภท</w:t>
             </w:r>
           </w:p>
         </w:tc>
@@ -4097,20 +4254,6 @@
             <w:pPr>
               <w:spacing w:after="20" w:line="260" w:lineRule="auto"/>
             </w:pPr>
-            <w:r>
-              <w:rPr>
-                <w:sz w:val="18"/>
-                <w:szCs w:val="18"/>
-              </w:rPr>
-              <w:t xml:space="preserve">18:00 </w:t>
-            </w:r>
-            <w:r>
-              <w:rPr>
-                <w:sz w:val="18"/>
-                <w:szCs w:val="18"/>
-              </w:rPr>
-              <w:t>ทุกวัน</w:t>
-            </w:r>
           </w:p>
         </w:tc>
         <w:tc>
@@ -4138,14 +4281,14 @@
                 <w:sz w:val="18"/>
                 <w:szCs w:val="18"/>
               </w:rPr>
-              <w:t xml:space="preserve">pg_cron → </w:t>
-            </w:r>
-            <w:r>
-              <w:rPr>
-                <w:sz w:val="18"/>
-                <w:szCs w:val="18"/>
-              </w:rPr>
-              <w:t>สั่ง daily.yml</w:t>
+              <w:t xml:space="preserve">← </w:t>
+            </w:r>
+            <w:r>
+              <w:rPr>
+                <w:sz w:val="18"/>
+                <w:szCs w:val="18"/>
+              </w:rPr>
+              <w:t>เขียน announcements, capped_feeds, collect_runs</w:t>
             </w:r>
           </w:p>
         </w:tc>
@@ -4174,14 +4317,7 @@
                 <w:sz w:val="18"/>
                 <w:szCs w:val="18"/>
               </w:rPr>
-              <w:t xml:space="preserve">job collect ×3 </w:t>
-            </w:r>
-            <w:r>
-              <w:rPr>
-                <w:sz w:val="18"/>
-                <w:szCs w:val="18"/>
-              </w:rPr>
-              <w:t>เครื่อง: ดึง RSS ทุกหน่วยงาน × 7 ประเภท</w:t>
+              <w:t>load_runs.py</w:t>
             </w:r>
           </w:p>
         </w:tc>
@@ -4205,13 +4341,6 @@
             <w:pPr>
               <w:spacing w:after="20" w:line="260" w:lineRule="auto"/>
             </w:pPr>
-            <w:r>
-              <w:rPr>
-                <w:sz w:val="18"/>
-                <w:szCs w:val="18"/>
-              </w:rPr>
-              <w:t>e-GP RSS (process3)</w:t>
-            </w:r>
           </w:p>
         </w:tc>
       </w:tr>
@@ -4276,7 +4405,7 @@
                 <w:sz w:val="18"/>
                 <w:szCs w:val="18"/>
               </w:rPr>
-              <w:t>เขียน announcements, capped_feeds, collect_runs</w:t>
+              <w:t>อ่านชื่อที่ยังไม่ตัดสิน / นับโควตา ai_usage / เขียน classifications</w:t>
             </w:r>
           </w:p>
         </w:tc>
@@ -4305,7 +4434,14 @@
                 <w:sz w:val="18"/>
                 <w:szCs w:val="18"/>
               </w:rPr>
-              <w:t>load_runs.py</w:t>
+              <w:t xml:space="preserve">classify.py: </w:t>
+            </w:r>
+            <w:r>
+              <w:rPr>
+                <w:sz w:val="18"/>
+                <w:szCs w:val="18"/>
+              </w:rPr>
+              <w:t>กฎคำ → ที่เหลือส่ง Gemini</w:t>
             </w:r>
           </w:p>
         </w:tc>
@@ -4329,6 +4465,13 @@
             <w:pPr>
               <w:spacing w:after="20" w:line="260" w:lineRule="auto"/>
             </w:pPr>
+            <w:r>
+              <w:rPr>
+                <w:sz w:val="18"/>
+                <w:szCs w:val="18"/>
+              </w:rPr>
+              <w:t>Gemini API (Flash)</w:t>
+            </w:r>
           </w:p>
         </w:tc>
       </w:tr>
@@ -4359,6 +4502,13 @@
             <w:pPr>
               <w:spacing w:after="20" w:line="260" w:lineRule="auto"/>
             </w:pPr>
+            <w:r>
+              <w:rPr>
+                <w:sz w:val="18"/>
+                <w:szCs w:val="18"/>
+              </w:rPr>
+              <w:t>~20:30</w:t>
+            </w:r>
           </w:p>
         </w:tc>
         <w:tc>
@@ -4393,7 +4543,7 @@
                 <w:sz w:val="18"/>
                 <w:szCs w:val="18"/>
               </w:rPr>
-              <w:t>อ่านชื่อที่ยังไม่ตัดสิน / นับโควตา ai_usage / เขียน classifications</w:t>
+              <w:t>เขียน announcement_details</w:t>
             </w:r>
           </w:p>
         </w:tc>
@@ -4422,14 +4572,14 @@
                 <w:sz w:val="18"/>
                 <w:szCs w:val="18"/>
               </w:rPr>
-              <w:t xml:space="preserve">classify.py: </w:t>
-            </w:r>
-            <w:r>
-              <w:rPr>
-                <w:sz w:val="18"/>
-                <w:szCs w:val="18"/>
-              </w:rPr>
-              <w:t>กฎคำ → ที่เหลือส่ง Gemini</w:t>
+              <w:t xml:space="preserve">enrich.py: </w:t>
+            </w:r>
+            <w:r>
+              <w:rPr>
+                <w:sz w:val="18"/>
+                <w:szCs w:val="18"/>
+              </w:rPr>
+              <w:t>ดาวน์โหลดเอกสาร → regex → Gemini ถ้าจำเป็น → จังหวัด, ผู้ชนะ (W0)</w:t>
             </w:r>
           </w:p>
         </w:tc>
@@ -4458,145 +4608,7 @@
                 <w:sz w:val="18"/>
                 <w:szCs w:val="18"/>
               </w:rPr>
-              <w:t>Gemini API (Flash)</w:t>
-            </w:r>
-          </w:p>
-        </w:tc>
-      </w:tr>
-      <w:tr>
-        <w:tblPrEx>
-          <w:tblCellMar>
-            <w:top w:w="0" w:type="dxa"/>
-            <w:bottom w:w="0" w:type="dxa"/>
-          </w:tblCellMar>
-        </w:tblPrEx>
-        <w:tc>
-          <w:tcPr>
-            <w:tcW w:w="1309" w:type="dxa"/>
-            <w:tcBorders>
-              <w:top w:val="single" w:sz="4" w:space="0" w:color="C9D3CE"/>
-              <w:left w:val="single" w:sz="4" w:space="0" w:color="C9D3CE"/>
-              <w:bottom w:val="single" w:sz="4" w:space="0" w:color="C9D3CE"/>
-              <w:right w:val="single" w:sz="4" w:space="0" w:color="C9D3CE"/>
-            </w:tcBorders>
-            <w:tcMar>
-              <w:top w:w="60" w:type="dxa"/>
-              <w:left w:w="100" w:type="dxa"/>
-              <w:bottom w:w="60" w:type="dxa"/>
-              <w:right w:w="100" w:type="dxa"/>
-            </w:tcMar>
-          </w:tcPr>
-          <w:p>
-            <w:pPr>
-              <w:spacing w:after="20" w:line="260" w:lineRule="auto"/>
-            </w:pPr>
-            <w:r>
-              <w:rPr>
-                <w:sz w:val="18"/>
-                <w:szCs w:val="18"/>
-              </w:rPr>
-              <w:t>~20:30</w:t>
-            </w:r>
-          </w:p>
-        </w:tc>
-        <w:tc>
-          <w:tcPr>
-            <w:tcW w:w="3094" w:type="dxa"/>
-            <w:tcBorders>
-              <w:top w:val="single" w:sz="4" w:space="0" w:color="C9D3CE"/>
-              <w:left w:val="single" w:sz="4" w:space="0" w:color="C9D3CE"/>
-              <w:bottom w:val="single" w:sz="4" w:space="0" w:color="C9D3CE"/>
-              <w:right w:val="single" w:sz="4" w:space="0" w:color="C9D3CE"/>
-            </w:tcBorders>
-            <w:tcMar>
-              <w:top w:w="60" w:type="dxa"/>
-              <w:left w:w="100" w:type="dxa"/>
-              <w:bottom w:w="60" w:type="dxa"/>
-              <w:right w:w="100" w:type="dxa"/>
-            </w:tcMar>
-          </w:tcPr>
-          <w:p>
-            <w:pPr>
-              <w:spacing w:after="20" w:line="260" w:lineRule="auto"/>
-            </w:pPr>
-            <w:r>
-              <w:rPr>
-                <w:sz w:val="18"/>
-                <w:szCs w:val="18"/>
-              </w:rPr>
-              <w:t xml:space="preserve">← </w:t>
-            </w:r>
-            <w:r>
-              <w:rPr>
-                <w:sz w:val="18"/>
-                <w:szCs w:val="18"/>
-              </w:rPr>
-              <w:t>เขียน announcement_details</w:t>
-            </w:r>
-          </w:p>
-        </w:tc>
-        <w:tc>
-          <w:tcPr>
-            <w:tcW w:w="3094" w:type="dxa"/>
-            <w:tcBorders>
-              <w:top w:val="single" w:sz="4" w:space="0" w:color="C9D3CE"/>
-              <w:left w:val="single" w:sz="4" w:space="0" w:color="C9D3CE"/>
-              <w:bottom w:val="single" w:sz="4" w:space="0" w:color="C9D3CE"/>
-              <w:right w:val="single" w:sz="4" w:space="0" w:color="C9D3CE"/>
-            </w:tcBorders>
-            <w:tcMar>
-              <w:top w:w="60" w:type="dxa"/>
-              <w:left w:w="100" w:type="dxa"/>
-              <w:bottom w:w="60" w:type="dxa"/>
-              <w:right w:w="100" w:type="dxa"/>
-            </w:tcMar>
-          </w:tcPr>
-          <w:p>
-            <w:pPr>
-              <w:spacing w:after="20" w:line="260" w:lineRule="auto"/>
-            </w:pPr>
-            <w:r>
-              <w:rPr>
-                <w:sz w:val="18"/>
-                <w:szCs w:val="18"/>
-              </w:rPr>
-              <w:t xml:space="preserve">enrich.py: </w:t>
-            </w:r>
-            <w:r>
-              <w:rPr>
-                <w:sz w:val="18"/>
-                <w:szCs w:val="18"/>
-              </w:rPr>
-              <w:t>ดาวน์โหลดเอกสาร → regex → Gemini Lite ถ้าจำเป็น</w:t>
-            </w:r>
-          </w:p>
-        </w:tc>
-        <w:tc>
-          <w:tcPr>
-            <w:tcW w:w="2141" w:type="dxa"/>
-            <w:tcBorders>
-              <w:top w:val="single" w:sz="4" w:space="0" w:color="C9D3CE"/>
-              <w:left w:val="single" w:sz="4" w:space="0" w:color="C9D3CE"/>
-              <w:bottom w:val="single" w:sz="4" w:space="0" w:color="C9D3CE"/>
-              <w:right w:val="single" w:sz="4" w:space="0" w:color="C9D3CE"/>
-            </w:tcBorders>
-            <w:tcMar>
-              <w:top w:w="60" w:type="dxa"/>
-              <w:left w:w="100" w:type="dxa"/>
-              <w:bottom w:w="60" w:type="dxa"/>
-              <w:right w:w="100" w:type="dxa"/>
-            </w:tcMar>
-          </w:tcPr>
-          <w:p>
-            <w:pPr>
-              <w:spacing w:after="20" w:line="260" w:lineRule="auto"/>
-            </w:pPr>
-            <w:r>
-              <w:rPr>
-                <w:sz w:val="18"/>
-                <w:szCs w:val="18"/>
-              </w:rPr>
-              <w:t>เอกสาร e-GP (process5), Gemini API (Lite)</w:t>
+              <w:t>เอกสาร e-GP (process / process5), Gemini API</w:t>
             </w:r>
           </w:p>
         </w:tc>
@@ -5499,7 +5511,30 @@
                 <w:sz w:val="18"/>
                 <w:szCs w:val="18"/>
               </w:rPr>
-              <w:t>ของ D0, ZIP ของ B0/15)</w:t>
+              <w:t xml:space="preserve">ของ D0 และ W0 แบบ e-bidding, ZIP ของ B0/15) และ </w:t>
+            </w:r>
+            <w:r>
+              <w:rPr>
+                <w:rFonts w:ascii="Consolas" w:eastAsia="Consolas" w:hAnsi="Consolas" w:cs="Consolas"/>
+                <w:color w:val="2D4A8A"/>
+                <w:sz w:val="18"/>
+                <w:szCs w:val="18"/>
+              </w:rPr>
+              <w:t>process.gprocurement.go.th</w:t>
+            </w:r>
+            <w:r>
+              <w:rPr>
+                <w:sz w:val="18"/>
+                <w:szCs w:val="18"/>
+              </w:rPr>
+              <w:t xml:space="preserve"> (</w:t>
+            </w:r>
+            <w:r>
+              <w:rPr>
+                <w:sz w:val="18"/>
+                <w:szCs w:val="18"/>
+              </w:rPr>
+              <w:t>หน้า HTML ของแผน P0 และ W0 ส่วนใหญ่)</w:t>
             </w:r>
           </w:p>
         </w:tc>
@@ -5723,8 +5758,9 @@
         <w:pageBreakBefore/>
         <w:spacing w:before="360" w:after="160"/>
       </w:pPr>
-      <w:bookmarkStart w:id="4" w:name="_Toc242978244"/>
-      <w:r>
+      <w:bookmarkStart w:id="4" w:name="_Toc243378717"/>
+      <w:r>
+        <w:lastRenderedPageBreak/>
         <w:t xml:space="preserve">3. </w:t>
       </w:r>
       <w:r>
@@ -6432,7 +6468,7 @@
         <w:keepNext/>
         <w:spacing w:before="280" w:after="120"/>
       </w:pPr>
-      <w:bookmarkStart w:id="5" w:name="_Toc242978245"/>
+      <w:bookmarkStart w:id="5" w:name="_Toc243378718"/>
       <w:r>
         <w:t xml:space="preserve">3.1 Flow </w:t>
       </w:r>
@@ -6578,7 +6614,7 @@
         <w:t xml:space="preserve"> </w:t>
       </w:r>
       <w:r>
-        <w:t xml:space="preserve">รายการที่เกี่ยวข้อง (คะแนน ≥ 50) ของ D0/B0/15/P0 → ดาวน์โหลดเอกสาร → regex / ตารางในหน้าแผน → (ถ้าจับไม่ได้) Gemini → บันทึก </w:t>
+        <w:t xml:space="preserve">รายการที่เกี่ยวข้อง (คะแนน ≥ 50) ของ D0/B0/15/P0/W0 → ดาวน์โหลดเอกสาร → regex / ตารางในหน้าแผน → (ถ้าจับไม่ได้) Gemini → จังหวัด และผู้ชนะ (W0) → บันทึก </w:t>
       </w:r>
       <w:r>
         <w:rPr>
@@ -6650,8 +6686,9 @@
         <w:pageBreakBefore/>
         <w:spacing w:before="360" w:after="160"/>
       </w:pPr>
-      <w:bookmarkStart w:id="6" w:name="_Toc242978246"/>
-      <w:r>
+      <w:bookmarkStart w:id="6" w:name="_Toc243378719"/>
+      <w:r>
+        <w:lastRenderedPageBreak/>
         <w:t xml:space="preserve">4. </w:t>
       </w:r>
       <w:r>
@@ -6703,7 +6740,7 @@
         <w:keepNext/>
         <w:spacing w:before="280" w:after="120"/>
       </w:pPr>
-      <w:bookmarkStart w:id="7" w:name="_Toc242978247"/>
+      <w:bookmarkStart w:id="7" w:name="_Toc243378720"/>
       <w:r>
         <w:t xml:space="preserve">4.1 RSS </w:t>
       </w:r>
@@ -7898,7 +7935,7 @@
         <w:keepNext/>
         <w:spacing w:before="280" w:after="120"/>
       </w:pPr>
-      <w:bookmarkStart w:id="8" w:name="_Toc242978248"/>
+      <w:bookmarkStart w:id="8" w:name="_Toc243378721"/>
       <w:r>
         <w:t xml:space="preserve">4.2 </w:t>
       </w:r>
@@ -8034,8 +8071,9 @@
         <w:keepNext/>
         <w:spacing w:before="280" w:after="120"/>
       </w:pPr>
-      <w:bookmarkStart w:id="9" w:name="_Toc242978249"/>
-      <w:r>
+      <w:bookmarkStart w:id="9" w:name="_Toc243378722"/>
+      <w:r>
+        <w:lastRenderedPageBreak/>
         <w:t xml:space="preserve">4.3 </w:t>
       </w:r>
       <w:r>
@@ -8669,8 +8707,9 @@
         <w:pageBreakBefore/>
         <w:spacing w:before="360" w:after="160"/>
       </w:pPr>
-      <w:bookmarkStart w:id="10" w:name="_Toc242978250"/>
-      <w:r>
+      <w:bookmarkStart w:id="10" w:name="_Toc243378723"/>
+      <w:r>
+        <w:lastRenderedPageBreak/>
         <w:t xml:space="preserve">5. </w:t>
       </w:r>
       <w:r>
@@ -8952,8 +8991,9 @@
         <w:pageBreakBefore/>
         <w:spacing w:before="360" w:after="160"/>
       </w:pPr>
-      <w:bookmarkStart w:id="11" w:name="_Toc242978251"/>
-      <w:r>
+      <w:bookmarkStart w:id="11" w:name="_Toc243378724"/>
+      <w:r>
+        <w:lastRenderedPageBreak/>
         <w:t xml:space="preserve">6. </w:t>
       </w:r>
       <w:r>
@@ -9035,7 +9075,7 @@
         <w:keepNext/>
         <w:spacing w:before="280" w:after="120"/>
       </w:pPr>
-      <w:bookmarkStart w:id="12" w:name="_Toc242978252"/>
+      <w:bookmarkStart w:id="12" w:name="_Toc243378725"/>
       <w:r>
         <w:t xml:space="preserve">6.1 </w:t>
       </w:r>
@@ -9160,7 +9200,7 @@
         <w:keepNext/>
         <w:spacing w:before="280" w:after="120"/>
       </w:pPr>
-      <w:bookmarkStart w:id="13" w:name="_Toc242978253"/>
+      <w:bookmarkStart w:id="13" w:name="_Toc243378726"/>
       <w:r>
         <w:t xml:space="preserve">6.2 </w:t>
       </w:r>
@@ -9993,7 +10033,7 @@
         <w:keepNext/>
         <w:spacing w:before="280" w:after="120"/>
       </w:pPr>
-      <w:bookmarkStart w:id="14" w:name="_Toc242978254"/>
+      <w:bookmarkStart w:id="14" w:name="_Toc243378727"/>
       <w:r>
         <w:t xml:space="preserve">6.3 Prompt </w:t>
       </w:r>
@@ -10202,6 +10242,7 @@
           <w:sz w:val="18"/>
           <w:szCs w:val="18"/>
         </w:rPr>
+        <w:lastRenderedPageBreak/>
         <w:t xml:space="preserve">  </w:t>
       </w:r>
       <w:r>
@@ -10654,8 +10695,9 @@
         <w:pageBreakBefore/>
         <w:spacing w:before="360" w:after="160"/>
       </w:pPr>
-      <w:bookmarkStart w:id="15" w:name="_Toc242978255"/>
-      <w:r>
+      <w:bookmarkStart w:id="15" w:name="_Toc243378728"/>
+      <w:r>
+        <w:lastRenderedPageBreak/>
         <w:t xml:space="preserve">7. </w:t>
       </w:r>
       <w:r>
@@ -11212,6 +11254,130 @@
                 <w:sz w:val="18"/>
                 <w:szCs w:val="18"/>
               </w:rPr>
+              <w:t>อ่านผู้ชนะจาก PDF ประกาศผู้ชนะแบบ e-bidding (W0)</w:t>
+            </w:r>
+          </w:p>
+        </w:tc>
+        <w:tc>
+          <w:tcPr>
+            <w:tcW w:w="2116" w:type="dxa"/>
+            <w:tcBorders>
+              <w:top w:val="single" w:sz="4" w:space="0" w:color="C9D3CE"/>
+              <w:left w:val="single" w:sz="4" w:space="0" w:color="C9D3CE"/>
+              <w:bottom w:val="single" w:sz="4" w:space="0" w:color="C9D3CE"/>
+              <w:right w:val="single" w:sz="4" w:space="0" w:color="C9D3CE"/>
+            </w:tcBorders>
+            <w:tcMar>
+              <w:top w:w="60" w:type="dxa"/>
+              <w:left w:w="100" w:type="dxa"/>
+              <w:bottom w:w="60" w:type="dxa"/>
+              <w:right w:w="100" w:type="dxa"/>
+            </w:tcMar>
+          </w:tcPr>
+          <w:p>
+            <w:pPr>
+              <w:spacing w:after="20" w:line="260" w:lineRule="auto"/>
+            </w:pPr>
+            <w:r>
+              <w:rPr>
+                <w:sz w:val="18"/>
+                <w:szCs w:val="18"/>
+              </w:rPr>
+              <w:t>enrich.py</w:t>
+            </w:r>
+          </w:p>
+        </w:tc>
+        <w:tc>
+          <w:tcPr>
+            <w:tcW w:w="3761" w:type="dxa"/>
+            <w:tcBorders>
+              <w:top w:val="single" w:sz="4" w:space="0" w:color="C9D3CE"/>
+              <w:left w:val="single" w:sz="4" w:space="0" w:color="C9D3CE"/>
+              <w:bottom w:val="single" w:sz="4" w:space="0" w:color="C9D3CE"/>
+              <w:right w:val="single" w:sz="4" w:space="0" w:color="C9D3CE"/>
+            </w:tcBorders>
+            <w:tcMar>
+              <w:top w:w="60" w:type="dxa"/>
+              <w:left w:w="100" w:type="dxa"/>
+              <w:bottom w:w="60" w:type="dxa"/>
+              <w:right w:w="100" w:type="dxa"/>
+            </w:tcMar>
+          </w:tcPr>
+          <w:p>
+            <w:pPr>
+              <w:spacing w:after="20" w:line="260" w:lineRule="auto"/>
+            </w:pPr>
+            <w:r>
+              <w:rPr>
+                <w:sz w:val="18"/>
+                <w:szCs w:val="18"/>
+              </w:rPr>
+              <w:t>gemini-3.1-flash-lite → gemini-2.5-flash-lite → gemini-3.6-flash → gemini-2.5-flash → gemini-3.8-flash</w:t>
+            </w:r>
+          </w:p>
+        </w:tc>
+        <w:tc>
+          <w:tcPr>
+            <w:tcW w:w="1880" w:type="dxa"/>
+            <w:tcBorders>
+              <w:top w:val="single" w:sz="4" w:space="0" w:color="C9D3CE"/>
+              <w:left w:val="single" w:sz="4" w:space="0" w:color="C9D3CE"/>
+              <w:bottom w:val="single" w:sz="4" w:space="0" w:color="C9D3CE"/>
+              <w:right w:val="single" w:sz="4" w:space="0" w:color="C9D3CE"/>
+            </w:tcBorders>
+            <w:tcMar>
+              <w:top w:w="60" w:type="dxa"/>
+              <w:left w:w="100" w:type="dxa"/>
+              <w:bottom w:w="60" w:type="dxa"/>
+              <w:right w:w="100" w:type="dxa"/>
+            </w:tcMar>
+          </w:tcPr>
+          <w:p>
+            <w:pPr>
+              <w:spacing w:after="20" w:line="260" w:lineRule="auto"/>
+            </w:pPr>
+            <w:r>
+              <w:rPr>
+                <w:sz w:val="18"/>
+                <w:szCs w:val="18"/>
+              </w:rPr>
+              <w:t>0–10 request</w:t>
+            </w:r>
+          </w:p>
+        </w:tc>
+      </w:tr>
+      <w:tr>
+        <w:tblPrEx>
+          <w:tblCellMar>
+            <w:top w:w="0" w:type="dxa"/>
+            <w:bottom w:w="0" w:type="dxa"/>
+          </w:tblCellMar>
+        </w:tblPrEx>
+        <w:tc>
+          <w:tcPr>
+            <w:tcW w:w="1881" w:type="dxa"/>
+            <w:tcBorders>
+              <w:top w:val="single" w:sz="4" w:space="0" w:color="C9D3CE"/>
+              <w:left w:val="single" w:sz="4" w:space="0" w:color="C9D3CE"/>
+              <w:bottom w:val="single" w:sz="4" w:space="0" w:color="C9D3CE"/>
+              <w:right w:val="single" w:sz="4" w:space="0" w:color="C9D3CE"/>
+            </w:tcBorders>
+            <w:tcMar>
+              <w:top w:w="60" w:type="dxa"/>
+              <w:left w:w="100" w:type="dxa"/>
+              <w:bottom w:w="60" w:type="dxa"/>
+              <w:right w:w="100" w:type="dxa"/>
+            </w:tcMar>
+          </w:tcPr>
+          <w:p>
+            <w:pPr>
+              <w:spacing w:after="20" w:line="260" w:lineRule="auto"/>
+            </w:pPr>
+            <w:r>
+              <w:rPr>
+                <w:sz w:val="18"/>
+                <w:szCs w:val="18"/>
+              </w:rPr>
               <w:t>อ่านราคากลางที่เป็นภาพสแกน (แนบ PDF)</w:t>
             </w:r>
           </w:p>
@@ -11323,7 +11489,7 @@
         <w:keepNext/>
         <w:spacing w:before="280" w:after="120"/>
       </w:pPr>
-      <w:bookmarkStart w:id="16" w:name="_Toc242978256"/>
+      <w:bookmarkStart w:id="16" w:name="_Toc243378729"/>
       <w:r>
         <w:t xml:space="preserve">7.1 </w:t>
       </w:r>
@@ -11781,7 +11947,7 @@
         <w:keepNext/>
         <w:spacing w:before="280" w:after="120"/>
       </w:pPr>
-      <w:bookmarkStart w:id="17" w:name="_Toc242978257"/>
+      <w:bookmarkStart w:id="17" w:name="_Toc243378730"/>
       <w:r>
         <w:t xml:space="preserve">7.2 </w:t>
       </w:r>
@@ -11905,8 +12071,9 @@
         <w:pageBreakBefore/>
         <w:spacing w:before="360" w:after="160"/>
       </w:pPr>
-      <w:bookmarkStart w:id="18" w:name="_Toc242978258"/>
-      <w:r>
+      <w:bookmarkStart w:id="18" w:name="_Toc243378731"/>
+      <w:r>
+        <w:lastRenderedPageBreak/>
         <w:t xml:space="preserve">8. </w:t>
       </w:r>
       <w:r>
@@ -11967,7 +12134,7 @@
         <w:keepNext/>
         <w:spacing w:before="280" w:after="120"/>
       </w:pPr>
-      <w:bookmarkStart w:id="19" w:name="_Toc242978259"/>
+      <w:bookmarkStart w:id="19" w:name="_Toc243378732"/>
       <w:r>
         <w:t xml:space="preserve">8.1 </w:t>
       </w:r>
@@ -12690,6 +12857,144 @@
           </w:p>
         </w:tc>
       </w:tr>
+      <w:tr>
+        <w:tblPrEx>
+          <w:tblCellMar>
+            <w:top w:w="0" w:type="dxa"/>
+            <w:bottom w:w="0" w:type="dxa"/>
+          </w:tblCellMar>
+        </w:tblPrEx>
+        <w:tc>
+          <w:tcPr>
+            <w:tcW w:w="1566" w:type="dxa"/>
+            <w:tcBorders>
+              <w:top w:val="single" w:sz="4" w:space="0" w:color="C9D3CE"/>
+              <w:left w:val="single" w:sz="4" w:space="0" w:color="C9D3CE"/>
+              <w:bottom w:val="single" w:sz="4" w:space="0" w:color="C9D3CE"/>
+              <w:right w:val="single" w:sz="4" w:space="0" w:color="C9D3CE"/>
+            </w:tcBorders>
+            <w:tcMar>
+              <w:top w:w="60" w:type="dxa"/>
+              <w:left w:w="100" w:type="dxa"/>
+              <w:bottom w:w="60" w:type="dxa"/>
+              <w:right w:w="100" w:type="dxa"/>
+            </w:tcMar>
+          </w:tcPr>
+          <w:p>
+            <w:pPr>
+              <w:spacing w:after="20" w:line="260" w:lineRule="auto"/>
+            </w:pPr>
+            <w:r>
+              <w:rPr>
+                <w:sz w:val="18"/>
+                <w:szCs w:val="18"/>
+              </w:rPr>
+              <w:t xml:space="preserve">W0 </w:t>
+            </w:r>
+            <w:r>
+              <w:rPr>
+                <w:sz w:val="18"/>
+                <w:szCs w:val="18"/>
+              </w:rPr>
+              <w:t>ประกาศผู้ชนะ</w:t>
+            </w:r>
+          </w:p>
+        </w:tc>
+        <w:tc>
+          <w:tcPr>
+            <w:tcW w:w="2891" w:type="dxa"/>
+            <w:tcBorders>
+              <w:top w:val="single" w:sz="4" w:space="0" w:color="C9D3CE"/>
+              <w:left w:val="single" w:sz="4" w:space="0" w:color="C9D3CE"/>
+              <w:bottom w:val="single" w:sz="4" w:space="0" w:color="C9D3CE"/>
+              <w:right w:val="single" w:sz="4" w:space="0" w:color="C9D3CE"/>
+            </w:tcBorders>
+            <w:tcMar>
+              <w:top w:w="60" w:type="dxa"/>
+              <w:left w:w="100" w:type="dxa"/>
+              <w:bottom w:w="60" w:type="dxa"/>
+              <w:right w:w="100" w:type="dxa"/>
+            </w:tcMar>
+          </w:tcPr>
+          <w:p>
+            <w:pPr>
+              <w:spacing w:after="20" w:line="260" w:lineRule="auto"/>
+            </w:pPr>
+            <w:r>
+              <w:rPr>
+                <w:sz w:val="18"/>
+                <w:szCs w:val="18"/>
+              </w:rPr>
+              <w:t>หน้า HTML (วิธีเฉพาะเจาะจง ส่วนใหญ่) หรือ PDF (e-bidding ข้อความเรียงสลับ)</w:t>
+            </w:r>
+          </w:p>
+        </w:tc>
+        <w:tc>
+          <w:tcPr>
+            <w:tcW w:w="2891" w:type="dxa"/>
+            <w:tcBorders>
+              <w:top w:val="single" w:sz="4" w:space="0" w:color="C9D3CE"/>
+              <w:left w:val="single" w:sz="4" w:space="0" w:color="C9D3CE"/>
+              <w:bottom w:val="single" w:sz="4" w:space="0" w:color="C9D3CE"/>
+              <w:right w:val="single" w:sz="4" w:space="0" w:color="C9D3CE"/>
+            </w:tcBorders>
+            <w:tcMar>
+              <w:top w:w="60" w:type="dxa"/>
+              <w:left w:w="100" w:type="dxa"/>
+              <w:bottom w:w="60" w:type="dxa"/>
+              <w:right w:w="100" w:type="dxa"/>
+            </w:tcMar>
+          </w:tcPr>
+          <w:p>
+            <w:pPr>
+              <w:spacing w:after="20" w:line="260" w:lineRule="auto"/>
+            </w:pPr>
+            <w:r>
+              <w:rPr>
+                <w:sz w:val="18"/>
+                <w:szCs w:val="18"/>
+              </w:rPr>
+              <w:t xml:space="preserve">regex </w:t>
+            </w:r>
+            <w:r>
+              <w:rPr>
+                <w:sz w:val="18"/>
+                <w:szCs w:val="18"/>
+              </w:rPr>
+              <w:t>จาก HTML · PDF ที่ regex จับไม่ได้ส่ง Gemini Flash Lite</w:t>
+            </w:r>
+          </w:p>
+        </w:tc>
+        <w:tc>
+          <w:tcPr>
+            <w:tcW w:w="2290" w:type="dxa"/>
+            <w:tcBorders>
+              <w:top w:val="single" w:sz="4" w:space="0" w:color="C9D3CE"/>
+              <w:left w:val="single" w:sz="4" w:space="0" w:color="C9D3CE"/>
+              <w:bottom w:val="single" w:sz="4" w:space="0" w:color="C9D3CE"/>
+              <w:right w:val="single" w:sz="4" w:space="0" w:color="C9D3CE"/>
+            </w:tcBorders>
+            <w:tcMar>
+              <w:top w:w="60" w:type="dxa"/>
+              <w:left w:w="100" w:type="dxa"/>
+              <w:bottom w:w="60" w:type="dxa"/>
+              <w:right w:w="100" w:type="dxa"/>
+            </w:tcMar>
+          </w:tcPr>
+          <w:p>
+            <w:pPr>
+              <w:spacing w:after="20" w:line="260" w:lineRule="auto"/>
+            </w:pPr>
+            <w:r>
+              <w:rPr>
+                <w:sz w:val="18"/>
+                <w:szCs w:val="18"/>
+              </w:rPr>
+              <w:t>ชื่อผู้ชนะ, ราคาที่ชนะ (ไม่มีราคากลาง)</w:t>
+            </w:r>
+          </w:p>
+        </w:tc>
+      </w:tr>
     </w:tbl>
     <w:p>
       <w:pPr>
@@ -12733,7 +13038,7 @@
         <w:keepNext/>
         <w:spacing w:before="280" w:after="120"/>
       </w:pPr>
-      <w:bookmarkStart w:id="20" w:name="_Toc242978260"/>
+      <w:bookmarkStart w:id="20" w:name="_Toc243378733"/>
       <w:r>
         <w:t xml:space="preserve">8.2 </w:t>
       </w:r>
@@ -12767,7 +13072,7 @@
         <w:t xml:space="preserve"> </w:t>
       </w:r>
       <w:r>
-        <w:t>คืนรายการที่เกี่ยวข้อง คะแนน ≥ 50 ประเภท D0, B0, 15 ที่ยังไม่เคยอ่าน (ภายใน 30 วัน) สูงสุด 300 ต่อรอบ</w:t>
+        <w:t>คืนรายการที่เกี่ยวข้อง คะแนน ≥ 50 ประเภท D0, B0, 15, P0, W0 ที่ยังไม่เคยอ่าน (ภายใน 30 วัน) เรียง D0 → B0 → 15 → P0 → W0 สูงสุด 400 ต่อรอบ</w:t>
       </w:r>
     </w:p>
     <w:p>
@@ -13067,6 +13372,7 @@
           <w:sz w:val="18"/>
           <w:szCs w:val="18"/>
         </w:rPr>
+        <w:lastRenderedPageBreak/>
         <w:t xml:space="preserve">- bid_date: </w:t>
       </w:r>
       <w:r>
@@ -13171,16 +13477,16 @@
     </w:p>
     <w:p>
       <w:pPr>
-        <w:pStyle w:val="Heading1"/>
-        <w:pageBreakBefore/>
-        <w:spacing w:before="360" w:after="160"/>
+        <w:pStyle w:val="Heading2"/>
+        <w:keepNext/>
+        <w:spacing w:before="280" w:after="120"/>
       </w:pPr>
-      <w:bookmarkStart w:id="21" w:name="_Toc242978261"/>
-      <w:r>
-        <w:t xml:space="preserve">9. </w:t>
-      </w:r>
-      <w:r>
-        <w:t>ขั้นที่ 5: อีเมลสรุปและ Excel</w:t>
+      <w:bookmarkStart w:id="21" w:name="_Toc243378734"/>
+      <w:r>
+        <w:t xml:space="preserve">8.3 </w:t>
+      </w:r>
+      <w:r>
+        <w:t>จังหวัดของประกาศ</w:t>
       </w:r>
       <w:bookmarkEnd w:id="21"/>
     </w:p>
@@ -13198,10 +13504,13 @@
           <w:sz w:val="17"/>
           <w:szCs w:val="17"/>
         </w:rPr>
-        <w:t>scripts/digest.py</w:t>
-      </w:r>
-      <w:r>
-        <w:t xml:space="preserve"> · Workflow: </w:t>
+        <w:t>egp/provinces.py</w:t>
+      </w:r>
+      <w:r>
+        <w:t xml:space="preserve"> · </w:t>
+      </w:r>
+      <w:r>
+        <w:t xml:space="preserve">เก็บใน </w:t>
       </w:r>
       <w:r>
         <w:rPr>
@@ -13210,13 +13519,82 @@
           <w:sz w:val="17"/>
           <w:szCs w:val="17"/>
         </w:rPr>
-        <w:t>digest.yml</w:t>
-      </w:r>
-      <w:r>
-        <w:t xml:space="preserve"> · </w:t>
-      </w:r>
-      <w:r>
-        <w:t xml:space="preserve">ฟังก์ชัน: </w:t>
+        <w:t>announcement_details.extracted.province</w:t>
+      </w:r>
+    </w:p>
+    <w:p>
+      <w:pPr>
+        <w:spacing w:after="120" w:line="300" w:lineRule="auto"/>
+      </w:pPr>
+      <w:r>
+        <w:t xml:space="preserve">RSS </w:t>
+      </w:r>
+      <w:r>
+        <w:t>บอกแค่หน่วยงานระดับกรม (เช่น 1508 กรมส่งเสริมการปกครองท้องถิ่น รวม อบต./เทศบาลทั้งประเทศ) และรหัสหน่วยงานย่อยในไฟล์รายชื่อหน่วยงานของ e-GP (govs_list) จับคู่กับประกาศไม่ได้ ระบบจึงอ่านจังหวัดจากข้อความ:</w:t>
+      </w:r>
+    </w:p>
+    <w:p>
+      <w:pPr>
+        <w:pStyle w:val="ListParagraph"/>
+        <w:numPr>
+          <w:ilvl w:val="0"/>
+          <w:numId w:val="2"/>
+        </w:numPr>
+        <w:spacing w:after="60" w:line="290" w:lineRule="auto"/>
+      </w:pPr>
+      <w:r>
+        <w:rPr>
+          <w:rFonts w:ascii="Consolas" w:eastAsia="Consolas" w:hAnsi="Consolas" w:cs="Consolas"/>
+          <w:color w:val="2D4A8A"/>
+          <w:sz w:val="17"/>
+          <w:szCs w:val="17"/>
+        </w:rPr>
+        <w:t>detect(title, document)</w:t>
+      </w:r>
+      <w:r>
+        <w:t xml:space="preserve"> </w:t>
+      </w:r>
+      <w:r>
+        <w:t>หาชื่อ 77 จังหวัดในชื่อโครงการก่อน ถ้าไม่มีจึงนับในเอกสาร (ที่อยู่ ชื่อสำนักงาน ตำแหน่งผู้ลงนาม) แล้วเลือกจังหวัดที่ถูกกล่าวถึงบ่อยสุด</w:t>
+      </w:r>
+    </w:p>
+    <w:p>
+      <w:pPr>
+        <w:pStyle w:val="ListParagraph"/>
+        <w:numPr>
+          <w:ilvl w:val="0"/>
+          <w:numId w:val="2"/>
+        </w:numPr>
+        <w:spacing w:after="60" w:line="290" w:lineRule="auto"/>
+      </w:pPr>
+      <w:r>
+        <w:t>รองรับชื่อย่อ: กรุงเทพฯ / กทม → กรุงเทพมหานคร, อยุธยา → พระนครศรีอยุธยา, โคราช → นครราชสีมา</w:t>
+      </w:r>
+    </w:p>
+    <w:p>
+      <w:pPr>
+        <w:pStyle w:val="ListParagraph"/>
+        <w:numPr>
+          <w:ilvl w:val="0"/>
+          <w:numId w:val="2"/>
+        </w:numPr>
+        <w:spacing w:after="60" w:line="290" w:lineRule="auto"/>
+      </w:pPr>
+      <w:r>
+        <w:t>ชื่อที่เป็นคำทั่วไปด้วย (เลย, แพร่, ตาก, น่าน, ตรัง) นับเฉพาะเมื่อมี "จังหวัด" / "จ." / "จว." นำหน้า</w:t>
+      </w:r>
+    </w:p>
+    <w:p>
+      <w:pPr>
+        <w:pStyle w:val="ListParagraph"/>
+        <w:numPr>
+          <w:ilvl w:val="0"/>
+          <w:numId w:val="2"/>
+        </w:numPr>
+        <w:spacing w:after="60" w:line="290" w:lineRule="auto"/>
+      </w:pPr>
+      <w:r>
+        <w:t xml:space="preserve">ถ้าเอกสารของประกาศนั้นไม่บอก ใช้จังหวัดจากเอกสารอื่นของโครงการเดียวกัน (ใน </w:t>
       </w:r>
       <w:r>
         <w:rPr>
@@ -13228,10 +13606,23 @@
         <w:t>digest_items</w:t>
       </w:r>
       <w:r>
-        <w:t xml:space="preserve"> · </w:t>
-      </w:r>
-      <w:r>
-        <w:t xml:space="preserve">ตาราง: </w:t>
+        <w:t>)</w:t>
+      </w:r>
+    </w:p>
+    <w:p>
+      <w:pPr>
+        <w:spacing w:after="120" w:line="300" w:lineRule="auto"/>
+      </w:pPr>
+      <w:r>
+        <w:t>ผล ณ 20 ต.ค. 2569 (14 วัน): ระบุจังหวัดได้ราว 2 ใน 3 ของประกาศผู้ชนะ (477/710) และแผนจัดซื้อ (156/210) ประกาศที่ระบุไม่ได้ส่วนใหญ่เป็นหน่วยงานส่วนกลาง (เช่น กรมอนามัย กรมควบคุมโรค) แต่มีหน่วยงานภูมิภาคที่เอกสารไม่เขียนชื่อจังหวัดปนอยู่บ้าง</w:t>
+      </w:r>
+    </w:p>
+    <w:p>
+      <w:pPr>
+        <w:spacing w:after="120" w:line="300" w:lineRule="auto"/>
+      </w:pPr>
+      <w:r>
+        <w:t xml:space="preserve">ประกาศที่อ่านไปก่อนมีระบบจังหวัด เติมได้ด้วย </w:t>
       </w:r>
       <w:r>
         <w:rPr>
@@ -13240,7 +13631,25 @@
           <w:sz w:val="17"/>
           <w:szCs w:val="17"/>
         </w:rPr>
-        <w:t>digests</w:t>
+        <w:t>enrich.py --add-province-days N</w:t>
+      </w:r>
+      <w:r>
+        <w:t xml:space="preserve"> (</w:t>
+      </w:r>
+      <w:r>
+        <w:t xml:space="preserve">เปิดเอกสารใหม่ ไม่ใช้ Gemini, RPC </w:t>
+      </w:r>
+      <w:r>
+        <w:rPr>
+          <w:rFonts w:ascii="Consolas" w:eastAsia="Consolas" w:hAnsi="Consolas" w:cs="Consolas"/>
+          <w:color w:val="2D4A8A"/>
+          <w:sz w:val="17"/>
+          <w:szCs w:val="17"/>
+        </w:rPr>
+        <w:t>details_without_province</w:t>
+      </w:r>
+      <w:r>
+        <w:t>)</w:t>
       </w:r>
     </w:p>
     <w:p>
@@ -13249,12 +13658,12 @@
         <w:keepNext/>
         <w:spacing w:before="280" w:after="120"/>
       </w:pPr>
-      <w:bookmarkStart w:id="22" w:name="_Toc242978262"/>
-      <w:r>
-        <w:t xml:space="preserve">9.1 </w:t>
-      </w:r>
-      <w:r>
-        <w:t>เลือกรายการอย่างไร</w:t>
+      <w:bookmarkStart w:id="22" w:name="_Toc243378735"/>
+      <w:r>
+        <w:t xml:space="preserve">8.4 </w:t>
+      </w:r>
+      <w:r>
+        <w:t>ผู้ชนะและราคาที่ชนะ (W0)</w:t>
       </w:r>
       <w:bookmarkEnd w:id="22"/>
     </w:p>
@@ -13268,22 +13677,19 @@
         <w:spacing w:after="60" w:line="290" w:lineRule="auto"/>
       </w:pPr>
       <w:r>
-        <w:t>ช่วงเวลา = ตั้งแต่ฉบับล่าสุดที่ส่งจริง (</w:t>
-      </w:r>
-      <w:r>
         <w:rPr>
           <w:rFonts w:ascii="Consolas" w:eastAsia="Consolas" w:hAnsi="Consolas" w:cs="Consolas"/>
           <w:color w:val="2D4A8A"/>
           <w:sz w:val="17"/>
           <w:szCs w:val="17"/>
         </w:rPr>
-        <w:t>digests</w:t>
-      </w:r>
-      <w:r>
-        <w:t xml:space="preserve">) </w:t>
-      </w:r>
-      <w:r>
-        <w:t>ถ้าไม่เคยส่งใช้ย้อน 1 วัน ใช้ "เวลาที่ระบบเห็นครั้งแรก" ไม่ใช่วันที่ประกาศ</w:t>
+        <w:t>parse_winners()</w:t>
+      </w:r>
+      <w:r>
+        <w:t xml:space="preserve"> </w:t>
+      </w:r>
+      <w:r>
+        <w:t>หา "ได้แก่ &lt;ชื่อ&gt; โดยเสนอราคา ... เป็นเงินทั้งสิ้น N บาท" ทุกรายการในประกาศ ตัดวงเล็บประเภทกิจการ (ขายส่ง, ขายปลีก, ...) ที่อยู่ "เลขที่ ..." และ "ผู้ประกอบการ..." ออก ราคาเป็นยอดรวมทุกรายการ</w:t>
       </w:r>
     </w:p>
     <w:p>
@@ -13296,7 +13702,7 @@
         <w:spacing w:after="60" w:line="290" w:lineRule="auto"/>
       </w:pPr>
       <w:r>
-        <w:t xml:space="preserve">แสดงเฉพาะ relevant และคะแนน ≥ 50 (ปรับได้ด้วย </w:t>
+        <w:t xml:space="preserve">ถ้าชื่อที่จับได้ไม่เหมือนชื่อผู้ขาย (เช่น PDF ที่ข้อความเรียงสลับ) ส่งข้อความให้ Gemini Flash Lite อ่านตาม </w:t>
       </w:r>
       <w:r>
         <w:rPr>
@@ -13305,10 +13711,7 @@
           <w:sz w:val="17"/>
           <w:szCs w:val="17"/>
         </w:rPr>
-        <w:t>--min-score</w:t>
-      </w:r>
-      <w:r>
-        <w:t>)</w:t>
+        <w:t>WINNER_PROMPT</w:t>
       </w:r>
     </w:p>
     <w:p>
@@ -13321,7 +13724,241 @@
         <w:spacing w:after="60" w:line="290" w:lineRule="auto"/>
       </w:pPr>
       <w:r>
+        <w:t>หน้า HTML ถอดรหัสด้วย cp874 (TIS-620 + ช่องว่างแบบ no-break) ไม่งั้นตัวเลขเงินกับคำว่า "บาท" ถูกคั่นด้วยอักขระเสียและจับไม่ได้</w:t>
+      </w:r>
+    </w:p>
+    <w:p>
+      <w:pPr>
+        <w:pStyle w:val="ListParagraph"/>
+        <w:numPr>
+          <w:ilvl w:val="0"/>
+          <w:numId w:val="2"/>
+        </w:numPr>
+        <w:spacing w:after="60" w:line="290" w:lineRule="auto"/>
+      </w:pPr>
+      <w:r>
+        <w:t>ผลทดสอบ 20 ต.ค. 2569: ได้ชื่อผู้ชนะ 689 จาก 710 ประกาศ (97%)</w:t>
+      </w:r>
+    </w:p>
+    <w:p>
+      <w:pPr>
+        <w:pBdr>
+          <w:left w:val="single" w:sz="18" w:space="8" w:color="C98A1B"/>
+        </w:pBdr>
+        <w:spacing w:before="80" w:after="160" w:line="290" w:lineRule="auto"/>
+        <w:ind w:left="200"/>
+      </w:pPr>
+      <w:r>
+        <w:t>ประกาศผู้ชนะส่วนใหญ่ (84%) เป็นวิธีเฉพาะเจาะจงซึ่งไม่มีประกาศราคากลางก่อนหน้า คอลัมน์งบประมาณจึงมักว่าง ให้ดูราคาที่ชนะแทน</w:t>
+      </w:r>
+    </w:p>
+    <w:p>
+      <w:pPr>
+        <w:pStyle w:val="Heading1"/>
+        <w:pageBreakBefore/>
+        <w:spacing w:before="360" w:after="160"/>
+      </w:pPr>
+      <w:bookmarkStart w:id="23" w:name="_Toc243378736"/>
+      <w:r>
+        <w:lastRenderedPageBreak/>
+        <w:t xml:space="preserve">9. </w:t>
+      </w:r>
+      <w:r>
+        <w:t>ขั้นที่ 5: อีเมลสรุปและ Excel</w:t>
+      </w:r>
+      <w:bookmarkEnd w:id="23"/>
+    </w:p>
+    <w:p>
+      <w:pPr>
+        <w:spacing w:after="120" w:line="300" w:lineRule="auto"/>
+      </w:pPr>
+      <w:r>
+        <w:t xml:space="preserve">ไฟล์: </w:t>
+      </w:r>
+      <w:r>
+        <w:rPr>
+          <w:rFonts w:ascii="Consolas" w:eastAsia="Consolas" w:hAnsi="Consolas" w:cs="Consolas"/>
+          <w:color w:val="2D4A8A"/>
+          <w:sz w:val="17"/>
+          <w:szCs w:val="17"/>
+        </w:rPr>
+        <w:t>scripts/digest.py</w:t>
+      </w:r>
+      <w:r>
+        <w:t xml:space="preserve"> · Workflow: </w:t>
+      </w:r>
+      <w:r>
+        <w:rPr>
+          <w:rFonts w:ascii="Consolas" w:eastAsia="Consolas" w:hAnsi="Consolas" w:cs="Consolas"/>
+          <w:color w:val="2D4A8A"/>
+          <w:sz w:val="17"/>
+          <w:szCs w:val="17"/>
+        </w:rPr>
+        <w:t>digest.yml</w:t>
+      </w:r>
+      <w:r>
+        <w:t xml:space="preserve"> · </w:t>
+      </w:r>
+      <w:r>
+        <w:t xml:space="preserve">ฟังก์ชัน: </w:t>
+      </w:r>
+      <w:r>
+        <w:rPr>
+          <w:rFonts w:ascii="Consolas" w:eastAsia="Consolas" w:hAnsi="Consolas" w:cs="Consolas"/>
+          <w:color w:val="2D4A8A"/>
+          <w:sz w:val="17"/>
+          <w:szCs w:val="17"/>
+        </w:rPr>
+        <w:t>digest_items</w:t>
+      </w:r>
+      <w:r>
+        <w:t xml:space="preserve"> · </w:t>
+      </w:r>
+      <w:r>
+        <w:t xml:space="preserve">ตาราง: </w:t>
+      </w:r>
+      <w:r>
+        <w:rPr>
+          <w:rFonts w:ascii="Consolas" w:eastAsia="Consolas" w:hAnsi="Consolas" w:cs="Consolas"/>
+          <w:color w:val="2D4A8A"/>
+          <w:sz w:val="17"/>
+          <w:szCs w:val="17"/>
+        </w:rPr>
+        <w:t>digests</w:t>
+      </w:r>
+    </w:p>
+    <w:p>
+      <w:pPr>
+        <w:pStyle w:val="Heading2"/>
+        <w:keepNext/>
+        <w:spacing w:before="280" w:after="120"/>
+      </w:pPr>
+      <w:bookmarkStart w:id="24" w:name="_Toc243378737"/>
+      <w:r>
+        <w:t xml:space="preserve">9.1 </w:t>
+      </w:r>
+      <w:r>
+        <w:t>เลือกรายการอย่างไร</w:t>
+      </w:r>
+      <w:bookmarkEnd w:id="24"/>
+    </w:p>
+    <w:p>
+      <w:pPr>
+        <w:pStyle w:val="ListParagraph"/>
+        <w:numPr>
+          <w:ilvl w:val="0"/>
+          <w:numId w:val="2"/>
+        </w:numPr>
+        <w:spacing w:after="60" w:line="290" w:lineRule="auto"/>
+      </w:pPr>
+      <w:r>
+        <w:t>ช่วงเวลา = ตั้งแต่ฉบับล่าสุดที่ส่งจริง (</w:t>
+      </w:r>
+      <w:r>
+        <w:rPr>
+          <w:rFonts w:ascii="Consolas" w:eastAsia="Consolas" w:hAnsi="Consolas" w:cs="Consolas"/>
+          <w:color w:val="2D4A8A"/>
+          <w:sz w:val="17"/>
+          <w:szCs w:val="17"/>
+        </w:rPr>
+        <w:t>digests</w:t>
+      </w:r>
+      <w:r>
+        <w:t xml:space="preserve">) </w:t>
+      </w:r>
+      <w:r>
+        <w:t>ถ้าไม่เคยส่งใช้ย้อน 1 วัน ใช้ "เวลาที่ระบบเห็นครั้งแรก" ไม่ใช่วันที่ประกาศ</w:t>
+      </w:r>
+    </w:p>
+    <w:p>
+      <w:pPr>
+        <w:pStyle w:val="ListParagraph"/>
+        <w:numPr>
+          <w:ilvl w:val="0"/>
+          <w:numId w:val="2"/>
+        </w:numPr>
+        <w:spacing w:after="60" w:line="290" w:lineRule="auto"/>
+      </w:pPr>
+      <w:r>
+        <w:t xml:space="preserve">แสดงเฉพาะ relevant และคะแนน ≥ 50 (ปรับได้ด้วย </w:t>
+      </w:r>
+      <w:r>
+        <w:rPr>
+          <w:rFonts w:ascii="Consolas" w:eastAsia="Consolas" w:hAnsi="Consolas" w:cs="Consolas"/>
+          <w:color w:val="2D4A8A"/>
+          <w:sz w:val="17"/>
+          <w:szCs w:val="17"/>
+        </w:rPr>
+        <w:t>--min-score</w:t>
+      </w:r>
+      <w:r>
+        <w:t>)</w:t>
+      </w:r>
+    </w:p>
+    <w:p>
+      <w:pPr>
+        <w:pStyle w:val="ListParagraph"/>
+        <w:numPr>
+          <w:ilvl w:val="0"/>
+          <w:numId w:val="2"/>
+        </w:numPr>
+        <w:spacing w:after="60" w:line="290" w:lineRule="auto"/>
+      </w:pPr>
+      <w:r>
         <w:t>งบประมาณ: ถ้าเอกสารของประกาศนั้นไม่มี จะใช้งบจากประกาศอื่นของโครงการเดียวกัน (เช่น B0 หรือ 15)</w:t>
+      </w:r>
+    </w:p>
+    <w:p>
+      <w:pPr>
+        <w:pStyle w:val="ListParagraph"/>
+        <w:numPr>
+          <w:ilvl w:val="0"/>
+          <w:numId w:val="2"/>
+        </w:numPr>
+        <w:spacing w:after="60" w:line="290" w:lineRule="auto"/>
+      </w:pPr>
+      <w:r>
+        <w:rPr>
+          <w:b/>
+          <w:bCs/>
+        </w:rPr>
+        <w:t>จังหวัด:</w:t>
+      </w:r>
+      <w:r>
+        <w:t xml:space="preserve"> </w:t>
+      </w:r>
+      <w:r>
+        <w:t xml:space="preserve">อีเมลมีเฉพาะจังหวัดใน GitHub Variable </w:t>
+      </w:r>
+      <w:r>
+        <w:rPr>
+          <w:rFonts w:ascii="Consolas" w:eastAsia="Consolas" w:hAnsi="Consolas" w:cs="Consolas"/>
+          <w:color w:val="2D4A8A"/>
+          <w:sz w:val="17"/>
+          <w:szCs w:val="17"/>
+        </w:rPr>
+        <w:t>TARGET_PROVINCES</w:t>
+      </w:r>
+      <w:r>
+        <w:t xml:space="preserve"> (</w:t>
+      </w:r>
+      <w:r>
+        <w:t xml:space="preserve">ไม่ตั้ง = </w:t>
+      </w:r>
+      <w:r>
+        <w:rPr>
+          <w:rFonts w:ascii="Consolas" w:eastAsia="Consolas" w:hAnsi="Consolas" w:cs="Consolas"/>
+          <w:color w:val="2D4A8A"/>
+          <w:sz w:val="17"/>
+          <w:szCs w:val="17"/>
+        </w:rPr>
+        <w:t>DEFAULT_PROVINCES</w:t>
+      </w:r>
+      <w:r>
+        <w:t xml:space="preserve"> 15 </w:t>
+      </w:r>
+      <w:r>
+        <w:t>จังหวัด: กรุงเทพมหานคร นนทบุรี ปทุมธานี สมุทรปราการ สมุทรสาคร สมุทรสงคราม นครปฐม พระนครศรีอยุธยา สระบุรี นครนายก ปราจีนบุรี ฉะเชิงเทรา ชลบุรี ระยอง จันทบุรี) รวมประกาศที่ระบุจังหวัดไม่ได้ ประกาศที่ระบุได้ว่าเป็นจังหวัดอื่นไม่อยู่ในอีเมล แต่อยู่ในแท็บ "จังหวัดอื่น" ของ Excel ชื่อจังหวัดที่สะกดผิดใน TARGET_PROVINCES ทำให้ digest หยุดพร้อมข้อความบอกชื่อที่ผิด</w:t>
       </w:r>
     </w:p>
     <w:tbl>
@@ -14361,18 +14998,31 @@
     </w:p>
     <w:p>
       <w:pPr>
+        <w:pStyle w:val="ListParagraph"/>
+        <w:numPr>
+          <w:ilvl w:val="0"/>
+          <w:numId w:val="2"/>
+        </w:numPr>
+        <w:spacing w:after="60" w:line="290" w:lineRule="auto"/>
+      </w:pPr>
+      <w:r>
+        <w:t>ใต้ชื่อหน่วยงานแสดงจังหวัด (หรือ "ไม่ระบุจังหวัด") · หมวดผลผู้ชนะ (W0) เปลี่ยนคอลัมน์งบและวันยื่นซองเป็น "ราคาที่ชนะ (บาท)" และ "ผู้ชนะ"</w:t>
+      </w:r>
+    </w:p>
+    <w:p>
+      <w:pPr>
         <w:pStyle w:val="Heading2"/>
         <w:keepNext/>
         <w:spacing w:before="280" w:after="120"/>
       </w:pPr>
-      <w:bookmarkStart w:id="23" w:name="_Toc242978263"/>
+      <w:bookmarkStart w:id="25" w:name="_Toc243378738"/>
       <w:r>
         <w:t xml:space="preserve">9.2 </w:t>
       </w:r>
       <w:r>
         <w:t>ผู้รับและการส่ง</w:t>
       </w:r>
-      <w:bookmarkEnd w:id="23"/>
+      <w:bookmarkEnd w:id="25"/>
     </w:p>
     <w:p>
       <w:pPr>
@@ -14525,21 +15175,21 @@
         <w:keepNext/>
         <w:spacing w:before="280" w:after="120"/>
       </w:pPr>
-      <w:bookmarkStart w:id="24" w:name="_Toc242978264"/>
+      <w:bookmarkStart w:id="26" w:name="_Toc243378739"/>
       <w:r>
         <w:t xml:space="preserve">9.3 </w:t>
       </w:r>
       <w:r>
         <w:t>คอลัมน์ Excel</w:t>
       </w:r>
-      <w:bookmarkEnd w:id="24"/>
+      <w:bookmarkEnd w:id="26"/>
     </w:p>
     <w:p>
       <w:pPr>
         <w:spacing w:after="120" w:line="300" w:lineRule="auto"/>
       </w:pPr>
       <w:r>
-        <w:t xml:space="preserve">หมวดอีเมล, คะแนน, ประเภทประกาศ (ชื่อไทย + รหัส), ชื่อโครงการ, หน่วยงาน, หมวดสินค้า, เหตุผล, งบประมาณ (บาท) รูปแบบ </w:t>
+        <w:t xml:space="preserve">แท็บ "รายการ" (ในอีเมล), "จังหวัดอื่น" (มีเมื่อมีรายการ) และ "คำอธิบาย" · คอลัมน์: หมวดอีเมล, คะแนน, ประเภทประกาศ (ชื่อไทย + รหัส), ชื่อโครงการ, หน่วยงาน, จังหวัด, หมวดสินค้า, เหตุผล, งบประมาณ (บาท) รูปแบบ </w:t>
       </w:r>
       <w:r>
         <w:rPr>
@@ -14554,6 +15204,21 @@
         <w:t xml:space="preserve">, </w:t>
       </w:r>
       <w:r>
+        <w:t xml:space="preserve">ผู้ชนะ, ราคาที่ชนะ (บาท) รูปแบบ </w:t>
+      </w:r>
+      <w:r>
+        <w:rPr>
+          <w:rFonts w:ascii="Consolas" w:eastAsia="Consolas" w:hAnsi="Consolas" w:cs="Consolas"/>
+          <w:color w:val="2D4A8A"/>
+          <w:sz w:val="17"/>
+          <w:szCs w:val="17"/>
+        </w:rPr>
+        <w:t>#,##0</w:t>
+      </w:r>
+      <w:r>
+        <w:t xml:space="preserve">, </w:t>
+      </w:r>
+      <w:r>
         <w:t xml:space="preserve">วันยื่นซอง, เวลายื่น, เหลือ (วัน), คาดว่าจะประกาศ (แผน P0), วันที่ประกาศ, วิธีจัดหา, เลขโครงการ, เลขแผน, ยกเลิกแล้ว, มีการแก้ไขประกาศ, ลิงก์ · ฟังก์ชัน </w:t>
       </w:r>
       <w:r>
@@ -14578,14 +15243,15 @@
         <w:pageBreakBefore/>
         <w:spacing w:before="360" w:after="160"/>
       </w:pPr>
-      <w:bookmarkStart w:id="25" w:name="_Toc242978265"/>
-      <w:r>
+      <w:bookmarkStart w:id="27" w:name="_Toc243378740"/>
+      <w:r>
+        <w:lastRenderedPageBreak/>
         <w:t xml:space="preserve">10. </w:t>
       </w:r>
       <w:r>
         <w:t>ความครอบคลุมหน่วยงาน</w:t>
       </w:r>
-      <w:bookmarkEnd w:id="25"/>
+      <w:bookmarkEnd w:id="27"/>
     </w:p>
     <w:p>
       <w:pPr>
@@ -14593,14 +15259,14 @@
         <w:keepNext/>
         <w:spacing w:before="280" w:after="120"/>
       </w:pPr>
-      <w:bookmarkStart w:id="26" w:name="_Toc242978266"/>
+      <w:bookmarkStart w:id="28" w:name="_Toc243378741"/>
       <w:r>
         <w:t xml:space="preserve">10.1 </w:t>
       </w:r>
       <w:r>
         <w:t>ดึงซ้ำ feed ที่ชนเพดาน (recheck.yml)</w:t>
       </w:r>
-      <w:bookmarkEnd w:id="26"/>
+      <w:bookmarkEnd w:id="28"/>
     </w:p>
     <w:p>
       <w:pPr>
@@ -14631,14 +15297,14 @@
         <w:keepNext/>
         <w:spacing w:before="280" w:after="120"/>
       </w:pPr>
-      <w:bookmarkStart w:id="27" w:name="_Toc242978267"/>
+      <w:bookmarkStart w:id="29" w:name="_Toc243378742"/>
       <w:r>
         <w:t xml:space="preserve">10.2 </w:t>
       </w:r>
       <w:r>
         <w:t>หาหน่วยงานใหม่ (sweep.yml)</w:t>
       </w:r>
-      <w:bookmarkEnd w:id="27"/>
+      <w:bookmarkEnd w:id="29"/>
     </w:p>
     <w:p>
       <w:pPr>
@@ -14693,14 +15359,15 @@
         <w:pageBreakBefore/>
         <w:spacing w:before="360" w:after="160"/>
       </w:pPr>
-      <w:bookmarkStart w:id="28" w:name="_Toc242978268"/>
-      <w:r>
+      <w:bookmarkStart w:id="30" w:name="_Toc243378743"/>
+      <w:r>
+        <w:lastRenderedPageBreak/>
         <w:t xml:space="preserve">11. </w:t>
       </w:r>
       <w:r>
         <w:t>ฐานข้อมูล (Supabase)</w:t>
       </w:r>
-      <w:bookmarkEnd w:id="28"/>
+      <w:bookmarkEnd w:id="30"/>
     </w:p>
     <w:p>
       <w:pPr>
@@ -14708,14 +15375,14 @@
         <w:keepNext/>
         <w:spacing w:before="280" w:after="120"/>
       </w:pPr>
-      <w:bookmarkStart w:id="29" w:name="_Toc242978269"/>
+      <w:bookmarkStart w:id="31" w:name="_Toc243378744"/>
       <w:r>
         <w:t xml:space="preserve">11.0 </w:t>
       </w:r>
       <w:r>
         <w:t>พื้นที่และการลบข้อมูลเก่า</w:t>
       </w:r>
-      <w:bookmarkEnd w:id="29"/>
+      <w:bookmarkEnd w:id="31"/>
     </w:p>
     <w:p>
       <w:pPr>
@@ -14879,14 +15546,14 @@
         <w:keepNext/>
         <w:spacing w:before="280" w:after="120"/>
       </w:pPr>
-      <w:bookmarkStart w:id="30" w:name="_Toc242978270"/>
+      <w:bookmarkStart w:id="32" w:name="_Toc243378745"/>
       <w:r>
         <w:t xml:space="preserve">11.1 </w:t>
       </w:r>
       <w:r>
         <w:t>ตาราง</w:t>
       </w:r>
-      <w:bookmarkEnd w:id="30"/>
+      <w:bookmarkEnd w:id="32"/>
     </w:p>
     <w:tbl>
       <w:tblPr>
@@ -15392,7 +16059,7 @@
                 <w:sz w:val="18"/>
                 <w:szCs w:val="18"/>
               </w:rPr>
-              <w:t>budget_thb, bid_date, item_count, extracted (bid_time, source, files, tor), error</w:t>
+              <w:t>budget_thb, bid_date, item_count, extracted (bid_time, source, files, tor, province, winners, winner_price, expected_month), error</w:t>
             </w:r>
           </w:p>
         </w:tc>
@@ -15886,14 +16553,14 @@
         <w:keepNext/>
         <w:spacing w:before="280" w:after="120"/>
       </w:pPr>
-      <w:bookmarkStart w:id="31" w:name="_Toc242978271"/>
+      <w:bookmarkStart w:id="33" w:name="_Toc243378746"/>
       <w:r>
         <w:t xml:space="preserve">11.2 </w:t>
       </w:r>
       <w:r>
         <w:t>ฟังก์ชัน (RPC) ที่โค้ดเรียก</w:t>
       </w:r>
-      <w:bookmarkEnd w:id="31"/>
+      <w:bookmarkEnd w:id="33"/>
     </w:p>
     <w:tbl>
       <w:tblPr>
@@ -16348,6 +17015,7 @@
                 <w:sz w:val="18"/>
                 <w:szCs w:val="18"/>
               </w:rPr>
+              <w:lastRenderedPageBreak/>
               <w:t>unclassified_titles(types, limit)</w:t>
             </w:r>
           </w:p>
@@ -16823,7 +17491,7 @@
                 <w:sz w:val="18"/>
                 <w:szCs w:val="18"/>
               </w:rPr>
-              <w:t>digest_items(since, types, min_score)</w:t>
+              <w:t>details_without_province(days, limit)</w:t>
             </w:r>
           </w:p>
         </w:tc>
@@ -16852,7 +17520,7 @@
                 <w:sz w:val="18"/>
                 <w:szCs w:val="18"/>
               </w:rPr>
-              <w:t>digest.py</w:t>
+              <w:t>enrich.py --add-province-days</w:t>
             </w:r>
           </w:p>
         </w:tc>
@@ -16881,7 +17549,7 @@
                 <w:sz w:val="18"/>
                 <w:szCs w:val="18"/>
               </w:rPr>
-              <w:t>รายการสำหรับอีเมล พร้อมงบ วันยื่นซอง ยกเลิก/แก้ไข</w:t>
+              <w:t>เอกสารที่อ่านแล้วแต่ยังไม่มีจังหวัด</w:t>
             </w:r>
           </w:p>
         </w:tc>
@@ -16918,7 +17586,7 @@
                 <w:sz w:val="18"/>
                 <w:szCs w:val="18"/>
               </w:rPr>
-              <w:t>trigger_workflow(workflow, inputs)</w:t>
+              <w:t>digest_items(since, types, min_score)</w:t>
             </w:r>
           </w:p>
         </w:tc>
@@ -16947,7 +17615,7 @@
                 <w:sz w:val="18"/>
                 <w:szCs w:val="18"/>
               </w:rPr>
-              <w:t>pg_cron</w:t>
+              <w:t>digest.py</w:t>
             </w:r>
           </w:p>
         </w:tc>
@@ -16976,7 +17644,7 @@
                 <w:sz w:val="18"/>
                 <w:szCs w:val="18"/>
               </w:rPr>
-              <w:t>ยิง workflow_dispatch ไป GitHub ด้วย token ใน Vault</w:t>
+              <w:t>รายการสำหรับอีเมล พร้อมงบ วันยื่นซอง ยกเลิก/แก้ไข จังหวัด ผู้ชนะ ราคาที่ชนะ</w:t>
             </w:r>
           </w:p>
         </w:tc>
@@ -17013,6 +17681,101 @@
                 <w:sz w:val="18"/>
                 <w:szCs w:val="18"/>
               </w:rPr>
+              <w:t>trigger_workflow(workflow, inputs)</w:t>
+            </w:r>
+          </w:p>
+        </w:tc>
+        <w:tc>
+          <w:tcPr>
+            <w:tcW w:w="2169" w:type="dxa"/>
+            <w:tcBorders>
+              <w:top w:val="single" w:sz="4" w:space="0" w:color="C9D3CE"/>
+              <w:left w:val="single" w:sz="4" w:space="0" w:color="C9D3CE"/>
+              <w:bottom w:val="single" w:sz="4" w:space="0" w:color="C9D3CE"/>
+              <w:right w:val="single" w:sz="4" w:space="0" w:color="C9D3CE"/>
+            </w:tcBorders>
+            <w:tcMar>
+              <w:top w:w="60" w:type="dxa"/>
+              <w:left w:w="100" w:type="dxa"/>
+              <w:bottom w:w="60" w:type="dxa"/>
+              <w:right w:w="100" w:type="dxa"/>
+            </w:tcMar>
+          </w:tcPr>
+          <w:p>
+            <w:pPr>
+              <w:spacing w:after="20" w:line="260" w:lineRule="auto"/>
+            </w:pPr>
+            <w:r>
+              <w:rPr>
+                <w:sz w:val="18"/>
+                <w:szCs w:val="18"/>
+              </w:rPr>
+              <w:t>pg_cron</w:t>
+            </w:r>
+          </w:p>
+        </w:tc>
+        <w:tc>
+          <w:tcPr>
+            <w:tcW w:w="3855" w:type="dxa"/>
+            <w:tcBorders>
+              <w:top w:val="single" w:sz="4" w:space="0" w:color="C9D3CE"/>
+              <w:left w:val="single" w:sz="4" w:space="0" w:color="C9D3CE"/>
+              <w:bottom w:val="single" w:sz="4" w:space="0" w:color="C9D3CE"/>
+              <w:right w:val="single" w:sz="4" w:space="0" w:color="C9D3CE"/>
+            </w:tcBorders>
+            <w:tcMar>
+              <w:top w:w="60" w:type="dxa"/>
+              <w:left w:w="100" w:type="dxa"/>
+              <w:bottom w:w="60" w:type="dxa"/>
+              <w:right w:w="100" w:type="dxa"/>
+            </w:tcMar>
+          </w:tcPr>
+          <w:p>
+            <w:pPr>
+              <w:spacing w:after="20" w:line="260" w:lineRule="auto"/>
+            </w:pPr>
+            <w:r>
+              <w:rPr>
+                <w:sz w:val="18"/>
+                <w:szCs w:val="18"/>
+              </w:rPr>
+              <w:t>ยิง workflow_dispatch ไป GitHub ด้วย token ใน Vault</w:t>
+            </w:r>
+          </w:p>
+        </w:tc>
+      </w:tr>
+      <w:tr>
+        <w:tblPrEx>
+          <w:tblCellMar>
+            <w:top w:w="0" w:type="dxa"/>
+            <w:bottom w:w="0" w:type="dxa"/>
+          </w:tblCellMar>
+        </w:tblPrEx>
+        <w:tc>
+          <w:tcPr>
+            <w:tcW w:w="3614" w:type="dxa"/>
+            <w:tcBorders>
+              <w:top w:val="single" w:sz="4" w:space="0" w:color="C9D3CE"/>
+              <w:left w:val="single" w:sz="4" w:space="0" w:color="C9D3CE"/>
+              <w:bottom w:val="single" w:sz="4" w:space="0" w:color="C9D3CE"/>
+              <w:right w:val="single" w:sz="4" w:space="0" w:color="C9D3CE"/>
+            </w:tcBorders>
+            <w:tcMar>
+              <w:top w:w="60" w:type="dxa"/>
+              <w:left w:w="100" w:type="dxa"/>
+              <w:bottom w:w="60" w:type="dxa"/>
+              <w:right w:w="100" w:type="dxa"/>
+            </w:tcMar>
+          </w:tcPr>
+          <w:p>
+            <w:pPr>
+              <w:spacing w:after="20" w:line="260" w:lineRule="auto"/>
+            </w:pPr>
+            <w:r>
+              <w:rPr>
+                <w:sz w:val="18"/>
+                <w:szCs w:val="18"/>
+              </w:rPr>
               <w:t>trigger_morning_digest()</w:t>
             </w:r>
           </w:p>
@@ -17083,14 +17846,14 @@
         <w:keepNext/>
         <w:spacing w:before="280" w:after="120"/>
       </w:pPr>
-      <w:bookmarkStart w:id="32" w:name="_Toc242978272"/>
+      <w:bookmarkStart w:id="34" w:name="_Toc243378747"/>
       <w:r>
         <w:t xml:space="preserve">11.3 </w:t>
       </w:r>
       <w:r>
         <w:t>งานตั้งเวลา (cron.job)</w:t>
       </w:r>
-      <w:bookmarkEnd w:id="32"/>
+      <w:bookmarkEnd w:id="34"/>
     </w:p>
     <w:tbl>
       <w:tblPr>
@@ -17808,14 +18571,15 @@
         <w:pageBreakBefore/>
         <w:spacing w:before="360" w:after="160"/>
       </w:pPr>
-      <w:bookmarkStart w:id="33" w:name="_Toc242978273"/>
-      <w:r>
+      <w:bookmarkStart w:id="35" w:name="_Toc243378748"/>
+      <w:r>
+        <w:lastRenderedPageBreak/>
         <w:t xml:space="preserve">12. </w:t>
       </w:r>
       <w:r>
         <w:t>แผนผังไฟล์ในโค้ด</w:t>
       </w:r>
-      <w:bookmarkEnd w:id="33"/>
+      <w:bookmarkEnd w:id="35"/>
     </w:p>
     <w:p>
       <w:pPr>
@@ -17823,11 +18587,11 @@
         <w:keepNext/>
         <w:spacing w:before="280" w:after="120"/>
       </w:pPr>
-      <w:bookmarkStart w:id="34" w:name="_Toc242978274"/>
+      <w:bookmarkStart w:id="36" w:name="_Toc243378749"/>
       <w:r>
         <w:t>12.1 GitHub Workflows (.github/workflows/)</w:t>
       </w:r>
-      <w:bookmarkEnd w:id="34"/>
+      <w:bookmarkEnd w:id="36"/>
     </w:p>
     <w:tbl>
       <w:tblPr>
@@ -18219,14 +18983,7 @@
                 <w:sz w:val="18"/>
                 <w:szCs w:val="18"/>
               </w:rPr>
-              <w:t xml:space="preserve">pg_cron 14:00, 16:30 / </w:t>
-            </w:r>
-            <w:r>
-              <w:rPr>
-                <w:sz w:val="18"/>
-                <w:szCs w:val="18"/>
-              </w:rPr>
-              <w:t>มือ</w:t>
+              <w:t>มือ (ยกเลิกการตั้งเวลาแล้ว)</w:t>
             </w:r>
           </w:p>
         </w:tc>
@@ -18255,7 +19012,14 @@
                 <w:sz w:val="18"/>
                 <w:szCs w:val="18"/>
               </w:rPr>
-              <w:t>collect --mode capped → load_runs</w:t>
+              <w:t xml:space="preserve">collect --mode capped → load_runs </w:t>
+            </w:r>
+            <w:r>
+              <w:rPr>
+                <w:sz w:val="18"/>
+                <w:szCs w:val="18"/>
+              </w:rPr>
+              <w:t>ใช้ช่วงเย็นเท่านั้น</w:t>
             </w:r>
           </w:p>
         </w:tc>
@@ -18793,7 +19557,7 @@
                 <w:sz w:val="18"/>
                 <w:szCs w:val="18"/>
               </w:rPr>
-              <w:t>แยกเดี่ยว (เช่น --limit, --no-ai)</w:t>
+              <w:t>แยกเดี่ยว (เช่น --limit, --no-ai, --add-province-days 14) จำกัด 90 นาทีต่อรอบ</w:t>
             </w:r>
           </w:p>
         </w:tc>
@@ -18805,14 +19569,14 @@
         <w:keepNext/>
         <w:spacing w:before="280" w:after="120"/>
       </w:pPr>
-      <w:bookmarkStart w:id="35" w:name="_Toc242978275"/>
+      <w:bookmarkStart w:id="37" w:name="_Toc243378750"/>
       <w:r>
         <w:t xml:space="preserve">12.2 </w:t>
       </w:r>
       <w:r>
         <w:t>โค้ด Python</w:t>
       </w:r>
-      <w:bookmarkEnd w:id="35"/>
+      <w:bookmarkEnd w:id="37"/>
     </w:p>
     <w:tbl>
       <w:tblPr>
@@ -19522,7 +20286,7 @@
                 <w:sz w:val="18"/>
                 <w:szCs w:val="18"/>
               </w:rPr>
-              <w:t>USER_AGENT, fetch_text(), html_text(), parse_plan_lines(), normalize(), parse_budget(), parse_bid_date(), parse_department(), plausible(), EXTRACT_PROMPT</w:t>
+              <w:t>USER_AGENT, fetch_text(), html_text(), parse_plan_lines(), normalize(), parse_budget(), parse_bid_date(), parse_winners(), parse_department(), plausible(), EXTRACT_PROMPT, WINNER_PROMPT</w:t>
             </w:r>
           </w:p>
         </w:tc>
@@ -19559,7 +20323,7 @@
                 <w:sz w:val="18"/>
                 <w:szCs w:val="18"/>
               </w:rPr>
-              <w:t>scripts/collect.py</w:t>
+              <w:t>egp/provinces.py</w:t>
             </w:r>
           </w:p>
         </w:tc>
@@ -19588,7 +20352,7 @@
                 <w:sz w:val="18"/>
                 <w:szCs w:val="18"/>
               </w:rPr>
-              <w:t>ขั้น 1 ดึง RSS</w:t>
+              <w:t>หาจังหวัด</w:t>
             </w:r>
           </w:p>
         </w:tc>
@@ -19617,14 +20381,7 @@
                 <w:sz w:val="18"/>
                 <w:szCs w:val="18"/>
               </w:rPr>
-              <w:t xml:space="preserve">DAILY_TYPES, build_requests() </w:t>
-            </w:r>
-            <w:r>
-              <w:rPr>
-                <w:sz w:val="18"/>
-                <w:szCs w:val="18"/>
-              </w:rPr>
-              <w:t>โหมด daily/capped/sweep, main()</w:t>
+              <w:t>PROVINCES (77), ALIASES, NEEDS_PREFIX, mentions(), detect(), parse_targets()</w:t>
             </w:r>
           </w:p>
         </w:tc>
@@ -19661,7 +20418,7 @@
                 <w:sz w:val="18"/>
                 <w:szCs w:val="18"/>
               </w:rPr>
-              <w:t>scripts/load_runs.py</w:t>
+              <w:t>scripts/collect.py</w:t>
             </w:r>
           </w:p>
         </w:tc>
@@ -19690,7 +20447,7 @@
                 <w:sz w:val="18"/>
                 <w:szCs w:val="18"/>
               </w:rPr>
-              <w:t>ขั้น 2 บันทึก</w:t>
+              <w:t>ขั้น 1 ดึง RSS</w:t>
             </w:r>
           </w:p>
         </w:tc>
@@ -19719,7 +20476,14 @@
                 <w:sz w:val="18"/>
                 <w:szCs w:val="18"/>
               </w:rPr>
-              <w:t>parse_item(), load_folder()</w:t>
+              <w:t xml:space="preserve">DAILY_TYPES, build_requests() </w:t>
+            </w:r>
+            <w:r>
+              <w:rPr>
+                <w:sz w:val="18"/>
+                <w:szCs w:val="18"/>
+              </w:rPr>
+              <w:t>โหมด daily/capped/sweep, main()</w:t>
             </w:r>
           </w:p>
         </w:tc>
@@ -19756,7 +20520,7 @@
                 <w:sz w:val="18"/>
                 <w:szCs w:val="18"/>
               </w:rPr>
-              <w:t>scripts/classify.py</w:t>
+              <w:t>scripts/load_runs.py</w:t>
             </w:r>
           </w:p>
         </w:tc>
@@ -19785,7 +20549,7 @@
                 <w:sz w:val="18"/>
                 <w:szCs w:val="18"/>
               </w:rPr>
-              <w:t>ขั้น 3 คัดกรอง</w:t>
+              <w:t>ขั้น 2 บันทึก</w:t>
             </w:r>
           </w:p>
         </w:tc>
@@ -19814,14 +20578,7 @@
                 <w:sz w:val="18"/>
                 <w:szCs w:val="18"/>
               </w:rPr>
-              <w:t>TYPES, main() (</w:t>
-            </w:r>
-            <w:r>
-              <w:rPr>
-                <w:sz w:val="18"/>
-                <w:szCs w:val="18"/>
-              </w:rPr>
-              <w:t>กฎ → Gemini)</w:t>
+              <w:t>parse_item(), load_folder()</w:t>
             </w:r>
           </w:p>
         </w:tc>
@@ -19858,7 +20615,7 @@
                 <w:sz w:val="18"/>
                 <w:szCs w:val="18"/>
               </w:rPr>
-              <w:t>scripts/enrich.py</w:t>
+              <w:t>scripts/classify.py</w:t>
             </w:r>
           </w:p>
         </w:tc>
@@ -19887,7 +20644,7 @@
                 <w:sz w:val="18"/>
                 <w:szCs w:val="18"/>
               </w:rPr>
-              <w:t>ขั้น 4 อ่านเอกสาร</w:t>
+              <w:t>ขั้น 3 คัดกรอง</w:t>
             </w:r>
           </w:p>
         </w:tc>
@@ -19916,7 +20673,14 @@
                 <w:sz w:val="18"/>
                 <w:szCs w:val="18"/>
               </w:rPr>
-              <w:t>SCAN_MODELS, transient(), ai_extract(), Enricher.document() / plan_page(), main()</w:t>
+              <w:t>TYPES, main() (</w:t>
+            </w:r>
+            <w:r>
+              <w:rPr>
+                <w:sz w:val="18"/>
+                <w:szCs w:val="18"/>
+              </w:rPr>
+              <w:t>กฎ → Gemini)</w:t>
             </w:r>
           </w:p>
         </w:tc>
@@ -19953,7 +20717,7 @@
                 <w:sz w:val="18"/>
                 <w:szCs w:val="18"/>
               </w:rPr>
-              <w:t>scripts/digest.py</w:t>
+              <w:t>scripts/enrich.py</w:t>
             </w:r>
           </w:p>
         </w:tc>
@@ -19982,7 +20746,7 @@
                 <w:sz w:val="18"/>
                 <w:szCs w:val="18"/>
               </w:rPr>
-              <w:t>ขั้น 5 อีเมล</w:t>
+              <w:t>ขั้น 4 อ่านเอกสาร</w:t>
             </w:r>
           </w:p>
         </w:tc>
@@ -20011,7 +20775,7 @@
                 <w:sz w:val="18"/>
                 <w:szCs w:val="18"/>
               </w:rPr>
-              <w:t>SECTIONS, TYPE_LABEL, SCORE_BANDS, build(), section_html(), write_xlsx(), style_sheet(), send()</w:t>
+              <w:t>TYPES, SCAN_MODELS, transient(), ai_extract(), Enricher.document() / winner() / plan_page() / add_province(), main()</w:t>
             </w:r>
           </w:p>
         </w:tc>
@@ -20048,7 +20812,7 @@
                 <w:sz w:val="18"/>
                 <w:szCs w:val="18"/>
               </w:rPr>
-              <w:t>supabase/migrations/*.sql</w:t>
+              <w:t>scripts/digest.py</w:t>
             </w:r>
           </w:p>
         </w:tc>
@@ -20077,7 +20841,7 @@
                 <w:sz w:val="18"/>
                 <w:szCs w:val="18"/>
               </w:rPr>
-              <w:t>โครงสร้างฐานข้อมูล</w:t>
+              <w:t>ขั้น 5 อีเมล</w:t>
             </w:r>
           </w:p>
         </w:tc>
@@ -20106,7 +20870,7 @@
                 <w:sz w:val="18"/>
                 <w:szCs w:val="18"/>
               </w:rPr>
-              <w:t>ตาราง ฟังก์ชัน cron ตามลำดับวันที่</w:t>
+              <w:t>DEFAULT_PROVINCES, SECTIONS, TYPE_LABEL, SCORE_BANDS, build(), section_html(), write_xlsx(), style_sheet(), send()</w:t>
             </w:r>
           </w:p>
         </w:tc>
@@ -20143,6 +20907,102 @@
                 <w:sz w:val="18"/>
                 <w:szCs w:val="18"/>
               </w:rPr>
+              <w:lastRenderedPageBreak/>
+              <w:t>supabase/migrations/*.sql</w:t>
+            </w:r>
+          </w:p>
+        </w:tc>
+        <w:tc>
+          <w:tcPr>
+            <w:tcW w:w="1807" w:type="dxa"/>
+            <w:tcBorders>
+              <w:top w:val="single" w:sz="4" w:space="0" w:color="C9D3CE"/>
+              <w:left w:val="single" w:sz="4" w:space="0" w:color="C9D3CE"/>
+              <w:bottom w:val="single" w:sz="4" w:space="0" w:color="C9D3CE"/>
+              <w:right w:val="single" w:sz="4" w:space="0" w:color="C9D3CE"/>
+            </w:tcBorders>
+            <w:tcMar>
+              <w:top w:w="60" w:type="dxa"/>
+              <w:left w:w="100" w:type="dxa"/>
+              <w:bottom w:w="60" w:type="dxa"/>
+              <w:right w:w="100" w:type="dxa"/>
+            </w:tcMar>
+          </w:tcPr>
+          <w:p>
+            <w:pPr>
+              <w:spacing w:after="20" w:line="260" w:lineRule="auto"/>
+            </w:pPr>
+            <w:r>
+              <w:rPr>
+                <w:sz w:val="18"/>
+                <w:szCs w:val="18"/>
+              </w:rPr>
+              <w:t>โครงสร้างฐานข้อมูล</w:t>
+            </w:r>
+          </w:p>
+        </w:tc>
+        <w:tc>
+          <w:tcPr>
+            <w:tcW w:w="5421" w:type="dxa"/>
+            <w:tcBorders>
+              <w:top w:val="single" w:sz="4" w:space="0" w:color="C9D3CE"/>
+              <w:left w:val="single" w:sz="4" w:space="0" w:color="C9D3CE"/>
+              <w:bottom w:val="single" w:sz="4" w:space="0" w:color="C9D3CE"/>
+              <w:right w:val="single" w:sz="4" w:space="0" w:color="C9D3CE"/>
+            </w:tcBorders>
+            <w:tcMar>
+              <w:top w:w="60" w:type="dxa"/>
+              <w:left w:w="100" w:type="dxa"/>
+              <w:bottom w:w="60" w:type="dxa"/>
+              <w:right w:w="100" w:type="dxa"/>
+            </w:tcMar>
+          </w:tcPr>
+          <w:p>
+            <w:pPr>
+              <w:spacing w:after="20" w:line="260" w:lineRule="auto"/>
+            </w:pPr>
+            <w:r>
+              <w:rPr>
+                <w:sz w:val="18"/>
+                <w:szCs w:val="18"/>
+              </w:rPr>
+              <w:t>ตาราง ฟังก์ชัน cron ตามลำดับวันที่</w:t>
+            </w:r>
+          </w:p>
+        </w:tc>
+      </w:tr>
+      <w:tr>
+        <w:tblPrEx>
+          <w:tblCellMar>
+            <w:top w:w="0" w:type="dxa"/>
+            <w:bottom w:w="0" w:type="dxa"/>
+          </w:tblCellMar>
+        </w:tblPrEx>
+        <w:tc>
+          <w:tcPr>
+            <w:tcW w:w="2410" w:type="dxa"/>
+            <w:tcBorders>
+              <w:top w:val="single" w:sz="4" w:space="0" w:color="C9D3CE"/>
+              <w:left w:val="single" w:sz="4" w:space="0" w:color="C9D3CE"/>
+              <w:bottom w:val="single" w:sz="4" w:space="0" w:color="C9D3CE"/>
+              <w:right w:val="single" w:sz="4" w:space="0" w:color="C9D3CE"/>
+            </w:tcBorders>
+            <w:tcMar>
+              <w:top w:w="60" w:type="dxa"/>
+              <w:left w:w="100" w:type="dxa"/>
+              <w:bottom w:w="60" w:type="dxa"/>
+              <w:right w:w="100" w:type="dxa"/>
+            </w:tcMar>
+          </w:tcPr>
+          <w:p>
+            <w:pPr>
+              <w:spacing w:after="20" w:line="260" w:lineRule="auto"/>
+            </w:pPr>
+            <w:r>
+              <w:rPr>
+                <w:sz w:val="18"/>
+                <w:szCs w:val="18"/>
+              </w:rPr>
               <w:t>docs/phase0-discovery-summary.md</w:t>
             </w:r>
           </w:p>
@@ -20213,14 +21073,15 @@
         <w:pageBreakBefore/>
         <w:spacing w:before="360" w:after="160"/>
       </w:pPr>
-      <w:bookmarkStart w:id="36" w:name="_Toc242978276"/>
-      <w:r>
+      <w:bookmarkStart w:id="38" w:name="_Toc243378751"/>
+      <w:r>
+        <w:lastRenderedPageBreak/>
         <w:t xml:space="preserve">13. </w:t>
       </w:r>
       <w:r>
         <w:t>รหัสผ่านและการตั้งค่า</w:t>
       </w:r>
-      <w:bookmarkEnd w:id="36"/>
+      <w:bookmarkEnd w:id="38"/>
     </w:p>
     <w:tbl>
       <w:tblPr>
@@ -21167,6 +22028,130 @@
                 <w:sz w:val="18"/>
                 <w:szCs w:val="18"/>
               </w:rPr>
+              <w:t>TARGET_PROVINCES</w:t>
+            </w:r>
+          </w:p>
+        </w:tc>
+        <w:tc>
+          <w:tcPr>
+            <w:tcW w:w="1701" w:type="dxa"/>
+            <w:tcBorders>
+              <w:top w:val="single" w:sz="4" w:space="0" w:color="C9D3CE"/>
+              <w:left w:val="single" w:sz="4" w:space="0" w:color="C9D3CE"/>
+              <w:bottom w:val="single" w:sz="4" w:space="0" w:color="C9D3CE"/>
+              <w:right w:val="single" w:sz="4" w:space="0" w:color="C9D3CE"/>
+            </w:tcBorders>
+            <w:tcMar>
+              <w:top w:w="60" w:type="dxa"/>
+              <w:left w:w="100" w:type="dxa"/>
+              <w:bottom w:w="60" w:type="dxa"/>
+              <w:right w:w="100" w:type="dxa"/>
+            </w:tcMar>
+          </w:tcPr>
+          <w:p>
+            <w:pPr>
+              <w:spacing w:after="20" w:line="260" w:lineRule="auto"/>
+            </w:pPr>
+            <w:r>
+              <w:rPr>
+                <w:sz w:val="18"/>
+                <w:szCs w:val="18"/>
+              </w:rPr>
+              <w:t>GitHub Variables</w:t>
+            </w:r>
+          </w:p>
+        </w:tc>
+        <w:tc>
+          <w:tcPr>
+            <w:tcW w:w="2041" w:type="dxa"/>
+            <w:tcBorders>
+              <w:top w:val="single" w:sz="4" w:space="0" w:color="C9D3CE"/>
+              <w:left w:val="single" w:sz="4" w:space="0" w:color="C9D3CE"/>
+              <w:bottom w:val="single" w:sz="4" w:space="0" w:color="C9D3CE"/>
+              <w:right w:val="single" w:sz="4" w:space="0" w:color="C9D3CE"/>
+            </w:tcBorders>
+            <w:tcMar>
+              <w:top w:w="60" w:type="dxa"/>
+              <w:left w:w="100" w:type="dxa"/>
+              <w:bottom w:w="60" w:type="dxa"/>
+              <w:right w:w="100" w:type="dxa"/>
+            </w:tcMar>
+          </w:tcPr>
+          <w:p>
+            <w:pPr>
+              <w:spacing w:after="20" w:line="260" w:lineRule="auto"/>
+            </w:pPr>
+            <w:r>
+              <w:rPr>
+                <w:sz w:val="18"/>
+                <w:szCs w:val="18"/>
+              </w:rPr>
+              <w:t>digest</w:t>
+            </w:r>
+          </w:p>
+        </w:tc>
+        <w:tc>
+          <w:tcPr>
+            <w:tcW w:w="3401" w:type="dxa"/>
+            <w:tcBorders>
+              <w:top w:val="single" w:sz="4" w:space="0" w:color="C9D3CE"/>
+              <w:left w:val="single" w:sz="4" w:space="0" w:color="C9D3CE"/>
+              <w:bottom w:val="single" w:sz="4" w:space="0" w:color="C9D3CE"/>
+              <w:right w:val="single" w:sz="4" w:space="0" w:color="C9D3CE"/>
+            </w:tcBorders>
+            <w:tcMar>
+              <w:top w:w="60" w:type="dxa"/>
+              <w:left w:w="100" w:type="dxa"/>
+              <w:bottom w:w="60" w:type="dxa"/>
+              <w:right w:w="100" w:type="dxa"/>
+            </w:tcMar>
+          </w:tcPr>
+          <w:p>
+            <w:pPr>
+              <w:spacing w:after="20" w:line="260" w:lineRule="auto"/>
+            </w:pPr>
+            <w:r>
+              <w:rPr>
+                <w:sz w:val="18"/>
+                <w:szCs w:val="18"/>
+              </w:rPr>
+              <w:t>ไม่มีค่า = 15 จังหวัดตั้งต้น · ใส่ชื่อจังหวัดเต็ม คั่นด้วยจุลภาค</w:t>
+            </w:r>
+          </w:p>
+        </w:tc>
+      </w:tr>
+      <w:tr>
+        <w:tblPrEx>
+          <w:tblCellMar>
+            <w:top w:w="0" w:type="dxa"/>
+            <w:bottom w:w="0" w:type="dxa"/>
+          </w:tblCellMar>
+        </w:tblPrEx>
+        <w:tc>
+          <w:tcPr>
+            <w:tcW w:w="2495" w:type="dxa"/>
+            <w:tcBorders>
+              <w:top w:val="single" w:sz="4" w:space="0" w:color="C9D3CE"/>
+              <w:left w:val="single" w:sz="4" w:space="0" w:color="C9D3CE"/>
+              <w:bottom w:val="single" w:sz="4" w:space="0" w:color="C9D3CE"/>
+              <w:right w:val="single" w:sz="4" w:space="0" w:color="C9D3CE"/>
+            </w:tcBorders>
+            <w:tcMar>
+              <w:top w:w="60" w:type="dxa"/>
+              <w:left w:w="100" w:type="dxa"/>
+              <w:bottom w:w="60" w:type="dxa"/>
+              <w:right w:w="100" w:type="dxa"/>
+            </w:tcMar>
+          </w:tcPr>
+          <w:p>
+            <w:pPr>
+              <w:spacing w:after="20" w:line="260" w:lineRule="auto"/>
+            </w:pPr>
+            <w:r>
+              <w:rPr>
+                <w:sz w:val="18"/>
+                <w:szCs w:val="18"/>
+              </w:rPr>
               <w:t>github_actions_token</w:t>
             </w:r>
           </w:p>
@@ -21273,14 +22258,15 @@
         <w:pageBreakBefore/>
         <w:spacing w:before="360" w:after="160"/>
       </w:pPr>
-      <w:bookmarkStart w:id="37" w:name="_Toc242978277"/>
-      <w:r>
+      <w:bookmarkStart w:id="39" w:name="_Toc243378752"/>
+      <w:r>
+        <w:lastRenderedPageBreak/>
         <w:t xml:space="preserve">14. </w:t>
       </w:r>
       <w:r>
         <w:t>การดูแลและแก้ปัญหา</w:t>
       </w:r>
-      <w:bookmarkEnd w:id="37"/>
+      <w:bookmarkEnd w:id="39"/>
     </w:p>
     <w:p>
       <w:pPr>
@@ -21288,14 +22274,14 @@
         <w:keepNext/>
         <w:spacing w:before="280" w:after="120"/>
       </w:pPr>
-      <w:bookmarkStart w:id="38" w:name="_Toc242978278"/>
+      <w:bookmarkStart w:id="40" w:name="_Toc243378753"/>
       <w:r>
         <w:t xml:space="preserve">14.1 </w:t>
       </w:r>
       <w:r>
         <w:t>งานที่ทำบ่อย</w:t>
       </w:r>
-      <w:bookmarkEnd w:id="38"/>
+      <w:bookmarkEnd w:id="40"/>
     </w:p>
     <w:tbl>
       <w:tblPr>
@@ -21564,7 +22550,7 @@
                 <w:sz w:val="18"/>
                 <w:szCs w:val="18"/>
               </w:rPr>
-              <w:t>ดูตัวอย่างอีเมลโดยไม่ส่ง</w:t>
+              <w:t>เปลี่ยนจังหวัดที่ส่ง</w:t>
             </w:r>
           </w:p>
         </w:tc>
@@ -21593,14 +22579,14 @@
                 <w:sz w:val="18"/>
                 <w:szCs w:val="18"/>
               </w:rPr>
-              <w:t xml:space="preserve">Actions → Morning digest → Run workflow → args </w:t>
-            </w:r>
-            <w:r>
-              <w:rPr>
-                <w:sz w:val="18"/>
-                <w:szCs w:val="18"/>
-              </w:rPr>
-              <w:t xml:space="preserve">เช่น </w:t>
+              <w:t xml:space="preserve">GitHub → Settings → Secrets and variables → Actions → Variables → </w:t>
+            </w:r>
+            <w:r>
+              <w:rPr>
+                <w:sz w:val="18"/>
+                <w:szCs w:val="18"/>
+              </w:rPr>
+              <w:t xml:space="preserve">สร้าง/แก้ TARGET_PROVINCES เช่น </w:t>
             </w:r>
             <w:r>
               <w:rPr>
@@ -21609,21 +22595,21 @@
                 <w:sz w:val="18"/>
                 <w:szCs w:val="18"/>
               </w:rPr>
-              <w:t>--since-days 3 --weekly no</w:t>
-            </w:r>
-            <w:r>
-              <w:rPr>
-                <w:sz w:val="18"/>
-                <w:szCs w:val="18"/>
-              </w:rPr>
-              <w:t xml:space="preserve"> </w:t>
-            </w:r>
-            <w:r>
-              <w:rPr>
-                <w:sz w:val="18"/>
-                <w:szCs w:val="18"/>
-              </w:rPr>
-              <w:t>แล้วดาวน์โหลด artifact</w:t>
+              <w:t>กรุงเทพมหานคร, นนทบุรี, ชลบุรี</w:t>
+            </w:r>
+            <w:r>
+              <w:rPr>
+                <w:sz w:val="18"/>
+                <w:szCs w:val="18"/>
+              </w:rPr>
+              <w:t xml:space="preserve"> (</w:t>
+            </w:r>
+            <w:r>
+              <w:rPr>
+                <w:sz w:val="18"/>
+                <w:szCs w:val="18"/>
+              </w:rPr>
+              <w:t>ลบทิ้ง = กลับไปใช้ 15 จังหวัดตั้งต้น)</w:t>
             </w:r>
           </w:p>
         </w:tc>
@@ -21660,7 +22646,7 @@
                 <w:sz w:val="18"/>
                 <w:szCs w:val="18"/>
               </w:rPr>
-              <w:t>รันรอบเย็นใหม่ด้วยมือ</w:t>
+              <w:t>ดูตัวอย่างอีเมลโดยไม่ส่ง</w:t>
             </w:r>
           </w:p>
         </w:tc>
@@ -21689,7 +22675,37 @@
                 <w:sz w:val="18"/>
                 <w:szCs w:val="18"/>
               </w:rPr>
-              <w:t>Actions → Daily pipeline → Run workflow</w:t>
+              <w:t xml:space="preserve">Actions → Morning digest → Run workflow → args </w:t>
+            </w:r>
+            <w:r>
+              <w:rPr>
+                <w:sz w:val="18"/>
+                <w:szCs w:val="18"/>
+              </w:rPr>
+              <w:t xml:space="preserve">เช่น </w:t>
+            </w:r>
+            <w:r>
+              <w:rPr>
+                <w:rFonts w:ascii="Consolas" w:eastAsia="Consolas" w:hAnsi="Consolas" w:cs="Consolas"/>
+                <w:color w:val="2D4A8A"/>
+                <w:sz w:val="18"/>
+                <w:szCs w:val="18"/>
+              </w:rPr>
+              <w:t>--since-days 3 --weekly no</w:t>
+            </w:r>
+            <w:r>
+              <w:rPr>
+                <w:sz w:val="18"/>
+                <w:szCs w:val="18"/>
+              </w:rPr>
+              <w:t xml:space="preserve"> </w:t>
+            </w:r>
+            <w:r>
+              <w:rPr>
+                <w:sz w:val="18"/>
+                <w:szCs w:val="18"/>
+              </w:rPr>
+              <w:t>แล้วดาวน์โหลด artifact</w:t>
             </w:r>
           </w:p>
         </w:tc>
@@ -21726,7 +22742,7 @@
                 <w:sz w:val="18"/>
                 <w:szCs w:val="18"/>
               </w:rPr>
-              <w:t>เพิ่มคำในกฎ</w:t>
+              <w:t>รันรอบเย็นใหม่ด้วยมือ</w:t>
             </w:r>
           </w:p>
         </w:tc>
@@ -21755,7 +22771,7 @@
                 <w:sz w:val="18"/>
                 <w:szCs w:val="18"/>
               </w:rPr>
-              <w:t>แก้ OURS/NOT_OURS ใน egp/rules.py แล้วเปลี่ยน MODEL เป็นรุ่นใหม่ (เช่น rules-v3)</w:t>
+              <w:t>Actions → Daily pipeline → Run workflow</w:t>
             </w:r>
           </w:p>
         </w:tc>
@@ -21792,7 +22808,7 @@
                 <w:sz w:val="18"/>
                 <w:szCs w:val="18"/>
               </w:rPr>
-              <w:t>ปรับคะแนนขั้นต่ำในอีเมล</w:t>
+              <w:t>เพิ่มคำในกฎ</w:t>
             </w:r>
           </w:p>
         </w:tc>
@@ -21821,7 +22837,7 @@
                 <w:sz w:val="18"/>
                 <w:szCs w:val="18"/>
               </w:rPr>
-              <w:t>แก้ default ของ --min-score ใน scripts/digest.py หรือคะแนนต่อหมวดใน SECTIONS</w:t>
+              <w:t>แก้ OURS/NOT_OURS ใน egp/rules.py แล้วเปลี่ยน MODEL เป็นรุ่นใหม่ (เช่น rules-v3)</w:t>
             </w:r>
           </w:p>
         </w:tc>
@@ -21858,7 +22874,7 @@
                 <w:sz w:val="18"/>
                 <w:szCs w:val="18"/>
               </w:rPr>
-              <w:t>หาหน่วยงานใหม่</w:t>
+              <w:t>ปรับคะแนนขั้นต่ำในอีเมล</w:t>
             </w:r>
           </w:p>
         </w:tc>
@@ -21887,7 +22903,7 @@
                 <w:sz w:val="18"/>
                 <w:szCs w:val="18"/>
               </w:rPr>
-              <w:t>ทำเองทุกคืน 21:00 ถ้าจะสั่งเพิ่ม: Actions → Find departments (sweep) หลัง 18:00 เท่านั้น</w:t>
+              <w:t>แก้ default ของ --min-score ใน scripts/digest.py หรือคะแนนต่อหมวดใน SECTIONS</w:t>
             </w:r>
           </w:p>
         </w:tc>
@@ -21924,6 +22940,72 @@
                 <w:sz w:val="18"/>
                 <w:szCs w:val="18"/>
               </w:rPr>
+              <w:t>หาหน่วยงานใหม่</w:t>
+            </w:r>
+          </w:p>
+        </w:tc>
+        <w:tc>
+          <w:tcPr>
+            <w:tcW w:w="6884" w:type="dxa"/>
+            <w:tcBorders>
+              <w:top w:val="single" w:sz="4" w:space="0" w:color="C9D3CE"/>
+              <w:left w:val="single" w:sz="4" w:space="0" w:color="C9D3CE"/>
+              <w:bottom w:val="single" w:sz="4" w:space="0" w:color="C9D3CE"/>
+              <w:right w:val="single" w:sz="4" w:space="0" w:color="C9D3CE"/>
+            </w:tcBorders>
+            <w:tcMar>
+              <w:top w:w="60" w:type="dxa"/>
+              <w:left w:w="100" w:type="dxa"/>
+              <w:bottom w:w="60" w:type="dxa"/>
+              <w:right w:w="100" w:type="dxa"/>
+            </w:tcMar>
+          </w:tcPr>
+          <w:p>
+            <w:pPr>
+              <w:spacing w:after="20" w:line="260" w:lineRule="auto"/>
+            </w:pPr>
+            <w:r>
+              <w:rPr>
+                <w:sz w:val="18"/>
+                <w:szCs w:val="18"/>
+              </w:rPr>
+              <w:t>ทำเองทุกคืน 21:00 ถ้าจะสั่งเพิ่ม: Actions → Find departments (sweep) หลัง 18:00 เท่านั้น</w:t>
+            </w:r>
+          </w:p>
+        </w:tc>
+      </w:tr>
+      <w:tr>
+        <w:tblPrEx>
+          <w:tblCellMar>
+            <w:top w:w="0" w:type="dxa"/>
+            <w:bottom w:w="0" w:type="dxa"/>
+          </w:tblCellMar>
+        </w:tblPrEx>
+        <w:tc>
+          <w:tcPr>
+            <w:tcW w:w="2754" w:type="dxa"/>
+            <w:tcBorders>
+              <w:top w:val="single" w:sz="4" w:space="0" w:color="C9D3CE"/>
+              <w:left w:val="single" w:sz="4" w:space="0" w:color="C9D3CE"/>
+              <w:bottom w:val="single" w:sz="4" w:space="0" w:color="C9D3CE"/>
+              <w:right w:val="single" w:sz="4" w:space="0" w:color="C9D3CE"/>
+            </w:tcBorders>
+            <w:tcMar>
+              <w:top w:w="60" w:type="dxa"/>
+              <w:left w:w="100" w:type="dxa"/>
+              <w:bottom w:w="60" w:type="dxa"/>
+              <w:right w:w="100" w:type="dxa"/>
+            </w:tcMar>
+          </w:tcPr>
+          <w:p>
+            <w:pPr>
+              <w:spacing w:after="20" w:line="260" w:lineRule="auto"/>
+            </w:pPr>
+            <w:r>
+              <w:rPr>
+                <w:sz w:val="18"/>
+                <w:szCs w:val="18"/>
+              </w:rPr>
               <w:t>ต่ออายุ GitHub token</w:t>
             </w:r>
           </w:p>
@@ -21965,14 +23047,14 @@
         <w:keepNext/>
         <w:spacing w:before="280" w:after="120"/>
       </w:pPr>
-      <w:bookmarkStart w:id="39" w:name="_Toc242978279"/>
+      <w:bookmarkStart w:id="41" w:name="_Toc243378754"/>
       <w:r>
         <w:t xml:space="preserve">14.2 </w:t>
       </w:r>
       <w:r>
         <w:t>อาการและสาเหตุ</w:t>
       </w:r>
-      <w:bookmarkEnd w:id="39"/>
+      <w:bookmarkEnd w:id="41"/>
     </w:p>
     <w:tbl>
       <w:tblPr>
@@ -22729,14 +23811,14 @@
         <w:keepNext/>
         <w:spacing w:before="280" w:after="120"/>
       </w:pPr>
-      <w:bookmarkStart w:id="40" w:name="_Toc242978280"/>
+      <w:bookmarkStart w:id="42" w:name="_Toc243378755"/>
       <w:r>
         <w:t xml:space="preserve">14.3 </w:t>
       </w:r>
       <w:r>
         <w:t>ข้อจำกัดที่ทราบ</w:t>
       </w:r>
-      <w:bookmarkEnd w:id="40"/>
+      <w:bookmarkEnd w:id="42"/>
     </w:p>
     <w:p>
       <w:pPr>
@@ -22803,6 +23885,33 @@
         <w:spacing w:after="60" w:line="290" w:lineRule="auto"/>
       </w:pPr>
       <w:r>
+        <w:t>ระบุจังหวัดไม่ได้ราว 1 ใน 3 (เอกสารไม่เขียนชื่อจังหวัด หรือเขียนย่อแบบ "จว.ศ.ก.") ประกาศเหล่านี้ยังอยู่ในอีเมลเพื่อไม่ให้งานส่วนกลางหลุด</w:t>
+      </w:r>
+    </w:p>
+    <w:p>
+      <w:pPr>
+        <w:pStyle w:val="ListParagraph"/>
+        <w:numPr>
+          <w:ilvl w:val="0"/>
+          <w:numId w:val="2"/>
+        </w:numPr>
+        <w:spacing w:after="60" w:line="290" w:lineRule="auto"/>
+      </w:pPr>
+      <w:r>
+        <w:t>ประกาศผู้ชนะมีวันละราว 50 รายการที่เกี่ยวข้อง อ่านเอกสารราว 10 วินาทีต่อรายการ ถ้าค้างสะสม รอบ 18:00 แต่ละคืนจะอ่านต่อจนครบ</w:t>
+      </w:r>
+    </w:p>
+    <w:p>
+      <w:pPr>
+        <w:pStyle w:val="ListParagraph"/>
+        <w:numPr>
+          <w:ilvl w:val="0"/>
+          <w:numId w:val="2"/>
+        </w:numPr>
+        <w:spacing w:after="60" w:line="290" w:lineRule="auto"/>
+      </w:pPr>
+      <w:r>
+        <w:lastRenderedPageBreak/>
         <w:t>ความแม่นยำการคัดกรองขึ้นกับกฎคำและ Gemini ถ้าพบรายการผิด ให้เพิ่มคำในกฎหรือปรับ prompt</w:t>
       </w:r>
     </w:p>
@@ -22812,11 +23921,12 @@
         <w:pageBreakBefore/>
         <w:spacing w:before="360" w:after="160"/>
       </w:pPr>
-      <w:bookmarkStart w:id="41" w:name="_Toc242978281"/>
-      <w:r>
+      <w:bookmarkStart w:id="43" w:name="_Toc243378756"/>
+      <w:r>
+        <w:lastRenderedPageBreak/>
         <w:t>ภาคผนวก</w:t>
       </w:r>
-      <w:bookmarkEnd w:id="41"/>
+      <w:bookmarkEnd w:id="43"/>
     </w:p>
     <w:p>
       <w:pPr>
@@ -22824,11 +23934,11 @@
         <w:keepNext/>
         <w:spacing w:before="280" w:after="120"/>
       </w:pPr>
-      <w:bookmarkStart w:id="42" w:name="_Toc242978282"/>
+      <w:bookmarkStart w:id="44" w:name="_Toc243378757"/>
       <w:r>
         <w:t>ก. รหัสวิธีจัดหา (methodId)</w:t>
       </w:r>
-      <w:bookmarkEnd w:id="42"/>
+      <w:bookmarkEnd w:id="44"/>
     </w:p>
     <w:tbl>
       <w:tblPr>
@@ -23730,11 +24840,11 @@
         <w:keepNext/>
         <w:spacing w:before="280" w:after="120"/>
       </w:pPr>
-      <w:bookmarkStart w:id="43" w:name="_Toc242978283"/>
+      <w:bookmarkStart w:id="45" w:name="_Toc243378758"/>
       <w:r>
         <w:t>ข. ผลสำคัญจาก Phase 0</w:t>
       </w:r>
-      <w:bookmarkEnd w:id="43"/>
+      <w:bookmarkEnd w:id="45"/>
     </w:p>
     <w:p>
       <w:pPr>
@@ -23907,230 +25017,10 @@
 <file path=word/numbering.xml><?xml version="1.0" encoding="utf-8"?>
 <w:numbering xmlns:wpc="http://schemas.microsoft.com/office/word/2010/wordprocessingCanvas" xmlns:cx="http://schemas.microsoft.com/office/drawing/2014/chartex" xmlns:cx1="http://schemas.microsoft.com/office/drawing/2015/9/8/chartex" xmlns:cx2="http://schemas.microsoft.com/office/drawing/2015/10/21/chartex" xmlns:cx3="http://schemas.microsoft.com/office/drawing/2016/5/9/chartex" xmlns:cx4="http://schemas.microsoft.com/office/drawing/2016/5/10/chartex" xmlns:cx5="http://schemas.microsoft.com/office/drawing/2016/5/11/chartex" xmlns:cx6="http://schemas.microsoft.com/office/drawing/2016/5/12/chartex" xmlns:cx7="http://schemas.microsoft.com/office/drawing/2016/5/13/chartex" xmlns:cx8="http://schemas.microsoft.com/office/drawing/2016/5/14/chartex" xmlns:mc="http://schemas.openxmlformats.org/markup-compatibility/2006" xmlns:aink="http://schemas.microsoft.com/office/drawing/2016/ink" xmlns:am3d="http://schemas.microsoft.com/office/drawing/2017/model3d" xmlns:o="urn:schemas-microsoft-com:office:office" xmlns:oel="http://schemas.microsoft.com/office/2019/extlst" xmlns:r="http://schemas.openxmlformats.org/officeDocument/2006/relationships" xmlns:m="http://schemas.openxmlformats.org/officeDocument/2006/math" xmlns:v="urn:schemas-microsoft-com:vml" xmlns:wp14="http://schemas.microsoft.com/office/word/2010/wordprocessingDrawing" xmlns:wp="http://schemas.openxmlformats.org/drawingml/2006/wordprocessingDrawing" xmlns:w10="urn:schemas-microsoft-com:office:word" xmlns:w="http://schemas.openxmlformats.org/wordprocessingml/2006/main" xmlns:w14="http://schemas.microsoft.com/office/word/2010/wordml" xmlns:w15="http://schemas.microsoft.com/office/word/2012/wordml" xmlns:w16cex="http://schemas.microsoft.com/office/word/2018/wordml/cex" xmlns:w16cid="http://schemas.microsoft.com/office/word/2016/wordml/cid" xmlns:w16="http://schemas.microsoft.com/office/word/2018/wordml" xmlns:w16du="http://schemas.microsoft.com/office/word/2023/wordml/word16du" xmlns:w16sdtdh="http://schemas.microsoft.com/office/word/2020/wordml/sdtdatahash" xmlns:w16sdtfl="http://schemas.microsoft.com/office/word/2024/wordml/sdtformatlock" xmlns:w16se="http://schemas.microsoft.com/office/word/2015/wordml/symex" xmlns:wpg="http://schemas.microsoft.com/office/word/2010/wordprocessingGroup" xmlns:wpi="http://schemas.microsoft.com/office/word/2010/wordprocessingInk" xmlns:wne="http://schemas.microsoft.com/office/word/2006/wordml" xmlns:wps="http://schemas.microsoft.com/office/word/2010/wordprocessingShape" mc:Ignorable="w14 w15 w16se w16cid w16 w16cex w16sdtdh w16sdtfl w16du wp14">
   <w:abstractNum w:abstractNumId="0" w15:restartNumberingAfterBreak="0">
-    <w:nsid w:val="05ED7297"/>
+    <w:nsid w:val="2E4F36B5"/>
     <w:multiLevelType w:val="hybridMultilevel"/>
-    <w:tmpl w:val="A1441900"/>
-    <w:lvl w:ilvl="0" w:tplc="8CA40C34">
-      <w:start w:val="1"/>
-      <w:numFmt w:val="decimal"/>
-      <w:lvlText w:val="%1."/>
-      <w:lvlJc w:val="left"/>
-      <w:pPr>
-        <w:ind w:left="540" w:hanging="360"/>
-      </w:pPr>
-    </w:lvl>
-    <w:lvl w:ilvl="1" w:tplc="615A1852">
-      <w:numFmt w:val="decimal"/>
-      <w:lvlText w:val=""/>
-      <w:lvlJc w:val="left"/>
-    </w:lvl>
-    <w:lvl w:ilvl="2" w:tplc="5C024058">
-      <w:numFmt w:val="decimal"/>
-      <w:lvlText w:val=""/>
-      <w:lvlJc w:val="left"/>
-    </w:lvl>
-    <w:lvl w:ilvl="3" w:tplc="FC9459DC">
-      <w:numFmt w:val="decimal"/>
-      <w:lvlText w:val=""/>
-      <w:lvlJc w:val="left"/>
-    </w:lvl>
-    <w:lvl w:ilvl="4" w:tplc="B57277F2">
-      <w:numFmt w:val="decimal"/>
-      <w:lvlText w:val=""/>
-      <w:lvlJc w:val="left"/>
-    </w:lvl>
-    <w:lvl w:ilvl="5" w:tplc="E4C26976">
-      <w:numFmt w:val="decimal"/>
-      <w:lvlText w:val=""/>
-      <w:lvlJc w:val="left"/>
-    </w:lvl>
-    <w:lvl w:ilvl="6" w:tplc="5C824C36">
-      <w:numFmt w:val="decimal"/>
-      <w:lvlText w:val=""/>
-      <w:lvlJc w:val="left"/>
-    </w:lvl>
-    <w:lvl w:ilvl="7" w:tplc="301E4800">
-      <w:numFmt w:val="decimal"/>
-      <w:lvlText w:val=""/>
-      <w:lvlJc w:val="left"/>
-    </w:lvl>
-    <w:lvl w:ilvl="8" w:tplc="B4EAFDA4">
-      <w:numFmt w:val="decimal"/>
-      <w:lvlText w:val=""/>
-      <w:lvlJc w:val="left"/>
-    </w:lvl>
-  </w:abstractNum>
-  <w:abstractNum w:abstractNumId="1" w15:restartNumberingAfterBreak="0">
-    <w:nsid w:val="2FDA6CBE"/>
-    <w:multiLevelType w:val="hybridMultilevel"/>
-    <w:tmpl w:val="1896A8B8"/>
-    <w:lvl w:ilvl="0" w:tplc="08B43554">
-      <w:start w:val="1"/>
-      <w:numFmt w:val="decimal"/>
-      <w:lvlText w:val="%1."/>
-      <w:lvlJc w:val="left"/>
-      <w:pPr>
-        <w:ind w:left="540" w:hanging="360"/>
-      </w:pPr>
-    </w:lvl>
-    <w:lvl w:ilvl="1" w:tplc="64EC26F4">
-      <w:numFmt w:val="decimal"/>
-      <w:lvlText w:val=""/>
-      <w:lvlJc w:val="left"/>
-    </w:lvl>
-    <w:lvl w:ilvl="2" w:tplc="C07E1634">
-      <w:numFmt w:val="decimal"/>
-      <w:lvlText w:val=""/>
-      <w:lvlJc w:val="left"/>
-    </w:lvl>
-    <w:lvl w:ilvl="3" w:tplc="39722B44">
-      <w:numFmt w:val="decimal"/>
-      <w:lvlText w:val=""/>
-      <w:lvlJc w:val="left"/>
-    </w:lvl>
-    <w:lvl w:ilvl="4" w:tplc="3612CA32">
-      <w:numFmt w:val="decimal"/>
-      <w:lvlText w:val=""/>
-      <w:lvlJc w:val="left"/>
-    </w:lvl>
-    <w:lvl w:ilvl="5" w:tplc="8ACC3B84">
-      <w:numFmt w:val="decimal"/>
-      <w:lvlText w:val=""/>
-      <w:lvlJc w:val="left"/>
-    </w:lvl>
-    <w:lvl w:ilvl="6" w:tplc="CA14111C">
-      <w:numFmt w:val="decimal"/>
-      <w:lvlText w:val=""/>
-      <w:lvlJc w:val="left"/>
-    </w:lvl>
-    <w:lvl w:ilvl="7" w:tplc="C1383908">
-      <w:numFmt w:val="decimal"/>
-      <w:lvlText w:val=""/>
-      <w:lvlJc w:val="left"/>
-    </w:lvl>
-    <w:lvl w:ilvl="8" w:tplc="5F246FC0">
-      <w:numFmt w:val="decimal"/>
-      <w:lvlText w:val=""/>
-      <w:lvlJc w:val="left"/>
-    </w:lvl>
-  </w:abstractNum>
-  <w:abstractNum w:abstractNumId="2" w15:restartNumberingAfterBreak="0">
-    <w:nsid w:val="36B62103"/>
-    <w:multiLevelType w:val="hybridMultilevel"/>
-    <w:tmpl w:val="58984986"/>
-    <w:lvl w:ilvl="0" w:tplc="23D04DFA">
-      <w:start w:val="1"/>
-      <w:numFmt w:val="decimal"/>
-      <w:lvlText w:val="%1."/>
-      <w:lvlJc w:val="left"/>
-      <w:pPr>
-        <w:ind w:left="540" w:hanging="360"/>
-      </w:pPr>
-    </w:lvl>
-    <w:lvl w:ilvl="1" w:tplc="F1526AD6">
-      <w:numFmt w:val="decimal"/>
-      <w:lvlText w:val=""/>
-      <w:lvlJc w:val="left"/>
-    </w:lvl>
-    <w:lvl w:ilvl="2" w:tplc="19E859AC">
-      <w:numFmt w:val="decimal"/>
-      <w:lvlText w:val=""/>
-      <w:lvlJc w:val="left"/>
-    </w:lvl>
-    <w:lvl w:ilvl="3" w:tplc="86A4DBC6">
-      <w:numFmt w:val="decimal"/>
-      <w:lvlText w:val=""/>
-      <w:lvlJc w:val="left"/>
-    </w:lvl>
-    <w:lvl w:ilvl="4" w:tplc="EDD6D23E">
-      <w:numFmt w:val="decimal"/>
-      <w:lvlText w:val=""/>
-      <w:lvlJc w:val="left"/>
-    </w:lvl>
-    <w:lvl w:ilvl="5" w:tplc="40881BB0">
-      <w:numFmt w:val="decimal"/>
-      <w:lvlText w:val=""/>
-      <w:lvlJc w:val="left"/>
-    </w:lvl>
-    <w:lvl w:ilvl="6" w:tplc="93AA4ADC">
-      <w:numFmt w:val="decimal"/>
-      <w:lvlText w:val=""/>
-      <w:lvlJc w:val="left"/>
-    </w:lvl>
-    <w:lvl w:ilvl="7" w:tplc="45F4151A">
-      <w:numFmt w:val="decimal"/>
-      <w:lvlText w:val=""/>
-      <w:lvlJc w:val="left"/>
-    </w:lvl>
-    <w:lvl w:ilvl="8" w:tplc="DE0E565E">
-      <w:numFmt w:val="decimal"/>
-      <w:lvlText w:val=""/>
-      <w:lvlJc w:val="left"/>
-    </w:lvl>
-  </w:abstractNum>
-  <w:abstractNum w:abstractNumId="3" w15:restartNumberingAfterBreak="0">
-    <w:nsid w:val="38345027"/>
-    <w:multiLevelType w:val="hybridMultilevel"/>
-    <w:tmpl w:val="53EE2696"/>
-    <w:lvl w:ilvl="0" w:tplc="CCA4236A">
-      <w:start w:val="1"/>
-      <w:numFmt w:val="bullet"/>
-      <w:lvlText w:val="•"/>
-      <w:lvlJc w:val="left"/>
-      <w:pPr>
-        <w:ind w:left="540" w:hanging="270"/>
-      </w:pPr>
-    </w:lvl>
-    <w:lvl w:ilvl="1" w:tplc="F8545836">
-      <w:start w:val="1"/>
-      <w:numFmt w:val="bullet"/>
-      <w:lvlText w:val="–"/>
-      <w:lvlJc w:val="left"/>
-      <w:pPr>
-        <w:ind w:left="900" w:hanging="270"/>
-      </w:pPr>
-    </w:lvl>
-    <w:lvl w:ilvl="2" w:tplc="88D6E1CE">
-      <w:numFmt w:val="decimal"/>
-      <w:lvlText w:val=""/>
-      <w:lvlJc w:val="left"/>
-    </w:lvl>
-    <w:lvl w:ilvl="3" w:tplc="1BD4E3DA">
-      <w:numFmt w:val="decimal"/>
-      <w:lvlText w:val=""/>
-      <w:lvlJc w:val="left"/>
-    </w:lvl>
-    <w:lvl w:ilvl="4" w:tplc="E3F27A8C">
-      <w:numFmt w:val="decimal"/>
-      <w:lvlText w:val=""/>
-      <w:lvlJc w:val="left"/>
-    </w:lvl>
-    <w:lvl w:ilvl="5" w:tplc="BAC82EE8">
-      <w:numFmt w:val="decimal"/>
-      <w:lvlText w:val=""/>
-      <w:lvlJc w:val="left"/>
-    </w:lvl>
-    <w:lvl w:ilvl="6" w:tplc="F54C2AE6">
-      <w:numFmt w:val="decimal"/>
-      <w:lvlText w:val=""/>
-      <w:lvlJc w:val="left"/>
-    </w:lvl>
-    <w:lvl w:ilvl="7" w:tplc="452899A0">
-      <w:numFmt w:val="decimal"/>
-      <w:lvlText w:val=""/>
-      <w:lvlJc w:val="left"/>
-    </w:lvl>
-    <w:lvl w:ilvl="8" w:tplc="0C9E88DA">
-      <w:numFmt w:val="decimal"/>
-      <w:lvlText w:val=""/>
-      <w:lvlJc w:val="left"/>
-    </w:lvl>
-  </w:abstractNum>
-  <w:abstractNum w:abstractNumId="4" w15:restartNumberingAfterBreak="0">
-    <w:nsid w:val="42933BB4"/>
-    <w:multiLevelType w:val="hybridMultilevel"/>
-    <w:tmpl w:val="29D8B04A"/>
-    <w:lvl w:ilvl="0" w:tplc="99B8B696">
+    <w:tmpl w:val="2F4A7186"/>
+    <w:lvl w:ilvl="0" w:tplc="8B3E4A18">
       <w:start w:val="1"/>
       <w:numFmt w:val="bullet"/>
       <w:lvlText w:val="●"/>
@@ -24139,7 +25029,7 @@
         <w:ind w:left="720" w:hanging="360"/>
       </w:pPr>
     </w:lvl>
-    <w:lvl w:ilvl="1" w:tplc="2912022A">
+    <w:lvl w:ilvl="1" w:tplc="C854C2FC">
       <w:start w:val="1"/>
       <w:numFmt w:val="bullet"/>
       <w:lvlText w:val="○"/>
@@ -24148,7 +25038,7 @@
         <w:ind w:left="1440" w:hanging="360"/>
       </w:pPr>
     </w:lvl>
-    <w:lvl w:ilvl="2" w:tplc="65E69B36">
+    <w:lvl w:ilvl="2" w:tplc="ECDA0134">
       <w:start w:val="1"/>
       <w:numFmt w:val="bullet"/>
       <w:lvlText w:val="■"/>
@@ -24157,7 +25047,7 @@
         <w:ind w:left="2160" w:hanging="360"/>
       </w:pPr>
     </w:lvl>
-    <w:lvl w:ilvl="3" w:tplc="DC78A68C">
+    <w:lvl w:ilvl="3" w:tplc="7304CF1E">
       <w:start w:val="1"/>
       <w:numFmt w:val="bullet"/>
       <w:lvlText w:val="●"/>
@@ -24166,7 +25056,7 @@
         <w:ind w:left="2880" w:hanging="360"/>
       </w:pPr>
     </w:lvl>
-    <w:lvl w:ilvl="4" w:tplc="D354ECDC">
+    <w:lvl w:ilvl="4" w:tplc="43101B6C">
       <w:start w:val="1"/>
       <w:numFmt w:val="bullet"/>
       <w:lvlText w:val="○"/>
@@ -24175,7 +25065,7 @@
         <w:ind w:left="3600" w:hanging="360"/>
       </w:pPr>
     </w:lvl>
-    <w:lvl w:ilvl="5" w:tplc="78DC2A02">
+    <w:lvl w:ilvl="5" w:tplc="644C13EE">
       <w:start w:val="1"/>
       <w:numFmt w:val="bullet"/>
       <w:lvlText w:val="■"/>
@@ -24184,7 +25074,7 @@
         <w:ind w:left="4320" w:hanging="360"/>
       </w:pPr>
     </w:lvl>
-    <w:lvl w:ilvl="6" w:tplc="FDB6C892">
+    <w:lvl w:ilvl="6" w:tplc="008C6B68">
       <w:start w:val="1"/>
       <w:numFmt w:val="bullet"/>
       <w:lvlText w:val="●"/>
@@ -24193,7 +25083,7 @@
         <w:ind w:left="5040" w:hanging="360"/>
       </w:pPr>
     </w:lvl>
-    <w:lvl w:ilvl="7" w:tplc="21680F78">
+    <w:lvl w:ilvl="7" w:tplc="D2407B90">
       <w:start w:val="1"/>
       <w:numFmt w:val="bullet"/>
       <w:lvlText w:val="●"/>
@@ -24202,7 +25092,7 @@
         <w:ind w:left="5760" w:hanging="360"/>
       </w:pPr>
     </w:lvl>
-    <w:lvl w:ilvl="8" w:tplc="EE04C98E">
+    <w:lvl w:ilvl="8" w:tplc="9FB8D1B0">
       <w:start w:val="1"/>
       <w:numFmt w:val="bullet"/>
       <w:lvlText w:val="●"/>
@@ -24212,11 +25102,11 @@
       </w:pPr>
     </w:lvl>
   </w:abstractNum>
-  <w:abstractNum w:abstractNumId="5" w15:restartNumberingAfterBreak="0">
-    <w:nsid w:val="484B22E4"/>
+  <w:abstractNum w:abstractNumId="1" w15:restartNumberingAfterBreak="0">
+    <w:nsid w:val="2EF0578B"/>
     <w:multiLevelType w:val="hybridMultilevel"/>
-    <w:tmpl w:val="6450B72E"/>
-    <w:lvl w:ilvl="0" w:tplc="07046228">
+    <w:tmpl w:val="8140F58A"/>
+    <w:lvl w:ilvl="0" w:tplc="3AF2C228">
       <w:start w:val="1"/>
       <w:numFmt w:val="decimal"/>
       <w:lvlText w:val="%1."/>
@@ -24225,79 +25115,299 @@
         <w:ind w:left="540" w:hanging="360"/>
       </w:pPr>
     </w:lvl>
-    <w:lvl w:ilvl="1" w:tplc="ECE81938">
+    <w:lvl w:ilvl="1" w:tplc="05025588">
       <w:numFmt w:val="decimal"/>
       <w:lvlText w:val=""/>
       <w:lvlJc w:val="left"/>
     </w:lvl>
-    <w:lvl w:ilvl="2" w:tplc="D84C8E8E">
+    <w:lvl w:ilvl="2" w:tplc="CC86E9A4">
       <w:numFmt w:val="decimal"/>
       <w:lvlText w:val=""/>
       <w:lvlJc w:val="left"/>
     </w:lvl>
-    <w:lvl w:ilvl="3" w:tplc="3FCA9F02">
+    <w:lvl w:ilvl="3" w:tplc="D0E46C34">
       <w:numFmt w:val="decimal"/>
       <w:lvlText w:val=""/>
       <w:lvlJc w:val="left"/>
     </w:lvl>
-    <w:lvl w:ilvl="4" w:tplc="B296BE02">
+    <w:lvl w:ilvl="4" w:tplc="91981BD4">
       <w:numFmt w:val="decimal"/>
       <w:lvlText w:val=""/>
       <w:lvlJc w:val="left"/>
     </w:lvl>
-    <w:lvl w:ilvl="5" w:tplc="D90AF598">
+    <w:lvl w:ilvl="5" w:tplc="D42C3D8A">
       <w:numFmt w:val="decimal"/>
       <w:lvlText w:val=""/>
       <w:lvlJc w:val="left"/>
     </w:lvl>
-    <w:lvl w:ilvl="6" w:tplc="6AE079FE">
+    <w:lvl w:ilvl="6" w:tplc="30E2952E">
       <w:numFmt w:val="decimal"/>
       <w:lvlText w:val=""/>
       <w:lvlJc w:val="left"/>
     </w:lvl>
-    <w:lvl w:ilvl="7" w:tplc="A0649832">
+    <w:lvl w:ilvl="7" w:tplc="800834FC">
       <w:numFmt w:val="decimal"/>
       <w:lvlText w:val=""/>
       <w:lvlJc w:val="left"/>
     </w:lvl>
-    <w:lvl w:ilvl="8" w:tplc="6318F020">
+    <w:lvl w:ilvl="8" w:tplc="0E90038E">
       <w:numFmt w:val="decimal"/>
       <w:lvlText w:val=""/>
       <w:lvlJc w:val="left"/>
     </w:lvl>
   </w:abstractNum>
-  <w:num w:numId="1" w16cid:durableId="11147571">
+  <w:abstractNum w:abstractNumId="2" w15:restartNumberingAfterBreak="0">
+    <w:nsid w:val="46811046"/>
+    <w:multiLevelType w:val="hybridMultilevel"/>
+    <w:tmpl w:val="0C046EE4"/>
+    <w:lvl w:ilvl="0" w:tplc="81146D5A">
+      <w:start w:val="1"/>
+      <w:numFmt w:val="bullet"/>
+      <w:lvlText w:val="•"/>
+      <w:lvlJc w:val="left"/>
+      <w:pPr>
+        <w:ind w:left="540" w:hanging="270"/>
+      </w:pPr>
+    </w:lvl>
+    <w:lvl w:ilvl="1" w:tplc="8ACE7A5E">
+      <w:start w:val="1"/>
+      <w:numFmt w:val="bullet"/>
+      <w:lvlText w:val="–"/>
+      <w:lvlJc w:val="left"/>
+      <w:pPr>
+        <w:ind w:left="900" w:hanging="270"/>
+      </w:pPr>
+    </w:lvl>
+    <w:lvl w:ilvl="2" w:tplc="D3761052">
+      <w:numFmt w:val="decimal"/>
+      <w:lvlText w:val=""/>
+      <w:lvlJc w:val="left"/>
+    </w:lvl>
+    <w:lvl w:ilvl="3" w:tplc="6D26CD14">
+      <w:numFmt w:val="decimal"/>
+      <w:lvlText w:val=""/>
+      <w:lvlJc w:val="left"/>
+    </w:lvl>
+    <w:lvl w:ilvl="4" w:tplc="11DA4B54">
+      <w:numFmt w:val="decimal"/>
+      <w:lvlText w:val=""/>
+      <w:lvlJc w:val="left"/>
+    </w:lvl>
+    <w:lvl w:ilvl="5" w:tplc="2B7E0712">
+      <w:numFmt w:val="decimal"/>
+      <w:lvlText w:val=""/>
+      <w:lvlJc w:val="left"/>
+    </w:lvl>
+    <w:lvl w:ilvl="6" w:tplc="99D61932">
+      <w:numFmt w:val="decimal"/>
+      <w:lvlText w:val=""/>
+      <w:lvlJc w:val="left"/>
+    </w:lvl>
+    <w:lvl w:ilvl="7" w:tplc="E530224E">
+      <w:numFmt w:val="decimal"/>
+      <w:lvlText w:val=""/>
+      <w:lvlJc w:val="left"/>
+    </w:lvl>
+    <w:lvl w:ilvl="8" w:tplc="917A9BAE">
+      <w:numFmt w:val="decimal"/>
+      <w:lvlText w:val=""/>
+      <w:lvlJc w:val="left"/>
+    </w:lvl>
+  </w:abstractNum>
+  <w:abstractNum w:abstractNumId="3" w15:restartNumberingAfterBreak="0">
+    <w:nsid w:val="615D7C8B"/>
+    <w:multiLevelType w:val="hybridMultilevel"/>
+    <w:tmpl w:val="708ACFC4"/>
+    <w:lvl w:ilvl="0" w:tplc="18F8289C">
+      <w:start w:val="1"/>
+      <w:numFmt w:val="decimal"/>
+      <w:lvlText w:val="%1."/>
+      <w:lvlJc w:val="left"/>
+      <w:pPr>
+        <w:ind w:left="540" w:hanging="360"/>
+      </w:pPr>
+    </w:lvl>
+    <w:lvl w:ilvl="1" w:tplc="42983028">
+      <w:numFmt w:val="decimal"/>
+      <w:lvlText w:val=""/>
+      <w:lvlJc w:val="left"/>
+    </w:lvl>
+    <w:lvl w:ilvl="2" w:tplc="CC94D41E">
+      <w:numFmt w:val="decimal"/>
+      <w:lvlText w:val=""/>
+      <w:lvlJc w:val="left"/>
+    </w:lvl>
+    <w:lvl w:ilvl="3" w:tplc="1EEA74F8">
+      <w:numFmt w:val="decimal"/>
+      <w:lvlText w:val=""/>
+      <w:lvlJc w:val="left"/>
+    </w:lvl>
+    <w:lvl w:ilvl="4" w:tplc="BEAEA31A">
+      <w:numFmt w:val="decimal"/>
+      <w:lvlText w:val=""/>
+      <w:lvlJc w:val="left"/>
+    </w:lvl>
+    <w:lvl w:ilvl="5" w:tplc="A3403DB4">
+      <w:numFmt w:val="decimal"/>
+      <w:lvlText w:val=""/>
+      <w:lvlJc w:val="left"/>
+    </w:lvl>
+    <w:lvl w:ilvl="6" w:tplc="8B967714">
+      <w:numFmt w:val="decimal"/>
+      <w:lvlText w:val=""/>
+      <w:lvlJc w:val="left"/>
+    </w:lvl>
+    <w:lvl w:ilvl="7" w:tplc="9FF4F7D6">
+      <w:numFmt w:val="decimal"/>
+      <w:lvlText w:val=""/>
+      <w:lvlJc w:val="left"/>
+    </w:lvl>
+    <w:lvl w:ilvl="8" w:tplc="73E6B55E">
+      <w:numFmt w:val="decimal"/>
+      <w:lvlText w:val=""/>
+      <w:lvlJc w:val="left"/>
+    </w:lvl>
+  </w:abstractNum>
+  <w:abstractNum w:abstractNumId="4" w15:restartNumberingAfterBreak="0">
+    <w:nsid w:val="65A23249"/>
+    <w:multiLevelType w:val="hybridMultilevel"/>
+    <w:tmpl w:val="A0185A3C"/>
+    <w:lvl w:ilvl="0" w:tplc="3E2437AC">
+      <w:start w:val="1"/>
+      <w:numFmt w:val="decimal"/>
+      <w:lvlText w:val="%1."/>
+      <w:lvlJc w:val="left"/>
+      <w:pPr>
+        <w:ind w:left="540" w:hanging="360"/>
+      </w:pPr>
+    </w:lvl>
+    <w:lvl w:ilvl="1" w:tplc="1D28F754">
+      <w:numFmt w:val="decimal"/>
+      <w:lvlText w:val=""/>
+      <w:lvlJc w:val="left"/>
+    </w:lvl>
+    <w:lvl w:ilvl="2" w:tplc="E7C40E30">
+      <w:numFmt w:val="decimal"/>
+      <w:lvlText w:val=""/>
+      <w:lvlJc w:val="left"/>
+    </w:lvl>
+    <w:lvl w:ilvl="3" w:tplc="AB569AB0">
+      <w:numFmt w:val="decimal"/>
+      <w:lvlText w:val=""/>
+      <w:lvlJc w:val="left"/>
+    </w:lvl>
+    <w:lvl w:ilvl="4" w:tplc="B74A2F3C">
+      <w:numFmt w:val="decimal"/>
+      <w:lvlText w:val=""/>
+      <w:lvlJc w:val="left"/>
+    </w:lvl>
+    <w:lvl w:ilvl="5" w:tplc="57D03E1E">
+      <w:numFmt w:val="decimal"/>
+      <w:lvlText w:val=""/>
+      <w:lvlJc w:val="left"/>
+    </w:lvl>
+    <w:lvl w:ilvl="6" w:tplc="7D047AD6">
+      <w:numFmt w:val="decimal"/>
+      <w:lvlText w:val=""/>
+      <w:lvlJc w:val="left"/>
+    </w:lvl>
+    <w:lvl w:ilvl="7" w:tplc="D06AEEE0">
+      <w:numFmt w:val="decimal"/>
+      <w:lvlText w:val=""/>
+      <w:lvlJc w:val="left"/>
+    </w:lvl>
+    <w:lvl w:ilvl="8" w:tplc="86BA0F7A">
+      <w:numFmt w:val="decimal"/>
+      <w:lvlText w:val=""/>
+      <w:lvlJc w:val="left"/>
+    </w:lvl>
+  </w:abstractNum>
+  <w:abstractNum w:abstractNumId="5" w15:restartNumberingAfterBreak="0">
+    <w:nsid w:val="73C218AB"/>
+    <w:multiLevelType w:val="hybridMultilevel"/>
+    <w:tmpl w:val="2E5E1254"/>
+    <w:lvl w:ilvl="0" w:tplc="6DA82BCA">
+      <w:start w:val="1"/>
+      <w:numFmt w:val="decimal"/>
+      <w:lvlText w:val="%1."/>
+      <w:lvlJc w:val="left"/>
+      <w:pPr>
+        <w:ind w:left="540" w:hanging="360"/>
+      </w:pPr>
+    </w:lvl>
+    <w:lvl w:ilvl="1" w:tplc="33D85C76">
+      <w:numFmt w:val="decimal"/>
+      <w:lvlText w:val=""/>
+      <w:lvlJc w:val="left"/>
+    </w:lvl>
+    <w:lvl w:ilvl="2" w:tplc="A33A5944">
+      <w:numFmt w:val="decimal"/>
+      <w:lvlText w:val=""/>
+      <w:lvlJc w:val="left"/>
+    </w:lvl>
+    <w:lvl w:ilvl="3" w:tplc="E45E7838">
+      <w:numFmt w:val="decimal"/>
+      <w:lvlText w:val=""/>
+      <w:lvlJc w:val="left"/>
+    </w:lvl>
+    <w:lvl w:ilvl="4" w:tplc="93943222">
+      <w:numFmt w:val="decimal"/>
+      <w:lvlText w:val=""/>
+      <w:lvlJc w:val="left"/>
+    </w:lvl>
+    <w:lvl w:ilvl="5" w:tplc="9E0C9D16">
+      <w:numFmt w:val="decimal"/>
+      <w:lvlText w:val=""/>
+      <w:lvlJc w:val="left"/>
+    </w:lvl>
+    <w:lvl w:ilvl="6" w:tplc="E6584ACE">
+      <w:numFmt w:val="decimal"/>
+      <w:lvlText w:val=""/>
+      <w:lvlJc w:val="left"/>
+    </w:lvl>
+    <w:lvl w:ilvl="7" w:tplc="4672DC06">
+      <w:numFmt w:val="decimal"/>
+      <w:lvlText w:val=""/>
+      <w:lvlJc w:val="left"/>
+    </w:lvl>
+    <w:lvl w:ilvl="8" w:tplc="4BF6785E">
+      <w:numFmt w:val="decimal"/>
+      <w:lvlText w:val=""/>
+      <w:lvlJc w:val="left"/>
+    </w:lvl>
+  </w:abstractNum>
+  <w:num w:numId="1" w16cid:durableId="621496756">
+    <w:abstractNumId w:val="0"/>
+    <w:lvlOverride w:ilvl="0">
+      <w:startOverride w:val="1"/>
+    </w:lvlOverride>
+  </w:num>
+  <w:num w:numId="2" w16cid:durableId="1805460298">
+    <w:abstractNumId w:val="2"/>
+    <w:lvlOverride w:ilvl="0">
+      <w:startOverride w:val="1"/>
+    </w:lvlOverride>
+  </w:num>
+  <w:num w:numId="3" w16cid:durableId="1378312274">
+    <w:abstractNumId w:val="5"/>
+    <w:lvlOverride w:ilvl="0">
+      <w:startOverride w:val="1"/>
+    </w:lvlOverride>
+  </w:num>
+  <w:num w:numId="4" w16cid:durableId="2012676612">
+    <w:abstractNumId w:val="1"/>
+    <w:lvlOverride w:ilvl="0">
+      <w:startOverride w:val="1"/>
+    </w:lvlOverride>
+  </w:num>
+  <w:num w:numId="5" w16cid:durableId="1813448035">
     <w:abstractNumId w:val="4"/>
     <w:lvlOverride w:ilvl="0">
       <w:startOverride w:val="1"/>
     </w:lvlOverride>
   </w:num>
-  <w:num w:numId="2" w16cid:durableId="1205406075">
+  <w:num w:numId="6" w16cid:durableId="121385340">
     <w:abstractNumId w:val="3"/>
-    <w:lvlOverride w:ilvl="0">
-      <w:startOverride w:val="1"/>
-    </w:lvlOverride>
-  </w:num>
-  <w:num w:numId="3" w16cid:durableId="1117258049">
-    <w:abstractNumId w:val="1"/>
-    <w:lvlOverride w:ilvl="0">
-      <w:startOverride w:val="1"/>
-    </w:lvlOverride>
-  </w:num>
-  <w:num w:numId="4" w16cid:durableId="943996199">
-    <w:abstractNumId w:val="5"/>
-    <w:lvlOverride w:ilvl="0">
-      <w:startOverride w:val="1"/>
-    </w:lvlOverride>
-  </w:num>
-  <w:num w:numId="5" w16cid:durableId="1095439021">
-    <w:abstractNumId w:val="0"/>
-    <w:lvlOverride w:ilvl="0">
-      <w:startOverride w:val="1"/>
-    </w:lvlOverride>
-  </w:num>
-  <w:num w:numId="6" w16cid:durableId="1812553294">
-    <w:abstractNumId w:val="2"/>
     <w:lvlOverride w:ilvl="0">
       <w:startOverride w:val="1"/>
     </w:lvlOverride>
@@ -24876,7 +25986,7 @@
     <w:autoRedefine/>
     <w:uiPriority w:val="39"/>
     <w:unhideWhenUsed/>
-    <w:rsid w:val="00A07D5D"/>
+    <w:rsid w:val="0094130B"/>
     <w:pPr>
       <w:spacing w:after="100"/>
     </w:pPr>
@@ -24892,7 +26002,7 @@
     <w:autoRedefine/>
     <w:uiPriority w:val="39"/>
     <w:unhideWhenUsed/>
-    <w:rsid w:val="00A07D5D"/>
+    <w:rsid w:val="0094130B"/>
     <w:pPr>
       <w:spacing w:after="100"/>
       <w:ind w:left="200"/>

</xml_diff>

<commit_message>
Manual: GitHub token no longer expires; how to replace and test it
Co-Authored-By: Claude Opus 5.5 <noreply@anthropic.com>
</commit_message>
<xml_diff>
--- a/docs/eGP-Alert-v3-Technical-Manual-v2.docx
+++ b/docs/eGP-Alert-v3-Technical-Manual-v2.docx
@@ -84,7 +84,7 @@
         <w:spacing w:after="120" w:line="300" w:lineRule="auto"/>
       </w:pPr>
       <w:r>
-        <w:t>ขอบเขต: Phase 0 (สำรวจข้อมูล) และ Phase 1 (ระบบแจ้งเตือนรายวัน) · เปิดใช้งานกับทีม Sale 15 ตุลาคม 2569 (ปิดระบบเดิม prospecting-automated-2 แล้ว) · ฉบับวันที่ 20 ตุลาคม 2569 (เพิ่มการกรองจังหวัด และผู้ชนะ/ราคาที่ชนะของประกาศผู้ชนะ)</w:t>
+        <w:t>ขอบเขต: Phase 0 (สำรวจข้อมูล) และ Phase 1 (ระบบแจ้งเตือนรายวัน) · เปิดใช้งานกับทีม Sale 15 ตุลาคม 2569 (ปิดระบบเดิม prospecting-automated-2 แล้ว) · ฉบับวันที่ 20 ตุลาคม 2569 (เพิ่มการกรองจังหวัด ผู้ชนะ/ราคาที่ชนะของประกาศผู้ชนะ และ GitHub token แบบไม่หมดอายุ)</w:t>
       </w:r>
     </w:p>
     <w:p>
@@ -111,7 +111,7 @@
     <w:sdt>
       <w:sdtPr>
         <w:alias w:val="สารบัญ"/>
-        <w:id w:val="-1297908597"/>
+        <w:id w:val="-2140026053"/>
       </w:sdtPr>
       <w:sdtEndPr>
         <w:rPr>
@@ -144,7 +144,7 @@
           <w:r>
             <w:fldChar w:fldCharType="separate"/>
           </w:r>
-          <w:hyperlink w:anchor="_Toc243378713" w:history="1">
+          <w:hyperlink w:anchor="_Toc243385308" w:history="1">
             <w:r>
               <w:rPr>
                 <w:rStyle w:val="Hyperlink"/>
@@ -168,7 +168,7 @@
               <w:rPr>
                 <w:noProof/>
               </w:rPr>
-              <w:instrText xml:space="preserve"> PAGEREF _Toc243378713 \h </w:instrText>
+              <w:instrText xml:space="preserve"> PAGEREF _Toc243385308 \h </w:instrText>
             </w:r>
             <w:r>
               <w:rPr>
@@ -210,7 +210,7 @@
               <w14:ligatures w14:val="standardContextual"/>
             </w:rPr>
           </w:pPr>
-          <w:hyperlink w:anchor="_Toc243378714" w:history="1">
+          <w:hyperlink w:anchor="_Toc243385309" w:history="1">
             <w:r>
               <w:rPr>
                 <w:rStyle w:val="Hyperlink"/>
@@ -234,7 +234,7 @@
               <w:rPr>
                 <w:noProof/>
               </w:rPr>
-              <w:instrText xml:space="preserve"> PAGEREF _Toc243378714 \h </w:instrText>
+              <w:instrText xml:space="preserve"> PAGEREF _Toc243385309 \h </w:instrText>
             </w:r>
             <w:r>
               <w:rPr>
@@ -276,7 +276,7 @@
               <w14:ligatures w14:val="standardContextual"/>
             </w:rPr>
           </w:pPr>
-          <w:hyperlink w:anchor="_Toc243378715" w:history="1">
+          <w:hyperlink w:anchor="_Toc243385310" w:history="1">
             <w:r>
               <w:rPr>
                 <w:rStyle w:val="Hyperlink"/>
@@ -300,7 +300,7 @@
               <w:rPr>
                 <w:noProof/>
               </w:rPr>
-              <w:instrText xml:space="preserve"> PAGEREF _Toc243378715 \h </w:instrText>
+              <w:instrText xml:space="preserve"> PAGEREF _Toc243385310 \h </w:instrText>
             </w:r>
             <w:r>
               <w:rPr>
@@ -342,7 +342,7 @@
               <w14:ligatures w14:val="standardContextual"/>
             </w:rPr>
           </w:pPr>
-          <w:hyperlink w:anchor="_Toc243378716" w:history="1">
+          <w:hyperlink w:anchor="_Toc243385311" w:history="1">
             <w:r>
               <w:rPr>
                 <w:rStyle w:val="Hyperlink"/>
@@ -366,7 +366,7 @@
               <w:rPr>
                 <w:noProof/>
               </w:rPr>
-              <w:instrText xml:space="preserve"> PAGEREF _Toc243378716 \h </w:instrText>
+              <w:instrText xml:space="preserve"> PAGEREF _Toc243385311 \h </w:instrText>
             </w:r>
             <w:r>
               <w:rPr>
@@ -408,7 +408,7 @@
               <w14:ligatures w14:val="standardContextual"/>
             </w:rPr>
           </w:pPr>
-          <w:hyperlink w:anchor="_Toc243378717" w:history="1">
+          <w:hyperlink w:anchor="_Toc243385312" w:history="1">
             <w:r>
               <w:rPr>
                 <w:rStyle w:val="Hyperlink"/>
@@ -432,7 +432,7 @@
               <w:rPr>
                 <w:noProof/>
               </w:rPr>
-              <w:instrText xml:space="preserve"> PAGEREF _Toc243378717 \h </w:instrText>
+              <w:instrText xml:space="preserve"> PAGEREF _Toc243385312 \h </w:instrText>
             </w:r>
             <w:r>
               <w:rPr>
@@ -474,7 +474,7 @@
               <w14:ligatures w14:val="standardContextual"/>
             </w:rPr>
           </w:pPr>
-          <w:hyperlink w:anchor="_Toc243378718" w:history="1">
+          <w:hyperlink w:anchor="_Toc243385313" w:history="1">
             <w:r>
               <w:rPr>
                 <w:rStyle w:val="Hyperlink"/>
@@ -498,7 +498,7 @@
               <w:rPr>
                 <w:noProof/>
               </w:rPr>
-              <w:instrText xml:space="preserve"> PAGEREF _Toc243378718 \h </w:instrText>
+              <w:instrText xml:space="preserve"> PAGEREF _Toc243385313 \h </w:instrText>
             </w:r>
             <w:r>
               <w:rPr>
@@ -540,7 +540,7 @@
               <w14:ligatures w14:val="standardContextual"/>
             </w:rPr>
           </w:pPr>
-          <w:hyperlink w:anchor="_Toc243378719" w:history="1">
+          <w:hyperlink w:anchor="_Toc243385314" w:history="1">
             <w:r>
               <w:rPr>
                 <w:rStyle w:val="Hyperlink"/>
@@ -564,7 +564,7 @@
               <w:rPr>
                 <w:noProof/>
               </w:rPr>
-              <w:instrText xml:space="preserve"> PAGEREF _Toc243378719 \h </w:instrText>
+              <w:instrText xml:space="preserve"> PAGEREF _Toc243385314 \h </w:instrText>
             </w:r>
             <w:r>
               <w:rPr>
@@ -606,7 +606,7 @@
               <w14:ligatures w14:val="standardContextual"/>
             </w:rPr>
           </w:pPr>
-          <w:hyperlink w:anchor="_Toc243378720" w:history="1">
+          <w:hyperlink w:anchor="_Toc243385315" w:history="1">
             <w:r>
               <w:rPr>
                 <w:rStyle w:val="Hyperlink"/>
@@ -630,7 +630,7 @@
               <w:rPr>
                 <w:noProof/>
               </w:rPr>
-              <w:instrText xml:space="preserve"> PAGEREF _Toc243378720 \h </w:instrText>
+              <w:instrText xml:space="preserve"> PAGEREF _Toc243385315 \h </w:instrText>
             </w:r>
             <w:r>
               <w:rPr>
@@ -672,7 +672,7 @@
               <w14:ligatures w14:val="standardContextual"/>
             </w:rPr>
           </w:pPr>
-          <w:hyperlink w:anchor="_Toc243378721" w:history="1">
+          <w:hyperlink w:anchor="_Toc243385316" w:history="1">
             <w:r>
               <w:rPr>
                 <w:rStyle w:val="Hyperlink"/>
@@ -696,7 +696,7 @@
               <w:rPr>
                 <w:noProof/>
               </w:rPr>
-              <w:instrText xml:space="preserve"> PAGEREF _Toc243378721 \h </w:instrText>
+              <w:instrText xml:space="preserve"> PAGEREF _Toc243385316 \h </w:instrText>
             </w:r>
             <w:r>
               <w:rPr>
@@ -738,7 +738,7 @@
               <w14:ligatures w14:val="standardContextual"/>
             </w:rPr>
           </w:pPr>
-          <w:hyperlink w:anchor="_Toc243378722" w:history="1">
+          <w:hyperlink w:anchor="_Toc243385317" w:history="1">
             <w:r>
               <w:rPr>
                 <w:rStyle w:val="Hyperlink"/>
@@ -762,7 +762,7 @@
               <w:rPr>
                 <w:noProof/>
               </w:rPr>
-              <w:instrText xml:space="preserve"> PAGEREF _Toc243378722 \h </w:instrText>
+              <w:instrText xml:space="preserve"> PAGEREF _Toc243385317 \h </w:instrText>
             </w:r>
             <w:r>
               <w:rPr>
@@ -804,7 +804,7 @@
               <w14:ligatures w14:val="standardContextual"/>
             </w:rPr>
           </w:pPr>
-          <w:hyperlink w:anchor="_Toc243378723" w:history="1">
+          <w:hyperlink w:anchor="_Toc243385318" w:history="1">
             <w:r>
               <w:rPr>
                 <w:rStyle w:val="Hyperlink"/>
@@ -828,7 +828,7 @@
               <w:rPr>
                 <w:noProof/>
               </w:rPr>
-              <w:instrText xml:space="preserve"> PAGEREF _Toc243378723 \h </w:instrText>
+              <w:instrText xml:space="preserve"> PAGEREF _Toc243385318 \h </w:instrText>
             </w:r>
             <w:r>
               <w:rPr>
@@ -870,7 +870,7 @@
               <w14:ligatures w14:val="standardContextual"/>
             </w:rPr>
           </w:pPr>
-          <w:hyperlink w:anchor="_Toc243378724" w:history="1">
+          <w:hyperlink w:anchor="_Toc243385319" w:history="1">
             <w:r>
               <w:rPr>
                 <w:rStyle w:val="Hyperlink"/>
@@ -894,7 +894,7 @@
               <w:rPr>
                 <w:noProof/>
               </w:rPr>
-              <w:instrText xml:space="preserve"> PAGEREF _Toc243378724 \h </w:instrText>
+              <w:instrText xml:space="preserve"> PAGEREF _Toc243385319 \h </w:instrText>
             </w:r>
             <w:r>
               <w:rPr>
@@ -936,7 +936,7 @@
               <w14:ligatures w14:val="standardContextual"/>
             </w:rPr>
           </w:pPr>
-          <w:hyperlink w:anchor="_Toc243378725" w:history="1">
+          <w:hyperlink w:anchor="_Toc243385320" w:history="1">
             <w:r>
               <w:rPr>
                 <w:rStyle w:val="Hyperlink"/>
@@ -960,7 +960,7 @@
               <w:rPr>
                 <w:noProof/>
               </w:rPr>
-              <w:instrText xml:space="preserve"> PAGEREF _Toc243378725 \h </w:instrText>
+              <w:instrText xml:space="preserve"> PAGEREF _Toc243385320 \h </w:instrText>
             </w:r>
             <w:r>
               <w:rPr>
@@ -1002,7 +1002,7 @@
               <w14:ligatures w14:val="standardContextual"/>
             </w:rPr>
           </w:pPr>
-          <w:hyperlink w:anchor="_Toc243378726" w:history="1">
+          <w:hyperlink w:anchor="_Toc243385321" w:history="1">
             <w:r>
               <w:rPr>
                 <w:rStyle w:val="Hyperlink"/>
@@ -1026,7 +1026,7 @@
               <w:rPr>
                 <w:noProof/>
               </w:rPr>
-              <w:instrText xml:space="preserve"> PAGEREF _Toc243378726 \h </w:instrText>
+              <w:instrText xml:space="preserve"> PAGEREF _Toc243385321 \h </w:instrText>
             </w:r>
             <w:r>
               <w:rPr>
@@ -1068,7 +1068,7 @@
               <w14:ligatures w14:val="standardContextual"/>
             </w:rPr>
           </w:pPr>
-          <w:hyperlink w:anchor="_Toc243378727" w:history="1">
+          <w:hyperlink w:anchor="_Toc243385322" w:history="1">
             <w:r>
               <w:rPr>
                 <w:rStyle w:val="Hyperlink"/>
@@ -1092,7 +1092,7 @@
               <w:rPr>
                 <w:noProof/>
               </w:rPr>
-              <w:instrText xml:space="preserve"> PAGEREF _Toc243378727 \h </w:instrText>
+              <w:instrText xml:space="preserve"> PAGEREF _Toc243385322 \h </w:instrText>
             </w:r>
             <w:r>
               <w:rPr>
@@ -1134,7 +1134,7 @@
               <w14:ligatures w14:val="standardContextual"/>
             </w:rPr>
           </w:pPr>
-          <w:hyperlink w:anchor="_Toc243378728" w:history="1">
+          <w:hyperlink w:anchor="_Toc243385323" w:history="1">
             <w:r>
               <w:rPr>
                 <w:rStyle w:val="Hyperlink"/>
@@ -1158,7 +1158,7 @@
               <w:rPr>
                 <w:noProof/>
               </w:rPr>
-              <w:instrText xml:space="preserve"> PAGEREF _Toc243378728 \h </w:instrText>
+              <w:instrText xml:space="preserve"> PAGEREF _Toc243385323 \h </w:instrText>
             </w:r>
             <w:r>
               <w:rPr>
@@ -1200,7 +1200,7 @@
               <w14:ligatures w14:val="standardContextual"/>
             </w:rPr>
           </w:pPr>
-          <w:hyperlink w:anchor="_Toc243378729" w:history="1">
+          <w:hyperlink w:anchor="_Toc243385324" w:history="1">
             <w:r>
               <w:rPr>
                 <w:rStyle w:val="Hyperlink"/>
@@ -1224,7 +1224,7 @@
               <w:rPr>
                 <w:noProof/>
               </w:rPr>
-              <w:instrText xml:space="preserve"> PAGEREF _Toc243378729 \h </w:instrText>
+              <w:instrText xml:space="preserve"> PAGEREF _Toc243385324 \h </w:instrText>
             </w:r>
             <w:r>
               <w:rPr>
@@ -1266,7 +1266,7 @@
               <w14:ligatures w14:val="standardContextual"/>
             </w:rPr>
           </w:pPr>
-          <w:hyperlink w:anchor="_Toc243378730" w:history="1">
+          <w:hyperlink w:anchor="_Toc243385325" w:history="1">
             <w:r>
               <w:rPr>
                 <w:rStyle w:val="Hyperlink"/>
@@ -1290,7 +1290,7 @@
               <w:rPr>
                 <w:noProof/>
               </w:rPr>
-              <w:instrText xml:space="preserve"> PAGEREF _Toc243378730 \h </w:instrText>
+              <w:instrText xml:space="preserve"> PAGEREF _Toc243385325 \h </w:instrText>
             </w:r>
             <w:r>
               <w:rPr>
@@ -1332,7 +1332,7 @@
               <w14:ligatures w14:val="standardContextual"/>
             </w:rPr>
           </w:pPr>
-          <w:hyperlink w:anchor="_Toc243378731" w:history="1">
+          <w:hyperlink w:anchor="_Toc243385326" w:history="1">
             <w:r>
               <w:rPr>
                 <w:rStyle w:val="Hyperlink"/>
@@ -1356,7 +1356,7 @@
               <w:rPr>
                 <w:noProof/>
               </w:rPr>
-              <w:instrText xml:space="preserve"> PAGEREF _Toc243378731 \h </w:instrText>
+              <w:instrText xml:space="preserve"> PAGEREF _Toc243385326 \h </w:instrText>
             </w:r>
             <w:r>
               <w:rPr>
@@ -1398,7 +1398,7 @@
               <w14:ligatures w14:val="standardContextual"/>
             </w:rPr>
           </w:pPr>
-          <w:hyperlink w:anchor="_Toc243378732" w:history="1">
+          <w:hyperlink w:anchor="_Toc243385327" w:history="1">
             <w:r>
               <w:rPr>
                 <w:rStyle w:val="Hyperlink"/>
@@ -1422,7 +1422,7 @@
               <w:rPr>
                 <w:noProof/>
               </w:rPr>
-              <w:instrText xml:space="preserve"> PAGEREF _Toc243378732 \h </w:instrText>
+              <w:instrText xml:space="preserve"> PAGEREF _Toc243385327 \h </w:instrText>
             </w:r>
             <w:r>
               <w:rPr>
@@ -1464,7 +1464,7 @@
               <w14:ligatures w14:val="standardContextual"/>
             </w:rPr>
           </w:pPr>
-          <w:hyperlink w:anchor="_Toc243378733" w:history="1">
+          <w:hyperlink w:anchor="_Toc243385328" w:history="1">
             <w:r>
               <w:rPr>
                 <w:rStyle w:val="Hyperlink"/>
@@ -1488,7 +1488,7 @@
               <w:rPr>
                 <w:noProof/>
               </w:rPr>
-              <w:instrText xml:space="preserve"> PAGEREF _Toc243378733 \h </w:instrText>
+              <w:instrText xml:space="preserve"> PAGEREF _Toc243385328 \h </w:instrText>
             </w:r>
             <w:r>
               <w:rPr>
@@ -1530,7 +1530,7 @@
               <w14:ligatures w14:val="standardContextual"/>
             </w:rPr>
           </w:pPr>
-          <w:hyperlink w:anchor="_Toc243378734" w:history="1">
+          <w:hyperlink w:anchor="_Toc243385329" w:history="1">
             <w:r>
               <w:rPr>
                 <w:rStyle w:val="Hyperlink"/>
@@ -1554,7 +1554,7 @@
               <w:rPr>
                 <w:noProof/>
               </w:rPr>
-              <w:instrText xml:space="preserve"> PAGEREF _Toc243378734 \h </w:instrText>
+              <w:instrText xml:space="preserve"> PAGEREF _Toc243385329 \h </w:instrText>
             </w:r>
             <w:r>
               <w:rPr>
@@ -1596,7 +1596,7 @@
               <w14:ligatures w14:val="standardContextual"/>
             </w:rPr>
           </w:pPr>
-          <w:hyperlink w:anchor="_Toc243378735" w:history="1">
+          <w:hyperlink w:anchor="_Toc243385330" w:history="1">
             <w:r>
               <w:rPr>
                 <w:rStyle w:val="Hyperlink"/>
@@ -1620,7 +1620,7 @@
               <w:rPr>
                 <w:noProof/>
               </w:rPr>
-              <w:instrText xml:space="preserve"> PAGEREF _Toc243378735 \h </w:instrText>
+              <w:instrText xml:space="preserve"> PAGEREF _Toc243385330 \h </w:instrText>
             </w:r>
             <w:r>
               <w:rPr>
@@ -1662,7 +1662,7 @@
               <w14:ligatures w14:val="standardContextual"/>
             </w:rPr>
           </w:pPr>
-          <w:hyperlink w:anchor="_Toc243378736" w:history="1">
+          <w:hyperlink w:anchor="_Toc243385331" w:history="1">
             <w:r>
               <w:rPr>
                 <w:rStyle w:val="Hyperlink"/>
@@ -1686,7 +1686,7 @@
               <w:rPr>
                 <w:noProof/>
               </w:rPr>
-              <w:instrText xml:space="preserve"> PAGEREF _Toc243378736 \h </w:instrText>
+              <w:instrText xml:space="preserve"> PAGEREF _Toc243385331 \h </w:instrText>
             </w:r>
             <w:r>
               <w:rPr>
@@ -1728,7 +1728,7 @@
               <w14:ligatures w14:val="standardContextual"/>
             </w:rPr>
           </w:pPr>
-          <w:hyperlink w:anchor="_Toc243378737" w:history="1">
+          <w:hyperlink w:anchor="_Toc243385332" w:history="1">
             <w:r>
               <w:rPr>
                 <w:rStyle w:val="Hyperlink"/>
@@ -1752,7 +1752,7 @@
               <w:rPr>
                 <w:noProof/>
               </w:rPr>
-              <w:instrText xml:space="preserve"> PAGEREF _Toc243378737 \h </w:instrText>
+              <w:instrText xml:space="preserve"> PAGEREF _Toc243385332 \h </w:instrText>
             </w:r>
             <w:r>
               <w:rPr>
@@ -1794,7 +1794,7 @@
               <w14:ligatures w14:val="standardContextual"/>
             </w:rPr>
           </w:pPr>
-          <w:hyperlink w:anchor="_Toc243378738" w:history="1">
+          <w:hyperlink w:anchor="_Toc243385333" w:history="1">
             <w:r>
               <w:rPr>
                 <w:rStyle w:val="Hyperlink"/>
@@ -1818,7 +1818,7 @@
               <w:rPr>
                 <w:noProof/>
               </w:rPr>
-              <w:instrText xml:space="preserve"> PAGEREF _Toc243378738 \h </w:instrText>
+              <w:instrText xml:space="preserve"> PAGEREF _Toc243385333 \h </w:instrText>
             </w:r>
             <w:r>
               <w:rPr>
@@ -1860,7 +1860,7 @@
               <w14:ligatures w14:val="standardContextual"/>
             </w:rPr>
           </w:pPr>
-          <w:hyperlink w:anchor="_Toc243378739" w:history="1">
+          <w:hyperlink w:anchor="_Toc243385334" w:history="1">
             <w:r>
               <w:rPr>
                 <w:rStyle w:val="Hyperlink"/>
@@ -1884,7 +1884,7 @@
               <w:rPr>
                 <w:noProof/>
               </w:rPr>
-              <w:instrText xml:space="preserve"> PAGEREF _Toc243378739 \h </w:instrText>
+              <w:instrText xml:space="preserve"> PAGEREF _Toc243385334 \h </w:instrText>
             </w:r>
             <w:r>
               <w:rPr>
@@ -1926,7 +1926,7 @@
               <w14:ligatures w14:val="standardContextual"/>
             </w:rPr>
           </w:pPr>
-          <w:hyperlink w:anchor="_Toc243378740" w:history="1">
+          <w:hyperlink w:anchor="_Toc243385335" w:history="1">
             <w:r>
               <w:rPr>
                 <w:rStyle w:val="Hyperlink"/>
@@ -1950,7 +1950,7 @@
               <w:rPr>
                 <w:noProof/>
               </w:rPr>
-              <w:instrText xml:space="preserve"> PAGEREF _Toc243378740 \h </w:instrText>
+              <w:instrText xml:space="preserve"> PAGEREF _Toc243385335 \h </w:instrText>
             </w:r>
             <w:r>
               <w:rPr>
@@ -1992,7 +1992,7 @@
               <w14:ligatures w14:val="standardContextual"/>
             </w:rPr>
           </w:pPr>
-          <w:hyperlink w:anchor="_Toc243378741" w:history="1">
+          <w:hyperlink w:anchor="_Toc243385336" w:history="1">
             <w:r>
               <w:rPr>
                 <w:rStyle w:val="Hyperlink"/>
@@ -2016,7 +2016,7 @@
               <w:rPr>
                 <w:noProof/>
               </w:rPr>
-              <w:instrText xml:space="preserve"> PAGEREF _Toc243378741 \h </w:instrText>
+              <w:instrText xml:space="preserve"> PAGEREF _Toc243385336 \h </w:instrText>
             </w:r>
             <w:r>
               <w:rPr>
@@ -2058,7 +2058,7 @@
               <w14:ligatures w14:val="standardContextual"/>
             </w:rPr>
           </w:pPr>
-          <w:hyperlink w:anchor="_Toc243378742" w:history="1">
+          <w:hyperlink w:anchor="_Toc243385337" w:history="1">
             <w:r>
               <w:rPr>
                 <w:rStyle w:val="Hyperlink"/>
@@ -2082,7 +2082,7 @@
               <w:rPr>
                 <w:noProof/>
               </w:rPr>
-              <w:instrText xml:space="preserve"> PAGEREF _Toc243378742 \h </w:instrText>
+              <w:instrText xml:space="preserve"> PAGEREF _Toc243385337 \h </w:instrText>
             </w:r>
             <w:r>
               <w:rPr>
@@ -2124,7 +2124,7 @@
               <w14:ligatures w14:val="standardContextual"/>
             </w:rPr>
           </w:pPr>
-          <w:hyperlink w:anchor="_Toc243378743" w:history="1">
+          <w:hyperlink w:anchor="_Toc243385338" w:history="1">
             <w:r>
               <w:rPr>
                 <w:rStyle w:val="Hyperlink"/>
@@ -2148,7 +2148,7 @@
               <w:rPr>
                 <w:noProof/>
               </w:rPr>
-              <w:instrText xml:space="preserve"> PAGEREF _Toc243378743 \h </w:instrText>
+              <w:instrText xml:space="preserve"> PAGEREF _Toc243385338 \h </w:instrText>
             </w:r>
             <w:r>
               <w:rPr>
@@ -2190,7 +2190,7 @@
               <w14:ligatures w14:val="standardContextual"/>
             </w:rPr>
           </w:pPr>
-          <w:hyperlink w:anchor="_Toc243378744" w:history="1">
+          <w:hyperlink w:anchor="_Toc243385339" w:history="1">
             <w:r>
               <w:rPr>
                 <w:rStyle w:val="Hyperlink"/>
@@ -2214,7 +2214,7 @@
               <w:rPr>
                 <w:noProof/>
               </w:rPr>
-              <w:instrText xml:space="preserve"> PAGEREF _Toc243378744 \h </w:instrText>
+              <w:instrText xml:space="preserve"> PAGEREF _Toc243385339 \h </w:instrText>
             </w:r>
             <w:r>
               <w:rPr>
@@ -2256,7 +2256,7 @@
               <w14:ligatures w14:val="standardContextual"/>
             </w:rPr>
           </w:pPr>
-          <w:hyperlink w:anchor="_Toc243378745" w:history="1">
+          <w:hyperlink w:anchor="_Toc243385340" w:history="1">
             <w:r>
               <w:rPr>
                 <w:rStyle w:val="Hyperlink"/>
@@ -2280,7 +2280,7 @@
               <w:rPr>
                 <w:noProof/>
               </w:rPr>
-              <w:instrText xml:space="preserve"> PAGEREF _Toc243378745 \h </w:instrText>
+              <w:instrText xml:space="preserve"> PAGEREF _Toc243385340 \h </w:instrText>
             </w:r>
             <w:r>
               <w:rPr>
@@ -2322,7 +2322,7 @@
               <w14:ligatures w14:val="standardContextual"/>
             </w:rPr>
           </w:pPr>
-          <w:hyperlink w:anchor="_Toc243378746" w:history="1">
+          <w:hyperlink w:anchor="_Toc243385341" w:history="1">
             <w:r>
               <w:rPr>
                 <w:rStyle w:val="Hyperlink"/>
@@ -2346,7 +2346,7 @@
               <w:rPr>
                 <w:noProof/>
               </w:rPr>
-              <w:instrText xml:space="preserve"> PAGEREF _Toc243378746 \h </w:instrText>
+              <w:instrText xml:space="preserve"> PAGEREF _Toc243385341 \h </w:instrText>
             </w:r>
             <w:r>
               <w:rPr>
@@ -2388,7 +2388,7 @@
               <w14:ligatures w14:val="standardContextual"/>
             </w:rPr>
           </w:pPr>
-          <w:hyperlink w:anchor="_Toc243378747" w:history="1">
+          <w:hyperlink w:anchor="_Toc243385342" w:history="1">
             <w:r>
               <w:rPr>
                 <w:rStyle w:val="Hyperlink"/>
@@ -2412,7 +2412,7 @@
               <w:rPr>
                 <w:noProof/>
               </w:rPr>
-              <w:instrText xml:space="preserve"> PAGEREF _Toc243378747 \h </w:instrText>
+              <w:instrText xml:space="preserve"> PAGEREF _Toc243385342 \h </w:instrText>
             </w:r>
             <w:r>
               <w:rPr>
@@ -2454,7 +2454,7 @@
               <w14:ligatures w14:val="standardContextual"/>
             </w:rPr>
           </w:pPr>
-          <w:hyperlink w:anchor="_Toc243378748" w:history="1">
+          <w:hyperlink w:anchor="_Toc243385343" w:history="1">
             <w:r>
               <w:rPr>
                 <w:rStyle w:val="Hyperlink"/>
@@ -2478,7 +2478,7 @@
               <w:rPr>
                 <w:noProof/>
               </w:rPr>
-              <w:instrText xml:space="preserve"> PAGEREF _Toc243378748 \h </w:instrText>
+              <w:instrText xml:space="preserve"> PAGEREF _Toc243385343 \h </w:instrText>
             </w:r>
             <w:r>
               <w:rPr>
@@ -2520,7 +2520,7 @@
               <w14:ligatures w14:val="standardContextual"/>
             </w:rPr>
           </w:pPr>
-          <w:hyperlink w:anchor="_Toc243378749" w:history="1">
+          <w:hyperlink w:anchor="_Toc243385344" w:history="1">
             <w:r>
               <w:rPr>
                 <w:rStyle w:val="Hyperlink"/>
@@ -2544,7 +2544,7 @@
               <w:rPr>
                 <w:noProof/>
               </w:rPr>
-              <w:instrText xml:space="preserve"> PAGEREF _Toc243378749 \h </w:instrText>
+              <w:instrText xml:space="preserve"> PAGEREF _Toc243385344 \h </w:instrText>
             </w:r>
             <w:r>
               <w:rPr>
@@ -2586,7 +2586,7 @@
               <w14:ligatures w14:val="standardContextual"/>
             </w:rPr>
           </w:pPr>
-          <w:hyperlink w:anchor="_Toc243378750" w:history="1">
+          <w:hyperlink w:anchor="_Toc243385345" w:history="1">
             <w:r>
               <w:rPr>
                 <w:rStyle w:val="Hyperlink"/>
@@ -2610,7 +2610,7 @@
               <w:rPr>
                 <w:noProof/>
               </w:rPr>
-              <w:instrText xml:space="preserve"> PAGEREF _Toc243378750 \h </w:instrText>
+              <w:instrText xml:space="preserve"> PAGEREF _Toc243385345 \h </w:instrText>
             </w:r>
             <w:r>
               <w:rPr>
@@ -2652,7 +2652,7 @@
               <w14:ligatures w14:val="standardContextual"/>
             </w:rPr>
           </w:pPr>
-          <w:hyperlink w:anchor="_Toc243378751" w:history="1">
+          <w:hyperlink w:anchor="_Toc243385346" w:history="1">
             <w:r>
               <w:rPr>
                 <w:rStyle w:val="Hyperlink"/>
@@ -2676,7 +2676,7 @@
               <w:rPr>
                 <w:noProof/>
               </w:rPr>
-              <w:instrText xml:space="preserve"> PAGEREF _Toc243378751 \h </w:instrText>
+              <w:instrText xml:space="preserve"> PAGEREF _Toc243385346 \h </w:instrText>
             </w:r>
             <w:r>
               <w:rPr>
@@ -2718,7 +2718,7 @@
               <w14:ligatures w14:val="standardContextual"/>
             </w:rPr>
           </w:pPr>
-          <w:hyperlink w:anchor="_Toc243378752" w:history="1">
+          <w:hyperlink w:anchor="_Toc243385347" w:history="1">
             <w:r>
               <w:rPr>
                 <w:rStyle w:val="Hyperlink"/>
@@ -2742,7 +2742,7 @@
               <w:rPr>
                 <w:noProof/>
               </w:rPr>
-              <w:instrText xml:space="preserve"> PAGEREF _Toc243378752 \h </w:instrText>
+              <w:instrText xml:space="preserve"> PAGEREF _Toc243385347 \h </w:instrText>
             </w:r>
             <w:r>
               <w:rPr>
@@ -2784,7 +2784,7 @@
               <w14:ligatures w14:val="standardContextual"/>
             </w:rPr>
           </w:pPr>
-          <w:hyperlink w:anchor="_Toc243378753" w:history="1">
+          <w:hyperlink w:anchor="_Toc243385348" w:history="1">
             <w:r>
               <w:rPr>
                 <w:rStyle w:val="Hyperlink"/>
@@ -2808,7 +2808,7 @@
               <w:rPr>
                 <w:noProof/>
               </w:rPr>
-              <w:instrText xml:space="preserve"> PAGEREF _Toc243378753 \h </w:instrText>
+              <w:instrText xml:space="preserve"> PAGEREF _Toc243385348 \h </w:instrText>
             </w:r>
             <w:r>
               <w:rPr>
@@ -2850,7 +2850,7 @@
               <w14:ligatures w14:val="standardContextual"/>
             </w:rPr>
           </w:pPr>
-          <w:hyperlink w:anchor="_Toc243378754" w:history="1">
+          <w:hyperlink w:anchor="_Toc243385349" w:history="1">
             <w:r>
               <w:rPr>
                 <w:rStyle w:val="Hyperlink"/>
@@ -2874,7 +2874,7 @@
               <w:rPr>
                 <w:noProof/>
               </w:rPr>
-              <w:instrText xml:space="preserve"> PAGEREF _Toc243378754 \h </w:instrText>
+              <w:instrText xml:space="preserve"> PAGEREF _Toc243385349 \h </w:instrText>
             </w:r>
             <w:r>
               <w:rPr>
@@ -2916,7 +2916,7 @@
               <w14:ligatures w14:val="standardContextual"/>
             </w:rPr>
           </w:pPr>
-          <w:hyperlink w:anchor="_Toc243378755" w:history="1">
+          <w:hyperlink w:anchor="_Toc243385350" w:history="1">
             <w:r>
               <w:rPr>
                 <w:rStyle w:val="Hyperlink"/>
@@ -2940,7 +2940,7 @@
               <w:rPr>
                 <w:noProof/>
               </w:rPr>
-              <w:instrText xml:space="preserve"> PAGEREF _Toc243378755 \h </w:instrText>
+              <w:instrText xml:space="preserve"> PAGEREF _Toc243385350 \h </w:instrText>
             </w:r>
             <w:r>
               <w:rPr>
@@ -2982,7 +2982,7 @@
               <w14:ligatures w14:val="standardContextual"/>
             </w:rPr>
           </w:pPr>
-          <w:hyperlink w:anchor="_Toc243378756" w:history="1">
+          <w:hyperlink w:anchor="_Toc243385351" w:history="1">
             <w:r>
               <w:rPr>
                 <w:rStyle w:val="Hyperlink"/>
@@ -3006,7 +3006,7 @@
               <w:rPr>
                 <w:noProof/>
               </w:rPr>
-              <w:instrText xml:space="preserve"> PAGEREF _Toc243378756 \h </w:instrText>
+              <w:instrText xml:space="preserve"> PAGEREF _Toc243385351 \h </w:instrText>
             </w:r>
             <w:r>
               <w:rPr>
@@ -3048,7 +3048,7 @@
               <w14:ligatures w14:val="standardContextual"/>
             </w:rPr>
           </w:pPr>
-          <w:hyperlink w:anchor="_Toc243378757" w:history="1">
+          <w:hyperlink w:anchor="_Toc243385352" w:history="1">
             <w:r>
               <w:rPr>
                 <w:rStyle w:val="Hyperlink"/>
@@ -3072,7 +3072,7 @@
               <w:rPr>
                 <w:noProof/>
               </w:rPr>
-              <w:instrText xml:space="preserve"> PAGEREF _Toc243378757 \h </w:instrText>
+              <w:instrText xml:space="preserve"> PAGEREF _Toc243385352 \h </w:instrText>
             </w:r>
             <w:r>
               <w:rPr>
@@ -3114,7 +3114,7 @@
               <w14:ligatures w14:val="standardContextual"/>
             </w:rPr>
           </w:pPr>
-          <w:hyperlink w:anchor="_Toc243378758" w:history="1">
+          <w:hyperlink w:anchor="_Toc243385353" w:history="1">
             <w:r>
               <w:rPr>
                 <w:rStyle w:val="Hyperlink"/>
@@ -3138,7 +3138,7 @@
               <w:rPr>
                 <w:noProof/>
               </w:rPr>
-              <w:instrText xml:space="preserve"> PAGEREF _Toc243378758 \h </w:instrText>
+              <w:instrText xml:space="preserve"> PAGEREF _Toc243385353 \h </w:instrText>
             </w:r>
             <w:r>
               <w:rPr>
@@ -3178,7 +3178,7 @@
         <w:pageBreakBefore/>
         <w:spacing w:before="360" w:after="160"/>
       </w:pPr>
-      <w:bookmarkStart w:id="0" w:name="_Toc243378713"/>
+      <w:bookmarkStart w:id="0" w:name="_Toc243385308"/>
       <w:r>
         <w:lastRenderedPageBreak/>
         <w:t xml:space="preserve">1. </w:t>
@@ -3205,7 +3205,7 @@
         <w:keepNext/>
         <w:spacing w:before="280" w:after="120"/>
       </w:pPr>
-      <w:bookmarkStart w:id="1" w:name="_Toc243378714"/>
+      <w:bookmarkStart w:id="1" w:name="_Toc243385309"/>
       <w:r>
         <w:t xml:space="preserve">1.1 </w:t>
       </w:r>
@@ -3734,7 +3734,7 @@
         <w:keepNext/>
         <w:spacing w:before="280" w:after="120"/>
       </w:pPr>
-      <w:bookmarkStart w:id="2" w:name="_Toc243378715"/>
+      <w:bookmarkStart w:id="2" w:name="_Toc243385310"/>
       <w:r>
         <w:t xml:space="preserve">1.2 </w:t>
       </w:r>
@@ -3864,7 +3864,7 @@
         <w:pageBreakBefore/>
         <w:spacing w:before="360" w:after="160"/>
       </w:pPr>
-      <w:bookmarkStart w:id="3" w:name="_Toc243378716"/>
+      <w:bookmarkStart w:id="3" w:name="_Toc243385311"/>
       <w:r>
         <w:lastRenderedPageBreak/>
         <w:t xml:space="preserve">2. </w:t>
@@ -5758,7 +5758,7 @@
         <w:pageBreakBefore/>
         <w:spacing w:before="360" w:after="160"/>
       </w:pPr>
-      <w:bookmarkStart w:id="4" w:name="_Toc243378717"/>
+      <w:bookmarkStart w:id="4" w:name="_Toc243385312"/>
       <w:r>
         <w:lastRenderedPageBreak/>
         <w:t xml:space="preserve">3. </w:t>
@@ -6468,7 +6468,7 @@
         <w:keepNext/>
         <w:spacing w:before="280" w:after="120"/>
       </w:pPr>
-      <w:bookmarkStart w:id="5" w:name="_Toc243378718"/>
+      <w:bookmarkStart w:id="5" w:name="_Toc243385313"/>
       <w:r>
         <w:t xml:space="preserve">3.1 Flow </w:t>
       </w:r>
@@ -6686,7 +6686,7 @@
         <w:pageBreakBefore/>
         <w:spacing w:before="360" w:after="160"/>
       </w:pPr>
-      <w:bookmarkStart w:id="6" w:name="_Toc243378719"/>
+      <w:bookmarkStart w:id="6" w:name="_Toc243385314"/>
       <w:r>
         <w:lastRenderedPageBreak/>
         <w:t xml:space="preserve">4. </w:t>
@@ -6740,7 +6740,7 @@
         <w:keepNext/>
         <w:spacing w:before="280" w:after="120"/>
       </w:pPr>
-      <w:bookmarkStart w:id="7" w:name="_Toc243378720"/>
+      <w:bookmarkStart w:id="7" w:name="_Toc243385315"/>
       <w:r>
         <w:t xml:space="preserve">4.1 RSS </w:t>
       </w:r>
@@ -7935,7 +7935,7 @@
         <w:keepNext/>
         <w:spacing w:before="280" w:after="120"/>
       </w:pPr>
-      <w:bookmarkStart w:id="8" w:name="_Toc243378721"/>
+      <w:bookmarkStart w:id="8" w:name="_Toc243385316"/>
       <w:r>
         <w:t xml:space="preserve">4.2 </w:t>
       </w:r>
@@ -8071,7 +8071,7 @@
         <w:keepNext/>
         <w:spacing w:before="280" w:after="120"/>
       </w:pPr>
-      <w:bookmarkStart w:id="9" w:name="_Toc243378722"/>
+      <w:bookmarkStart w:id="9" w:name="_Toc243385317"/>
       <w:r>
         <w:lastRenderedPageBreak/>
         <w:t xml:space="preserve">4.3 </w:t>
@@ -8707,7 +8707,7 @@
         <w:pageBreakBefore/>
         <w:spacing w:before="360" w:after="160"/>
       </w:pPr>
-      <w:bookmarkStart w:id="10" w:name="_Toc243378723"/>
+      <w:bookmarkStart w:id="10" w:name="_Toc243385318"/>
       <w:r>
         <w:lastRenderedPageBreak/>
         <w:t xml:space="preserve">5. </w:t>
@@ -8991,7 +8991,7 @@
         <w:pageBreakBefore/>
         <w:spacing w:before="360" w:after="160"/>
       </w:pPr>
-      <w:bookmarkStart w:id="11" w:name="_Toc243378724"/>
+      <w:bookmarkStart w:id="11" w:name="_Toc243385319"/>
       <w:r>
         <w:lastRenderedPageBreak/>
         <w:t xml:space="preserve">6. </w:t>
@@ -9075,7 +9075,7 @@
         <w:keepNext/>
         <w:spacing w:before="280" w:after="120"/>
       </w:pPr>
-      <w:bookmarkStart w:id="12" w:name="_Toc243378725"/>
+      <w:bookmarkStart w:id="12" w:name="_Toc243385320"/>
       <w:r>
         <w:t xml:space="preserve">6.1 </w:t>
       </w:r>
@@ -9200,7 +9200,7 @@
         <w:keepNext/>
         <w:spacing w:before="280" w:after="120"/>
       </w:pPr>
-      <w:bookmarkStart w:id="13" w:name="_Toc243378726"/>
+      <w:bookmarkStart w:id="13" w:name="_Toc243385321"/>
       <w:r>
         <w:t xml:space="preserve">6.2 </w:t>
       </w:r>
@@ -10033,7 +10033,7 @@
         <w:keepNext/>
         <w:spacing w:before="280" w:after="120"/>
       </w:pPr>
-      <w:bookmarkStart w:id="14" w:name="_Toc243378727"/>
+      <w:bookmarkStart w:id="14" w:name="_Toc243385322"/>
       <w:r>
         <w:t xml:space="preserve">6.3 Prompt </w:t>
       </w:r>
@@ -10695,7 +10695,7 @@
         <w:pageBreakBefore/>
         <w:spacing w:before="360" w:after="160"/>
       </w:pPr>
-      <w:bookmarkStart w:id="15" w:name="_Toc243378728"/>
+      <w:bookmarkStart w:id="15" w:name="_Toc243385323"/>
       <w:r>
         <w:lastRenderedPageBreak/>
         <w:t xml:space="preserve">7. </w:t>
@@ -11489,7 +11489,7 @@
         <w:keepNext/>
         <w:spacing w:before="280" w:after="120"/>
       </w:pPr>
-      <w:bookmarkStart w:id="16" w:name="_Toc243378729"/>
+      <w:bookmarkStart w:id="16" w:name="_Toc243385324"/>
       <w:r>
         <w:t xml:space="preserve">7.1 </w:t>
       </w:r>
@@ -11947,7 +11947,7 @@
         <w:keepNext/>
         <w:spacing w:before="280" w:after="120"/>
       </w:pPr>
-      <w:bookmarkStart w:id="17" w:name="_Toc243378730"/>
+      <w:bookmarkStart w:id="17" w:name="_Toc243385325"/>
       <w:r>
         <w:t xml:space="preserve">7.2 </w:t>
       </w:r>
@@ -12071,7 +12071,7 @@
         <w:pageBreakBefore/>
         <w:spacing w:before="360" w:after="160"/>
       </w:pPr>
-      <w:bookmarkStart w:id="18" w:name="_Toc243378731"/>
+      <w:bookmarkStart w:id="18" w:name="_Toc243385326"/>
       <w:r>
         <w:lastRenderedPageBreak/>
         <w:t xml:space="preserve">8. </w:t>
@@ -12134,7 +12134,7 @@
         <w:keepNext/>
         <w:spacing w:before="280" w:after="120"/>
       </w:pPr>
-      <w:bookmarkStart w:id="19" w:name="_Toc243378732"/>
+      <w:bookmarkStart w:id="19" w:name="_Toc243385327"/>
       <w:r>
         <w:t xml:space="preserve">8.1 </w:t>
       </w:r>
@@ -13038,7 +13038,7 @@
         <w:keepNext/>
         <w:spacing w:before="280" w:after="120"/>
       </w:pPr>
-      <w:bookmarkStart w:id="20" w:name="_Toc243378733"/>
+      <w:bookmarkStart w:id="20" w:name="_Toc243385328"/>
       <w:r>
         <w:t xml:space="preserve">8.2 </w:t>
       </w:r>
@@ -13481,7 +13481,7 @@
         <w:keepNext/>
         <w:spacing w:before="280" w:after="120"/>
       </w:pPr>
-      <w:bookmarkStart w:id="21" w:name="_Toc243378734"/>
+      <w:bookmarkStart w:id="21" w:name="_Toc243385329"/>
       <w:r>
         <w:t xml:space="preserve">8.3 </w:t>
       </w:r>
@@ -13658,7 +13658,7 @@
         <w:keepNext/>
         <w:spacing w:before="280" w:after="120"/>
       </w:pPr>
-      <w:bookmarkStart w:id="22" w:name="_Toc243378735"/>
+      <w:bookmarkStart w:id="22" w:name="_Toc243385330"/>
       <w:r>
         <w:t xml:space="preserve">8.4 </w:t>
       </w:r>
@@ -13758,7 +13758,7 @@
         <w:pageBreakBefore/>
         <w:spacing w:before="360" w:after="160"/>
       </w:pPr>
-      <w:bookmarkStart w:id="23" w:name="_Toc243378736"/>
+      <w:bookmarkStart w:id="23" w:name="_Toc243385331"/>
       <w:r>
         <w:lastRenderedPageBreak/>
         <w:t xml:space="preserve">9. </w:t>
@@ -13833,7 +13833,7 @@
         <w:keepNext/>
         <w:spacing w:before="280" w:after="120"/>
       </w:pPr>
-      <w:bookmarkStart w:id="24" w:name="_Toc243378737"/>
+      <w:bookmarkStart w:id="24" w:name="_Toc243385332"/>
       <w:r>
         <w:t xml:space="preserve">9.1 </w:t>
       </w:r>
@@ -15015,7 +15015,7 @@
         <w:keepNext/>
         <w:spacing w:before="280" w:after="120"/>
       </w:pPr>
-      <w:bookmarkStart w:id="25" w:name="_Toc243378738"/>
+      <w:bookmarkStart w:id="25" w:name="_Toc243385333"/>
       <w:r>
         <w:t xml:space="preserve">9.2 </w:t>
       </w:r>
@@ -15175,7 +15175,7 @@
         <w:keepNext/>
         <w:spacing w:before="280" w:after="120"/>
       </w:pPr>
-      <w:bookmarkStart w:id="26" w:name="_Toc243378739"/>
+      <w:bookmarkStart w:id="26" w:name="_Toc243385334"/>
       <w:r>
         <w:t xml:space="preserve">9.3 </w:t>
       </w:r>
@@ -15243,7 +15243,7 @@
         <w:pageBreakBefore/>
         <w:spacing w:before="360" w:after="160"/>
       </w:pPr>
-      <w:bookmarkStart w:id="27" w:name="_Toc243378740"/>
+      <w:bookmarkStart w:id="27" w:name="_Toc243385335"/>
       <w:r>
         <w:lastRenderedPageBreak/>
         <w:t xml:space="preserve">10. </w:t>
@@ -15259,7 +15259,7 @@
         <w:keepNext/>
         <w:spacing w:before="280" w:after="120"/>
       </w:pPr>
-      <w:bookmarkStart w:id="28" w:name="_Toc243378741"/>
+      <w:bookmarkStart w:id="28" w:name="_Toc243385336"/>
       <w:r>
         <w:t xml:space="preserve">10.1 </w:t>
       </w:r>
@@ -15297,7 +15297,7 @@
         <w:keepNext/>
         <w:spacing w:before="280" w:after="120"/>
       </w:pPr>
-      <w:bookmarkStart w:id="29" w:name="_Toc243378742"/>
+      <w:bookmarkStart w:id="29" w:name="_Toc243385337"/>
       <w:r>
         <w:t xml:space="preserve">10.2 </w:t>
       </w:r>
@@ -15359,7 +15359,7 @@
         <w:pageBreakBefore/>
         <w:spacing w:before="360" w:after="160"/>
       </w:pPr>
-      <w:bookmarkStart w:id="30" w:name="_Toc243378743"/>
+      <w:bookmarkStart w:id="30" w:name="_Toc243385338"/>
       <w:r>
         <w:lastRenderedPageBreak/>
         <w:t xml:space="preserve">11. </w:t>
@@ -15375,7 +15375,7 @@
         <w:keepNext/>
         <w:spacing w:before="280" w:after="120"/>
       </w:pPr>
-      <w:bookmarkStart w:id="31" w:name="_Toc243378744"/>
+      <w:bookmarkStart w:id="31" w:name="_Toc243385339"/>
       <w:r>
         <w:t xml:space="preserve">11.0 </w:t>
       </w:r>
@@ -15546,7 +15546,7 @@
         <w:keepNext/>
         <w:spacing w:before="280" w:after="120"/>
       </w:pPr>
-      <w:bookmarkStart w:id="32" w:name="_Toc243378745"/>
+      <w:bookmarkStart w:id="32" w:name="_Toc243385340"/>
       <w:r>
         <w:t xml:space="preserve">11.1 </w:t>
       </w:r>
@@ -16553,7 +16553,7 @@
         <w:keepNext/>
         <w:spacing w:before="280" w:after="120"/>
       </w:pPr>
-      <w:bookmarkStart w:id="33" w:name="_Toc243378746"/>
+      <w:bookmarkStart w:id="33" w:name="_Toc243385341"/>
       <w:r>
         <w:t xml:space="preserve">11.2 </w:t>
       </w:r>
@@ -17846,7 +17846,7 @@
         <w:keepNext/>
         <w:spacing w:before="280" w:after="120"/>
       </w:pPr>
-      <w:bookmarkStart w:id="34" w:name="_Toc243378747"/>
+      <w:bookmarkStart w:id="34" w:name="_Toc243385342"/>
       <w:r>
         <w:t xml:space="preserve">11.3 </w:t>
       </w:r>
@@ -18571,7 +18571,7 @@
         <w:pageBreakBefore/>
         <w:spacing w:before="360" w:after="160"/>
       </w:pPr>
-      <w:bookmarkStart w:id="35" w:name="_Toc243378748"/>
+      <w:bookmarkStart w:id="35" w:name="_Toc243385343"/>
       <w:r>
         <w:lastRenderedPageBreak/>
         <w:t xml:space="preserve">12. </w:t>
@@ -18587,7 +18587,7 @@
         <w:keepNext/>
         <w:spacing w:before="280" w:after="120"/>
       </w:pPr>
-      <w:bookmarkStart w:id="36" w:name="_Toc243378749"/>
+      <w:bookmarkStart w:id="36" w:name="_Toc243385344"/>
       <w:r>
         <w:t>12.1 GitHub Workflows (.github/workflows/)</w:t>
       </w:r>
@@ -19569,7 +19569,7 @@
         <w:keepNext/>
         <w:spacing w:before="280" w:after="120"/>
       </w:pPr>
-      <w:bookmarkStart w:id="37" w:name="_Toc243378750"/>
+      <w:bookmarkStart w:id="37" w:name="_Toc243385345"/>
       <w:r>
         <w:t xml:space="preserve">12.2 </w:t>
       </w:r>
@@ -21073,7 +21073,7 @@
         <w:pageBreakBefore/>
         <w:spacing w:before="360" w:after="160"/>
       </w:pPr>
-      <w:bookmarkStart w:id="38" w:name="_Toc243378751"/>
+      <w:bookmarkStart w:id="38" w:name="_Toc243385346"/>
       <w:r>
         <w:lastRenderedPageBreak/>
         <w:t xml:space="preserve">13. </w:t>
@@ -22246,7 +22246,7 @@
                 <w:sz w:val="18"/>
                 <w:szCs w:val="18"/>
               </w:rPr>
-              <w:t>นี้เท่านั้น, Actions read/write</w:t>
+              <w:t>นี้เท่านั้น, Actions read/write · ไม่หมดอายุ (No expiration, regenerate 20 ต.ค. 2569 ทดสอบแล้ว status 204)</w:t>
             </w:r>
           </w:p>
         </w:tc>
@@ -22258,7 +22258,7 @@
         <w:pageBreakBefore/>
         <w:spacing w:before="360" w:after="160"/>
       </w:pPr>
-      <w:bookmarkStart w:id="39" w:name="_Toc243378752"/>
+      <w:bookmarkStart w:id="39" w:name="_Toc243385347"/>
       <w:r>
         <w:lastRenderedPageBreak/>
         <w:t xml:space="preserve">14. </w:t>
@@ -22274,7 +22274,7 @@
         <w:keepNext/>
         <w:spacing w:before="280" w:after="120"/>
       </w:pPr>
-      <w:bookmarkStart w:id="40" w:name="_Toc243378753"/>
+      <w:bookmarkStart w:id="40" w:name="_Toc243385348"/>
       <w:r>
         <w:t xml:space="preserve">14.1 </w:t>
       </w:r>
@@ -23006,7 +23006,7 @@
                 <w:sz w:val="18"/>
                 <w:szCs w:val="18"/>
               </w:rPr>
-              <w:t>ต่ออายุ GitHub token</w:t>
+              <w:t>เปลี่ยน GitHub token (ถูกยกเลิก รั่ว หรือ regenerate)</w:t>
             </w:r>
           </w:p>
         </w:tc>
@@ -23035,7 +23035,14 @@
                 <w:sz w:val="18"/>
                 <w:szCs w:val="18"/>
               </w:rPr>
-              <w:t>สร้าง token ใหม่ แล้วใน Supabase SQL Editor: select vault.update_secret((select id from vault.secrets where name='github_actions_token'), '&lt;token&gt;');</w:t>
+              <w:t xml:space="preserve">token </w:t>
+            </w:r>
+            <w:r>
+              <w:rPr>
+                <w:sz w:val="18"/>
+                <w:szCs w:val="18"/>
+              </w:rPr>
+              <w:t>ตั้งเป็นไม่หมดอายุแล้ว ไม่ต้องต่ออายุ ถ้าต้องเปลี่ยน: GitHub → Settings → Developer settings → Fine-grained tokens → Regenerate token (Expiration: No expiration) แล้วใน Supabase SQL Editor: select vault.update_secret((select id from vault.secrets where name='github_actions_token'), '&lt;token&gt;'); · ทดสอบ: select public.trigger_workflow('digest.yml', '{"args": ""}'::jsonb); แล้วดู status_code ใน net._http_response (204 = ใช้ได้, ไม่ส่งอีเมลจริง)</w:t>
             </w:r>
           </w:p>
         </w:tc>
@@ -23047,7 +23054,7 @@
         <w:keepNext/>
         <w:spacing w:before="280" w:after="120"/>
       </w:pPr>
-      <w:bookmarkStart w:id="41" w:name="_Toc243378754"/>
+      <w:bookmarkStart w:id="41" w:name="_Toc243385349"/>
       <w:r>
         <w:t xml:space="preserve">14.2 </w:t>
       </w:r>
@@ -23289,7 +23296,7 @@
                 <w:sz w:val="18"/>
                 <w:szCs w:val="18"/>
               </w:rPr>
-              <w:t>หมดอายุ (status 401)</w:t>
+              <w:t>ถูกยกเลิก/regenerate โดยไม่ได้อัปเดต Vault (status 401) หรือ token ไม่มีสิทธิ์ Actions (403/404)</w:t>
             </w:r>
           </w:p>
         </w:tc>
@@ -23811,7 +23818,7 @@
         <w:keepNext/>
         <w:spacing w:before="280" w:after="120"/>
       </w:pPr>
-      <w:bookmarkStart w:id="42" w:name="_Toc243378755"/>
+      <w:bookmarkStart w:id="42" w:name="_Toc243385350"/>
       <w:r>
         <w:t xml:space="preserve">14.3 </w:t>
       </w:r>
@@ -23885,6 +23892,7 @@
         <w:spacing w:after="60" w:line="290" w:lineRule="auto"/>
       </w:pPr>
       <w:r>
+        <w:lastRenderedPageBreak/>
         <w:t>ระบุจังหวัดไม่ได้ราว 1 ใน 3 (เอกสารไม่เขียนชื่อจังหวัด หรือเขียนย่อแบบ "จว.ศ.ก.") ประกาศเหล่านี้ยังอยู่ในอีเมลเพื่อไม่ให้งานส่วนกลางหลุด</w:t>
       </w:r>
     </w:p>
@@ -23911,7 +23919,6 @@
         <w:spacing w:after="60" w:line="290" w:lineRule="auto"/>
       </w:pPr>
       <w:r>
-        <w:lastRenderedPageBreak/>
         <w:t>ความแม่นยำการคัดกรองขึ้นกับกฎคำและ Gemini ถ้าพบรายการผิด ให้เพิ่มคำในกฎหรือปรับ prompt</w:t>
       </w:r>
     </w:p>
@@ -23921,7 +23928,7 @@
         <w:pageBreakBefore/>
         <w:spacing w:before="360" w:after="160"/>
       </w:pPr>
-      <w:bookmarkStart w:id="43" w:name="_Toc243378756"/>
+      <w:bookmarkStart w:id="43" w:name="_Toc243385351"/>
       <w:r>
         <w:lastRenderedPageBreak/>
         <w:t>ภาคผนวก</w:t>
@@ -23934,7 +23941,7 @@
         <w:keepNext/>
         <w:spacing w:before="280" w:after="120"/>
       </w:pPr>
-      <w:bookmarkStart w:id="44" w:name="_Toc243378757"/>
+      <w:bookmarkStart w:id="44" w:name="_Toc243385352"/>
       <w:r>
         <w:t>ก. รหัสวิธีจัดหา (methodId)</w:t>
       </w:r>
@@ -24840,7 +24847,7 @@
         <w:keepNext/>
         <w:spacing w:before="280" w:after="120"/>
       </w:pPr>
-      <w:bookmarkStart w:id="45" w:name="_Toc243378758"/>
+      <w:bookmarkStart w:id="45" w:name="_Toc243385353"/>
       <w:r>
         <w:t>ข. ผลสำคัญจาก Phase 0</w:t>
       </w:r>
@@ -25017,10 +25024,64 @@
 <file path=word/numbering.xml><?xml version="1.0" encoding="utf-8"?>
 <w:numbering xmlns:wpc="http://schemas.microsoft.com/office/word/2010/wordprocessingCanvas" xmlns:cx="http://schemas.microsoft.com/office/drawing/2014/chartex" xmlns:cx1="http://schemas.microsoft.com/office/drawing/2015/9/8/chartex" xmlns:cx2="http://schemas.microsoft.com/office/drawing/2015/10/21/chartex" xmlns:cx3="http://schemas.microsoft.com/office/drawing/2016/5/9/chartex" xmlns:cx4="http://schemas.microsoft.com/office/drawing/2016/5/10/chartex" xmlns:cx5="http://schemas.microsoft.com/office/drawing/2016/5/11/chartex" xmlns:cx6="http://schemas.microsoft.com/office/drawing/2016/5/12/chartex" xmlns:cx7="http://schemas.microsoft.com/office/drawing/2016/5/13/chartex" xmlns:cx8="http://schemas.microsoft.com/office/drawing/2016/5/14/chartex" xmlns:mc="http://schemas.openxmlformats.org/markup-compatibility/2006" xmlns:aink="http://schemas.microsoft.com/office/drawing/2016/ink" xmlns:am3d="http://schemas.microsoft.com/office/drawing/2017/model3d" xmlns:o="urn:schemas-microsoft-com:office:office" xmlns:oel="http://schemas.microsoft.com/office/2019/extlst" xmlns:r="http://schemas.openxmlformats.org/officeDocument/2006/relationships" xmlns:m="http://schemas.openxmlformats.org/officeDocument/2006/math" xmlns:v="urn:schemas-microsoft-com:vml" xmlns:wp14="http://schemas.microsoft.com/office/word/2010/wordprocessingDrawing" xmlns:wp="http://schemas.openxmlformats.org/drawingml/2006/wordprocessingDrawing" xmlns:w10="urn:schemas-microsoft-com:office:word" xmlns:w="http://schemas.openxmlformats.org/wordprocessingml/2006/main" xmlns:w14="http://schemas.microsoft.com/office/word/2010/wordml" xmlns:w15="http://schemas.microsoft.com/office/word/2012/wordml" xmlns:w16cex="http://schemas.microsoft.com/office/word/2018/wordml/cex" xmlns:w16cid="http://schemas.microsoft.com/office/word/2016/wordml/cid" xmlns:w16="http://schemas.microsoft.com/office/word/2018/wordml" xmlns:w16du="http://schemas.microsoft.com/office/word/2023/wordml/word16du" xmlns:w16sdtdh="http://schemas.microsoft.com/office/word/2020/wordml/sdtdatahash" xmlns:w16sdtfl="http://schemas.microsoft.com/office/word/2024/wordml/sdtformatlock" xmlns:w16se="http://schemas.microsoft.com/office/word/2015/wordml/symex" xmlns:wpg="http://schemas.microsoft.com/office/word/2010/wordprocessingGroup" xmlns:wpi="http://schemas.microsoft.com/office/word/2010/wordprocessingInk" xmlns:wne="http://schemas.microsoft.com/office/word/2006/wordml" xmlns:wps="http://schemas.microsoft.com/office/word/2010/wordprocessingShape" mc:Ignorable="w14 w15 w16se w16cid w16 w16cex w16sdtdh w16sdtfl w16du wp14">
   <w:abstractNum w:abstractNumId="0" w15:restartNumberingAfterBreak="0">
-    <w:nsid w:val="2E4F36B5"/>
+    <w:nsid w:val="31E42248"/>
     <w:multiLevelType w:val="hybridMultilevel"/>
-    <w:tmpl w:val="2F4A7186"/>
-    <w:lvl w:ilvl="0" w:tplc="8B3E4A18">
+    <w:tmpl w:val="DBAE31B4"/>
+    <w:lvl w:ilvl="0" w:tplc="264A5B00">
+      <w:start w:val="1"/>
+      <w:numFmt w:val="decimal"/>
+      <w:lvlText w:val="%1."/>
+      <w:lvlJc w:val="left"/>
+      <w:pPr>
+        <w:ind w:left="540" w:hanging="360"/>
+      </w:pPr>
+    </w:lvl>
+    <w:lvl w:ilvl="1" w:tplc="72F6C28C">
+      <w:numFmt w:val="decimal"/>
+      <w:lvlText w:val=""/>
+      <w:lvlJc w:val="left"/>
+    </w:lvl>
+    <w:lvl w:ilvl="2" w:tplc="2EA24810">
+      <w:numFmt w:val="decimal"/>
+      <w:lvlText w:val=""/>
+      <w:lvlJc w:val="left"/>
+    </w:lvl>
+    <w:lvl w:ilvl="3" w:tplc="20F6DA3C">
+      <w:numFmt w:val="decimal"/>
+      <w:lvlText w:val=""/>
+      <w:lvlJc w:val="left"/>
+    </w:lvl>
+    <w:lvl w:ilvl="4" w:tplc="A9E8B166">
+      <w:numFmt w:val="decimal"/>
+      <w:lvlText w:val=""/>
+      <w:lvlJc w:val="left"/>
+    </w:lvl>
+    <w:lvl w:ilvl="5" w:tplc="3D9CEADE">
+      <w:numFmt w:val="decimal"/>
+      <w:lvlText w:val=""/>
+      <w:lvlJc w:val="left"/>
+    </w:lvl>
+    <w:lvl w:ilvl="6" w:tplc="E56AB666">
+      <w:numFmt w:val="decimal"/>
+      <w:lvlText w:val=""/>
+      <w:lvlJc w:val="left"/>
+    </w:lvl>
+    <w:lvl w:ilvl="7" w:tplc="07209F7C">
+      <w:numFmt w:val="decimal"/>
+      <w:lvlText w:val=""/>
+      <w:lvlJc w:val="left"/>
+    </w:lvl>
+    <w:lvl w:ilvl="8" w:tplc="CAC6CAFC">
+      <w:numFmt w:val="decimal"/>
+      <w:lvlText w:val=""/>
+      <w:lvlJc w:val="left"/>
+    </w:lvl>
+  </w:abstractNum>
+  <w:abstractNum w:abstractNumId="1" w15:restartNumberingAfterBreak="0">
+    <w:nsid w:val="45660C5F"/>
+    <w:multiLevelType w:val="hybridMultilevel"/>
+    <w:tmpl w:val="6CEE500A"/>
+    <w:lvl w:ilvl="0" w:tplc="0FA80F0A">
       <w:start w:val="1"/>
       <w:numFmt w:val="bullet"/>
       <w:lvlText w:val="●"/>
@@ -25029,7 +25090,7 @@
         <w:ind w:left="720" w:hanging="360"/>
       </w:pPr>
     </w:lvl>
-    <w:lvl w:ilvl="1" w:tplc="C854C2FC">
+    <w:lvl w:ilvl="1" w:tplc="4C68A422">
       <w:start w:val="1"/>
       <w:numFmt w:val="bullet"/>
       <w:lvlText w:val="○"/>
@@ -25038,7 +25099,7 @@
         <w:ind w:left="1440" w:hanging="360"/>
       </w:pPr>
     </w:lvl>
-    <w:lvl w:ilvl="2" w:tplc="ECDA0134">
+    <w:lvl w:ilvl="2" w:tplc="5E2E8062">
       <w:start w:val="1"/>
       <w:numFmt w:val="bullet"/>
       <w:lvlText w:val="■"/>
@@ -25047,7 +25108,7 @@
         <w:ind w:left="2160" w:hanging="360"/>
       </w:pPr>
     </w:lvl>
-    <w:lvl w:ilvl="3" w:tplc="7304CF1E">
+    <w:lvl w:ilvl="3" w:tplc="93580976">
       <w:start w:val="1"/>
       <w:numFmt w:val="bullet"/>
       <w:lvlText w:val="●"/>
@@ -25056,7 +25117,7 @@
         <w:ind w:left="2880" w:hanging="360"/>
       </w:pPr>
     </w:lvl>
-    <w:lvl w:ilvl="4" w:tplc="43101B6C">
+    <w:lvl w:ilvl="4" w:tplc="62B6511A">
       <w:start w:val="1"/>
       <w:numFmt w:val="bullet"/>
       <w:lvlText w:val="○"/>
@@ -25065,7 +25126,7 @@
         <w:ind w:left="3600" w:hanging="360"/>
       </w:pPr>
     </w:lvl>
-    <w:lvl w:ilvl="5" w:tplc="644C13EE">
+    <w:lvl w:ilvl="5" w:tplc="CC601F40">
       <w:start w:val="1"/>
       <w:numFmt w:val="bullet"/>
       <w:lvlText w:val="■"/>
@@ -25074,7 +25135,7 @@
         <w:ind w:left="4320" w:hanging="360"/>
       </w:pPr>
     </w:lvl>
-    <w:lvl w:ilvl="6" w:tplc="008C6B68">
+    <w:lvl w:ilvl="6" w:tplc="2D90790E">
       <w:start w:val="1"/>
       <w:numFmt w:val="bullet"/>
       <w:lvlText w:val="●"/>
@@ -25083,7 +25144,7 @@
         <w:ind w:left="5040" w:hanging="360"/>
       </w:pPr>
     </w:lvl>
-    <w:lvl w:ilvl="7" w:tplc="D2407B90">
+    <w:lvl w:ilvl="7" w:tplc="9F76E72C">
       <w:start w:val="1"/>
       <w:numFmt w:val="bullet"/>
       <w:lvlText w:val="●"/>
@@ -25092,7 +25153,7 @@
         <w:ind w:left="5760" w:hanging="360"/>
       </w:pPr>
     </w:lvl>
-    <w:lvl w:ilvl="8" w:tplc="9FB8D1B0">
+    <w:lvl w:ilvl="8" w:tplc="105E53A8">
       <w:start w:val="1"/>
       <w:numFmt w:val="bullet"/>
       <w:lvlText w:val="●"/>
@@ -25102,11 +25163,11 @@
       </w:pPr>
     </w:lvl>
   </w:abstractNum>
-  <w:abstractNum w:abstractNumId="1" w15:restartNumberingAfterBreak="0">
-    <w:nsid w:val="2EF0578B"/>
+  <w:abstractNum w:abstractNumId="2" w15:restartNumberingAfterBreak="0">
+    <w:nsid w:val="6BE91113"/>
     <w:multiLevelType w:val="hybridMultilevel"/>
-    <w:tmpl w:val="8140F58A"/>
-    <w:lvl w:ilvl="0" w:tplc="3AF2C228">
+    <w:tmpl w:val="5CD4A846"/>
+    <w:lvl w:ilvl="0" w:tplc="246A7F44">
       <w:start w:val="1"/>
       <w:numFmt w:val="decimal"/>
       <w:lvlText w:val="%1."/>
@@ -25115,52 +25176,106 @@
         <w:ind w:left="540" w:hanging="360"/>
       </w:pPr>
     </w:lvl>
-    <w:lvl w:ilvl="1" w:tplc="05025588">
+    <w:lvl w:ilvl="1" w:tplc="D7C40CA4">
       <w:numFmt w:val="decimal"/>
       <w:lvlText w:val=""/>
       <w:lvlJc w:val="left"/>
     </w:lvl>
-    <w:lvl w:ilvl="2" w:tplc="CC86E9A4">
+    <w:lvl w:ilvl="2" w:tplc="3EE07E08">
       <w:numFmt w:val="decimal"/>
       <w:lvlText w:val=""/>
       <w:lvlJc w:val="left"/>
     </w:lvl>
-    <w:lvl w:ilvl="3" w:tplc="D0E46C34">
+    <w:lvl w:ilvl="3" w:tplc="89F62F3A">
       <w:numFmt w:val="decimal"/>
       <w:lvlText w:val=""/>
       <w:lvlJc w:val="left"/>
     </w:lvl>
-    <w:lvl w:ilvl="4" w:tplc="91981BD4">
+    <w:lvl w:ilvl="4" w:tplc="16D89F36">
       <w:numFmt w:val="decimal"/>
       <w:lvlText w:val=""/>
       <w:lvlJc w:val="left"/>
     </w:lvl>
-    <w:lvl w:ilvl="5" w:tplc="D42C3D8A">
+    <w:lvl w:ilvl="5" w:tplc="7E167770">
       <w:numFmt w:val="decimal"/>
       <w:lvlText w:val=""/>
       <w:lvlJc w:val="left"/>
     </w:lvl>
-    <w:lvl w:ilvl="6" w:tplc="30E2952E">
+    <w:lvl w:ilvl="6" w:tplc="6700E924">
       <w:numFmt w:val="decimal"/>
       <w:lvlText w:val=""/>
       <w:lvlJc w:val="left"/>
     </w:lvl>
-    <w:lvl w:ilvl="7" w:tplc="800834FC">
+    <w:lvl w:ilvl="7" w:tplc="BF522DAE">
       <w:numFmt w:val="decimal"/>
       <w:lvlText w:val=""/>
       <w:lvlJc w:val="left"/>
     </w:lvl>
-    <w:lvl w:ilvl="8" w:tplc="0E90038E">
+    <w:lvl w:ilvl="8" w:tplc="E2348BF2">
       <w:numFmt w:val="decimal"/>
       <w:lvlText w:val=""/>
       <w:lvlJc w:val="left"/>
     </w:lvl>
   </w:abstractNum>
-  <w:abstractNum w:abstractNumId="2" w15:restartNumberingAfterBreak="0">
-    <w:nsid w:val="46811046"/>
+  <w:abstractNum w:abstractNumId="3" w15:restartNumberingAfterBreak="0">
+    <w:nsid w:val="6EB15590"/>
     <w:multiLevelType w:val="hybridMultilevel"/>
-    <w:tmpl w:val="0C046EE4"/>
-    <w:lvl w:ilvl="0" w:tplc="81146D5A">
+    <w:tmpl w:val="88267CCC"/>
+    <w:lvl w:ilvl="0" w:tplc="177E7EC8">
+      <w:start w:val="1"/>
+      <w:numFmt w:val="decimal"/>
+      <w:lvlText w:val="%1."/>
+      <w:lvlJc w:val="left"/>
+      <w:pPr>
+        <w:ind w:left="540" w:hanging="360"/>
+      </w:pPr>
+    </w:lvl>
+    <w:lvl w:ilvl="1" w:tplc="33EA265A">
+      <w:numFmt w:val="decimal"/>
+      <w:lvlText w:val=""/>
+      <w:lvlJc w:val="left"/>
+    </w:lvl>
+    <w:lvl w:ilvl="2" w:tplc="8EBA0FF8">
+      <w:numFmt w:val="decimal"/>
+      <w:lvlText w:val=""/>
+      <w:lvlJc w:val="left"/>
+    </w:lvl>
+    <w:lvl w:ilvl="3" w:tplc="DF3C7B1A">
+      <w:numFmt w:val="decimal"/>
+      <w:lvlText w:val=""/>
+      <w:lvlJc w:val="left"/>
+    </w:lvl>
+    <w:lvl w:ilvl="4" w:tplc="2FCADCDE">
+      <w:numFmt w:val="decimal"/>
+      <w:lvlText w:val=""/>
+      <w:lvlJc w:val="left"/>
+    </w:lvl>
+    <w:lvl w:ilvl="5" w:tplc="C0FCF6C8">
+      <w:numFmt w:val="decimal"/>
+      <w:lvlText w:val=""/>
+      <w:lvlJc w:val="left"/>
+    </w:lvl>
+    <w:lvl w:ilvl="6" w:tplc="EC088936">
+      <w:numFmt w:val="decimal"/>
+      <w:lvlText w:val=""/>
+      <w:lvlJc w:val="left"/>
+    </w:lvl>
+    <w:lvl w:ilvl="7" w:tplc="705E66EC">
+      <w:numFmt w:val="decimal"/>
+      <w:lvlText w:val=""/>
+      <w:lvlJc w:val="left"/>
+    </w:lvl>
+    <w:lvl w:ilvl="8" w:tplc="D818A8CC">
+      <w:numFmt w:val="decimal"/>
+      <w:lvlText w:val=""/>
+      <w:lvlJc w:val="left"/>
+    </w:lvl>
+  </w:abstractNum>
+  <w:abstractNum w:abstractNumId="4" w15:restartNumberingAfterBreak="0">
+    <w:nsid w:val="7D113BDB"/>
+    <w:multiLevelType w:val="hybridMultilevel"/>
+    <w:tmpl w:val="F6DCF888"/>
+    <w:lvl w:ilvl="0" w:tplc="0CA4629E">
       <w:start w:val="1"/>
       <w:numFmt w:val="bullet"/>
       <w:lvlText w:val="•"/>
@@ -25169,7 +25284,7 @@
         <w:ind w:left="540" w:hanging="270"/>
       </w:pPr>
     </w:lvl>
-    <w:lvl w:ilvl="1" w:tplc="8ACE7A5E">
+    <w:lvl w:ilvl="1" w:tplc="D5E2B742">
       <w:start w:val="1"/>
       <w:numFmt w:val="bullet"/>
       <w:lvlText w:val="–"/>
@@ -25178,47 +25293,47 @@
         <w:ind w:left="900" w:hanging="270"/>
       </w:pPr>
     </w:lvl>
-    <w:lvl w:ilvl="2" w:tplc="D3761052">
+    <w:lvl w:ilvl="2" w:tplc="0D48D58A">
       <w:numFmt w:val="decimal"/>
       <w:lvlText w:val=""/>
       <w:lvlJc w:val="left"/>
     </w:lvl>
-    <w:lvl w:ilvl="3" w:tplc="6D26CD14">
+    <w:lvl w:ilvl="3" w:tplc="96C0F0D4">
       <w:numFmt w:val="decimal"/>
       <w:lvlText w:val=""/>
       <w:lvlJc w:val="left"/>
     </w:lvl>
-    <w:lvl w:ilvl="4" w:tplc="11DA4B54">
+    <w:lvl w:ilvl="4" w:tplc="BCFCC422">
       <w:numFmt w:val="decimal"/>
       <w:lvlText w:val=""/>
       <w:lvlJc w:val="left"/>
     </w:lvl>
-    <w:lvl w:ilvl="5" w:tplc="2B7E0712">
+    <w:lvl w:ilvl="5" w:tplc="C2781016">
       <w:numFmt w:val="decimal"/>
       <w:lvlText w:val=""/>
       <w:lvlJc w:val="left"/>
     </w:lvl>
-    <w:lvl w:ilvl="6" w:tplc="99D61932">
+    <w:lvl w:ilvl="6" w:tplc="5F6E838A">
       <w:numFmt w:val="decimal"/>
       <w:lvlText w:val=""/>
       <w:lvlJc w:val="left"/>
     </w:lvl>
-    <w:lvl w:ilvl="7" w:tplc="E530224E">
+    <w:lvl w:ilvl="7" w:tplc="C3FE5ED2">
       <w:numFmt w:val="decimal"/>
       <w:lvlText w:val=""/>
       <w:lvlJc w:val="left"/>
     </w:lvl>
-    <w:lvl w:ilvl="8" w:tplc="917A9BAE">
+    <w:lvl w:ilvl="8" w:tplc="2692001A">
       <w:numFmt w:val="decimal"/>
       <w:lvlText w:val=""/>
       <w:lvlJc w:val="left"/>
     </w:lvl>
   </w:abstractNum>
-  <w:abstractNum w:abstractNumId="3" w15:restartNumberingAfterBreak="0">
-    <w:nsid w:val="615D7C8B"/>
+  <w:abstractNum w:abstractNumId="5" w15:restartNumberingAfterBreak="0">
+    <w:nsid w:val="7E45650F"/>
     <w:multiLevelType w:val="hybridMultilevel"/>
-    <w:tmpl w:val="708ACFC4"/>
-    <w:lvl w:ilvl="0" w:tplc="18F8289C">
+    <w:tmpl w:val="74FAF88C"/>
+    <w:lvl w:ilvl="0" w:tplc="CD327B1E">
       <w:start w:val="1"/>
       <w:numFmt w:val="decimal"/>
       <w:lvlText w:val="%1."/>
@@ -25227,187 +25342,79 @@
         <w:ind w:left="540" w:hanging="360"/>
       </w:pPr>
     </w:lvl>
-    <w:lvl w:ilvl="1" w:tplc="42983028">
+    <w:lvl w:ilvl="1" w:tplc="D08E5100">
       <w:numFmt w:val="decimal"/>
       <w:lvlText w:val=""/>
       <w:lvlJc w:val="left"/>
     </w:lvl>
-    <w:lvl w:ilvl="2" w:tplc="CC94D41E">
+    <w:lvl w:ilvl="2" w:tplc="046E3912">
       <w:numFmt w:val="decimal"/>
       <w:lvlText w:val=""/>
       <w:lvlJc w:val="left"/>
     </w:lvl>
-    <w:lvl w:ilvl="3" w:tplc="1EEA74F8">
+    <w:lvl w:ilvl="3" w:tplc="B94C39A8">
       <w:numFmt w:val="decimal"/>
       <w:lvlText w:val=""/>
       <w:lvlJc w:val="left"/>
     </w:lvl>
-    <w:lvl w:ilvl="4" w:tplc="BEAEA31A">
+    <w:lvl w:ilvl="4" w:tplc="49E2BD2A">
       <w:numFmt w:val="decimal"/>
       <w:lvlText w:val=""/>
       <w:lvlJc w:val="left"/>
     </w:lvl>
-    <w:lvl w:ilvl="5" w:tplc="A3403DB4">
+    <w:lvl w:ilvl="5" w:tplc="709A525C">
       <w:numFmt w:val="decimal"/>
       <w:lvlText w:val=""/>
       <w:lvlJc w:val="left"/>
     </w:lvl>
-    <w:lvl w:ilvl="6" w:tplc="8B967714">
+    <w:lvl w:ilvl="6" w:tplc="25C2E0D8">
       <w:numFmt w:val="decimal"/>
       <w:lvlText w:val=""/>
       <w:lvlJc w:val="left"/>
     </w:lvl>
-    <w:lvl w:ilvl="7" w:tplc="9FF4F7D6">
+    <w:lvl w:ilvl="7" w:tplc="5E58C60E">
       <w:numFmt w:val="decimal"/>
       <w:lvlText w:val=""/>
       <w:lvlJc w:val="left"/>
     </w:lvl>
-    <w:lvl w:ilvl="8" w:tplc="73E6B55E">
+    <w:lvl w:ilvl="8" w:tplc="B4B659F4">
       <w:numFmt w:val="decimal"/>
       <w:lvlText w:val=""/>
       <w:lvlJc w:val="left"/>
     </w:lvl>
   </w:abstractNum>
-  <w:abstractNum w:abstractNumId="4" w15:restartNumberingAfterBreak="0">
-    <w:nsid w:val="65A23249"/>
-    <w:multiLevelType w:val="hybridMultilevel"/>
-    <w:tmpl w:val="A0185A3C"/>
-    <w:lvl w:ilvl="0" w:tplc="3E2437AC">
-      <w:start w:val="1"/>
-      <w:numFmt w:val="decimal"/>
-      <w:lvlText w:val="%1."/>
-      <w:lvlJc w:val="left"/>
-      <w:pPr>
-        <w:ind w:left="540" w:hanging="360"/>
-      </w:pPr>
-    </w:lvl>
-    <w:lvl w:ilvl="1" w:tplc="1D28F754">
-      <w:numFmt w:val="decimal"/>
-      <w:lvlText w:val=""/>
-      <w:lvlJc w:val="left"/>
-    </w:lvl>
-    <w:lvl w:ilvl="2" w:tplc="E7C40E30">
-      <w:numFmt w:val="decimal"/>
-      <w:lvlText w:val=""/>
-      <w:lvlJc w:val="left"/>
-    </w:lvl>
-    <w:lvl w:ilvl="3" w:tplc="AB569AB0">
-      <w:numFmt w:val="decimal"/>
-      <w:lvlText w:val=""/>
-      <w:lvlJc w:val="left"/>
-    </w:lvl>
-    <w:lvl w:ilvl="4" w:tplc="B74A2F3C">
-      <w:numFmt w:val="decimal"/>
-      <w:lvlText w:val=""/>
-      <w:lvlJc w:val="left"/>
-    </w:lvl>
-    <w:lvl w:ilvl="5" w:tplc="57D03E1E">
-      <w:numFmt w:val="decimal"/>
-      <w:lvlText w:val=""/>
-      <w:lvlJc w:val="left"/>
-    </w:lvl>
-    <w:lvl w:ilvl="6" w:tplc="7D047AD6">
-      <w:numFmt w:val="decimal"/>
-      <w:lvlText w:val=""/>
-      <w:lvlJc w:val="left"/>
-    </w:lvl>
-    <w:lvl w:ilvl="7" w:tplc="D06AEEE0">
-      <w:numFmt w:val="decimal"/>
-      <w:lvlText w:val=""/>
-      <w:lvlJc w:val="left"/>
-    </w:lvl>
-    <w:lvl w:ilvl="8" w:tplc="86BA0F7A">
-      <w:numFmt w:val="decimal"/>
-      <w:lvlText w:val=""/>
-      <w:lvlJc w:val="left"/>
-    </w:lvl>
-  </w:abstractNum>
-  <w:abstractNum w:abstractNumId="5" w15:restartNumberingAfterBreak="0">
-    <w:nsid w:val="73C218AB"/>
-    <w:multiLevelType w:val="hybridMultilevel"/>
-    <w:tmpl w:val="2E5E1254"/>
-    <w:lvl w:ilvl="0" w:tplc="6DA82BCA">
-      <w:start w:val="1"/>
-      <w:numFmt w:val="decimal"/>
-      <w:lvlText w:val="%1."/>
-      <w:lvlJc w:val="left"/>
-      <w:pPr>
-        <w:ind w:left="540" w:hanging="360"/>
-      </w:pPr>
-    </w:lvl>
-    <w:lvl w:ilvl="1" w:tplc="33D85C76">
-      <w:numFmt w:val="decimal"/>
-      <w:lvlText w:val=""/>
-      <w:lvlJc w:val="left"/>
-    </w:lvl>
-    <w:lvl w:ilvl="2" w:tplc="A33A5944">
-      <w:numFmt w:val="decimal"/>
-      <w:lvlText w:val=""/>
-      <w:lvlJc w:val="left"/>
-    </w:lvl>
-    <w:lvl w:ilvl="3" w:tplc="E45E7838">
-      <w:numFmt w:val="decimal"/>
-      <w:lvlText w:val=""/>
-      <w:lvlJc w:val="left"/>
-    </w:lvl>
-    <w:lvl w:ilvl="4" w:tplc="93943222">
-      <w:numFmt w:val="decimal"/>
-      <w:lvlText w:val=""/>
-      <w:lvlJc w:val="left"/>
-    </w:lvl>
-    <w:lvl w:ilvl="5" w:tplc="9E0C9D16">
-      <w:numFmt w:val="decimal"/>
-      <w:lvlText w:val=""/>
-      <w:lvlJc w:val="left"/>
-    </w:lvl>
-    <w:lvl w:ilvl="6" w:tplc="E6584ACE">
-      <w:numFmt w:val="decimal"/>
-      <w:lvlText w:val=""/>
-      <w:lvlJc w:val="left"/>
-    </w:lvl>
-    <w:lvl w:ilvl="7" w:tplc="4672DC06">
-      <w:numFmt w:val="decimal"/>
-      <w:lvlText w:val=""/>
-      <w:lvlJc w:val="left"/>
-    </w:lvl>
-    <w:lvl w:ilvl="8" w:tplc="4BF6785E">
-      <w:numFmt w:val="decimal"/>
-      <w:lvlText w:val=""/>
-      <w:lvlJc w:val="left"/>
-    </w:lvl>
-  </w:abstractNum>
-  <w:num w:numId="1" w16cid:durableId="621496756">
+  <w:num w:numId="1" w16cid:durableId="763722994">
+    <w:abstractNumId w:val="1"/>
+    <w:lvlOverride w:ilvl="0">
+      <w:startOverride w:val="1"/>
+    </w:lvlOverride>
+  </w:num>
+  <w:num w:numId="2" w16cid:durableId="1140997718">
+    <w:abstractNumId w:val="4"/>
+    <w:lvlOverride w:ilvl="0">
+      <w:startOverride w:val="1"/>
+    </w:lvlOverride>
+  </w:num>
+  <w:num w:numId="3" w16cid:durableId="2044086785">
+    <w:abstractNumId w:val="5"/>
+    <w:lvlOverride w:ilvl="0">
+      <w:startOverride w:val="1"/>
+    </w:lvlOverride>
+  </w:num>
+  <w:num w:numId="4" w16cid:durableId="667903052">
     <w:abstractNumId w:val="0"/>
     <w:lvlOverride w:ilvl="0">
       <w:startOverride w:val="1"/>
     </w:lvlOverride>
   </w:num>
-  <w:num w:numId="2" w16cid:durableId="1805460298">
-    <w:abstractNumId w:val="2"/>
+  <w:num w:numId="5" w16cid:durableId="998119162">
+    <w:abstractNumId w:val="3"/>
     <w:lvlOverride w:ilvl="0">
       <w:startOverride w:val="1"/>
     </w:lvlOverride>
   </w:num>
-  <w:num w:numId="3" w16cid:durableId="1378312274">
-    <w:abstractNumId w:val="5"/>
-    <w:lvlOverride w:ilvl="0">
-      <w:startOverride w:val="1"/>
-    </w:lvlOverride>
-  </w:num>
-  <w:num w:numId="4" w16cid:durableId="2012676612">
-    <w:abstractNumId w:val="1"/>
-    <w:lvlOverride w:ilvl="0">
-      <w:startOverride w:val="1"/>
-    </w:lvlOverride>
-  </w:num>
-  <w:num w:numId="5" w16cid:durableId="1813448035">
-    <w:abstractNumId w:val="4"/>
-    <w:lvlOverride w:ilvl="0">
-      <w:startOverride w:val="1"/>
-    </w:lvlOverride>
-  </w:num>
-  <w:num w:numId="6" w16cid:durableId="121385340">
-    <w:abstractNumId w:val="3"/>
+  <w:num w:numId="6" w16cid:durableId="2125073742">
+    <w:abstractNumId w:val="2"/>
     <w:lvlOverride w:ilvl="0">
       <w:startOverride w:val="1"/>
     </w:lvlOverride>
@@ -25986,7 +25993,7 @@
     <w:autoRedefine/>
     <w:uiPriority w:val="39"/>
     <w:unhideWhenUsed/>
-    <w:rsid w:val="0094130B"/>
+    <w:rsid w:val="00181D5D"/>
     <w:pPr>
       <w:spacing w:after="100"/>
     </w:pPr>
@@ -26002,7 +26009,7 @@
     <w:autoRedefine/>
     <w:uiPriority w:val="39"/>
     <w:unhideWhenUsed/>
-    <w:rsid w:val="0094130B"/>
+    <w:rsid w:val="00181D5D"/>
     <w:pPr>
       <w:spacing w:after="100"/>
       <w:ind w:left="200"/>

</xml_diff>